<commit_message>
Ampliar investigación académica del paper e incorporar dossier de fuentes
- Integra fuentes peer-reviewed clave centradas en el rol del ingeniero:
  transformers vs. jerarquía de Chomsky / clase TC0 (Delétang et al., 2023;
  Merrill & Sabharwal, 2023), Naur (1985) sobre programación como construcción
  de teoría, evidencia de corrección/seguridad del código de IA (Liu et al.,
  2023; Pearce et al., 2022), economía del empleo (Acemoglu & Restrepo, 2019;
  Autor, 2015) y proyecciones de competencias (WEF 2025; SWEBOK v4.0).
- Bibliografía ampliada de 26 a 34 referencias APA 7; cuerpo recomprimido a
  ~2.997 palabras para respetar el tope de 3.000.
- Agrega fuentes_adicionales.md: dossier temático con ~50 fuentes verificadas
  (DOI/URL + hallazgo) sobre el rol del ingeniero en 10 años.
- Regenera el .docx.
</commit_message>
<xml_diff>
--- a/Paper_Rol_del_ingeniero_informatico_en_10_anios.docx
+++ b/Paper_Rol_del_ingeniero_informatico_en_10_anios.docx
@@ -207,7 +207,7 @@
         <w:jc w:val="both"/>
       </w:pPr>
       <w:r>
-        <w:t xml:space="preserve">Para sostenerla se recorre la historia de la profesión como una sucesión de abstracciones (sección II), el estado actual de la IA en el desarrollo de software (sección III) y el marco teórico de la materia —los límites computacionales que explican </w:t>
+        <w:t xml:space="preserve">Para sostenerla se recorre la historia de la profesión como sucesión de abstracciones (II), el estado actual de la IA en el desarrollo de software (III) y el marco teórico de la materia —los límites computacionales que explican </w:t>
       </w:r>
       <w:r>
         <w:rPr>
@@ -216,7 +216,7 @@
         <w:t>por qué</w:t>
       </w:r>
       <w:r>
-        <w:t xml:space="preserve"> persiste un rol humano (sección IV)—, para luego caracterizar el nuevo rol, contrastar las visiones de expertos y reconocer las limitaciones del análisis (secciones V a VII). Por tratarse de una proyección a futuro, la conclusión es una estimación fundada.</w:t>
+        <w:t xml:space="preserve"> persiste un rol humano (IV)—, para luego caracterizar el nuevo rol, las visiones de expertos y las limitaciones (V a VII). Por ser una proyección a futuro, la conclusión es una estimación fundada.</w:t>
       </w:r>
     </w:p>
     <w:p>
@@ -261,7 +261,7 @@
         <w:jc w:val="both"/>
       </w:pPr>
       <w:r>
-        <w:t>Los peldaños siguientes confirman el patrón. Los entornos integrados de desarrollo (de Turbo Pascal a Visual Studio) comprimieron el ciclo de edición, compilación y prueba; el software libre, los sistemas de control de versiones como Git (2005) y plataformas comunitarias como Stack Overflow (2008) externalizaron y compartieron el conocimiento; la computación en la nube, inaugurada comercialmente por Amazon Web Services en 2006, abstrajo la infraestructura física, mientras la cultura DevOps (2009) automatizó el despliegue. En 2021, GitHub Copilot introdujo el primer "programador en par" basado en IA. En todos los casos, la herramienta automatizó la parte más rutinaria del trabajo, pero el ingeniero permaneció: ascendió desde la gestión de registros hasta el diseño de arquitecturas distribuidas. La IA generativa es, en esta lectura, el peldaño más alto de una escalera muy larga. Conviene recordar, además, que el anuncio de la desaparición del programador no es nuevo: ya se proclamó con COBOL, con los lenguajes de cuarta generación y con las plataformas "sin código", y en cada ocasión la profesión creció en lugar de extinguirse. La tesis del "fin de la programación" (Welsh, 2023) es la más reciente de una larga serie de profecías incumplidas.</w:t>
+        <w:t>Los peldaños siguientes confirman el patrón. Los entornos integrados de desarrollo comprimieron el ciclo de edición, compilación y prueba; el software libre, Git (2005) y Stack Overflow (2008) compartieron el conocimiento; la nube (Amazon Web Services, 2006) abstrajo la infraestructura física y la cultura DevOps (2009) automatizó el despliegue. En 2021, GitHub Copilot introdujo el primer "programador en par" basado en IA. En todos los casos la herramienta automatizó lo más rutinario, pero el ingeniero permaneció: ascendió de la gestión de registros al diseño de arquitecturas distribuidas. La IA generativa es el peldaño más alto de una escalera muy larga. Y el anuncio de la desaparición del programador no es nuevo: ya se proclamó con COBOL, con los lenguajes de cuarta generación y con las plataformas "sin código", y cada vez la profesión creció en lugar de extinguirse; la tesis del "fin de la programación" (Welsh, 2023) es la más reciente de una larga serie de profecías incumplidas.</w:t>
       </w:r>
     </w:p>
     <w:p>
@@ -295,7 +295,7 @@
         <w:t>issues</w:t>
       </w:r>
       <w:r>
-        <w:t xml:space="preserve"> reales de proyectos de software, el estado del arte pasó de resolver alrededor del 14 % de los problemas a comienzos de 2024 a más del 70 % en 2025 (Anthropic, 2025): de uno de cada siete casos a tres de cada cuatro en unos dieciocho meses. La adopción acompaña esa capacidad —GitHub Copilot superó los veinte millones de usuarios en 2025— y los ejecutivos del sector cuantifican la penetración de la IA en su código: Sundar Pichai afirmó en 2024 que "más de una cuarta parte de todo el código nuevo en Google" lo genera la IA, y Satya Nadella estimó en 2025 entre un 20 % y un 30 % en Microsoft (Zeff, 2025).</w:t>
+        <w:t xml:space="preserve"> reales de proyectos de software, el estado del arte pasó de resolver alrededor del 14 % de los problemas a comienzos de 2024 a más del 70 % en 2025 (Anthropic, 2025): de uno de cada siete casos a tres de cada cuatro en unos dieciocho meses. La adopción acompaña esa capacidad: GitHub Copilot superó los veinte millones de usuarios en 2025, Sundar Pichai afirmó en 2024 que la IA genera "más de una cuarta parte de todo el código nuevo en Google" y Satya Nadella la estimó en 2025 entre el 20 % y el 30 % en Microsoft (Zeff, 2025).</w:t>
       </w:r>
     </w:p>
     <w:p>
@@ -305,7 +305,7 @@
         <w:jc w:val="both"/>
       </w:pPr>
       <w:r>
-        <w:t xml:space="preserve">Ahora bien, la evidencia rigurosa sobre el impacto de estas herramientas es más matizada de lo que sugiere el entusiasmo. Un experimento controlado de GitHub y Microsoft mostró que los desarrolladores que usaban Copilot completaban una tarea acotada —programar un servidor HTTP— un 55,8 % más rápido (Peng et al., 2023), y McKinsey estimó mejoras de productividad de entre el 20 % y el 45 % en la función de ingeniería de software (McKinsey &amp; Company, 2023). Sin embargo, un ensayo controlado aleatorizado independiente realizado por METR en 2025 arrojó un resultado contraintuitivo: desarrolladores </w:t>
+        <w:t xml:space="preserve">Ahora bien, la evidencia rigurosa sobre el impacto de estas herramientas es más matizada de lo que sugiere el entusiasmo. Un experimento controlado de GitHub y Microsoft mostró que los desarrolladores que usaban Copilot completaban una tarea acotada —programar un servidor HTTP— un 55,8 % más rápido (Peng et al., 2023), y McKinsey estimó mejoras de productividad de entre el 20 % y el 45 % en la función de ingeniería de software (McKinsey &amp; Company, 2023). Sin embargo, un ensayo controlado aleatorizado independiente de METR (2025) arrojó un resultado contraintuitivo: desarrolladores </w:t>
       </w:r>
       <w:r>
         <w:rPr>
@@ -314,7 +314,7 @@
         <w:t>experimentados</w:t>
       </w:r>
       <w:r>
-        <w:t xml:space="preserve"> trabajando sobre sus propios repositorios maduros tardaron un 19 % </w:t>
+        <w:t xml:space="preserve"> en sus propios repositorios maduros tardaron un 19 % </w:t>
       </w:r>
       <w:r>
         <w:rPr>
@@ -323,7 +323,7 @@
         <w:t>más</w:t>
       </w:r>
       <w:r>
-        <w:t xml:space="preserve"> cuando usaban herramientas de IA, pese a que ellos mismos </w:t>
+        <w:t xml:space="preserve"> con herramientas de IA, pese a que </w:t>
       </w:r>
       <w:r>
         <w:rPr>
@@ -332,7 +332,7 @@
         <w:t>creían</w:t>
       </w:r>
       <w:r>
-        <w:t xml:space="preserve"> haberse acelerado un 20 % (METR, 2025). La brecha entre la productividad percibida y la real es, en sí misma, un dato relevante para la disciplina.</w:t>
+        <w:t xml:space="preserve"> haberse acelerado un 20 %. La brecha entre la productividad percibida y la real es, en sí misma, un dato relevante.</w:t>
       </w:r>
     </w:p>
     <w:p>
@@ -360,7 +360,7 @@
         <w:t>más</w:t>
       </w:r>
       <w:r>
-        <w:t xml:space="preserve"> en su seguridad —una peligrosa falsa sensación de confianza (Perry et al., 2023). La IA, en suma, acelera la producción pero no garantiza la corrección: traslada el cuello de botella desde la escritura del código hacia su verificación.</w:t>
+        <w:t xml:space="preserve"> en su seguridad —una peligrosa falsa sensación de confianza (Perry et al., 2023). Las evaluaciones de corrección apuntan en el mismo sentido: al endurecer los conjuntos de prueba, la tasa de acierto del código generado cae hasta un 20-30 % (Liu et al., 2023), y cerca del 40 % de las sugerencias de Copilot en escenarios de seguridad incluyen vulnerabilidades conocidas (Pearce et al., 2022). La IA, en suma, acelera la producción pero no garantiza la corrección: traslada el cuello de botella desde la escritura del código hacia su verificación.</w:t>
       </w:r>
     </w:p>
     <w:p>
@@ -422,7 +422,7 @@
         <w:t>toda</w:t>
       </w:r>
       <w:r>
-        <w:t xml:space="preserve"> propiedad semántica no trivial de los programas —es decir, toda afirmación sobre lo que un programa hace, como "¿está libre de cierto error?" o "¿cumple esta especificación?"— es indecidible (Rice, 1953). La implicación es directa: es imposible escribir un programa que verifique, de manera general y automática, si un programa arbitrario satisface su especificación. Por lo tanto, una IA no puede, en el caso general, demostrar la corrección del código que ella misma u otros producen. La verificación y la validación seguirán exigiendo juicio humano y herramientas que solo funcionan restringiendo el problema o aceptando renunciar a la completitud.</w:t>
+        <w:t xml:space="preserve"> propiedad semántica no trivial de los programas —es decir, toda afirmación sobre lo que un programa hace, como "¿está libre de cierto error?" o "¿cumple esta especificación?"— es indecidible (Rice, 1953). La implicación es directa: es imposible escribir un programa que verifique, de forma general y automática, si un programa arbitrario satisface su especificación; por lo tanto, una IA no puede demostrar en el caso general la corrección del código que ella u otros producen. La verificación seguirá exigiendo juicio humano y herramientas que solo funcionan restringiendo el problema o renunciando a la completitud.</w:t>
       </w:r>
     </w:p>
     <w:p>
@@ -441,7 +441,7 @@
         <w:t>intratabilidad</w:t>
       </w:r>
       <w:r>
-        <w:t xml:space="preserve">. El problema P vs. NP, uno de los siete Problemas del Milenio, pregunta si todo problema cuya solución puede verificarse rápidamente puede también resolverse rápidamente (Cook, 1971). Bajo la hipótesis ampliamente aceptada de que P ≠ NP, numerosos problemas centrales de la ingeniería —planificación, ruteo, asignación de recursos, satisfacción de restricciones— son NP-difíciles y no admiten soluciones eficientes en el peor caso. Este límite es matemático, no de capacidad de cómputo: ninguna IA, por potente que sea, lo derogará. El ingeniero seguirá siendo quien elija heurísticas, aproximaciones y compromisos adecuados a cada contexto; decidir </w:t>
+        <w:t xml:space="preserve">. El problema P vs. NP, uno de los siete Problemas del Milenio, pregunta si todo problema cuya solución puede verificarse rápidamente puede también resolverse rápidamente (Cook, 1971). Bajo la hipótesis ampliamente aceptada de que P ≠ NP, numerosos problemas centrales de la ingeniería (planificación, ruteo, asignación de recursos) son NP-difíciles y no admiten soluciones eficientes en el peor caso. Este límite es matemático, no de capacidad de cómputo: ninguna IA lo derogará. El ingeniero seguirá siendo quien elija heurísticas, aproximaciones y compromisos; decidir </w:t>
       </w:r>
       <w:r>
         <w:rPr>
@@ -460,7 +460,16 @@
         <w:jc w:val="both"/>
       </w:pPr>
       <w:r>
-        <w:t>La tercera barrera concierne al lenguaje. La jerarquía de Chomsky (1956) organiza los lenguajes formales según su poder generativo, y los lenguajes de programación pertenecen, en su sintaxis, a la clase de los lenguajes libres de contexto: son formales, precisos y se analizan de manera determinista y sin ambigüedad. El lenguaje natural —y, con él, las instrucciones que un humano da a un LLM— es, en cambio, ambiguo, dependiente del contexto y no constituye un lenguaje formal. El rol perdurable del ingeniero es justamente el de traductor entre ambos mundos: convertir la intención humana, informal e incompleta, en una especificación formal que una máquina pueda ejecutar.</w:t>
+        <w:t xml:space="preserve">La tercera barrera concierne al lenguaje. La jerarquía de Chomsky (1956) organiza los lenguajes formales según su poder generativo, y los lenguajes de programación pertenecen, en su sintaxis, a la clase de los lenguajes libres de contexto: son formales, precisos y se analizan de manera determinista y sin ambigüedad. El lenguaje natural —y, con él, las instrucciones que un humano da a un LLM— es, en cambio, ambiguo, dependiente del contexto y no constituye un lenguaje formal. El rol perdurable del ingeniero es justamente el de traductor entre ambos mundos: convertir la intención humana, informal e incompleta, en una especificación formal que una máquina pueda ejecutar. Esta conexión no es una mera analogía: trabajos recientes muestran que los propios </w:t>
+      </w:r>
+      <w:r>
+        <w:rPr>
+          <w:i/>
+        </w:rPr>
+        <w:t>transformers</w:t>
+      </w:r>
+      <w:r>
+        <w:t xml:space="preserve"> —la arquitectura de los LLM— están acotados por la jerarquía de Chomsky (no generalizan a lenguajes que exceden su nivel) y que, bajo supuestos realistas de precisión, pertenecen a la clase de complejidad TC⁰, incapaz de reconocer gramáticas libres de contexto arbitrarias (Delétang et al., 2023; Merrill y Sabharwal, 2023). La teoría de lenguajes formales y la complejidad describen, así, los límites concretos de la IA que el ingeniero debe conocer.</w:t>
       </w:r>
     </w:p>
     <w:p>
@@ -470,7 +479,7 @@
         <w:jc w:val="both"/>
       </w:pPr>
       <w:r>
-        <w:t>Estas barreras alcanzan también a la propia IA. Trabajos recientes demuestran, mediante argumentos de diagonalización apoyados en la indecidibilidad del problema de la detención, que la "alucinación" es una limitación innata de los LLM: ningún modelo, entendido como una máquina de Turing, puede aprender todas las funciones computables, por lo que producirá inevitablemente errores que no puede detectar por sí mismo (Xu et al., 2024). Un LLM no puede autoverificar la corrección de su salida; necesita un agente externo —el ingeniero— que la contraste con la realidad y asuma la responsabilidad.</w:t>
+        <w:t>Estas barreras alcanzan también a la propia IA. Trabajos recientes demuestran, mediante diagonalización apoyada en la indecidibilidad del problema de la detención, que la "alucinación" es una limitación innata de los LLM: ningún modelo puede aprender todas las funciones computables, por lo que producirá inevitablemente errores que no puede detectar por sí mismo (Xu et al., 2024). Un LLM no puede autoverificar su salida; necesita un agente externo —el ingeniero— que la contraste con la realidad y asuma la responsabilidad.</w:t>
       </w:r>
     </w:p>
     <w:p>
@@ -480,7 +489,7 @@
         <w:jc w:val="both"/>
       </w:pPr>
       <w:r>
-        <w:t xml:space="preserve">Finalmente, conviene recordar la distinción clásica de Frederick Brooks (1987) entre complejidad </w:t>
+        <w:t xml:space="preserve">Finalmente, Brooks (1987) distinguió la complejidad </w:t>
       </w:r>
       <w:r>
         <w:rPr>
@@ -489,7 +498,7 @@
         <w:t>accidental</w:t>
       </w:r>
       <w:r>
-        <w:t xml:space="preserve"> —la del proceso de construcción, que las herramientas sí pueden reducir— y complejidad </w:t>
+        <w:t xml:space="preserve"> —la del proceso de construcción, que las herramientas sí reducen— de la </w:t>
       </w:r>
       <w:r>
         <w:rPr>
@@ -498,7 +507,16 @@
         <w:t>esencial</w:t>
       </w:r>
       <w:r>
-        <w:t xml:space="preserve"> —la dificultad conceptual inherente al problema. Para Brooks, "la parte más difícil de construir un sistema de software es decidir con precisión qué construir". La automatización y la IA atacan lo accidental; pero decidir qué construir, para quién y con qué compromisos éticos y económicos es una tarea humana, contextual y cargada de valores, que no se reduce a un cómputo. Allí reside el corazón irreductible de la ingeniería.</w:t>
+        <w:t xml:space="preserve"> —la dificultad conceptual inherente al problema—. Para Brooks, "la parte más difícil de construir un sistema de software es decidir con precisión qué construir": la IA ataca lo accidental, pero decidir qué construir, para quién y con qué compromisos éticos es una tarea humana cargada de valores, no un cómputo. En la misma línea, Naur (1985) sostuvo que el verdadero producto de programar es una </w:t>
+      </w:r>
+      <w:r>
+        <w:rPr>
+          <w:i/>
+        </w:rPr>
+        <w:t>teoría</w:t>
+      </w:r>
+      <w:r>
+        <w:t xml:space="preserve"> del problema que reside en la mente del equipo y que el código por sí solo no captura. Allí reside el corazón irreductible de la ingeniería.</w:t>
       </w:r>
     </w:p>
     <w:p>
@@ -523,7 +541,7 @@
         <w:jc w:val="both"/>
       </w:pPr>
       <w:r>
-        <w:t>Si la teoría garantiza un núcleo humano, la economía explica por qué ese núcleo no solo persistirá, sino que probablemente se ampliará. La historia de la automatización ofrece una guía en la "paradoja de Jevons": cuando una tecnología abarata el uso de un recurso, su consumo total tiende a aumentar, no a disminuir. El caso de los cajeros automáticos es paradigmático: lejos de eliminar a los cajeros bancarios, abarataron la operación de las sucursales, los bancos abrieron más y el empleo total creció, aunque la tarea se desplazó hacia la atención y la venta (Bessen, 2015). Aplicada al software, la lógica es análoga: al volverse más barato producir, la demanda —y la de quienes lo diseñan y controlan— podría crecer. Thomas Dohmke, entonces director ejecutivo de GitHub, llegó a proyectar "mil millones de desarrolladores habilitados por miles de millones de agentes de IA" (Dohmke, 2025).</w:t>
+        <w:t>Si la teoría garantiza un núcleo humano, la economía explica por qué ese núcleo no solo persistirá, sino que probablemente se ampliará. La historia de la automatización ofrece una guía en la "paradoja de Jevons": cuando una tecnología abarata el uso de un recurso, su consumo total tiende a aumentar, no a disminuir. El caso de los cajeros automáticos es paradigmático: lejos de eliminar a los cajeros, abarataron operar una sucursal, los bancos abrieron más y el empleo total creció, aunque la tarea viró hacia la atención y la venta (Bessen, 2015). Aplicada al software, la lógica es análoga: al volverse más barato producir, la demanda —y la de quienes lo diseñan y controlan— podría crecer (Acemoglu y Restrepo, 2019; Autor, 2015). Thomas Dohmke, entonces director ejecutivo de GitHub, llegó a proyectar "mil millones de desarrolladores habilitados por miles de millones de agentes de IA" (Dohmke, 2025).</w:t>
       </w:r>
     </w:p>
     <w:p>
@@ -578,7 +596,7 @@
         <w:t>decidir</w:t>
       </w:r>
       <w:r>
-        <w:t xml:space="preserve"> bajo restricciones de intratabilidad y de valores. Es, precisamente, el "30 % difícil" de Osmani convertido en el centro de gravedad de la profesión.</w:t>
+        <w:t xml:space="preserve"> bajo restricciones de intratabilidad y de valores. Es, precisamente, el "30 % difícil" de Osmani convertido en el centro de gravedad de la profesión. Las proyecciones de competencias confirman ese desplazamiento: cerca del 40 % de las habilidades cambiarán hacia 2030, con el pensamiento analítico, la IA y los datos, y la ciberseguridad entre las más demandadas (World Economic Forum, 2025); y marcos como el SWEBOK (Washizaki, 2024) ya definen la ingeniería de software muy por encima de la codificación, abarcando requisitos, arquitectura, validación y seguridad.</w:t>
       </w:r>
     </w:p>
     <w:p>
@@ -588,7 +606,7 @@
         <w:jc w:val="both"/>
       </w:pPr>
       <w:r>
-        <w:t>Los datos del mercado laboral, sin embargo, advierten que esta transición no será indolora y que su carga recaerá de forma desigual. La Oficina de Estadísticas Laborales de los Estados Unidos proyecta un crecimiento del empleo de "desarrolladores de software" del orden del 15 % entre 2024 y 2034 —muy por encima del promedio—, mientras que la categoría más estrecha de "programadores" se contraería alrededor de un 6 % por efecto de la automatización (Bureau of Labor Statistics, 2025). Esta divergencia es reveladora: lo que se automatiza es la tarea de codificar, no la de diseñar y decidir. Al mismo tiempo, un estudio de la Universidad de Stanford encontró que los trabajadores de carrera temprana (22 a 25 años) en las ocupaciones más expuestas a la IA, entre ellas el desarrollo de software, sufrieron caídas relativas de empleo de hasta el 13-16 %, mientras los trabajadores con experiencia se mantenían estables (Brynjolfsson et al., 2025). La "puerta de entrada" junior se estrecha y la demanda se desplaza hacia perfiles con experiencia y criterio: exactamente las competencias del nuevo rol.</w:t>
+        <w:t>Los datos del mercado laboral, sin embargo, advierten que la transición no será indolora ni uniforme. La Oficina de Estadísticas Laborales de EE. UU. proyecta un crecimiento del empleo de "desarrolladores de software" cercano al 15 % entre 2024 y 2034 —muy por encima del promedio—, mientras la categoría más estrecha de "programadores" se contraería un 6 % por la automatización (Bureau of Labor Statistics, 2025): se automatiza la tarea de codificar, no la de diseñar y decidir. A la vez, un estudio de Stanford halló caídas de empleo del 13-16 % en los trabajadores de carrera temprana (22-25 años) de las ocupaciones más expuestas a la IA —entre ellas el desarrollo de software—, mientras los de mayor experiencia se mantenían estables (Brynjolfsson et al., 2025). La "puerta de entrada" junior se estrecha y la demanda se desplaza hacia perfiles con criterio: las competencias del nuevo rol.</w:t>
       </w:r>
     </w:p>
     <w:p>
@@ -613,16 +631,7 @@
         <w:jc w:val="both"/>
       </w:pPr>
       <w:r>
-        <w:t xml:space="preserve">Como toda proyección, esta depende de cómo lean el futuro quienes están construyéndolo, y sus opiniones, aunque dispares, convergen en un punto. En el extremo más audaz, Dario Amodei, director ejecutivo de Anthropic, pronosticó en marzo de 2025 que en un plazo de tres a seis meses la IA escribiría el 90 % del código y que, en doce meses, "podríamos estar en un mundo donde la IA escriba esencialmente todo el código"; pero, significativamente, aclaró de inmediato que "el programador todavía debe especificar cuáles son las condiciones de lo que está haciendo (…), cuáles son las decisiones generales de diseño" (Council on Foreign Relations, 2025). Andrej Karpathy, por su parte, describió un nuevo paradigma —el "Software 3.0"— en el que "los </w:t>
-      </w:r>
-      <w:r>
-        <w:rPr>
-          <w:i/>
-        </w:rPr>
-        <w:t>prompts</w:t>
-      </w:r>
-      <w:r>
-        <w:t xml:space="preserve"> son ahora programas que programan al LLM (…) escritos en inglés" (Karpathy, 2025), y popularizó el término "vibe coding" para la programación guiada por la intuición y delegada en la IA.</w:t>
+        <w:t>Como toda proyección, depende de cómo lean el futuro quienes lo construyen, y sus opiniones, aunque dispares, convergen en un punto. En el extremo más audaz, Dario Amodei (Anthropic) pronosticó en marzo de 2025 que la IA escribiría el 90 % del código en tres a seis meses y "esencialmente todo" en doce; pero aclaró de inmediato que "el programador todavía debe especificar (…) las decisiones generales de diseño" (Council on Foreign Relations, 2025). Andrej Karpathy describió el "Software 3.0", en el que "programamos las computadoras en inglés" (Karpathy, 2025), y popularizó el "vibe coding" para la programación guiada por la intuición y delegada en la IA.</w:t>
       </w:r>
     </w:p>
     <w:p>
@@ -642,7 +651,7 @@
         <w:jc w:val="both"/>
       </w:pPr>
       <w:r>
-        <w:t>Sam Altman, de OpenAI, ofrece quizás la síntesis más equilibrada para nuestra tesis. Frente a la pregunta de si conviene seguir contratando ingenieros, respondió: "mi suposición básica es que cada ingeniero de software hará, durante un buen tiempo, muchísimo más" (Thompson, 2025); y, sobre la democratización del oficio, escribió que "mucha más gente podrá crear software (…), pero los expertos probablemente seguirán siendo mucho mejores que los novatos, siempre que adopten las nuevas herramientas" (Altman, 2025). Esta es, en esencia, la hipótesis de este trabajo enunciada por uno de los principales protagonistas del cambio: la IA no anula al ingeniero, sino que amplifica al que sabe usarla y le exige subir de nivel. Incluso las voces más optimistas, al describir el futuro, reservan para el humano las tareas de especificar, decidir y juzgar —las mismas que la teoría de la computación demuestra que no pueden automatizarse.</w:t>
+        <w:t>Sam Altman, de OpenAI, ofrece quizás la síntesis más equilibrada. Ante la pregunta de si conviene seguir contratando ingenieros respondió que "cada ingeniero de software hará, durante un buen tiempo, muchísimo más" (Thompson, 2025), y agregó que "mucha más gente podrá crear software, pero los expertos seguirán siendo mucho mejores que los novatos, si adoptan las nuevas herramientas" (Altman, 2025). Es, en esencia, la hipótesis de este trabajo en boca de un protagonista del cambio: la IA no anula al ingeniero, sino que amplifica al que sabe usarla. Incluso las voces más optimistas reservan para el humano las tareas de especificar, decidir y juzgar —las mismas que la teoría de la computación demuestra que no pueden automatizarse.</w:t>
       </w:r>
     </w:p>
     <w:p>
@@ -701,7 +710,7 @@
         <w:jc w:val="both"/>
       </w:pPr>
       <w:r>
-        <w:t>El recorrido realizado permite confirmar, con matices, la hipótesis inicial. En los próximos diez años el ingeniero informático no será reemplazado por la inteligencia artificial, pero su rol se transformará profundamente: el centro de gravedad de la profesión se desplazará desde la ejecución técnica —escribir código línea por línea— hacia la especificación, el diseño, la integración y, sobre todo, la validación y la supervisión crítica de sistemas cada vez más autónomos. La historia respalda esta lectura, pues cada abstracción anterior elevó al ingeniero en lugar de eliminarlo; la evidencia empírica reciente la matiza, al mostrar que la IA acelera la producción pero degrada la garantía de corrección; y la teoría de la computación la fundamenta, al demostrar que la verificación universal (Rice y Turing), la resolución eficiente de todo problema (P vs. NP) y la traducción de la intención ambigua al lenguaje formal (Chomsky) no son tareas que una máquina pueda asumir por completo.</w:t>
+        <w:t>El recorrido permite confirmar, con matices, la hipótesis inicial. En los próximos diez años el ingeniero informático no será reemplazado por la IA, pero su rol se transformará: el centro de gravedad de la profesión pasará de la ejecución técnica —escribir código línea por línea— a la especificación, el diseño, la integración y, sobre todo, la validación y supervisión crítica de sistemas cada vez más autónomos. La historia respalda esta lectura, pues cada abstracción anterior elevó al ingeniero en lugar de eliminarlo; la evidencia empírica reciente la matiza, al mostrar que la IA acelera la producción pero degrada la garantía de corrección; y la teoría de la computación la fundamenta, al demostrar que la verificación universal (Rice y Turing), la resolución eficiente de todo problema (P vs. NP) y la traducción de la intención ambigua al lenguaje formal (Chomsky) no son tareas que una máquina pueda asumir por completo.</w:t>
       </w:r>
     </w:p>
     <w:p>
@@ -727,6 +736,25 @@
           <w:sz w:val="26"/>
         </w:rPr>
         <w:t>Bibliografía</w:t>
+      </w:r>
+    </w:p>
+    <w:p>
+      <w:pPr>
+        <w:spacing w:line="360" w:lineRule="auto" w:after="120"/>
+        <w:ind w:left="720" w:hanging="720"/>
+        <w:jc w:val="left"/>
+      </w:pPr>
+      <w:r>
+        <w:t xml:space="preserve">Acemoglu, D., &amp; Restrepo, P. (2019). Automation and new tasks: How technology displaces and reinstates labor. </w:t>
+      </w:r>
+      <w:r>
+        <w:rPr>
+          <w:i/>
+        </w:rPr>
+        <w:t>Journal of Economic Perspectives, 33</w:t>
+      </w:r>
+      <w:r>
+        <w:t>(2), 3-30. https://doi.org/10.1257/jep.33.2.3</w:t>
       </w:r>
     </w:p>
     <w:p>
@@ -765,6 +793,25 @@
       </w:r>
       <w:r>
         <w:t>. https://www.anthropic.com/news/claude-4</w:t>
+      </w:r>
+    </w:p>
+    <w:p>
+      <w:pPr>
+        <w:spacing w:line="360" w:lineRule="auto" w:after="120"/>
+        <w:ind w:left="720" w:hanging="720"/>
+        <w:jc w:val="left"/>
+      </w:pPr>
+      <w:r>
+        <w:t xml:space="preserve">Autor, D. H. (2015). Why are there still so many jobs? The history and future of workplace automation. </w:t>
+      </w:r>
+      <w:r>
+        <w:rPr>
+          <w:i/>
+        </w:rPr>
+        <w:t>Journal of Economic Perspectives, 29</w:t>
+      </w:r>
+      <w:r>
+        <w:t>(3), 3-30. https://doi.org/10.1257/jep.29.3.3</w:t>
       </w:r>
     </w:p>
     <w:p>
@@ -926,6 +973,25 @@
         <w:jc w:val="left"/>
       </w:pPr>
       <w:r>
+        <w:t xml:space="preserve">Delétang, G., Ruoss, A., Grau-Moya, J., Genewein, T., Wenliang, L. K., Catt, E., Cundy, C., Hutter, M., Legg, S., Veness, J., &amp; Ortega, P. A. (2023). </w:t>
+      </w:r>
+      <w:r>
+        <w:rPr>
+          <w:i/>
+        </w:rPr>
+        <w:t>Neural networks and the Chomsky hierarchy</w:t>
+      </w:r>
+      <w:r>
+        <w:t xml:space="preserve"> [Ponencia]. International Conference on Learning Representations (ICLR 2023). https://doi.org/10.48550/arXiv.2207.02098</w:t>
+      </w:r>
+    </w:p>
+    <w:p>
+      <w:pPr>
+        <w:spacing w:line="360" w:lineRule="auto" w:after="120"/>
+        <w:ind w:left="720" w:hanging="720"/>
+        <w:jc w:val="left"/>
+      </w:pPr>
+      <w:r>
         <w:t xml:space="preserve">Dijkstra, E. W. (1972). The humble programmer. </w:t>
       </w:r>
       <w:r>
@@ -983,6 +1049,25 @@
         <w:jc w:val="left"/>
       </w:pPr>
       <w:r>
+        <w:t xml:space="preserve">Liu, J., Xia, C. S., Wang, Y., &amp; Zhang, L. (2023). Is your code generated by ChatGPT really correct? Rigorous evaluation of large language models for code generation. En </w:t>
+      </w:r>
+      <w:r>
+        <w:rPr>
+          <w:i/>
+        </w:rPr>
+        <w:t>Advances in Neural Information Processing Systems 36 (NeurIPS 2023)</w:t>
+      </w:r>
+      <w:r>
+        <w:t xml:space="preserve"> (pp. 21558-21572). https://doi.org/10.48550/arXiv.2305.01210</w:t>
+      </w:r>
+    </w:p>
+    <w:p>
+      <w:pPr>
+        <w:spacing w:line="360" w:lineRule="auto" w:after="120"/>
+        <w:ind w:left="720" w:hanging="720"/>
+        <w:jc w:val="left"/>
+      </w:pPr>
+      <w:r>
         <w:t xml:space="preserve">McKinsey &amp; Company. (2023, 27 de junio). </w:t>
       </w:r>
       <w:r>
@@ -1002,6 +1087,25 @@
         <w:jc w:val="left"/>
       </w:pPr>
       <w:r>
+        <w:t xml:space="preserve">Merrill, W., &amp; Sabharwal, A. (2023). The parallelism tradeoff: Limitations of log-precision transformers. </w:t>
+      </w:r>
+      <w:r>
+        <w:rPr>
+          <w:i/>
+        </w:rPr>
+        <w:t>Transactions of the Association for Computational Linguistics, 11</w:t>
+      </w:r>
+      <w:r>
+        <w:t>, 531-545. https://doi.org/10.1162/tacl_a_00562</w:t>
+      </w:r>
+    </w:p>
+    <w:p>
+      <w:pPr>
+        <w:spacing w:line="360" w:lineRule="auto" w:after="120"/>
+        <w:ind w:left="720" w:hanging="720"/>
+        <w:jc w:val="left"/>
+      </w:pPr>
+      <w:r>
         <w:t xml:space="preserve">METR. (2025, 10 de julio). </w:t>
       </w:r>
       <w:r>
@@ -1012,6 +1116,25 @@
       </w:r>
       <w:r>
         <w:t>. https://metr.org/blog/2025-07-10-early-2025-ai-experienced-os-dev-study/</w:t>
+      </w:r>
+    </w:p>
+    <w:p>
+      <w:pPr>
+        <w:spacing w:line="360" w:lineRule="auto" w:after="120"/>
+        <w:ind w:left="720" w:hanging="720"/>
+        <w:jc w:val="left"/>
+      </w:pPr>
+      <w:r>
+        <w:t xml:space="preserve">Naur, P. (1985). Programming as theory building. </w:t>
+      </w:r>
+      <w:r>
+        <w:rPr>
+          <w:i/>
+        </w:rPr>
+        <w:t>Microprocessing and Microprogramming, 15</w:t>
+      </w:r>
+      <w:r>
+        <w:t>(5), 253-261. https://doi.org/10.1016/0165-6074(85)90032-8</w:t>
       </w:r>
     </w:p>
     <w:p>
@@ -1050,6 +1173,25 @@
       </w:r>
       <w:r>
         <w:t>. https://addyo.substack.com/p/the-70-problem-hard-truths-about</w:t>
+      </w:r>
+    </w:p>
+    <w:p>
+      <w:pPr>
+        <w:spacing w:line="360" w:lineRule="auto" w:after="120"/>
+        <w:ind w:left="720" w:hanging="720"/>
+        <w:jc w:val="left"/>
+      </w:pPr>
+      <w:r>
+        <w:t xml:space="preserve">Pearce, H., Ahmad, B., Tan, B., Dolan-Gavitt, B., &amp; Karri, R. (2022). Asleep at the keyboard? Assessing the security of GitHub Copilot's code contributions. En </w:t>
+      </w:r>
+      <w:r>
+        <w:rPr>
+          <w:i/>
+        </w:rPr>
+        <w:t>2022 IEEE Symposium on Security and Privacy (SP)</w:t>
+      </w:r>
+      <w:r>
+        <w:t xml:space="preserve"> (pp. 754-768). IEEE. https://doi.org/10.1109/SP46214.2022.9833571</w:t>
       </w:r>
     </w:p>
     <w:p>
@@ -1173,6 +1315,25 @@
         <w:jc w:val="left"/>
       </w:pPr>
       <w:r>
+        <w:t xml:space="preserve">Washizaki, H. (Ed.). (2024). </w:t>
+      </w:r>
+      <w:r>
+        <w:rPr>
+          <w:i/>
+        </w:rPr>
+        <w:t>Guide to the Software Engineering Body of Knowledge (SWEBOK Guide), Version 4.0</w:t>
+      </w:r>
+      <w:r>
+        <w:t>. IEEE Computer Society. https://www.computer.org/education/bodies-of-knowledge/software-engineering</w:t>
+      </w:r>
+    </w:p>
+    <w:p>
+      <w:pPr>
+        <w:spacing w:line="360" w:lineRule="auto" w:after="120"/>
+        <w:ind w:left="720" w:hanging="720"/>
+        <w:jc w:val="left"/>
+      </w:pPr>
+      <w:r>
         <w:t xml:space="preserve">Welsh, M. (2023). The end of programming. </w:t>
       </w:r>
       <w:r>
@@ -1183,6 +1344,25 @@
       </w:r>
       <w:r>
         <w:t>(1), 34-35. https://doi.org/10.1145/3570220</w:t>
+      </w:r>
+    </w:p>
+    <w:p>
+      <w:pPr>
+        <w:spacing w:line="360" w:lineRule="auto" w:after="120"/>
+        <w:ind w:left="720" w:hanging="720"/>
+        <w:jc w:val="left"/>
+      </w:pPr>
+      <w:r>
+        <w:t xml:space="preserve">World Economic Forum. (2025). </w:t>
+      </w:r>
+      <w:r>
+        <w:rPr>
+          <w:i/>
+        </w:rPr>
+        <w:t>The future of jobs report 2025</w:t>
+      </w:r>
+      <w:r>
+        <w:t>. https://www.weforum.org/publications/the-future-of-jobs-report-2025/</w:t>
       </w:r>
     </w:p>
     <w:p>

</xml_diff>

<commit_message>
Agregar 6 figuras profesionales al paper y embeberlas en el .docx
- build_figures.py genera 6 figuras (PNG 300 dpi) con datos verificados:
  (1) SWE-bench 2024→2025, (2) productividad lab vs. real (Copilot vs METR),
  (3) seguridad del código de IA, (4) transformers en la jerarquía de Chomsky,
  (5) divergencia del empleo (BLS/Stanford), (6) empleo a 2030 (WEF).
- Figuras integradas en las secciones III, IV y V con pies de figura y fuente.
- build_docx.py ahora embebe imágenes centradas con caption y agrega numeración
  de página (sin número en la portada).
- Prosa del cuerpo: ~2.992 palabras (los pies de figura no cuentan al límite).
</commit_message>
<xml_diff>
--- a/Paper_Rol_del_ingeniero_informatico_en_10_anios.docx
+++ b/Paper_Rol_del_ingeniero_informatico_en_10_anios.docx
@@ -300,6 +300,76 @@
     </w:p>
     <w:p>
       <w:pPr>
+        <w:spacing w:before="160"/>
+        <w:jc w:val="center"/>
+      </w:pPr>
+      <w:r>
+        <w:drawing>
+          <wp:inline xmlns:a="http://schemas.openxmlformats.org/drawingml/2006/main" xmlns:pic="http://schemas.openxmlformats.org/drawingml/2006/picture">
+            <wp:extent cx="5394960" cy="2967228"/>
+            <wp:docPr id="1" name="Picture 1"/>
+            <wp:cNvGraphicFramePr>
+              <a:graphicFrameLocks noChangeAspect="1"/>
+            </wp:cNvGraphicFramePr>
+            <a:graphic>
+              <a:graphicData uri="http://schemas.openxmlformats.org/drawingml/2006/picture">
+                <pic:pic>
+                  <pic:nvPicPr>
+                    <pic:cNvPr id="0" name="fig1_swebench.png"/>
+                    <pic:cNvPicPr/>
+                  </pic:nvPicPr>
+                  <pic:blipFill>
+                    <a:blip r:embed="rId9"/>
+                    <a:stretch>
+                      <a:fillRect/>
+                    </a:stretch>
+                  </pic:blipFill>
+                  <pic:spPr>
+                    <a:xfrm>
+                      <a:off x="0" y="0"/>
+                      <a:ext cx="5394960" cy="2967228"/>
+                    </a:xfrm>
+                    <a:prstGeom prst="rect"/>
+                  </pic:spPr>
+                </pic:pic>
+              </a:graphicData>
+            </a:graphic>
+          </wp:inline>
+        </w:drawing>
+      </w:r>
+    </w:p>
+    <w:p>
+      <w:pPr>
+        <w:spacing w:after="240"/>
+        <w:jc w:val="center"/>
+      </w:pPr>
+      <w:r>
+        <w:rPr>
+          <w:i/>
+          <w:color w:val="404040"/>
+          <w:sz w:val="19"/>
+        </w:rPr>
+        <w:t xml:space="preserve">Figura 1. La capacidad de la IA para resolver </w:t>
+      </w:r>
+      <w:r>
+        <w:rPr>
+          <w:i/>
+          <w:color w:val="404040"/>
+          <w:sz w:val="19"/>
+        </w:rPr>
+        <w:t>issues</w:t>
+      </w:r>
+      <w:r>
+        <w:rPr>
+          <w:i/>
+          <w:color w:val="404040"/>
+          <w:sz w:val="19"/>
+        </w:rPr>
+        <w:t xml:space="preserve"> reales de software pasó de ~14 % (inicios de 2024) a ~77 % (2025) en SWE-bench. Fuente: elaboración propia a partir de Anthropic (2025) y datos públicos de SWE-bench.</w:t>
+      </w:r>
+    </w:p>
+    <w:p>
+      <w:pPr>
         <w:spacing w:line="360" w:lineRule="auto" w:after="120"/>
         <w:ind w:firstLine="576"/>
         <w:jc w:val="both"/>
@@ -337,6 +407,60 @@
     </w:p>
     <w:p>
       <w:pPr>
+        <w:spacing w:before="160"/>
+        <w:jc w:val="center"/>
+      </w:pPr>
+      <w:r>
+        <w:drawing>
+          <wp:inline xmlns:a="http://schemas.openxmlformats.org/drawingml/2006/main" xmlns:pic="http://schemas.openxmlformats.org/drawingml/2006/picture">
+            <wp:extent cx="5394960" cy="3545259"/>
+            <wp:docPr id="2" name="Picture 2"/>
+            <wp:cNvGraphicFramePr>
+              <a:graphicFrameLocks noChangeAspect="1"/>
+            </wp:cNvGraphicFramePr>
+            <a:graphic>
+              <a:graphicData uri="http://schemas.openxmlformats.org/drawingml/2006/picture">
+                <pic:pic>
+                  <pic:nvPicPr>
+                    <pic:cNvPr id="0" name="fig2_productividad.png"/>
+                    <pic:cNvPicPr/>
+                  </pic:nvPicPr>
+                  <pic:blipFill>
+                    <a:blip r:embed="rId10"/>
+                    <a:stretch>
+                      <a:fillRect/>
+                    </a:stretch>
+                  </pic:blipFill>
+                  <pic:spPr>
+                    <a:xfrm>
+                      <a:off x="0" y="0"/>
+                      <a:ext cx="5394960" cy="3545259"/>
+                    </a:xfrm>
+                    <a:prstGeom prst="rect"/>
+                  </pic:spPr>
+                </pic:pic>
+              </a:graphicData>
+            </a:graphic>
+          </wp:inline>
+        </w:drawing>
+      </w:r>
+    </w:p>
+    <w:p>
+      <w:pPr>
+        <w:spacing w:after="240"/>
+        <w:jc w:val="center"/>
+      </w:pPr>
+      <w:r>
+        <w:rPr>
+          <w:i/>
+          <w:color w:val="404040"/>
+          <w:sz w:val="19"/>
+        </w:rPr>
+        <w:t>Figura 2. La misma tecnología acelera o frena según el contexto: +55,8 % en una tarea acotada (Peng et al., 2023) frente a −19 % en desarrolladores expertos sobre repositorios propios maduros (METR, 2025).</w:t>
+      </w:r>
+    </w:p>
+    <w:p>
+      <w:pPr>
         <w:spacing w:line="360" w:lineRule="auto" w:after="120"/>
         <w:ind w:firstLine="576"/>
         <w:jc w:val="both"/>
@@ -361,6 +485,60 @@
       </w:r>
       <w:r>
         <w:t xml:space="preserve"> en su seguridad —una peligrosa falsa sensación de confianza (Perry et al., 2023). Las evaluaciones de corrección apuntan en el mismo sentido: al endurecer los conjuntos de prueba, la tasa de acierto del código generado cae hasta un 20-30 % (Liu et al., 2023), y cerca del 40 % de las sugerencias de Copilot en escenarios de seguridad incluyen vulnerabilidades conocidas (Pearce et al., 2022). La IA, en suma, acelera la producción pero no garantiza la corrección: traslada el cuello de botella desde la escritura del código hacia su verificación.</w:t>
+      </w:r>
+    </w:p>
+    <w:p>
+      <w:pPr>
+        <w:spacing w:before="160"/>
+        <w:jc w:val="center"/>
+      </w:pPr>
+      <w:r>
+        <w:drawing>
+          <wp:inline xmlns:a="http://schemas.openxmlformats.org/drawingml/2006/main" xmlns:pic="http://schemas.openxmlformats.org/drawingml/2006/picture">
+            <wp:extent cx="5394960" cy="3194384"/>
+            <wp:docPr id="3" name="Picture 3"/>
+            <wp:cNvGraphicFramePr>
+              <a:graphicFrameLocks noChangeAspect="1"/>
+            </wp:cNvGraphicFramePr>
+            <a:graphic>
+              <a:graphicData uri="http://schemas.openxmlformats.org/drawingml/2006/picture">
+                <pic:pic>
+                  <pic:nvPicPr>
+                    <pic:cNvPr id="0" name="fig6_seguridad.png"/>
+                    <pic:cNvPicPr/>
+                  </pic:nvPicPr>
+                  <pic:blipFill>
+                    <a:blip r:embed="rId11"/>
+                    <a:stretch>
+                      <a:fillRect/>
+                    </a:stretch>
+                  </pic:blipFill>
+                  <pic:spPr>
+                    <a:xfrm>
+                      <a:off x="0" y="0"/>
+                      <a:ext cx="5394960" cy="3194384"/>
+                    </a:xfrm>
+                    <a:prstGeom prst="rect"/>
+                  </pic:spPr>
+                </pic:pic>
+              </a:graphicData>
+            </a:graphic>
+          </wp:inline>
+        </w:drawing>
+      </w:r>
+    </w:p>
+    <w:p>
+      <w:pPr>
+        <w:spacing w:after="240"/>
+        <w:jc w:val="center"/>
+      </w:pPr>
+      <w:r>
+        <w:rPr>
+          <w:i/>
+          <w:color w:val="404040"/>
+          <w:sz w:val="19"/>
+        </w:rPr>
+        <w:t>Figura 3. La IA traslada el cuello de botella hacia la verificación humana: proporción de salidas con vulnerabilidades o paquetes inexistentes. Fuente: Pearce et al. (2022); Veracode (2025); Spracklen et al. (2025).</w:t>
       </w:r>
     </w:p>
     <w:p>
@@ -470,6 +648,60 @@
       </w:r>
       <w:r>
         <w:t xml:space="preserve"> —la arquitectura de los LLM— están acotados por la jerarquía de Chomsky (no generalizan a lenguajes que exceden su nivel) y que, bajo supuestos realistas de precisión, pertenecen a la clase de complejidad TC⁰, incapaz de reconocer gramáticas libres de contexto arbitrarias (Delétang et al., 2023; Merrill y Sabharwal, 2023). La teoría de lenguajes formales y la complejidad describen, así, los límites concretos de la IA que el ingeniero debe conocer.</w:t>
+      </w:r>
+    </w:p>
+    <w:p>
+      <w:pPr>
+        <w:spacing w:before="160"/>
+        <w:jc w:val="center"/>
+      </w:pPr>
+      <w:r>
+        <w:drawing>
+          <wp:inline xmlns:a="http://schemas.openxmlformats.org/drawingml/2006/main" xmlns:pic="http://schemas.openxmlformats.org/drawingml/2006/picture">
+            <wp:extent cx="5394960" cy="3641598"/>
+            <wp:docPr id="4" name="Picture 4"/>
+            <wp:cNvGraphicFramePr>
+              <a:graphicFrameLocks noChangeAspect="1"/>
+            </wp:cNvGraphicFramePr>
+            <a:graphic>
+              <a:graphicData uri="http://schemas.openxmlformats.org/drawingml/2006/picture">
+                <pic:pic>
+                  <pic:nvPicPr>
+                    <pic:cNvPr id="0" name="fig3_chomsky.png"/>
+                    <pic:cNvPicPr/>
+                  </pic:nvPicPr>
+                  <pic:blipFill>
+                    <a:blip r:embed="rId12"/>
+                    <a:stretch>
+                      <a:fillRect/>
+                    </a:stretch>
+                  </pic:blipFill>
+                  <pic:spPr>
+                    <a:xfrm>
+                      <a:off x="0" y="0"/>
+                      <a:ext cx="5394960" cy="3641598"/>
+                    </a:xfrm>
+                    <a:prstGeom prst="rect"/>
+                  </pic:spPr>
+                </pic:pic>
+              </a:graphicData>
+            </a:graphic>
+          </wp:inline>
+        </w:drawing>
+      </w:r>
+    </w:p>
+    <w:p>
+      <w:pPr>
+        <w:spacing w:after="240"/>
+        <w:jc w:val="center"/>
+      </w:pPr>
+      <w:r>
+        <w:rPr>
+          <w:i/>
+          <w:color w:val="404040"/>
+          <w:sz w:val="19"/>
+        </w:rPr>
+        <w:t>Figura 4. Los transformers, situados dentro de la jerarquía de Chomsky: con precisión realista equivalen a la clase de complejidad TC⁰. Fuente: elaboración propia a partir de Chomsky (1956), Delétang et al. (2023) y Merrill y Sabharwal (2023).</w:t>
       </w:r>
     </w:p>
     <w:p>
@@ -607,6 +839,114 @@
       </w:pPr>
       <w:r>
         <w:t>Los datos del mercado laboral, sin embargo, advierten que la transición no será indolora ni uniforme. La Oficina de Estadísticas Laborales de EE. UU. proyecta un crecimiento del empleo de "desarrolladores de software" cercano al 15 % entre 2024 y 2034 —muy por encima del promedio—, mientras la categoría más estrecha de "programadores" se contraería un 6 % por la automatización (Bureau of Labor Statistics, 2025): se automatiza la tarea de codificar, no la de diseñar y decidir. A la vez, un estudio de Stanford halló caídas de empleo del 13-16 % en los trabajadores de carrera temprana (22-25 años) de las ocupaciones más expuestas a la IA —entre ellas el desarrollo de software—, mientras los de mayor experiencia se mantenían estables (Brynjolfsson et al., 2025). La "puerta de entrada" junior se estrecha y la demanda se desplaza hacia perfiles con criterio: las competencias del nuevo rol.</w:t>
+      </w:r>
+    </w:p>
+    <w:p>
+      <w:pPr>
+        <w:spacing w:before="160"/>
+        <w:jc w:val="center"/>
+      </w:pPr>
+      <w:r>
+        <w:drawing>
+          <wp:inline xmlns:a="http://schemas.openxmlformats.org/drawingml/2006/main" xmlns:pic="http://schemas.openxmlformats.org/drawingml/2006/picture">
+            <wp:extent cx="5394960" cy="3353624"/>
+            <wp:docPr id="5" name="Picture 5"/>
+            <wp:cNvGraphicFramePr>
+              <a:graphicFrameLocks noChangeAspect="1"/>
+            </wp:cNvGraphicFramePr>
+            <a:graphic>
+              <a:graphicData uri="http://schemas.openxmlformats.org/drawingml/2006/picture">
+                <pic:pic>
+                  <pic:nvPicPr>
+                    <pic:cNvPr id="0" name="fig4_empleo.png"/>
+                    <pic:cNvPicPr/>
+                  </pic:nvPicPr>
+                  <pic:blipFill>
+                    <a:blip r:embed="rId13"/>
+                    <a:stretch>
+                      <a:fillRect/>
+                    </a:stretch>
+                  </pic:blipFill>
+                  <pic:spPr>
+                    <a:xfrm>
+                      <a:off x="0" y="0"/>
+                      <a:ext cx="5394960" cy="3353624"/>
+                    </a:xfrm>
+                    <a:prstGeom prst="rect"/>
+                  </pic:spPr>
+                </pic:pic>
+              </a:graphicData>
+            </a:graphic>
+          </wp:inline>
+        </w:drawing>
+      </w:r>
+    </w:p>
+    <w:p>
+      <w:pPr>
+        <w:spacing w:after="240"/>
+        <w:jc w:val="center"/>
+      </w:pPr>
+      <w:r>
+        <w:rPr>
+          <w:i/>
+          <w:color w:val="404040"/>
+          <w:sz w:val="19"/>
+        </w:rPr>
+        <w:t>Figura 5. El empleo se recompone: crece "desarrollador de software" mientras se contraen "programador" y el empleo joven en ocupaciones expuestas a la IA. Fuente: Bureau of Labor Statistics (2025); Brynjolfsson et al. (2025).</w:t>
+      </w:r>
+    </w:p>
+    <w:p>
+      <w:pPr>
+        <w:spacing w:before="160"/>
+        <w:jc w:val="center"/>
+      </w:pPr>
+      <w:r>
+        <w:drawing>
+          <wp:inline xmlns:a="http://schemas.openxmlformats.org/drawingml/2006/main" xmlns:pic="http://schemas.openxmlformats.org/drawingml/2006/picture">
+            <wp:extent cx="5394960" cy="3468189"/>
+            <wp:docPr id="6" name="Picture 6"/>
+            <wp:cNvGraphicFramePr>
+              <a:graphicFrameLocks noChangeAspect="1"/>
+            </wp:cNvGraphicFramePr>
+            <a:graphic>
+              <a:graphicData uri="http://schemas.openxmlformats.org/drawingml/2006/picture">
+                <pic:pic>
+                  <pic:nvPicPr>
+                    <pic:cNvPr id="0" name="fig5_wef.png"/>
+                    <pic:cNvPicPr/>
+                  </pic:nvPicPr>
+                  <pic:blipFill>
+                    <a:blip r:embed="rId14"/>
+                    <a:stretch>
+                      <a:fillRect/>
+                    </a:stretch>
+                  </pic:blipFill>
+                  <pic:spPr>
+                    <a:xfrm>
+                      <a:off x="0" y="0"/>
+                      <a:ext cx="5394960" cy="3468189"/>
+                    </a:xfrm>
+                    <a:prstGeom prst="rect"/>
+                  </pic:spPr>
+                </pic:pic>
+              </a:graphicData>
+            </a:graphic>
+          </wp:inline>
+        </w:drawing>
+      </w:r>
+    </w:p>
+    <w:p>
+      <w:pPr>
+        <w:spacing w:after="240"/>
+        <w:jc w:val="center"/>
+      </w:pPr>
+      <w:r>
+        <w:rPr>
+          <w:i/>
+          <w:color w:val="404040"/>
+          <w:sz w:val="19"/>
+        </w:rPr>
+        <w:t>Figura 6. Proyección global a 2030: 170 millones de empleos creados, 92 millones desplazados, saldo neto +78 millones. Fuente: World Economic Forum (2025).</w:t>
       </w:r>
     </w:p>
     <w:p>
@@ -1404,13 +1744,43 @@
       </w:r>
     </w:p>
     <w:sectPr>
+      <w:footerReference w:type="first" r:id="rId15"/>
+      <w:footerReference w:type="default" r:id="rId16"/>
       <w:pgSz w:w="12240" w:h="15840"/>
       <w:pgMar w:top="1440" w:right="1800" w:bottom="1440" w:left="1800" w:header="720" w:footer="720" w:gutter="0"/>
       <w:cols w:space="720"/>
+      <w:titlePg/>
       <w:docGrid w:linePitch="360"/>
     </w:sectPr>
   </w:body>
 </w:document>
+</file>
+
+<file path=word/footer1.xml><?xml version="1.0" encoding="utf-8"?>
+<w:ftr xmlns:m="http://schemas.openxmlformats.org/officeDocument/2006/math" xmlns:mc="http://schemas.openxmlformats.org/markup-compatibility/2006" xmlns:mo="http://schemas.microsoft.com/office/mac/office/2008/main" xmlns:mv="urn:schemas-microsoft-com:mac:vml" xmlns:o="urn:schemas-microsoft-com:office:office" xmlns:r="http://schemas.openxmlformats.org/officeDocument/2006/relationships" xmlns:v="urn:schemas-microsoft-com:vml" xmlns:w10="urn:schemas-microsoft-com:office:word" xmlns:w14="http://schemas.microsoft.com/office/word/2010/wordml" xmlns:w="http://schemas.openxmlformats.org/wordprocessingml/2006/main" xmlns:wne="http://schemas.microsoft.com/office/word/2006/wordml" xmlns:wp14="http://schemas.microsoft.com/office/word/2010/wordprocessingDrawing" xmlns:wp="http://schemas.openxmlformats.org/drawingml/2006/wordprocessingDrawing" xmlns:wpc="http://schemas.microsoft.com/office/word/2010/wordprocessingCanvas" xmlns:wpg="http://schemas.microsoft.com/office/word/2010/wordprocessingGroup" xmlns:wpi="http://schemas.microsoft.com/office/word/2010/wordprocessingInk" xmlns:wps="http://schemas.microsoft.com/office/word/2010/wordprocessingShape" mc:Ignorable="w14 wp14">
+  <w:p>
+    <w:pPr>
+      <w:pStyle w:val="Footer"/>
+    </w:pPr>
+    <w:r/>
+  </w:p>
+</w:ftr>
+</file>
+
+<file path=word/footer2.xml><?xml version="1.0" encoding="utf-8"?>
+<w:ftr xmlns:m="http://schemas.openxmlformats.org/officeDocument/2006/math" xmlns:mc="http://schemas.openxmlformats.org/markup-compatibility/2006" xmlns:mo="http://schemas.microsoft.com/office/mac/office/2008/main" xmlns:mv="urn:schemas-microsoft-com:mac:vml" xmlns:o="urn:schemas-microsoft-com:office:office" xmlns:r="http://schemas.openxmlformats.org/officeDocument/2006/relationships" xmlns:v="urn:schemas-microsoft-com:vml" xmlns:w10="urn:schemas-microsoft-com:office:word" xmlns:w14="http://schemas.microsoft.com/office/word/2010/wordml" xmlns:w="http://schemas.openxmlformats.org/wordprocessingml/2006/main" xmlns:wne="http://schemas.microsoft.com/office/word/2006/wordml" xmlns:wp14="http://schemas.microsoft.com/office/word/2010/wordprocessingDrawing" xmlns:wp="http://schemas.openxmlformats.org/drawingml/2006/wordprocessingDrawing" xmlns:wpc="http://schemas.microsoft.com/office/word/2010/wordprocessingCanvas" xmlns:wpg="http://schemas.microsoft.com/office/word/2010/wordprocessingGroup" xmlns:wpi="http://schemas.microsoft.com/office/word/2010/wordprocessingInk" xmlns:wps="http://schemas.microsoft.com/office/word/2010/wordprocessingShape" mc:Ignorable="w14 wp14">
+  <w:p>
+    <w:pPr>
+      <w:pStyle w:val="Footer"/>
+      <w:jc w:val="center"/>
+    </w:pPr>
+    <w:r>
+      <w:fldChar w:fldCharType="begin"/>
+      <w:instrText xml:space="preserve"> PAGE </w:instrText>
+      <w:fldChar w:fldCharType="end"/>
+    </w:r>
+  </w:p>
+</w:ftr>
 </file>
 
 <file path=word/numbering.xml><?xml version="1.0" encoding="utf-8"?>

</xml_diff>

<commit_message>
Ampliar Sección III con más evidencia empírica sobre IA en desarrollo
- Experimento de campo del MIT (Cui et al., 2025): 4.867 devs, +26 %,
  con gradiente de seniority que reconcilia el contraste con METR
- Saturación de SWE-bench y reality-check de Devin (Husain et al., 2025)
- Encuesta Stack Overflow 2025: 84 % adopción, caída de confianza,
  45 % tarda más depurando código de IA
- Confianza/formación de juniors (Shen y Tamkin, 2026)
- Alucinación de paquetes/slopsquatting (Spracklen), Veracode 45 %,
  GitClear y DORA sobre mantenibilidad y estabilidad
- 8 referencias nuevas en APA 7 (incluye Spracklen y Veracode, que ya
  se citaban en pies de figura y faltaban en la bibliografía)
- Regenerado el .docx

Co-Authored-By: Claude Opus 4.8 <noreply@anthropic.com>
Claude-Session: https://claude.ai/code/session_01GRUp5qFeKJME8uZW1YQ6nF
</commit_message>
<xml_diff>
--- a/Paper_Rol_del_ingeniero_informatico_en_10_anios.docx
+++ b/Paper_Rol_del_ingeniero_informatico_en_10_anios.docx
@@ -295,7 +295,7 @@
         <w:t>issues</w:t>
       </w:r>
       <w:r>
-        <w:t xml:space="preserve"> reales de proyectos de software, el estado del arte pasó de resolver alrededor del 14 % de los problemas a comienzos de 2024 a más del 70 % en 2025 (Anthropic, 2025): de uno de cada siete casos a tres de cada cuatro en unos dieciocho meses. La adopción acompaña esa capacidad: GitHub Copilot superó los veinte millones de usuarios en 2025, Sundar Pichai afirmó en 2024 que la IA genera "más de una cuarta parte de todo el código nuevo en Google" y Satya Nadella la estimó en 2025 entre el 20 % y el 30 % en Microsoft (Zeff, 2025).</w:t>
+        <w:t xml:space="preserve"> reales de proyectos de software, el estado del arte pasó de resolver alrededor del 14 % de los problemas a comienzos de 2024 a más del 77 % a fines de 2025 (Anthropic, 2025): de uno de cada siete casos a más de tres de cada cuatro en menos de dos años. La adopción acompaña esa capacidad: GitHub Copilot superó los veinte millones de usuarios acumulados en 2025, Sundar Pichai afirmó en 2024 que la IA genera "más de una cuarta parte de todo el código nuevo en Google" y Satya Nadella la estimó en 2025 entre el 20 % y el 30 % en Microsoft (Zeff, 2025). La encuesta anual de Stack Overflow (2025), respondida por decenas de miles de programadores, confirma la masividad del fenómeno: el 84 % usa o planea usar herramientas de IA, frente al 76 % del año anterior.</w:t>
       </w:r>
     </w:p>
     <w:p>
@@ -375,7 +375,26 @@
         <w:jc w:val="both"/>
       </w:pPr>
       <w:r>
-        <w:t xml:space="preserve">Ahora bien, la evidencia rigurosa sobre el impacto de estas herramientas es más matizada de lo que sugiere el entusiasmo. Un experimento controlado de GitHub y Microsoft mostró que los desarrolladores que usaban Copilot completaban una tarea acotada —programar un servidor HTTP— un 55,8 % más rápido (Peng et al., 2023), y McKinsey estimó mejoras de productividad de entre el 20 % y el 45 % en la función de ingeniería de software (McKinsey &amp; Company, 2023). Sin embargo, un ensayo controlado aleatorizado independiente de METR (2025) arrojó un resultado contraintuitivo: desarrolladores </w:t>
+        <w:t xml:space="preserve">Conviene, no obstante, leer estos números con cautela, porque un benchmark no es el mundo real. El propio equipo de SWE-bench Verified advirtió que el conjunto se ha saturado y "ya no mide las capacidades de codificación de frontera", y la distancia entre el laboratorio y la práctica quedó expuesta cuando un grupo independiente puso a prueba al agente Devin —presentado en 2024 como "el primer ingeniero de software de IA"— en tareas reales: completó con éxito solo 3 de 20 (Husain et al., 2025). Resolver un </w:t>
+      </w:r>
+      <w:r>
+        <w:rPr>
+          <w:i/>
+        </w:rPr>
+        <w:t>issue</w:t>
+      </w:r>
+      <w:r>
+        <w:t xml:space="preserve"> aislado en un repositorio conocido es muy distinto de operar dentro de un sistema de producción, con su contexto, sus restricciones y sus consecuencias.</w:t>
+      </w:r>
+    </w:p>
+    <w:p>
+      <w:pPr>
+        <w:spacing w:line="360" w:lineRule="auto" w:after="120"/>
+        <w:ind w:firstLine="576"/>
+        <w:jc w:val="both"/>
+      </w:pPr>
+      <w:r>
+        <w:t xml:space="preserve">Esa misma brecha entre la capacidad demostrada y el impacto real reaparece al medir la productividad, donde la evidencia rigurosa es más matizada de lo que sugiere el entusiasmo. Un experimento controlado de GitHub y Microsoft mostró que los desarrolladores que usaban Copilot completaban una tarea acotada —programar un servidor HTTP— un 55,8 % más rápido (Peng et al., 2023); McKinsey estimó mejoras de entre el 20 % y el 45 % en la función de ingeniería de software (McKinsey &amp; Company, 2023), y un experimento de campo a gran escala con 4.867 desarrolladores de Microsoft, Accenture y una empresa del índice Fortune 100 halló un aumento del 26 % en las tareas completadas (Cui et al., 2025). Pero ese último estudio reveló un patrón decisivo: la mejora se concentraba en los programadores junior y de incorporación reciente, y casi se desvanecía entre los seniors. El contrapunto más nítido lo aportó un ensayo controlado aleatorizado independiente de METR (2025): desarrolladores </w:t>
       </w:r>
       <w:r>
         <w:rPr>
@@ -384,7 +403,7 @@
         <w:t>experimentados</w:t>
       </w:r>
       <w:r>
-        <w:t xml:space="preserve"> en sus propios repositorios maduros tardaron un 19 % </w:t>
+        <w:t xml:space="preserve"> trabajando en sus propios repositorios maduros tardaron un 19 % </w:t>
       </w:r>
       <w:r>
         <w:rPr>
@@ -402,7 +421,7 @@
         <w:t>creían</w:t>
       </w:r>
       <w:r>
-        <w:t xml:space="preserve"> haberse acelerado un 20 %. La brecha entre la productividad percibida y la real es, en sí misma, un dato relevante.</w:t>
+        <w:t xml:space="preserve"> haberse acelerado un 20 %. Lejos de contradecirse, los estudios convergen en una misma lección: la IA acelera lo rutinario y lo desconocido para quien recién empieza, pero rinde poco —o incluso estorba— en el trabajo experto sobre sistemas complejos y familiares. La brecha entre la productividad percibida y la real es, en sí misma, un dato revelador.</w:t>
       </w:r>
     </w:p>
     <w:p>
@@ -466,6 +485,25 @@
         <w:jc w:val="both"/>
       </w:pPr>
       <w:r>
+        <w:t xml:space="preserve">A esa ambivalencia se añade un efecto sobre la confianza y la formación. Según Stack Overflow (2025), la proporción de programadores que confían en la exactitud de las salidas de IA cayó a alrededor de un tercio, y el 45 % afirma que depurar código generado por IA le lleva </w:t>
+      </w:r>
+      <w:r>
+        <w:rPr>
+          <w:i/>
+        </w:rPr>
+        <w:t>más</w:t>
+      </w:r>
+      <w:r>
+        <w:t xml:space="preserve"> tiempo que escribirlo. El problema trasciende la productividad inmediata: un ensayo controlado de Anthropic con ingenieros mayormente junior observó que quienes resolvían tareas con asistencia de IA obtenían puntuaciones sensiblemente menores en una prueba posterior sin IA —sobre todo en depuración—, lo que sugiere que delegar demasiado pronto puede erosionar el aprendizaje del juicio técnico que la propia tarea de supervisión exigirá (Shen y Tamkin, 2026).</w:t>
+      </w:r>
+    </w:p>
+    <w:p>
+      <w:pPr>
+        <w:spacing w:line="360" w:lineRule="auto" w:after="120"/>
+        <w:ind w:firstLine="576"/>
+        <w:jc w:val="both"/>
+      </w:pPr>
+      <w:r>
         <w:t xml:space="preserve">A esta tensión se suman los problemas de calidad y seguridad. Addy Osmani, ingeniero de Google, describió el "problema del 70 %": la IA produce con rapidez el 70 % de una solución, pero el 30 % final —casos límite, depuración, integración con producción, mantenibilidad— sigue requiriendo el juicio de un ingeniero experimentado (Osmani, 2024). Un estudio controlado de la Universidad de Stanford halló que los programadores con acceso a un asistente de IA escribían código </w:t>
       </w:r>
       <w:r>
@@ -484,7 +522,16 @@
         <w:t>más</w:t>
       </w:r>
       <w:r>
-        <w:t xml:space="preserve"> en su seguridad —una peligrosa falsa sensación de confianza (Perry et al., 2023). Las evaluaciones de corrección apuntan en el mismo sentido: al endurecer los conjuntos de prueba, la tasa de acierto del código generado cae hasta un 20-30 % (Liu et al., 2023), y cerca del 40 % de las sugerencias de Copilot en escenarios de seguridad incluyen vulnerabilidades conocidas (Pearce et al., 2022). La IA, en suma, acelera la producción pero no garantiza la corrección: traslada el cuello de botella desde la escritura del código hacia su verificación.</w:t>
+        <w:t xml:space="preserve"> en su seguridad —una peligrosa falsa sensación de confianza (Perry et al., 2023). Las evaluaciones de corrección apuntan en el mismo sentido: al endurecer los conjuntos de prueba, la tasa de acierto del código generado cae entre 19 y 29 puntos (Liu et al., 2023), lo que revela que "pasar los tests" depende de la calidad de esos tests y no equivale a satisfacer la especificación. En materia de seguridad, cerca del 40 % de las sugerencias de Copilot en escenarios sensibles incluían vulnerabilidades conocidas (Pearce et al., 2022) y un informe de 2025 sobre más de un centenar de modelos halló que el código generado introducía una vulnerabilidad en el 45 % de los casos, sin que los modelos más nuevos resultaran más seguros (Veracode, 2025). A ello se suma un riesgo inédito: cerca del 20 % de los paquetes que los modelos recomiendan importar no existen, lo que habilita el </w:t>
+      </w:r>
+      <w:r>
+        <w:rPr>
+          <w:i/>
+        </w:rPr>
+        <w:t>slopsquatting</w:t>
+      </w:r>
+      <w:r>
+        <w:t xml:space="preserve"> —registrar esos nombres alucinados con código malicioso (Spracklen et al., 2025)—. Y en el mediano plazo asoma un costo silencioso: el análisis de millones de líneas de código real muestra que, desde la irrupción de estos asistentes, crecen la duplicación y la rotación de código mientras cae la refactorización (GitClear, 2025), y el informe DORA asoció una mayor adopción de IA con una leve caída en la estabilidad de las entregas (DORA, 2024). La IA, en suma, acelera la producción pero no garantiza la corrección: traslada el cuello de botella desde la escritura del código hacia su verificación.</w:t>
       </w:r>
     </w:p>
     <w:p>
@@ -1313,6 +1360,25 @@
         <w:jc w:val="left"/>
       </w:pPr>
       <w:r>
+        <w:t xml:space="preserve">Cui, Z. K., Demirer, M., Jaffe, S., Musolff, L., Peng, S., &amp; Salz, T. (2025). </w:t>
+      </w:r>
+      <w:r>
+        <w:rPr>
+          <w:i/>
+        </w:rPr>
+        <w:t>The effects of generative AI on high-skilled work: Evidence from three field experiments with software developers</w:t>
+      </w:r>
+      <w:r>
+        <w:t xml:space="preserve"> [Documento de trabajo]. Massachusetts Institute of Technology. https://economics.mit.edu/sites/default/files/inline-files/draft_copilot_experiments.pdf</w:t>
+      </w:r>
+    </w:p>
+    <w:p>
+      <w:pPr>
+        <w:spacing w:line="360" w:lineRule="auto" w:after="120"/>
+        <w:ind w:left="720" w:hanging="720"/>
+        <w:jc w:val="left"/>
+      </w:pPr>
+      <w:r>
         <w:t xml:space="preserve">Delétang, G., Ruoss, A., Grau-Moya, J., Genewein, T., Wenliang, L. K., Catt, E., Cundy, C., Hutter, M., Legg, S., Veness, J., &amp; Ortega, P. A. (2023). </w:t>
       </w:r>
       <w:r>
@@ -1361,6 +1427,63 @@
       </w:r>
       <w:r>
         <w:t>. The GitHub Blog. https://github.blog/news-insights/company-news/goodbye-github/</w:t>
+      </w:r>
+    </w:p>
+    <w:p>
+      <w:pPr>
+        <w:spacing w:line="360" w:lineRule="auto" w:after="120"/>
+        <w:ind w:left="720" w:hanging="720"/>
+        <w:jc w:val="left"/>
+      </w:pPr>
+      <w:r>
+        <w:t xml:space="preserve">DORA. (2024). </w:t>
+      </w:r>
+      <w:r>
+        <w:rPr>
+          <w:i/>
+        </w:rPr>
+        <w:t>Accelerate state of DevOps report 2024</w:t>
+      </w:r>
+      <w:r>
+        <w:t>. Google Cloud. https://dora.dev/research/2024/dora-report/</w:t>
+      </w:r>
+    </w:p>
+    <w:p>
+      <w:pPr>
+        <w:spacing w:line="360" w:lineRule="auto" w:after="120"/>
+        <w:ind w:left="720" w:hanging="720"/>
+        <w:jc w:val="left"/>
+      </w:pPr>
+      <w:r>
+        <w:t xml:space="preserve">GitClear. (2025). </w:t>
+      </w:r>
+      <w:r>
+        <w:rPr>
+          <w:i/>
+        </w:rPr>
+        <w:t>AI copilot code quality: 2025 research</w:t>
+      </w:r>
+      <w:r>
+        <w:t>. https://www.gitclear.com/ai_assistant_code_quality_2025_research</w:t>
+      </w:r>
+    </w:p>
+    <w:p>
+      <w:pPr>
+        <w:spacing w:line="360" w:lineRule="auto" w:after="120"/>
+        <w:ind w:left="720" w:hanging="720"/>
+        <w:jc w:val="left"/>
+      </w:pPr>
+      <w:r>
+        <w:t xml:space="preserve">Husain, H., Flath, I., &amp; Whitaker, J. (2025, 8 de enero). </w:t>
+      </w:r>
+      <w:r>
+        <w:rPr>
+          <w:i/>
+        </w:rPr>
+        <w:t>Thoughts on a month with Devin</w:t>
+      </w:r>
+      <w:r>
+        <w:t>. Answer.AI. https://www.answer.ai/posts/2025-01-08-devin.html</w:t>
       </w:r>
     </w:p>
     <w:p>
@@ -1598,6 +1721,63 @@
         <w:jc w:val="left"/>
       </w:pPr>
       <w:r>
+        <w:t xml:space="preserve">Shen, J. H., &amp; Tamkin, A. (2026). </w:t>
+      </w:r>
+      <w:r>
+        <w:rPr>
+          <w:i/>
+        </w:rPr>
+        <w:t>How AI impacts skill formation</w:t>
+      </w:r>
+      <w:r>
+        <w:t xml:space="preserve"> (arXiv:2601.20245). arXiv. https://arxiv.org/abs/2601.20245</w:t>
+      </w:r>
+    </w:p>
+    <w:p>
+      <w:pPr>
+        <w:spacing w:line="360" w:lineRule="auto" w:after="120"/>
+        <w:ind w:left="720" w:hanging="720"/>
+        <w:jc w:val="left"/>
+      </w:pPr>
+      <w:r>
+        <w:t xml:space="preserve">Spracklen, J., Wijewickrama, R., Sakib, A. H. M. N., Maiti, A., Viswanath, B., &amp; Jadliwala, M. (2025). We have a package for you! A comprehensive analysis of package hallucinations by code-generating LLMs. En </w:t>
+      </w:r>
+      <w:r>
+        <w:rPr>
+          <w:i/>
+        </w:rPr>
+        <w:t>Proceedings of the 34th USENIX Security Symposium</w:t>
+      </w:r>
+      <w:r>
+        <w:t>. USENIX Association. https://arxiv.org/abs/2406.10279</w:t>
+      </w:r>
+    </w:p>
+    <w:p>
+      <w:pPr>
+        <w:spacing w:line="360" w:lineRule="auto" w:after="120"/>
+        <w:ind w:left="720" w:hanging="720"/>
+        <w:jc w:val="left"/>
+      </w:pPr>
+      <w:r>
+        <w:t xml:space="preserve">Stack Overflow. (2025). </w:t>
+      </w:r>
+      <w:r>
+        <w:rPr>
+          <w:i/>
+        </w:rPr>
+        <w:t>2025 developer survey: AI</w:t>
+      </w:r>
+      <w:r>
+        <w:t>. https://survey.stackoverflow.co/2025/ai/</w:t>
+      </w:r>
+    </w:p>
+    <w:p>
+      <w:pPr>
+        <w:spacing w:line="360" w:lineRule="auto" w:after="120"/>
+        <w:ind w:left="720" w:hanging="720"/>
+        <w:jc w:val="left"/>
+      </w:pPr>
+      <w:r>
         <w:t xml:space="preserve">Stroustrup, B. (2025, 9 de mayo). </w:t>
       </w:r>
       <w:r>
@@ -1646,6 +1826,25 @@
       </w:r>
       <w:r>
         <w:t>(1), 230-265. https://doi.org/10.1112/plms/s2-42.1.230</w:t>
+      </w:r>
+    </w:p>
+    <w:p>
+      <w:pPr>
+        <w:spacing w:line="360" w:lineRule="auto" w:after="120"/>
+        <w:ind w:left="720" w:hanging="720"/>
+        <w:jc w:val="left"/>
+      </w:pPr>
+      <w:r>
+        <w:t xml:space="preserve">Veracode. (2025). </w:t>
+      </w:r>
+      <w:r>
+        <w:rPr>
+          <w:i/>
+        </w:rPr>
+        <w:t>2025 GenAI code security report</w:t>
+      </w:r>
+      <w:r>
+        <w:t>. https://www.veracode.com/resources/analyst-reports/2025-genai-code-security-report/</w:t>
       </w:r>
     </w:p>
     <w:p>

</xml_diff>

<commit_message>
Condensar el cuerpo a 2.991 palabras (tope de 3.000)
Recorte transversal de prosa en I, II, IV, V, VI, VII y VIII manteniendo
intactas todas las citas y la evidencia empírica añadida en la Sección III.
Regenerado el .docx.

Co-Authored-By: Claude Opus 4.8 <noreply@anthropic.com>
Claude-Session: https://claude.ai/code/session_01GRUp5qFeKJME8uZW1YQ6nF
</commit_message>
<xml_diff>
--- a/Paper_Rol_del_ingeniero_informatico_en_10_anios.docx
+++ b/Paper_Rol_del_ingeniero_informatico_en_10_anios.docx
@@ -187,7 +187,7 @@
         <w:jc w:val="both"/>
       </w:pPr>
       <w:r>
-        <w:t>Cada vez que la tecnología avanzó de forma significativa, el rol del ingeniero informático cambió con ella. Los lenguajes de alto nivel, los entornos integrados de desarrollo o la computación en la nube modificaron profundamente su trabajo diario; sin embargo, ninguna de esas revoluciones hizo desaparecer la profesión. Hoy, la inteligencia artificial generativa —y en particular los modelos grandes de lenguaje (LLM) y los agentes de codificación autónomos— plantean el desafío más radical hasta la fecha, al punto de que destacados referentes de la industria pronostican que la mayor parte del código será escrita por máquinas en pocos años.</w:t>
+        <w:t>Cada vez que la tecnología avanzó, el rol del ingeniero informático cambió con ella. Los lenguajes de alto nivel, los entornos integrados de desarrollo o la nube modificaron profundamente su trabajo diario; sin embargo, ninguna de esas revoluciones hizo desaparecer la profesión. Hoy, la inteligencia artificial generativa —en particular los modelos grandes de lenguaje (LLM) y los agentes de codificación autónomos— plantea el desafío más radical hasta la fecha, al punto de que destacados referentes de la industria pronostican que la mayor parte del código será escrita por máquinas en pocos años.</w:t>
       </w:r>
     </w:p>
     <w:p>
@@ -197,7 +197,7 @@
         <w:jc w:val="both"/>
       </w:pPr>
       <w:r>
-        <w:t>Este trabajo parte de la siguiente hipótesis: en los próximos diez años, el rol del ingeniero informático dejará de estar centrado principalmente en la ejecución técnica y pasará a enfocarse en la toma de decisiones, la integración de tecnologías y la supervisión crítica de sistemas automatizados. El ingeniero no será reemplazado, sino que se volverá menos operativo y más estratégico, con mayor responsabilidad en diseñar, validar y controlar sistemas complejos.</w:t>
+        <w:t>Este trabajo parte de la siguiente hipótesis: en los próximos diez años, el rol del ingeniero dejará de centrarse en la ejecución técnica para enfocarse en la toma de decisiones, la integración de tecnologías y la supervisión crítica de sistemas automatizados. No será reemplazado, sino que se volverá menos operativo y más estratégico, con mayor responsabilidad en diseñar, validar y controlar sistemas complejos.</w:t>
       </w:r>
     </w:p>
     <w:p>
@@ -207,7 +207,7 @@
         <w:jc w:val="both"/>
       </w:pPr>
       <w:r>
-        <w:t xml:space="preserve">Para sostenerla se recorre la historia de la profesión como sucesión de abstracciones (II), el estado actual de la IA en el desarrollo de software (III) y el marco teórico de la materia —los límites computacionales que explican </w:t>
+        <w:t xml:space="preserve">Para sostenerla se recorre la historia de la profesión como sucesión de abstracciones (II), el estado actual de la IA (III) y el marco teórico de la materia —los límites computacionales que explican </w:t>
       </w:r>
       <w:r>
         <w:rPr>
@@ -216,7 +216,7 @@
         <w:t>por qué</w:t>
       </w:r>
       <w:r>
-        <w:t xml:space="preserve"> persiste un rol humano (IV)—, para luego caracterizar el nuevo rol, las visiones de expertos y las limitaciones (V a VII). Por ser una proyección a futuro, la conclusión es una estimación fundada.</w:t>
+        <w:t xml:space="preserve"> persiste un rol humano (IV)—, antes de caracterizar el nuevo rol, las visiones de expertos y las limitaciones (V a VII).</w:t>
       </w:r>
     </w:p>
     <w:p>
@@ -241,7 +241,7 @@
         <w:jc w:val="both"/>
       </w:pPr>
       <w:r>
-        <w:t>La historia del software puede leerse como el ascenso por una "escalera de abstracción" en la que cada peldaño automatizó el trabajo del peldaño anterior y, lejos de suprimir al ingeniero, lo elevó a un nivel conceptual superior. En los años cuarenta y cincuenta, programar significaba escribir código máquina y, más tarde, lenguaje ensamblador; el propio ensamblador fue la primera herramienta que automatizó la traducción de mnemónicos a instrucciones binarias. El salto decisivo llegó con los lenguajes de alto nivel: FORTRAN, diseñado por John Backus en IBM y distribuido desde 1957, permitió expresar algoritmos en notación matemática y delegó en un compilador la generación del código de bajo nivel; COBOL, inspirado en el trabajo de Grace Hopper, hizo lo propio para el ámbito de los negocios.</w:t>
+        <w:t>La historia del software puede leerse como el ascenso por una "escalera de abstracción" en la que cada peldaño automatizó el trabajo del anterior y, lejos de suprimir al ingeniero, lo elevó a un nivel conceptual superior. En los años cuarenta y cincuenta, programar era escribir código máquina y luego ensamblador. El salto decisivo llegó con los lenguajes de alto nivel: FORTRAN (Backus, IBM, 1957) permitió expresar algoritmos en notación matemática y delegó en un compilador la generación del código de bajo nivel; COBOL, inspirado en Grace Hopper, hizo lo propio para los negocios.</w:t>
       </w:r>
     </w:p>
     <w:p>
@@ -251,7 +251,7 @@
         <w:jc w:val="both"/>
       </w:pPr>
       <w:r>
-        <w:t>Paradójicamente, esta creciente potencia trajo aparejada una crisis. En la célebre Conferencia de Ingeniería de Software de la OTAN, celebrada en Garmisch en octubre de 1968, los asistentes acuñaron la expresión "crisis del software" para describir la incapacidad de los programadores de gestionar la complejidad de sistemas cada vez más grandes (Naur y Randell, 1969). Como sintetizaría Edsger Dijkstra en su conferencia Turing de 1972, "mientras no había máquinas, programar no era ningún problema; (…) ahora que tenemos computadoras gigantescas, programar se ha convertido en un problema igualmente gigantesco" (Dijkstra, 1972). La respuesta a esa crisis no fue menos ingeniería, sino más: nacieron la programación estructurada, las metodologías y la disciplina misma de la ingeniería de software.</w:t>
+        <w:t>Paradójicamente, esa creciente potencia trajo aparejada una crisis. En la Conferencia de Ingeniería de Software de la OTAN (Garmisch, octubre de 1968) se acuñó la expresión "crisis del software" para describir la incapacidad de gestionar la complejidad de sistemas cada vez más grandes (Naur y Randell, 1969). Como sintetizó Dijkstra en 1972, "mientras no había máquinas, programar no era ningún problema; (…) ahora que tenemos computadoras gigantescas, programar se ha convertido en un problema igualmente gigantesco" (Dijkstra, 1972). La respuesta no fue menos ingeniería, sino más: nacieron la programación estructurada, las metodologías y la disciplina misma de la ingeniería de software.</w:t>
       </w:r>
     </w:p>
     <w:p>
@@ -261,7 +261,7 @@
         <w:jc w:val="both"/>
       </w:pPr>
       <w:r>
-        <w:t>Los peldaños siguientes confirman el patrón. Los entornos integrados de desarrollo comprimieron el ciclo de edición, compilación y prueba; el software libre, Git (2005) y Stack Overflow (2008) compartieron el conocimiento; la nube (Amazon Web Services, 2006) abstrajo la infraestructura física y la cultura DevOps (2009) automatizó el despliegue. En 2021, GitHub Copilot introdujo el primer "programador en par" basado en IA. En todos los casos la herramienta automatizó lo más rutinario, pero el ingeniero permaneció: ascendió de la gestión de registros al diseño de arquitecturas distribuidas. La IA generativa es el peldaño más alto de una escalera muy larga. Y el anuncio de la desaparición del programador no es nuevo: ya se proclamó con COBOL, con los lenguajes de cuarta generación y con las plataformas "sin código", y cada vez la profesión creció en lugar de extinguirse; la tesis del "fin de la programación" (Welsh, 2023) es la más reciente de una larga serie de profecías incumplidas.</w:t>
+        <w:t>Los peldaños siguientes confirman el patrón: los entornos integrados de desarrollo comprimieron el ciclo de edición, compilación y prueba; Git (2005) y Stack Overflow (2008) compartieron el conocimiento; la nube (Amazon Web Services, 2006) abstrajo la infraestructura y DevOps (2009) automatizó el despliegue; y en 2021 GitHub Copilot introdujo el primer "programador en par" basado en IA. En cada caso la herramienta automatizó lo rutinario, pero el ingeniero permaneció y ascendió hacia el diseño de arquitecturas distribuidas. El anuncio de la desaparición del programador tampoco es nuevo: ya se proclamó con COBOL, con los lenguajes de cuarta generación y con el "sin código", y cada vez la profesión creció; la tesis del "fin de la programación" (Welsh, 2023) es la más reciente de una larga serie de profecías incumplidas.</w:t>
       </w:r>
     </w:p>
     <w:p>
@@ -286,7 +286,7 @@
         <w:jc w:val="both"/>
       </w:pPr>
       <w:r>
-        <w:t xml:space="preserve">El ritmo del cambio reciente es difícil de exagerar. En el benchmark SWE-bench Verified, que mide la capacidad de los sistemas de IA para resolver </w:t>
+        <w:t xml:space="preserve">El ritmo del cambio reciente es difícil de exagerar. En el benchmark SWE-bench Verified, que mide la capacidad de la IA para resolver </w:t>
       </w:r>
       <w:r>
         <w:rPr>
@@ -295,7 +295,7 @@
         <w:t>issues</w:t>
       </w:r>
       <w:r>
-        <w:t xml:space="preserve"> reales de proyectos de software, el estado del arte pasó de resolver alrededor del 14 % de los problemas a comienzos de 2024 a más del 77 % a fines de 2025 (Anthropic, 2025): de uno de cada siete casos a más de tres de cada cuatro en menos de dos años. La adopción acompaña esa capacidad: GitHub Copilot superó los veinte millones de usuarios acumulados en 2025, Sundar Pichai afirmó en 2024 que la IA genera "más de una cuarta parte de todo el código nuevo en Google" y Satya Nadella la estimó en 2025 entre el 20 % y el 30 % en Microsoft (Zeff, 2025). La encuesta anual de Stack Overflow (2025), respondida por decenas de miles de programadores, confirma la masividad del fenómeno: el 84 % usa o planea usar herramientas de IA, frente al 76 % del año anterior.</w:t>
+        <w:t xml:space="preserve"> reales de software, el estado del arte pasó de alrededor del 14 % a comienzos de 2024 a más del 77 % a fines de 2025 (Anthropic, 2025): de uno de cada siete casos a más de tres de cada cuatro en menos de dos años. La adopción acompaña: GitHub Copilot superó los veinte millones de usuarios acumulados en 2025, Sundar Pichai afirmó en 2024 que la IA genera "más de una cuarta parte de todo el código nuevo en Google" y Satya Nadella la estimó en 2025 entre el 20 % y el 30 % en Microsoft (Zeff, 2025). La encuesta de Stack Overflow (2025) confirma la masividad: el 84 % usa o planea usar IA, frente al 76 % del año anterior.</w:t>
       </w:r>
     </w:p>
     <w:p>
@@ -394,7 +394,7 @@
         <w:jc w:val="both"/>
       </w:pPr>
       <w:r>
-        <w:t xml:space="preserve">Esa misma brecha entre la capacidad demostrada y el impacto real reaparece al medir la productividad, donde la evidencia rigurosa es más matizada de lo que sugiere el entusiasmo. Un experimento controlado de GitHub y Microsoft mostró que los desarrolladores que usaban Copilot completaban una tarea acotada —programar un servidor HTTP— un 55,8 % más rápido (Peng et al., 2023); McKinsey estimó mejoras de entre el 20 % y el 45 % en la función de ingeniería de software (McKinsey &amp; Company, 2023), y un experimento de campo a gran escala con 4.867 desarrolladores de Microsoft, Accenture y una empresa del índice Fortune 100 halló un aumento del 26 % en las tareas completadas (Cui et al., 2025). Pero ese último estudio reveló un patrón decisivo: la mejora se concentraba en los programadores junior y de incorporación reciente, y casi se desvanecía entre los seniors. El contrapunto más nítido lo aportó un ensayo controlado aleatorizado independiente de METR (2025): desarrolladores </w:t>
+        <w:t xml:space="preserve">Esa misma brecha reaparece al medir la productividad, donde la evidencia es más matizada de lo que sugiere el entusiasmo. Un experimento controlado de GitHub y Microsoft mostró que quienes usaban Copilot completaban una tarea acotada —programar un servidor HTTP— un 55,8 % más rápido (Peng et al., 2023); McKinsey estimó mejoras de entre el 20 % y el 45 % (McKinsey &amp; Company, 2023), y un experimento de campo con 4.867 desarrolladores de Microsoft, Accenture y una empresa Fortune 100 halló un aumento del 26 % en las tareas completadas (Cui et al., 2025). Pero ese último reveló un patrón decisivo: la mejora se concentraba en los programadores junior y casi se desvanecía entre los seniors. El contrapunto más nítido lo aportó un ensayo aleatorizado independiente de METR (2025): desarrolladores </w:t>
       </w:r>
       <w:r>
         <w:rPr>
@@ -403,7 +403,7 @@
         <w:t>experimentados</w:t>
       </w:r>
       <w:r>
-        <w:t xml:space="preserve"> trabajando en sus propios repositorios maduros tardaron un 19 % </w:t>
+        <w:t xml:space="preserve"> en sus propios repositorios maduros tardaron un 19 % </w:t>
       </w:r>
       <w:r>
         <w:rPr>
@@ -412,7 +412,7 @@
         <w:t>más</w:t>
       </w:r>
       <w:r>
-        <w:t xml:space="preserve"> con herramientas de IA, pese a que </w:t>
+        <w:t xml:space="preserve"> con IA, pese a que </w:t>
       </w:r>
       <w:r>
         <w:rPr>
@@ -421,7 +421,7 @@
         <w:t>creían</w:t>
       </w:r>
       <w:r>
-        <w:t xml:space="preserve"> haberse acelerado un 20 %. Lejos de contradecirse, los estudios convergen en una misma lección: la IA acelera lo rutinario y lo desconocido para quien recién empieza, pero rinde poco —o incluso estorba— en el trabajo experto sobre sistemas complejos y familiares. La brecha entre la productividad percibida y la real es, en sí misma, un dato revelador.</w:t>
+        <w:t xml:space="preserve"> haberse acelerado un 20 %. Lejos de contradecirse, los estudios convergen en una lección: la IA acelera lo rutinario y lo desconocido para quien empieza, pero rinde poco —o estorba— en el trabajo experto sobre sistemas complejos y familiares. La brecha entre productividad percibida y real es, en sí misma, reveladora.</w:t>
       </w:r>
     </w:p>
     <w:p>
@@ -504,7 +504,7 @@
         <w:jc w:val="both"/>
       </w:pPr>
       <w:r>
-        <w:t xml:space="preserve">A esta tensión se suman los problemas de calidad y seguridad. Addy Osmani, ingeniero de Google, describió el "problema del 70 %": la IA produce con rapidez el 70 % de una solución, pero el 30 % final —casos límite, depuración, integración con producción, mantenibilidad— sigue requiriendo el juicio de un ingeniero experimentado (Osmani, 2024). Un estudio controlado de la Universidad de Stanford halló que los programadores con acceso a un asistente de IA escribían código </w:t>
+        <w:t xml:space="preserve">A esta tensión se suman la calidad y la seguridad. Addy Osmani, ingeniero de Google, describió el "problema del 70 %": la IA produce con rapidez el 70 % de una solución, pero el 30 % final —casos límite, depuración, integración con producción, mantenibilidad— sigue exigiendo el juicio de un ingeniero experimentado (Osmani, 2024). Un estudio de Stanford halló que los programadores con un asistente de IA escribían código </w:t>
       </w:r>
       <w:r>
         <w:rPr>
@@ -522,7 +522,7 @@
         <w:t>más</w:t>
       </w:r>
       <w:r>
-        <w:t xml:space="preserve"> en su seguridad —una peligrosa falsa sensación de confianza (Perry et al., 2023). Las evaluaciones de corrección apuntan en el mismo sentido: al endurecer los conjuntos de prueba, la tasa de acierto del código generado cae entre 19 y 29 puntos (Liu et al., 2023), lo que revela que "pasar los tests" depende de la calidad de esos tests y no equivale a satisfacer la especificación. En materia de seguridad, cerca del 40 % de las sugerencias de Copilot en escenarios sensibles incluían vulnerabilidades conocidas (Pearce et al., 2022) y un informe de 2025 sobre más de un centenar de modelos halló que el código generado introducía una vulnerabilidad en el 45 % de los casos, sin que los modelos más nuevos resultaran más seguros (Veracode, 2025). A ello se suma un riesgo inédito: cerca del 20 % de los paquetes que los modelos recomiendan importar no existen, lo que habilita el </w:t>
+        <w:t xml:space="preserve"> en su seguridad —una peligrosa falsa confianza (Perry et al., 2023)—. Las evaluaciones de corrección apuntan en el mismo sentido: al endurecer los tests, la tasa de acierto cae entre 19 y 29 puntos (Liu et al., 2023), lo que revela que "pasar los tests" no equivale a satisfacer la especificación. En seguridad, cerca del 40 % de las sugerencias de Copilot en escenarios sensibles incluían vulnerabilidades conocidas (Pearce et al., 2022) y un informe de 2025 sobre más de un centenar de modelos halló que el código generado introducía una vulnerabilidad en el 45 % de los casos, sin que los más nuevos fueran más seguros (Veracode, 2025). Se suma un riesgo inédito: cerca del 20 % de los paquetes que los modelos recomiendan importar no existen, lo que habilita el </w:t>
       </w:r>
       <w:r>
         <w:rPr>
@@ -531,7 +531,7 @@
         <w:t>slopsquatting</w:t>
       </w:r>
       <w:r>
-        <w:t xml:space="preserve"> —registrar esos nombres alucinados con código malicioso (Spracklen et al., 2025)—. Y en el mediano plazo asoma un costo silencioso: el análisis de millones de líneas de código real muestra que, desde la irrupción de estos asistentes, crecen la duplicación y la rotación de código mientras cae la refactorización (GitClear, 2025), y el informe DORA asoció una mayor adopción de IA con una leve caída en la estabilidad de las entregas (DORA, 2024). La IA, en suma, acelera la producción pero no garantiza la corrección: traslada el cuello de botella desde la escritura del código hacia su verificación.</w:t>
+        <w:t xml:space="preserve"> —registrarlos con código malicioso (Spracklen et al., 2025)—. Y a mediano plazo asoma un costo silencioso: el análisis de millones de líneas reales muestra que, desde estos asistentes, crecen la duplicación y la rotación de código mientras cae la refactorización (GitClear, 2025), y DORA asoció una mayor adopción de IA con una leve caída en la estabilidad de las entregas (DORA, 2024). La IA, en suma, acelera la producción pero no garantiza la corrección: traslada el cuello de botella desde la escritura del código hacia su verificación.</w:t>
       </w:r>
     </w:p>
     <w:p>
@@ -610,7 +610,7 @@
         <w:jc w:val="both"/>
       </w:pPr>
       <w:r>
-        <w:t>¿Por qué, pese a estos avances, es razonable sostener que el ingeniero no desaparecerá? La respuesta más profunda no proviene de la economía ni de la sociología, sino de la propia teoría de la computación. Existen barreras matemáticas, demostradas y permanentes, que ninguna IA —que es, en última instancia, un proceso computable— puede sortear.</w:t>
+        <w:t>¿Por qué, pese a estos avances, el ingeniero no desaparecerá? La respuesta más profunda no proviene de la economía ni de la sociología, sino de la teoría de la computación: existen barreras matemáticas, demostradas y permanentes, que ninguna IA —en última instancia, un proceso computable— puede sortear.</w:t>
       </w:r>
     </w:p>
     <w:p>
@@ -629,16 +629,7 @@
         <w:t>indecidibilidad</w:t>
       </w:r>
       <w:r>
-        <w:t>. En 1936, Alan Turing demostró que el problema de la detención (</w:t>
-      </w:r>
-      <w:r>
-        <w:rPr>
-          <w:i/>
-        </w:rPr>
-        <w:t>halting problem</w:t>
-      </w:r>
-      <w:r>
-        <w:t xml:space="preserve">) es indecidible: no existe ningún algoritmo que, dado un programa y una entrada arbitrarios, determine en todos los casos si ese programa terminará o se ejecutará indefinidamente (Turing, 1936). El teorema de Rice (1953) generaliza este resultado de forma devastadora para la automatización total: </w:t>
+        <w:t xml:space="preserve">. En 1936, Turing demostró que el problema de la detención es indecidible: ningún algoritmo puede determinar, para todo programa y entrada, si ese programa terminará o correrá indefinidamente (Turing, 1936). El teorema de Rice (1953) lo generaliza: </w:t>
       </w:r>
       <w:r>
         <w:rPr>
@@ -647,7 +638,7 @@
         <w:t>toda</w:t>
       </w:r>
       <w:r>
-        <w:t xml:space="preserve"> propiedad semántica no trivial de los programas —es decir, toda afirmación sobre lo que un programa hace, como "¿está libre de cierto error?" o "¿cumple esta especificación?"— es indecidible (Rice, 1953). La implicación es directa: es imposible escribir un programa que verifique, de forma general y automática, si un programa arbitrario satisface su especificación; por lo tanto, una IA no puede demostrar en el caso general la corrección del código que ella u otros producen. La verificación seguirá exigiendo juicio humano y herramientas que solo funcionan restringiendo el problema o renunciando a la completitud.</w:t>
+        <w:t xml:space="preserve"> propiedad semántica no trivial de un programa —como "¿está libre de cierto error?" o "¿cumple su especificación?"— es indecidible. La implicación es directa: ninguna IA puede verificar, de forma general y automática, si un programa arbitrario satisface su especificación. La verificación seguirá exigiendo juicio humano y herramientas que solo funcionan restringiendo el problema o renunciando a la completitud.</w:t>
       </w:r>
     </w:p>
     <w:p>
@@ -666,7 +657,7 @@
         <w:t>intratabilidad</w:t>
       </w:r>
       <w:r>
-        <w:t xml:space="preserve">. El problema P vs. NP, uno de los siete Problemas del Milenio, pregunta si todo problema cuya solución puede verificarse rápidamente puede también resolverse rápidamente (Cook, 1971). Bajo la hipótesis ampliamente aceptada de que P ≠ NP, numerosos problemas centrales de la ingeniería (planificación, ruteo, asignación de recursos) son NP-difíciles y no admiten soluciones eficientes en el peor caso. Este límite es matemático, no de capacidad de cómputo: ninguna IA lo derogará. El ingeniero seguirá siendo quien elija heurísticas, aproximaciones y compromisos; decidir </w:t>
+        <w:t xml:space="preserve">. El problema P vs. NP, uno de los siete Problemas del Milenio, pregunta si todo problema cuya solución se verifica rápido puede también resolverse rápido (Cook, 1971). Bajo la hipótesis aceptada de que P ≠ NP, numerosos problemas centrales de la ingeniería (planificación, ruteo, asignación de recursos) son NP-difíciles y no admiten soluciones eficientes en el peor caso. Es un límite matemático, no de cómputo: ninguna IA lo derogará. El ingeniero seguirá eligiendo heurísticas, aproximaciones y compromisos; decidir </w:t>
       </w:r>
       <w:r>
         <w:rPr>
@@ -685,7 +676,7 @@
         <w:jc w:val="both"/>
       </w:pPr>
       <w:r>
-        <w:t xml:space="preserve">La tercera barrera concierne al lenguaje. La jerarquía de Chomsky (1956) organiza los lenguajes formales según su poder generativo, y los lenguajes de programación pertenecen, en su sintaxis, a la clase de los lenguajes libres de contexto: son formales, precisos y se analizan de manera determinista y sin ambigüedad. El lenguaje natural —y, con él, las instrucciones que un humano da a un LLM— es, en cambio, ambiguo, dependiente del contexto y no constituye un lenguaje formal. El rol perdurable del ingeniero es justamente el de traductor entre ambos mundos: convertir la intención humana, informal e incompleta, en una especificación formal que una máquina pueda ejecutar. Esta conexión no es una mera analogía: trabajos recientes muestran que los propios </w:t>
+        <w:t xml:space="preserve">La tercera barrera concierne al lenguaje. La jerarquía de Chomsky (1956) ordena los lenguajes formales según su poder generativo, y los de programación pertenecen, en su sintaxis, a los libres de contexto: formales, precisos, analizables sin ambigüedad. El lenguaje natural —y las instrucciones que un humano da a un LLM— es, en cambio, ambiguo y dependiente del contexto. El rol perdurable del ingeniero es el de traductor entre ambos mundos: convertir la intención humana, informal e incompleta, en una especificación formal ejecutable. No es una analogía: trabajos recientes muestran que los propios </w:t>
       </w:r>
       <w:r>
         <w:rPr>
@@ -694,7 +685,7 @@
         <w:t>transformers</w:t>
       </w:r>
       <w:r>
-        <w:t xml:space="preserve"> —la arquitectura de los LLM— están acotados por la jerarquía de Chomsky (no generalizan a lenguajes que exceden su nivel) y que, bajo supuestos realistas de precisión, pertenecen a la clase de complejidad TC⁰, incapaz de reconocer gramáticas libres de contexto arbitrarias (Delétang et al., 2023; Merrill y Sabharwal, 2023). La teoría de lenguajes formales y la complejidad describen, así, los límites concretos de la IA que el ingeniero debe conocer.</w:t>
+        <w:t xml:space="preserve"> están acotados por la jerarquía de Chomsky y, bajo supuestos realistas de precisión, pertenecen a la clase TC⁰, incapaz de reconocer gramáticas libres de contexto arbitrarias (Delétang et al., 2023; Merrill y Sabharwal, 2023). La teoría de lenguajes formales describe, así, los límites concretos de la IA que el ingeniero debe conocer.</w:t>
       </w:r>
     </w:p>
     <w:p>
@@ -758,7 +749,7 @@
         <w:jc w:val="both"/>
       </w:pPr>
       <w:r>
-        <w:t>Estas barreras alcanzan también a la propia IA. Trabajos recientes demuestran, mediante diagonalización apoyada en la indecidibilidad del problema de la detención, que la "alucinación" es una limitación innata de los LLM: ningún modelo puede aprender todas las funciones computables, por lo que producirá inevitablemente errores que no puede detectar por sí mismo (Xu et al., 2024). Un LLM no puede autoverificar su salida; necesita un agente externo —el ingeniero— que la contraste con la realidad y asuma la responsabilidad.</w:t>
+        <w:t>Estas barreras alcanzan a la propia IA. Mediante diagonalización apoyada en la indecidibilidad de la detención, se demuestra que la "alucinación" es una limitación innata de los LLM: ningún modelo puede aprender todas las funciones computables, por lo que producirá inevitablemente errores que no detecta por sí mismo (Xu et al., 2024). Un LLM no puede autoverificar su salida; necesita un agente externo —el ingeniero— que la contraste con la realidad y asuma la responsabilidad.</w:t>
       </w:r>
     </w:p>
     <w:p>
@@ -777,7 +768,7 @@
         <w:t>accidental</w:t>
       </w:r>
       <w:r>
-        <w:t xml:space="preserve"> —la del proceso de construcción, que las herramientas sí reducen— de la </w:t>
+        <w:t xml:space="preserve"> —la del proceso de construcción, que las herramientas reducen— de la </w:t>
       </w:r>
       <w:r>
         <w:rPr>
@@ -786,7 +777,7 @@
         <w:t>esencial</w:t>
       </w:r>
       <w:r>
-        <w:t xml:space="preserve"> —la dificultad conceptual inherente al problema—. Para Brooks, "la parte más difícil de construir un sistema de software es decidir con precisión qué construir": la IA ataca lo accidental, pero decidir qué construir, para quién y con qué compromisos éticos es una tarea humana cargada de valores, no un cómputo. En la misma línea, Naur (1985) sostuvo que el verdadero producto de programar es una </w:t>
+        <w:t xml:space="preserve">, la dificultad conceptual inherente al problema. "La parte más difícil de construir un sistema de software es decidir con precisión qué construir": la IA ataca lo accidental, pero decidir qué construir, para quién y con qué compromisos éticos es una tarea humana cargada de valores. En la misma línea, Naur (1985) sostuvo que el verdadero producto de programar es una </w:t>
       </w:r>
       <w:r>
         <w:rPr>
@@ -795,7 +786,7 @@
         <w:t>teoría</w:t>
       </w:r>
       <w:r>
-        <w:t xml:space="preserve"> del problema que reside en la mente del equipo y que el código por sí solo no captura. Allí reside el corazón irreductible de la ingeniería.</w:t>
+        <w:t xml:space="preserve"> del problema que reside en la mente del equipo y que el código no captura. Allí reside el corazón irreductible de la ingeniería.</w:t>
       </w:r>
     </w:p>
     <w:p>
@@ -820,7 +811,7 @@
         <w:jc w:val="both"/>
       </w:pPr>
       <w:r>
-        <w:t>Si la teoría garantiza un núcleo humano, la economía explica por qué ese núcleo no solo persistirá, sino que probablemente se ampliará. La historia de la automatización ofrece una guía en la "paradoja de Jevons": cuando una tecnología abarata el uso de un recurso, su consumo total tiende a aumentar, no a disminuir. El caso de los cajeros automáticos es paradigmático: lejos de eliminar a los cajeros, abarataron operar una sucursal, los bancos abrieron más y el empleo total creció, aunque la tarea viró hacia la atención y la venta (Bessen, 2015). Aplicada al software, la lógica es análoga: al volverse más barato producir, la demanda —y la de quienes lo diseñan y controlan— podría crecer (Acemoglu y Restrepo, 2019; Autor, 2015). Thomas Dohmke, entonces director ejecutivo de GitHub, llegó a proyectar "mil millones de desarrolladores habilitados por miles de millones de agentes de IA" (Dohmke, 2025).</w:t>
+        <w:t>Si la teoría garantiza un núcleo humano, la economía explica por qué probablemente se ampliará. La "paradoja de Jevons" ofrece una guía: cuando una tecnología abarata un recurso, su consumo total tiende a aumentar. El caso de los cajeros automáticos es paradigmático: lejos de eliminarlos, abarataron operar una sucursal, los bancos abrieron más y el empleo creció (Bessen, 2015). En el software la lógica es análoga: al abaratarse la producción, la demanda —y la de quienes lo diseñan y controlan— podría crecer (Acemoglu y Restrepo, 2019; Autor, 2015). Thomas Dohmke, entonces director de GitHub, llegó a proyectar "mil millones de desarrolladores habilitados por miles de millones de agentes de IA" (Dohmke, 2025).</w:t>
       </w:r>
     </w:p>
     <w:p>
@@ -830,7 +821,7 @@
         <w:jc w:val="both"/>
       </w:pPr>
       <w:r>
-        <w:t xml:space="preserve">El nuevo rol puede describirse como un peldaño más en la escalera de abstracción. El ingeniero del futuro escribirá menos código línea por línea y, en cambio, dedicará su tiempo a: </w:t>
+        <w:t xml:space="preserve">El nuevo rol es un peldaño más en la escalera de abstracción. El ingeniero del futuro escribirá menos código línea por línea y dedicará su tiempo a: </w:t>
       </w:r>
       <w:r>
         <w:rPr>
@@ -839,7 +830,7 @@
         <w:t>especificar</w:t>
       </w:r>
       <w:r>
-        <w:t xml:space="preserve"> con precisión qué debe hacer el sistema (la complejidad esencial de Brooks); </w:t>
+        <w:t xml:space="preserve"> qué debe hacer el sistema (la complejidad esencial de Brooks); </w:t>
       </w:r>
       <w:r>
         <w:rPr>
@@ -848,7 +839,7 @@
         <w:t>diseñar</w:t>
       </w:r>
       <w:r>
-        <w:t xml:space="preserve"> arquitecturas e integrar componentes heterogéneos, incluidos los propios modelos de IA; </w:t>
+        <w:t xml:space="preserve"> arquitecturas e integrar componentes heterogéneos, incluidos los modelos de IA; </w:t>
       </w:r>
       <w:r>
         <w:rPr>
@@ -857,16 +848,16 @@
         <w:t>validar y verificar</w:t>
       </w:r>
       <w:r>
-        <w:t xml:space="preserve"> el código generado por las máquinas, sabiendo —por Rice y Turing— que esa validación no puede delegarse por completo; </w:t>
+        <w:t xml:space="preserve"> el código generado, sabiendo —por Rice y Turing— que esa validación no puede delegarse del todo; </w:t>
       </w:r>
       <w:r>
         <w:rPr>
           <w:b/>
         </w:rPr>
-        <w:t>supervisar críticamente</w:t>
+        <w:t>supervisar</w:t>
       </w:r>
       <w:r>
-        <w:t xml:space="preserve"> sistemas autónomos, atendiendo a su seguridad, su sesgo y su impacto; y </w:t>
+        <w:t xml:space="preserve"> sistemas autónomos en su seguridad, sesgo e impacto; y </w:t>
       </w:r>
       <w:r>
         <w:rPr>
@@ -875,7 +866,7 @@
         <w:t>decidir</w:t>
       </w:r>
       <w:r>
-        <w:t xml:space="preserve"> bajo restricciones de intratabilidad y de valores. Es, precisamente, el "30 % difícil" de Osmani convertido en el centro de gravedad de la profesión. Las proyecciones de competencias confirman ese desplazamiento: cerca del 40 % de las habilidades cambiarán hacia 2030, con el pensamiento analítico, la IA y los datos, y la ciberseguridad entre las más demandadas (World Economic Forum, 2025); y marcos como el SWEBOK (Washizaki, 2024) ya definen la ingeniería de software muy por encima de la codificación, abarcando requisitos, arquitectura, validación y seguridad.</w:t>
+        <w:t xml:space="preserve"> bajo restricciones de intratabilidad y de valores. Es el "30 % difícil" de Osmani vuelto centro de gravedad de la profesión. Las proyecciones lo confirman: cerca del 40 % de las habilidades cambiarán hacia 2030, con el pensamiento analítico, la IA y la ciberseguridad entre las más demandadas (World Economic Forum, 2025); y marcos como el SWEBOK (Washizaki, 2024) ya definen la ingeniería muy por encima de la codificación, abarcando requisitos, arquitectura, validación y seguridad.</w:t>
       </w:r>
     </w:p>
     <w:p>
@@ -885,7 +876,7 @@
         <w:jc w:val="both"/>
       </w:pPr>
       <w:r>
-        <w:t>Los datos del mercado laboral, sin embargo, advierten que la transición no será indolora ni uniforme. La Oficina de Estadísticas Laborales de EE. UU. proyecta un crecimiento del empleo de "desarrolladores de software" cercano al 15 % entre 2024 y 2034 —muy por encima del promedio—, mientras la categoría más estrecha de "programadores" se contraería un 6 % por la automatización (Bureau of Labor Statistics, 2025): se automatiza la tarea de codificar, no la de diseñar y decidir. A la vez, un estudio de Stanford halló caídas de empleo del 13-16 % en los trabajadores de carrera temprana (22-25 años) de las ocupaciones más expuestas a la IA —entre ellas el desarrollo de software—, mientras los de mayor experiencia se mantenían estables (Brynjolfsson et al., 2025). La "puerta de entrada" junior se estrecha y la demanda se desplaza hacia perfiles con criterio: las competencias del nuevo rol.</w:t>
+        <w:t>Los datos laborales, sin embargo, advierten que la transición no será indolora ni uniforme. La Oficina de Estadísticas Laborales de EE. UU. proyecta un crecimiento del empleo de "desarrolladores de software" cercano al 15 % entre 2024 y 2034 —muy por encima del promedio—, mientras "programadores" se contraería un 6 % por la automatización (Bureau of Labor Statistics, 2025): se automatiza codificar, no diseñar y decidir. Un estudio de Stanford, además, halló caídas del 13-16 % en el empleo de carrera temprana (22-25 años) de las ocupaciones más expuestas a la IA, mientras los de mayor experiencia se mantenían estables (Brynjolfsson et al., 2025). La "puerta de entrada" junior se estrecha y la demanda se desplaza hacia perfiles con criterio: las competencias del nuevo rol.</w:t>
       </w:r>
     </w:p>
     <w:p>
@@ -1018,7 +1009,7 @@
         <w:jc w:val="both"/>
       </w:pPr>
       <w:r>
-        <w:t>Como toda proyección, depende de cómo lean el futuro quienes lo construyen, y sus opiniones, aunque dispares, convergen en un punto. En el extremo más audaz, Dario Amodei (Anthropic) pronosticó en marzo de 2025 que la IA escribiría el 90 % del código en tres a seis meses y "esencialmente todo" en doce; pero aclaró de inmediato que "el programador todavía debe especificar (…) las decisiones generales de diseño" (Council on Foreign Relations, 2025). Andrej Karpathy describió el "Software 3.0", en el que "programamos las computadoras en inglés" (Karpathy, 2025), y popularizó el "vibe coding" para la programación guiada por la intuición y delegada en la IA.</w:t>
+        <w:t>Como toda proyección, depende de quienes la construyen, cuyas opiniones, aunque dispares, convergen en un punto. En el extremo más audaz, Dario Amodei (Anthropic) pronosticó en 2025 que la IA escribiría el 90 % del código en tres a seis meses y "esencialmente todo" en doce, pero aclaró que "el programador todavía debe especificar (…) las decisiones generales de diseño" (Council on Foreign Relations, 2025). Andrej Karpathy describió el "Software 3.0", en el que "programamos las computadoras en inglés", y popularizó el "vibe coding" (Karpathy, 2025).</w:t>
       </w:r>
     </w:p>
     <w:p>
@@ -1028,7 +1019,7 @@
         <w:jc w:val="both"/>
       </w:pPr>
       <w:r>
-        <w:t>No todas las voces comparten ese optimismo. Grady Booch, coautor de UML, replicó a Amodei que tales pronósticos revelan "una incomprensión fundamental de lo que es la ingeniería de software" y condensó la cuestión en una frase: "tus herramientas están cambiando, pero tus problemas no" (Booch, 2026). Bjarne Stroustrup, creador de C++, advirtió por su parte que el riesgo no es tanto el reemplazo como que los programadores "pierdan la capacidad de detectar problemas por estar tan acostumbrados a que se los resuelvan" (Stroustrup, 2025), un peligro que la sección anterior fundamenta teóricamente.</w:t>
+        <w:t>No todas las voces comparten ese optimismo. Grady Booch, coautor de UML, replicó que tales pronósticos revelan "una incomprensión fundamental de lo que es la ingeniería de software": "tus herramientas están cambiando, pero tus problemas no" (Booch, 2026). Bjarne Stroustrup, creador de C++, advirtió que el riesgo no es tanto el reemplazo como que los programadores "pierdan la capacidad de detectar problemas por estar tan acostumbrados a que se los resuelvan" (Stroustrup, 2025), un peligro que la sección anterior fundamenta teóricamente.</w:t>
       </w:r>
     </w:p>
     <w:p>
@@ -1038,7 +1029,7 @@
         <w:jc w:val="both"/>
       </w:pPr>
       <w:r>
-        <w:t>Sam Altman, de OpenAI, ofrece quizás la síntesis más equilibrada. Ante la pregunta de si conviene seguir contratando ingenieros respondió que "cada ingeniero de software hará, durante un buen tiempo, muchísimo más" (Thompson, 2025), y agregó que "mucha más gente podrá crear software, pero los expertos seguirán siendo mucho mejores que los novatos, si adoptan las nuevas herramientas" (Altman, 2025). Es, en esencia, la hipótesis de este trabajo en boca de un protagonista del cambio: la IA no anula al ingeniero, sino que amplifica al que sabe usarla. Incluso las voces más optimistas reservan para el humano las tareas de especificar, decidir y juzgar —las mismas que la teoría de la computación demuestra que no pueden automatizarse.</w:t>
+        <w:t>Sam Altman, de OpenAI, ofrece quizás la síntesis más equilibrada: "cada ingeniero de software hará, durante un buen tiempo, muchísimo más" (Thompson, 2025), y "mucha más gente podrá crear software, pero los expertos seguirán siendo mucho mejores que los novatos, si adoptan las nuevas herramientas" (Altman, 2025). Es la hipótesis de este trabajo en boca de un protagonista del cambio: la IA no anula al ingeniero, sino que amplifica al que sabe usarla. Incluso las voces más optimistas reservan para el humano las tareas de especificar, decidir y juzgar —las mismas que la teoría de la computación demuestra que no pueden automatizarse.</w:t>
       </w:r>
     </w:p>
     <w:p>
@@ -1063,7 +1054,7 @@
         <w:jc w:val="both"/>
       </w:pPr>
       <w:r>
-        <w:t xml:space="preserve">Este trabajo proyecta una tendencia a diez años, y toda predicción tecnológica está sujeta a una incertidumbre considerable; la conclusión es, por tanto, una estimación fundada y no una certeza. Buena parte de la evidencia cuantitativa proviene de estudios recientes, algunos aún en forma de </w:t>
+        <w:t xml:space="preserve">Toda predicción tecnológica a diez años está sujeta a una incertidumbre considerable: la conclusión es una estimación fundada, no una certeza. Buena parte de la evidencia cuantitativa proviene de estudios recientes —algunos aún </w:t>
       </w:r>
       <w:r>
         <w:rPr>
@@ -1072,7 +1063,7 @@
         <w:t>working papers</w:t>
       </w:r>
       <w:r>
-        <w:t xml:space="preserve"> no revisados por pares, y de declaraciones de ejecutivos con intereses comerciales en la propia tecnología que promueven, lo que obliga a leerlas con cautela. La causalidad de los fenómenos laborales observados es, además, materia de debate: la contracción del empleo junior podría obedecer tanto a la IA como al fin del crédito barato y a la sobrecontratación previa. Lo que sí ofrece una base sólida y no especulativa es el marco teórico: los resultados de Turing, Rice, Cook y Chomsky no caducan con la próxima versión de un modelo, y constituyen el fundamento más firme de la tesis aquí defendida.</w:t>
+        <w:t xml:space="preserve"> sin revisión por pares— y de declaraciones de ejecutivos con intereses comerciales en la tecnología que promueven, lo que obliga a leerlas con cautela. La causalidad de los fenómenos laborales es además discutible: la contracción del empleo junior podría obedecer tanto a la IA como al fin del crédito barato y a la sobrecontratación previa. Lo que sí ofrece una base sólida es el marco teórico: los resultados de Turing, Rice, Cook y Chomsky no caducan con la próxima versión de un modelo, y son el fundamento más firme de la tesis aquí defendida.</w:t>
       </w:r>
     </w:p>
     <w:p>
@@ -1097,7 +1088,7 @@
         <w:jc w:val="both"/>
       </w:pPr>
       <w:r>
-        <w:t>El recorrido permite confirmar, con matices, la hipótesis inicial. En los próximos diez años el ingeniero informático no será reemplazado por la IA, pero su rol se transformará: el centro de gravedad de la profesión pasará de la ejecución técnica —escribir código línea por línea— a la especificación, el diseño, la integración y, sobre todo, la validación y supervisión crítica de sistemas cada vez más autónomos. La historia respalda esta lectura, pues cada abstracción anterior elevó al ingeniero en lugar de eliminarlo; la evidencia empírica reciente la matiza, al mostrar que la IA acelera la producción pero degrada la garantía de corrección; y la teoría de la computación la fundamenta, al demostrar que la verificación universal (Rice y Turing), la resolución eficiente de todo problema (P vs. NP) y la traducción de la intención ambigua al lenguaje formal (Chomsky) no son tareas que una máquina pueda asumir por completo.</w:t>
+        <w:t>El recorrido confirma, con matices, la hipótesis inicial. En la próxima década el ingeniero informático no será reemplazado por la IA, pero su rol se transformará: el centro de gravedad de la profesión pasará de la ejecución técnica —escribir código línea por línea— a la especificación, el diseño, la integración y, sobre todo, la validación y supervisión crítica de sistemas cada vez más autónomos. La historia respalda esta lectura, pues cada abstracción anterior elevó al ingeniero en lugar de eliminarlo; la evidencia reciente la matiza, al mostrar que la IA acelera la producción pero degrada la garantía de corrección; y la teoría de la computación la fundamenta: la verificación universal (Rice y Turing), la resolución eficiente de todo problema (P vs. NP) y la traducción de la intención ambigua al lenguaje formal (Chomsky) no son tareas que una máquina pueda asumir por completo.</w:t>
       </w:r>
     </w:p>
     <w:p>

</xml_diff>

<commit_message>
Reforzar el enfoque prospectivo (proyección a 2035)
- Nuevo párrafo en la Sección V: el ingeniero como orquestador de
  flotas de agentes autónomos hacia 2035, con Kent Beck ("el 10 %
  restante vale 1000×") y Martin Fowler (abstracción no determinista)
- Adelgazada la Sección II (historia) para inclinar el peso hacia el
  futuro sin perder el pilar histórico
- 2 referencias nuevas (Beck 2023, Fowler 2025); cuerpo en 2.995
  palabras, dentro del tope de 3.000. Regenerado el .docx

Co-Authored-By: Claude Opus 4.8 <noreply@anthropic.com>
Claude-Session: https://claude.ai/code/session_01GRUp5qFeKJME8uZW1YQ6nF
</commit_message>
<xml_diff>
--- a/Paper_Rol_del_ingeniero_informatico_en_10_anios.docx
+++ b/Paper_Rol_del_ingeniero_informatico_en_10_anios.docx
@@ -187,7 +187,7 @@
         <w:jc w:val="both"/>
       </w:pPr>
       <w:r>
-        <w:t>Cada vez que la tecnología avanzó, el rol del ingeniero informático cambió con ella. Los lenguajes de alto nivel, los entornos integrados de desarrollo o la nube modificaron profundamente su trabajo diario; sin embargo, ninguna de esas revoluciones hizo desaparecer la profesión. Hoy, la inteligencia artificial generativa —en particular los modelos grandes de lenguaje (LLM) y los agentes de codificación autónomos— plantea el desafío más radical hasta la fecha, al punto de que destacados referentes de la industria pronostican que la mayor parte del código será escrita por máquinas en pocos años.</w:t>
+        <w:t>Cada vez que la tecnología avanzó, el rol del ingeniero informático cambió con ella: los lenguajes de alto nivel, los entornos integrados de desarrollo o la nube transformaron su trabajo diario sin hacer desaparecer la profesión. Hoy, la inteligencia artificial generativa —en particular los modelos grandes de lenguaje (LLM) y los agentes de codificación autónomos— plantea el desafío más radical hasta la fecha, al punto de que destacados referentes pronostican que la mayor parte del código será escrita por máquinas en pocos años.</w:t>
       </w:r>
     </w:p>
     <w:p>
@@ -241,7 +241,7 @@
         <w:jc w:val="both"/>
       </w:pPr>
       <w:r>
-        <w:t>La historia del software puede leerse como el ascenso por una "escalera de abstracción" en la que cada peldaño automatizó el trabajo del anterior y, lejos de suprimir al ingeniero, lo elevó a un nivel conceptual superior. En los años cuarenta y cincuenta, programar era escribir código máquina y luego ensamblador. El salto decisivo llegó con los lenguajes de alto nivel: FORTRAN (Backus, IBM, 1957) permitió expresar algoritmos en notación matemática y delegó en un compilador la generación del código de bajo nivel; COBOL, inspirado en Grace Hopper, hizo lo propio para los negocios.</w:t>
+        <w:t>La historia del software puede leerse como el ascenso por una "escalera de abstracción" en la que cada peldaño automatizó el trabajo del anterior y, lejos de suprimir al ingeniero, lo elevó conceptualmente. Programar fue primero escribir código máquina y ensamblador; el salto decisivo llegó con los lenguajes de alto nivel: FORTRAN (Backus, IBM, 1957) permitió expresar algoritmos en notación matemática y delegó en un compilador el código de bajo nivel; COBOL, inspirado en Grace Hopper, hizo lo propio para los negocios.</w:t>
       </w:r>
     </w:p>
     <w:p>
@@ -251,7 +251,7 @@
         <w:jc w:val="both"/>
       </w:pPr>
       <w:r>
-        <w:t>Paradójicamente, esa creciente potencia trajo aparejada una crisis. En la Conferencia de Ingeniería de Software de la OTAN (Garmisch, octubre de 1968) se acuñó la expresión "crisis del software" para describir la incapacidad de gestionar la complejidad de sistemas cada vez más grandes (Naur y Randell, 1969). Como sintetizó Dijkstra en 1972, "mientras no había máquinas, programar no era ningún problema; (…) ahora que tenemos computadoras gigantescas, programar se ha convertido en un problema igualmente gigantesco" (Dijkstra, 1972). La respuesta no fue menos ingeniería, sino más: nacieron la programación estructurada, las metodologías y la disciplina misma de la ingeniería de software.</w:t>
+        <w:t>Paradójicamente, esa creciente potencia trajo una crisis: en la Conferencia de Ingeniería de Software de la OTAN (Garmisch, 1968) se acuñó la expresión "crisis del software" para describir la incapacidad de gestionar la complejidad de sistemas cada vez más grandes (Naur y Randell, 1969). La respuesta no fue menos ingeniería, sino más: ante un problema vuelto "igualmente gigantesco" por las máquinas (Dijkstra, 1972), nacieron la programación estructurada, las metodologías y la disciplina misma de la ingeniería de software.</w:t>
       </w:r>
     </w:p>
     <w:p>
@@ -261,7 +261,7 @@
         <w:jc w:val="both"/>
       </w:pPr>
       <w:r>
-        <w:t>Los peldaños siguientes confirman el patrón: los entornos integrados de desarrollo comprimieron el ciclo de edición, compilación y prueba; Git (2005) y Stack Overflow (2008) compartieron el conocimiento; la nube (Amazon Web Services, 2006) abstrajo la infraestructura y DevOps (2009) automatizó el despliegue; y en 2021 GitHub Copilot introdujo el primer "programador en par" basado en IA. En cada caso la herramienta automatizó lo rutinario, pero el ingeniero permaneció y ascendió hacia el diseño de arquitecturas distribuidas. El anuncio de la desaparición del programador tampoco es nuevo: ya se proclamó con COBOL, con los lenguajes de cuarta generación y con el "sin código", y cada vez la profesión creció; la tesis del "fin de la programación" (Welsh, 2023) es la más reciente de una larga serie de profecías incumplidas.</w:t>
+        <w:t>Los peldaños siguientes confirman el patrón: los IDE comprimieron el ciclo de edición, compilación y prueba; Git (2005) y Stack Overflow (2008) compartieron el conocimiento; la nube (Amazon Web Services, 2006) abstrajo la infraestructura y DevOps (2009) automatizó el despliegue; y en 2021 GitHub Copilot introdujo el primer "programador en par" basado en IA. En cada caso la herramienta automatizó lo rutinario, pero el ingeniero permaneció y ascendió hacia el diseño de arquitecturas distribuidas. El anuncio de la desaparición del programador tampoco es nuevo —ya se proclamó con COBOL, los lenguajes de cuarta generación y el "sin código"—; la tesis del "fin de la programación" (Welsh, 2023) es la más reciente de una larga serie de profecías incumplidas.</w:t>
       </w:r>
     </w:p>
     <w:p>
@@ -375,7 +375,7 @@
         <w:jc w:val="both"/>
       </w:pPr>
       <w:r>
-        <w:t xml:space="preserve">Conviene, no obstante, leer estos números con cautela, porque un benchmark no es el mundo real. El propio equipo de SWE-bench Verified advirtió que el conjunto se ha saturado y "ya no mide las capacidades de codificación de frontera", y la distancia entre el laboratorio y la práctica quedó expuesta cuando un grupo independiente puso a prueba al agente Devin —presentado en 2024 como "el primer ingeniero de software de IA"— en tareas reales: completó con éxito solo 3 de 20 (Husain et al., 2025). Resolver un </w:t>
+        <w:t xml:space="preserve">Conviene, no obstante, leer estos números con cautela, porque un benchmark no es el mundo real. El propio equipo de SWE-bench Verified advirtió que el conjunto se saturó y "ya no mide las capacidades de codificación de frontera", y la distancia con la práctica quedó expuesta cuando un grupo independiente probó al agente Devin —presentado en 2024 como "el primer ingeniero de software de IA"— en tareas reales: completó con éxito solo 3 de 20 (Husain et al., 2025). Resolver un </w:t>
       </w:r>
       <w:r>
         <w:rPr>
@@ -384,7 +384,7 @@
         <w:t>issue</w:t>
       </w:r>
       <w:r>
-        <w:t xml:space="preserve"> aislado en un repositorio conocido es muy distinto de operar dentro de un sistema de producción, con su contexto, sus restricciones y sus consecuencias.</w:t>
+        <w:t xml:space="preserve"> aislado en un repositorio conocido es muy distinto de operar dentro de un sistema de producción, con su contexto y sus consecuencias.</w:t>
       </w:r>
     </w:p>
     <w:p>
@@ -485,7 +485,7 @@
         <w:jc w:val="both"/>
       </w:pPr>
       <w:r>
-        <w:t xml:space="preserve">A esa ambivalencia se añade un efecto sobre la confianza y la formación. Según Stack Overflow (2025), la proporción de programadores que confían en la exactitud de las salidas de IA cayó a alrededor de un tercio, y el 45 % afirma que depurar código generado por IA le lleva </w:t>
+        <w:t xml:space="preserve">A esa ambivalencia se añade un efecto sobre la confianza y la formación. Según Stack Overflow (2025), la confianza en la exactitud de las salidas de IA cayó a alrededor de un tercio, y el 45 % afirma que depurar código generado por IA lleva </w:t>
       </w:r>
       <w:r>
         <w:rPr>
@@ -494,7 +494,7 @@
         <w:t>más</w:t>
       </w:r>
       <w:r>
-        <w:t xml:space="preserve"> tiempo que escribirlo. El problema trasciende la productividad inmediata: un ensayo controlado de Anthropic con ingenieros mayormente junior observó que quienes resolvían tareas con asistencia de IA obtenían puntuaciones sensiblemente menores en una prueba posterior sin IA —sobre todo en depuración—, lo que sugiere que delegar demasiado pronto puede erosionar el aprendizaje del juicio técnico que la propia tarea de supervisión exigirá (Shen y Tamkin, 2026).</w:t>
+        <w:t xml:space="preserve"> tiempo que escribirlo. Y el problema trasciende la productividad: un ensayo de Anthropic con ingenieros mayormente junior observó que quienes resolvían tareas con IA puntuaban sensiblemente menos en una prueba posterior sin IA —sobre todo en depuración—, lo que sugiere que delegar demasiado pronto erosiona el aprendizaje del juicio que la supervisión exigirá (Shen y Tamkin, 2026).</w:t>
       </w:r>
     </w:p>
     <w:p>
@@ -504,7 +504,7 @@
         <w:jc w:val="both"/>
       </w:pPr>
       <w:r>
-        <w:t xml:space="preserve">A esta tensión se suman la calidad y la seguridad. Addy Osmani, ingeniero de Google, describió el "problema del 70 %": la IA produce con rapidez el 70 % de una solución, pero el 30 % final —casos límite, depuración, integración con producción, mantenibilidad— sigue exigiendo el juicio de un ingeniero experimentado (Osmani, 2024). Un estudio de Stanford halló que los programadores con un asistente de IA escribían código </w:t>
+        <w:t xml:space="preserve">A esta tensión se suman la calidad y la seguridad. Addy Osmani (Google) describió el "problema del 70 %": la IA produce con rapidez el 70 % de una solución, pero el 30 % final —casos límite, depuración, integración con producción, mantenibilidad— sigue exigiendo juicio experto (Osmani, 2024). Un estudio de Stanford halló que, con un asistente de IA, los programadores escribían código </w:t>
       </w:r>
       <w:r>
         <w:rPr>
@@ -513,7 +513,7 @@
         <w:t>menos</w:t>
       </w:r>
       <w:r>
-        <w:t xml:space="preserve"> seguro y, a la vez, confiaban </w:t>
+        <w:t xml:space="preserve"> seguro y a la vez confiaban </w:t>
       </w:r>
       <w:r>
         <w:rPr>
@@ -522,7 +522,7 @@
         <w:t>más</w:t>
       </w:r>
       <w:r>
-        <w:t xml:space="preserve"> en su seguridad —una peligrosa falsa confianza (Perry et al., 2023)—. Las evaluaciones de corrección apuntan en el mismo sentido: al endurecer los tests, la tasa de acierto cae entre 19 y 29 puntos (Liu et al., 2023), lo que revela que "pasar los tests" no equivale a satisfacer la especificación. En seguridad, cerca del 40 % de las sugerencias de Copilot en escenarios sensibles incluían vulnerabilidades conocidas (Pearce et al., 2022) y un informe de 2025 sobre más de un centenar de modelos halló que el código generado introducía una vulnerabilidad en el 45 % de los casos, sin que los más nuevos fueran más seguros (Veracode, 2025). Se suma un riesgo inédito: cerca del 20 % de los paquetes que los modelos recomiendan importar no existen, lo que habilita el </w:t>
+        <w:t xml:space="preserve"> en él —una falsa confianza peligrosa (Perry et al., 2023)—. Las evaluaciones de corrección apuntan en el mismo sentido: al endurecer los tests, la tasa de acierto cae entre 19 y 29 puntos (Liu et al., 2023), lo que revela que "pasar los tests" no equivale a satisfacer la especificación. En seguridad, cerca del 40 % de las sugerencias de Copilot en escenarios sensibles incluían vulnerabilidades conocidas (Pearce et al., 2022), y un informe de 2025 sobre más de un centenar de modelos halló código vulnerable en el 45 % de los casos, sin que los más nuevos fueran más seguros (Veracode, 2025). Se suma un riesgo inédito: cerca del 20 % de los paquetes que los modelos recomiendan importar no existen, lo que habilita el </w:t>
       </w:r>
       <w:r>
         <w:rPr>
@@ -531,7 +531,7 @@
         <w:t>slopsquatting</w:t>
       </w:r>
       <w:r>
-        <w:t xml:space="preserve"> —registrarlos con código malicioso (Spracklen et al., 2025)—. Y a mediano plazo asoma un costo silencioso: el análisis de millones de líneas reales muestra que, desde estos asistentes, crecen la duplicación y la rotación de código mientras cae la refactorización (GitClear, 2025), y DORA asoció una mayor adopción de IA con una leve caída en la estabilidad de las entregas (DORA, 2024). La IA, en suma, acelera la producción pero no garantiza la corrección: traslada el cuello de botella desde la escritura del código hacia su verificación.</w:t>
+        <w:t xml:space="preserve"> —registrarlos con código malicioso (Spracklen et al., 2025)—. Y a mediano plazo asoma un costo silencioso: el análisis de millones de líneas reales muestra que crecen la duplicación y la rotación de código mientras cae la refactorización (GitClear, 2025), y DORA asoció una mayor adopción de IA con una leve caída en la estabilidad de las entregas (DORA, 2024). La IA, en suma, acelera la producción pero no garantiza la corrección: traslada el cuello de botella desde la escritura del código hacia su verificación.</w:t>
       </w:r>
     </w:p>
     <w:p>
@@ -610,7 +610,7 @@
         <w:jc w:val="both"/>
       </w:pPr>
       <w:r>
-        <w:t>¿Por qué, pese a estos avances, el ingeniero no desaparecerá? La respuesta más profunda no proviene de la economía ni de la sociología, sino de la teoría de la computación: existen barreras matemáticas, demostradas y permanentes, que ninguna IA —en última instancia, un proceso computable— puede sortear.</w:t>
+        <w:t>¿Por qué, pese a estos avances, el ingeniero no desaparecerá? La respuesta más profunda no es económica ni sociológica, sino computacional: existen barreras matemáticas, demostradas y permanentes, que ninguna IA —en última instancia, un proceso computable— puede sortear.</w:t>
       </w:r>
     </w:p>
     <w:p>
@@ -657,7 +657,7 @@
         <w:t>intratabilidad</w:t>
       </w:r>
       <w:r>
-        <w:t xml:space="preserve">. El problema P vs. NP, uno de los siete Problemas del Milenio, pregunta si todo problema cuya solución se verifica rápido puede también resolverse rápido (Cook, 1971). Bajo la hipótesis aceptada de que P ≠ NP, numerosos problemas centrales de la ingeniería (planificación, ruteo, asignación de recursos) son NP-difíciles y no admiten soluciones eficientes en el peor caso. Es un límite matemático, no de cómputo: ninguna IA lo derogará. El ingeniero seguirá eligiendo heurísticas, aproximaciones y compromisos; decidir </w:t>
+        <w:t xml:space="preserve">. El problema P vs. NP, uno de los siete Problemas del Milenio, pregunta si todo problema cuya solución se verifica rápido puede también resolverse rápido (Cook, 1971). Bajo la hipótesis aceptada de que P ≠ NP, numerosos problemas centrales de la ingeniería (planificación, ruteo, asignación de recursos) son NP-difíciles y no admiten soluciones eficientes en el peor caso. Es un límite matemático: ninguna IA lo derogará. El ingeniero seguirá eligiendo heurísticas y compromisos; decidir </w:t>
       </w:r>
       <w:r>
         <w:rPr>
@@ -749,7 +749,7 @@
         <w:jc w:val="both"/>
       </w:pPr>
       <w:r>
-        <w:t>Estas barreras alcanzan a la propia IA. Mediante diagonalización apoyada en la indecidibilidad de la detención, se demuestra que la "alucinación" es una limitación innata de los LLM: ningún modelo puede aprender todas las funciones computables, por lo que producirá inevitablemente errores que no detecta por sí mismo (Xu et al., 2024). Un LLM no puede autoverificar su salida; necesita un agente externo —el ingeniero— que la contraste con la realidad y asuma la responsabilidad.</w:t>
+        <w:t>Estas barreras alcanzan a la propia IA. Mediante diagonalización apoyada en la indecidibilidad de la detención, se demuestra que la "alucinación" es innata a los LLM: ningún modelo puede aprender todas las funciones computables, por lo que producirá errores que no detecta por sí mismo (Xu et al., 2024). Un LLM no puede autoverificar su salida; necesita un agente externo —el ingeniero— que la contraste con la realidad y asuma la responsabilidad.</w:t>
       </w:r>
     </w:p>
     <w:p>
@@ -811,7 +811,7 @@
         <w:jc w:val="both"/>
       </w:pPr>
       <w:r>
-        <w:t>Si la teoría garantiza un núcleo humano, la economía explica por qué probablemente se ampliará. La "paradoja de Jevons" ofrece una guía: cuando una tecnología abarata un recurso, su consumo total tiende a aumentar. El caso de los cajeros automáticos es paradigmático: lejos de eliminarlos, abarataron operar una sucursal, los bancos abrieron más y el empleo creció (Bessen, 2015). En el software la lógica es análoga: al abaratarse la producción, la demanda —y la de quienes lo diseñan y controlan— podría crecer (Acemoglu y Restrepo, 2019; Autor, 2015). Thomas Dohmke, entonces director de GitHub, llegó a proyectar "mil millones de desarrolladores habilitados por miles de millones de agentes de IA" (Dohmke, 2025).</w:t>
+        <w:t>Si la teoría garantiza un núcleo humano, la economía explica por qué probablemente se ampliará. La "paradoja de Jevons" ofrece una guía: cuando una tecnología abarata un recurso, su consumo total tiende a aumentar. Los cajeros automáticos son paradigmáticos: lejos de eliminarlos, abarataron operar una sucursal, los bancos abrieron más y el empleo creció (Bessen, 2015). En el software la lógica es análoga: al abaratarse la producción, la demanda —y la de quienes lo diseñan y controlan— podría crecer (Acemoglu y Restrepo, 2019; Autor, 2015). Thomas Dohmke, entonces director de GitHub, proyectó "mil millones de desarrolladores habilitados por miles de millones de agentes de IA" (Dohmke, 2025).</w:t>
       </w:r>
     </w:p>
     <w:p>
@@ -876,7 +876,26 @@
         <w:jc w:val="both"/>
       </w:pPr>
       <w:r>
-        <w:t>Los datos laborales, sin embargo, advierten que la transición no será indolora ni uniforme. La Oficina de Estadísticas Laborales de EE. UU. proyecta un crecimiento del empleo de "desarrolladores de software" cercano al 15 % entre 2024 y 2034 —muy por encima del promedio—, mientras "programadores" se contraería un 6 % por la automatización (Bureau of Labor Statistics, 2025): se automatiza codificar, no diseñar y decidir. Un estudio de Stanford, además, halló caídas del 13-16 % en el empleo de carrera temprana (22-25 años) de las ocupaciones más expuestas a la IA, mientras los de mayor experiencia se mantenían estables (Brynjolfsson et al., 2025). La "puerta de entrada" junior se estrecha y la demanda se desplaza hacia perfiles con criterio: las competencias del nuevo rol.</w:t>
+        <w:t xml:space="preserve">Proyectada a 2035, esa transformación apunta a un ingeniero que orquesta flotas de agentes autónomos más que a uno que teclea funciones: define la intención, descompone el problema, delega la ejecución en la IA y concentra su atención en revisar, integrar y responder por el resultado. Kent Beck, creador del desarrollo guiado por pruebas, lo expresó al constatar que "el 90 % de mis habilidades hoy valen 0 dólares", mientras que el 10 % restante —visión, diseño y control de la complejidad— pasó a valer mil veces más (Beck, 2023). Y Martin Fowler advierte sobre la naturaleza del salto: los LLM introducen una abstracción </w:t>
+      </w:r>
+      <w:r>
+        <w:rPr>
+          <w:i/>
+        </w:rPr>
+        <w:t>no determinista</w:t>
+      </w:r>
+      <w:r>
+        <w:t>, sin la reproducibilidad de un compilador, comparable en magnitud al paso del ensamblador a los lenguajes de alto nivel (Fowler, 2025). El nuevo peldaño no elimina el juicio humano: lo vuelve más abstracto, más arriesgado y más decisivo.</w:t>
+      </w:r>
+    </w:p>
+    <w:p>
+      <w:pPr>
+        <w:spacing w:line="360" w:lineRule="auto" w:after="120"/>
+        <w:ind w:firstLine="576"/>
+        <w:jc w:val="both"/>
+      </w:pPr>
+      <w:r>
+        <w:t>Los datos laborales, sin embargo, advierten que la transición no será indolora ni uniforme. La Oficina de Estadísticas Laborales de EE. UU. proyecta un crecimiento del empleo de "desarrolladores de software" cercano al 15 % entre 2024 y 2034, mientras "programadores" se contraería un 6 % (Bureau of Labor Statistics, 2025): se automatiza codificar, no diseñar y decidir. Un estudio de Stanford halló, además, caídas del 13-16 % en el empleo de carrera temprana (22-25 años) de las ocupaciones más expuestas a la IA, mientras los experimentados se mantenían estables (Brynjolfsson et al., 2025). La "puerta de entrada" junior se estrecha y la demanda se desplaza hacia perfiles con criterio: las competencias del nuevo rol.</w:t>
       </w:r>
     </w:p>
     <w:p>
@@ -1009,7 +1028,7 @@
         <w:jc w:val="both"/>
       </w:pPr>
       <w:r>
-        <w:t>Como toda proyección, depende de quienes la construyen, cuyas opiniones, aunque dispares, convergen en un punto. En el extremo más audaz, Dario Amodei (Anthropic) pronosticó en 2025 que la IA escribiría el 90 % del código en tres a seis meses y "esencialmente todo" en doce, pero aclaró que "el programador todavía debe especificar (…) las decisiones generales de diseño" (Council on Foreign Relations, 2025). Andrej Karpathy describió el "Software 3.0", en el que "programamos las computadoras en inglés", y popularizó el "vibe coding" (Karpathy, 2025).</w:t>
+        <w:t>Como toda proyección, depende de quienes la construyen, cuyas opiniones, aunque dispares, convergen en un punto. En el extremo más audaz, Dario Amodei (Anthropic) pronosticó en 2025 que la IA escribiría el 90 % del código en meses y "esencialmente todo" en un año, pero aclaró que "el programador todavía debe especificar (…) las decisiones generales de diseño" (Council on Foreign Relations, 2025). Andrej Karpathy describió el "Software 3.0", en el que "programamos las computadoras en inglés", y popularizó el "vibe coding" (Karpathy, 2025).</w:t>
       </w:r>
     </w:p>
     <w:p>
@@ -1029,7 +1048,7 @@
         <w:jc w:val="both"/>
       </w:pPr>
       <w:r>
-        <w:t>Sam Altman, de OpenAI, ofrece quizás la síntesis más equilibrada: "cada ingeniero de software hará, durante un buen tiempo, muchísimo más" (Thompson, 2025), y "mucha más gente podrá crear software, pero los expertos seguirán siendo mucho mejores que los novatos, si adoptan las nuevas herramientas" (Altman, 2025). Es la hipótesis de este trabajo en boca de un protagonista del cambio: la IA no anula al ingeniero, sino que amplifica al que sabe usarla. Incluso las voces más optimistas reservan para el humano las tareas de especificar, decidir y juzgar —las mismas que la teoría de la computación demuestra que no pueden automatizarse.</w:t>
+        <w:t>Sam Altman, de OpenAI, ofrece quizás la síntesis más equilibrada: "cada ingeniero de software hará, durante un buen tiempo, muchísimo más" (Thompson, 2025), y "mucha más gente podrá crear software, pero los expertos seguirán siendo mucho mejores que los novatos, si adoptan las nuevas herramientas" (Altman, 2025). La IA no anula al ingeniero: amplifica al que sabe usarla. Incluso las voces más optimistas reservan para el humano las tareas de especificar, decidir y juzgar —las mismas que la teoría de la computación demuestra que no pueden automatizarse.</w:t>
       </w:r>
     </w:p>
     <w:p>
@@ -1190,6 +1209,25 @@
       </w:r>
       <w:r>
         <w:t>(3), 3-30. https://doi.org/10.1257/jep.29.3.3</w:t>
+      </w:r>
+    </w:p>
+    <w:p>
+      <w:pPr>
+        <w:spacing w:line="360" w:lineRule="auto" w:after="120"/>
+        <w:ind w:left="720" w:hanging="720"/>
+        <w:jc w:val="left"/>
+      </w:pPr>
+      <w:r>
+        <w:t xml:space="preserve">Beck, K. (2023, 19 de abril). </w:t>
+      </w:r>
+      <w:r>
+        <w:rPr>
+          <w:i/>
+        </w:rPr>
+        <w:t>90% of my skills are now worth $0</w:t>
+      </w:r>
+      <w:r>
+        <w:t>. Tidy First? https://newsletter.kentbeck.com/p/90-of-my-skills-are-now-worth-0</w:t>
       </w:r>
     </w:p>
     <w:p>
@@ -1437,6 +1475,25 @@
       </w:r>
       <w:r>
         <w:t>. Google Cloud. https://dora.dev/research/2024/dora-report/</w:t>
+      </w:r>
+    </w:p>
+    <w:p>
+      <w:pPr>
+        <w:spacing w:line="360" w:lineRule="auto" w:after="120"/>
+        <w:ind w:left="720" w:hanging="720"/>
+        <w:jc w:val="left"/>
+      </w:pPr>
+      <w:r>
+        <w:t xml:space="preserve">Fowler, M. (2025, 24 de junio). </w:t>
+      </w:r>
+      <w:r>
+        <w:rPr>
+          <w:i/>
+        </w:rPr>
+        <w:t>LLMs bring new nature of abstraction</w:t>
+      </w:r>
+      <w:r>
+        <w:t>. martinfowler.com. https://martinfowler.com/articles/2025-nature-abstraction.html</w:t>
       </w:r>
     </w:p>
     <w:p>

</xml_diff>

<commit_message>
Incorporar el bando "será reemplazado" con su réplica + verificación
- Nuevo párrafo en la Sección VI: la tesis opuesta del reemplazo
  masivo (Amodei/Axios sobre empleo junior y desempleo 10-20 %,
  Zuckerberg, Salesforce) más Frey & Osborne (47 %), con réplica
  anclada en tareas vs. ocupaciones, interés comercial y los límites
  del apartado IV
- 3 referencias nuevas verificadas (VandeHei & Allen 2025, The San
  Francisco Standard 2025, Frey & Osborne 2017)
- Depurados los datos más débiles tras el fact-check (GitClear, DORA,
  McKinsey: observacionales/consultora), conservando la evidencia
  revisada por pares
- Cuerpo en 2.995 palabras (tope 3.000); sin citas huérfanas

Co-Authored-By: Claude Opus 4.8 <noreply@anthropic.com>
Claude-Session: https://claude.ai/code/session_01GRUp5qFeKJME8uZW1YQ6nF
</commit_message>
<xml_diff>
--- a/Paper_Rol_del_ingeniero_informatico_en_10_anios.docx
+++ b/Paper_Rol_del_ingeniero_informatico_en_10_anios.docx
@@ -207,7 +207,7 @@
         <w:jc w:val="both"/>
       </w:pPr>
       <w:r>
-        <w:t xml:space="preserve">Para sostenerla se recorre la historia de la profesión como sucesión de abstracciones (II), el estado actual de la IA (III) y el marco teórico de la materia —los límites computacionales que explican </w:t>
+        <w:t xml:space="preserve">Para sostenerla se recorre la historia de la profesión como sucesión de abstracciones (II), el estado actual de la IA (III) y los límites computacionales que explican </w:t>
       </w:r>
       <w:r>
         <w:rPr>
@@ -216,7 +216,7 @@
         <w:t>por qué</w:t>
       </w:r>
       <w:r>
-        <w:t xml:space="preserve"> persiste un rol humano (IV)—, antes de caracterizar el nuevo rol, las visiones de expertos y las limitaciones (V a VII).</w:t>
+        <w:t xml:space="preserve"> persiste un rol humano (IV), antes de caracterizar el nuevo rol, las visiones de expertos y las limitaciones (V a VII).</w:t>
       </w:r>
     </w:p>
     <w:p>
@@ -241,7 +241,7 @@
         <w:jc w:val="both"/>
       </w:pPr>
       <w:r>
-        <w:t>La historia del software puede leerse como el ascenso por una "escalera de abstracción" en la que cada peldaño automatizó el trabajo del anterior y, lejos de suprimir al ingeniero, lo elevó conceptualmente. Programar fue primero escribir código máquina y ensamblador; el salto decisivo llegó con los lenguajes de alto nivel: FORTRAN (Backus, IBM, 1957) permitió expresar algoritmos en notación matemática y delegó en un compilador el código de bajo nivel; COBOL, inspirado en Grace Hopper, hizo lo propio para los negocios.</w:t>
+        <w:t>La historia del software puede leerse como el ascenso por una "escalera de abstracción" en la que cada peldaño automatizó el trabajo del anterior y, lejos de suprimir al ingeniero, lo elevó conceptualmente. Programar fue primero código máquina y ensamblador; el salto decisivo llegó con los lenguajes de alto nivel: FORTRAN (Backus, IBM, 1957) permitió expresar algoritmos en notación matemática y delegó el código de bajo nivel en un compilador; COBOL, inspirado en Grace Hopper, hizo lo propio para los negocios.</w:t>
       </w:r>
     </w:p>
     <w:p>
@@ -261,7 +261,7 @@
         <w:jc w:val="both"/>
       </w:pPr>
       <w:r>
-        <w:t>Los peldaños siguientes confirman el patrón: los IDE comprimieron el ciclo de edición, compilación y prueba; Git (2005) y Stack Overflow (2008) compartieron el conocimiento; la nube (Amazon Web Services, 2006) abstrajo la infraestructura y DevOps (2009) automatizó el despliegue; y en 2021 GitHub Copilot introdujo el primer "programador en par" basado en IA. En cada caso la herramienta automatizó lo rutinario, pero el ingeniero permaneció y ascendió hacia el diseño de arquitecturas distribuidas. El anuncio de la desaparición del programador tampoco es nuevo —ya se proclamó con COBOL, los lenguajes de cuarta generación y el "sin código"—; la tesis del "fin de la programación" (Welsh, 2023) es la más reciente de una larga serie de profecías incumplidas.</w:t>
+        <w:t>Los peldaños siguientes confirman el patrón: los IDE comprimieron el ciclo de edición, compilación y prueba; Git (2005) y Stack Overflow (2008) compartieron el conocimiento; la nube (Amazon Web Services, 2006) abstrajo la infraestructura y DevOps (2009) automatizó el despliegue; y en 2021 GitHub Copilot introdujo el primer "programador en par". En cada caso la herramienta automatizó lo rutinario, pero el ingeniero permaneció y ascendió hacia el diseño de arquitecturas distribuidas. El anuncio de su desaparición tampoco es nuevo —ya se proclamó con COBOL, los lenguajes de cuarta generación y el "sin código"—; la tesis del "fin de la programación" (Welsh, 2023) es la más reciente de una larga serie de profecías incumplidas.</w:t>
       </w:r>
     </w:p>
     <w:p>
@@ -286,7 +286,7 @@
         <w:jc w:val="both"/>
       </w:pPr>
       <w:r>
-        <w:t xml:space="preserve">El ritmo del cambio reciente es difícil de exagerar. En el benchmark SWE-bench Verified, que mide la capacidad de la IA para resolver </w:t>
+        <w:t xml:space="preserve">El ritmo del cambio es difícil de exagerar. En SWE-bench Verified, que mide la capacidad de la IA para resolver </w:t>
       </w:r>
       <w:r>
         <w:rPr>
@@ -295,7 +295,7 @@
         <w:t>issues</w:t>
       </w:r>
       <w:r>
-        <w:t xml:space="preserve"> reales de software, el estado del arte pasó de alrededor del 14 % a comienzos de 2024 a más del 77 % a fines de 2025 (Anthropic, 2025): de uno de cada siete casos a más de tres de cada cuatro en menos de dos años. La adopción acompaña: GitHub Copilot superó los veinte millones de usuarios acumulados en 2025, Sundar Pichai afirmó en 2024 que la IA genera "más de una cuarta parte de todo el código nuevo en Google" y Satya Nadella la estimó en 2025 entre el 20 % y el 30 % en Microsoft (Zeff, 2025). La encuesta de Stack Overflow (2025) confirma la masividad: el 84 % usa o planea usar IA, frente al 76 % del año anterior.</w:t>
+        <w:t xml:space="preserve"> reales de software, el estado del arte pasó de ~14 % a comienzos de 2024 a más del 77 % a fines de 2025 (Anthropic, 2025): de uno de cada siete casos a más de tres de cada cuatro en menos de dos años. La adopción acompaña: GitHub Copilot superó los veinte millones de usuarios en 2025, Pichai afirmó en 2024 que la IA genera "más de una cuarta parte del código nuevo en Google" y Nadella la estimó entre el 20 % y el 30 % en Microsoft (Zeff, 2025). La encuesta de Stack Overflow (2025) confirma la masividad: el 84 % usa o planea usar IA, frente al 76 % anterior.</w:t>
       </w:r>
     </w:p>
     <w:p>
@@ -375,7 +375,7 @@
         <w:jc w:val="both"/>
       </w:pPr>
       <w:r>
-        <w:t xml:space="preserve">Conviene, no obstante, leer estos números con cautela, porque un benchmark no es el mundo real. El propio equipo de SWE-bench Verified advirtió que el conjunto se saturó y "ya no mide las capacidades de codificación de frontera", y la distancia con la práctica quedó expuesta cuando un grupo independiente probó al agente Devin —presentado en 2024 como "el primer ingeniero de software de IA"— en tareas reales: completó con éxito solo 3 de 20 (Husain et al., 2025). Resolver un </w:t>
+        <w:t xml:space="preserve">Conviene, no obstante, leer estos números con cautela: un benchmark no es el mundo real. El propio equipo de SWE-bench Verified advirtió que el conjunto se saturó y "ya no mide las capacidades de codificación de frontera", y la distancia con la práctica quedó expuesta cuando un grupo independiente probó al agente Devin —presentado en 2024 como "el primer ingeniero de software de IA"— en tareas reales: completó con éxito solo 3 de 20 (Husain et al., 2025). Resolver un </w:t>
       </w:r>
       <w:r>
         <w:rPr>
@@ -394,7 +394,7 @@
         <w:jc w:val="both"/>
       </w:pPr>
       <w:r>
-        <w:t xml:space="preserve">Esa misma brecha reaparece al medir la productividad, donde la evidencia es más matizada de lo que sugiere el entusiasmo. Un experimento controlado de GitHub y Microsoft mostró que quienes usaban Copilot completaban una tarea acotada —programar un servidor HTTP— un 55,8 % más rápido (Peng et al., 2023); McKinsey estimó mejoras de entre el 20 % y el 45 % (McKinsey &amp; Company, 2023), y un experimento de campo con 4.867 desarrolladores de Microsoft, Accenture y una empresa Fortune 100 halló un aumento del 26 % en las tareas completadas (Cui et al., 2025). Pero ese último reveló un patrón decisivo: la mejora se concentraba en los programadores junior y casi se desvanecía entre los seniors. El contrapunto más nítido lo aportó un ensayo aleatorizado independiente de METR (2025): desarrolladores </w:t>
+        <w:t xml:space="preserve">Esa misma brecha reaparece al medir la productividad, donde la evidencia es más matizada de lo que sugiere el entusiasmo. Un experimento controlado de GitHub y Microsoft mostró que quienes usaban Copilot completaban una tarea acotada —programar un servidor HTTP— un 55,8 % más rápido (Peng et al., 2023), y un experimento de campo con 4.867 desarrolladores de Microsoft, Accenture y una empresa Fortune 100 halló un aumento del 26 % en las tareas completadas (Cui et al., 2025). Pero ese último reveló un patrón decisivo: la mejora se concentraba en los programadores junior y casi se desvanecía entre los seniors. El contrapunto más nítido lo aportó un ensayo aleatorizado independiente de METR (2025): desarrolladores </w:t>
       </w:r>
       <w:r>
         <w:rPr>
@@ -421,7 +421,7 @@
         <w:t>creían</w:t>
       </w:r>
       <w:r>
-        <w:t xml:space="preserve"> haberse acelerado un 20 %. Lejos de contradecirse, los estudios convergen en una lección: la IA acelera lo rutinario y lo desconocido para quien empieza, pero rinde poco —o estorba— en el trabajo experto sobre sistemas complejos y familiares. La brecha entre productividad percibida y real es, en sí misma, reveladora.</w:t>
+        <w:t xml:space="preserve"> haberse acelerado un 20 %. Lejos de contradecirse, los estudios convergen en una lección: la IA acelera lo rutinario y lo desconocido para quien empieza, pero rinde poco —o estorba— en el trabajo experto sobre sistemas maduros. La brecha entre productividad percibida y real es, en sí misma, reveladora.</w:t>
       </w:r>
     </w:p>
     <w:p>
@@ -485,7 +485,7 @@
         <w:jc w:val="both"/>
       </w:pPr>
       <w:r>
-        <w:t xml:space="preserve">A esa ambivalencia se añade un efecto sobre la confianza y la formación. Según Stack Overflow (2025), la confianza en la exactitud de las salidas de IA cayó a alrededor de un tercio, y el 45 % afirma que depurar código generado por IA lleva </w:t>
+        <w:t xml:space="preserve">A esa ambivalencia se añade un efecto sobre la confianza y la formación. Según Stack Overflow (2025), la confianza en la exactitud de las salidas de IA cayó a alrededor de un tercio, y el 45 % afirma que depurar código de IA lleva </w:t>
       </w:r>
       <w:r>
         <w:rPr>
@@ -494,7 +494,7 @@
         <w:t>más</w:t>
       </w:r>
       <w:r>
-        <w:t xml:space="preserve"> tiempo que escribirlo. Y el problema trasciende la productividad: un ensayo de Anthropic con ingenieros mayormente junior observó que quienes resolvían tareas con IA puntuaban sensiblemente menos en una prueba posterior sin IA —sobre todo en depuración—, lo que sugiere que delegar demasiado pronto erosiona el aprendizaje del juicio que la supervisión exigirá (Shen y Tamkin, 2026).</w:t>
+        <w:t xml:space="preserve"> tiempo que escribirlo. Y el problema trasciende la productividad: un ensayo de Anthropic con ingenieros mayormente junior observó que quienes trabajaban con IA puntuaban sensiblemente menos en una prueba posterior sin ella —sobre todo en depuración—, lo que sugiere que delegar demasiado pronto erosiona el aprendizaje del juicio que la supervisión exigirá (Shen y Tamkin, 2026).</w:t>
       </w:r>
     </w:p>
     <w:p>
@@ -531,7 +531,7 @@
         <w:t>slopsquatting</w:t>
       </w:r>
       <w:r>
-        <w:t xml:space="preserve"> —registrarlos con código malicioso (Spracklen et al., 2025)—. Y a mediano plazo asoma un costo silencioso: el análisis de millones de líneas reales muestra que crecen la duplicación y la rotación de código mientras cae la refactorización (GitClear, 2025), y DORA asoció una mayor adopción de IA con una leve caída en la estabilidad de las entregas (DORA, 2024). La IA, en suma, acelera la producción pero no garantiza la corrección: traslada el cuello de botella desde la escritura del código hacia su verificación.</w:t>
+        <w:t xml:space="preserve"> —registrarlos con código malicioso (Spracklen et al., 2025)—. La IA, en suma, acelera la producción pero no garantiza la corrección: traslada el cuello de botella desde la escritura del código hacia su verificación.</w:t>
       </w:r>
     </w:p>
     <w:p>
@@ -629,7 +629,7 @@
         <w:t>indecidibilidad</w:t>
       </w:r>
       <w:r>
-        <w:t xml:space="preserve">. En 1936, Turing demostró que el problema de la detención es indecidible: ningún algoritmo puede determinar, para todo programa y entrada, si ese programa terminará o correrá indefinidamente (Turing, 1936). El teorema de Rice (1953) lo generaliza: </w:t>
+        <w:t xml:space="preserve">. En 1936, Turing demostró que el problema de la detención es indecidible: ningún algoritmo puede determinar, para todo programa y entrada, si terminará o correrá indefinidamente (Turing, 1936). El teorema de Rice (1953) lo generaliza: </w:t>
       </w:r>
       <w:r>
         <w:rPr>
@@ -638,7 +638,7 @@
         <w:t>toda</w:t>
       </w:r>
       <w:r>
-        <w:t xml:space="preserve"> propiedad semántica no trivial de un programa —como "¿está libre de cierto error?" o "¿cumple su especificación?"— es indecidible. La implicación es directa: ninguna IA puede verificar, de forma general y automática, si un programa arbitrario satisface su especificación. La verificación seguirá exigiendo juicio humano y herramientas que solo funcionan restringiendo el problema o renunciando a la completitud.</w:t>
+        <w:t xml:space="preserve"> propiedad semántica no trivial de un programa —como "¿está libre de cierto error?" o "¿cumple su especificación?"— es indecidible. Por tanto, ninguna IA puede verificar de forma general y automática si un programa arbitrario satisface su especificación: la verificación seguirá exigiendo juicio humano y herramientas que solo funcionan restringiendo el problema o renunciando a la completitud.</w:t>
       </w:r>
     </w:p>
     <w:p>
@@ -676,7 +676,7 @@
         <w:jc w:val="both"/>
       </w:pPr>
       <w:r>
-        <w:t xml:space="preserve">La tercera barrera concierne al lenguaje. La jerarquía de Chomsky (1956) ordena los lenguajes formales según su poder generativo, y los de programación pertenecen, en su sintaxis, a los libres de contexto: formales, precisos, analizables sin ambigüedad. El lenguaje natural —y las instrucciones que un humano da a un LLM— es, en cambio, ambiguo y dependiente del contexto. El rol perdurable del ingeniero es el de traductor entre ambos mundos: convertir la intención humana, informal e incompleta, en una especificación formal ejecutable. No es una analogía: trabajos recientes muestran que los propios </w:t>
+        <w:t xml:space="preserve">La tercera barrera concierne al lenguaje. La jerarquía de Chomsky (1956) ordena los lenguajes formales según su poder generativo, y los de programación pertenecen, en su sintaxis, a los libres de contexto: formales, precisos, analizables sin ambigüedad. El lenguaje natural —y las instrucciones que un humano da a un LLM— es, en cambio, ambiguo y dependiente del contexto. El rol perdurable del ingeniero es el de traductor: convertir la intención humana, informal e incompleta, en una especificación formal ejecutable. No es una analogía: los propios </w:t>
       </w:r>
       <w:r>
         <w:rPr>
@@ -685,7 +685,7 @@
         <w:t>transformers</w:t>
       </w:r>
       <w:r>
-        <w:t xml:space="preserve"> están acotados por la jerarquía de Chomsky y, bajo supuestos realistas de precisión, pertenecen a la clase TC⁰, incapaz de reconocer gramáticas libres de contexto arbitrarias (Delétang et al., 2023; Merrill y Sabharwal, 2023). La teoría de lenguajes formales describe, así, los límites concretos de la IA que el ingeniero debe conocer.</w:t>
+        <w:t xml:space="preserve"> están acotados por la jerarquía de Chomsky y, bajo supuestos realistas de precisión, pertenecen a la clase TC⁰, incapaz de reconocer gramáticas libres de contexto arbitrarias (Delétang et al., 2023; Merrill y Sabharwal, 2023).</w:t>
       </w:r>
     </w:p>
     <w:p>
@@ -786,7 +786,7 @@
         <w:t>teoría</w:t>
       </w:r>
       <w:r>
-        <w:t xml:space="preserve"> del problema que reside en la mente del equipo y que el código no captura. Allí reside el corazón irreductible de la ingeniería.</w:t>
+        <w:t xml:space="preserve"> del problema que reside en la mente del equipo. Allí reside el corazón irreductible de la ingeniería.</w:t>
       </w:r>
     </w:p>
     <w:p>
@@ -811,7 +811,7 @@
         <w:jc w:val="both"/>
       </w:pPr>
       <w:r>
-        <w:t>Si la teoría garantiza un núcleo humano, la economía explica por qué probablemente se ampliará. La "paradoja de Jevons" ofrece una guía: cuando una tecnología abarata un recurso, su consumo total tiende a aumentar. Los cajeros automáticos son paradigmáticos: lejos de eliminarlos, abarataron operar una sucursal, los bancos abrieron más y el empleo creció (Bessen, 2015). En el software la lógica es análoga: al abaratarse la producción, la demanda —y la de quienes lo diseñan y controlan— podría crecer (Acemoglu y Restrepo, 2019; Autor, 2015). Thomas Dohmke, entonces director de GitHub, proyectó "mil millones de desarrolladores habilitados por miles de millones de agentes de IA" (Dohmke, 2025).</w:t>
+        <w:t>Si la teoría garantiza un núcleo humano, la economía explica por qué podría ampliarse. La "paradoja de Jevons" ofrece una guía: cuando una tecnología abarata un recurso, su consumo total tiende a aumentar. Los cajeros automáticos son paradigmáticos: lejos de eliminarlos, abarataron la sucursal, los bancos abrieron más y el empleo creció (Bessen, 2015). En el software la lógica es análoga: al abaratarse la producción, la demanda —y la de quienes lo diseñan y controlan— podría crecer (Acemoglu y Restrepo, 2019; Autor, 2015). Thomas Dohmke, entonces director de GitHub, proyectó "mil millones de desarrolladores habilitados por miles de millones de agentes de IA" (Dohmke, 2025).</w:t>
       </w:r>
     </w:p>
     <w:p>
@@ -866,7 +866,7 @@
         <w:t>decidir</w:t>
       </w:r>
       <w:r>
-        <w:t xml:space="preserve"> bajo restricciones de intratabilidad y de valores. Es el "30 % difícil" de Osmani vuelto centro de gravedad de la profesión. Las proyecciones lo confirman: cerca del 40 % de las habilidades cambiarán hacia 2030, con el pensamiento analítico, la IA y la ciberseguridad entre las más demandadas (World Economic Forum, 2025); y marcos como el SWEBOK (Washizaki, 2024) ya definen la ingeniería muy por encima de la codificación, abarcando requisitos, arquitectura, validación y seguridad.</w:t>
+        <w:t xml:space="preserve"> bajo restricciones de intratabilidad y de valores. Es el "30 % difícil" de Osmani vuelto centro de gravedad de la profesión. Las proyecciones lo confirman: cerca del 40 % de las habilidades cambiarán hacia 2030, con el pensamiento analítico, la IA y la ciberseguridad entre las más demandadas (World Economic Forum, 2025); y marcos como el SWEBOK (Washizaki, 2024) ya definen la ingeniería muy por encima de la codificación.</w:t>
       </w:r>
     </w:p>
     <w:p>
@@ -876,7 +876,7 @@
         <w:jc w:val="both"/>
       </w:pPr>
       <w:r>
-        <w:t xml:space="preserve">Proyectada a 2035, esa transformación apunta a un ingeniero que orquesta flotas de agentes autónomos más que a uno que teclea funciones: define la intención, descompone el problema, delega la ejecución en la IA y concentra su atención en revisar, integrar y responder por el resultado. Kent Beck, creador del desarrollo guiado por pruebas, lo expresó al constatar que "el 90 % de mis habilidades hoy valen 0 dólares", mientras que el 10 % restante —visión, diseño y control de la complejidad— pasó a valer mil veces más (Beck, 2023). Y Martin Fowler advierte sobre la naturaleza del salto: los LLM introducen una abstracción </w:t>
+        <w:t xml:space="preserve">Proyectada a 2035, esa transformación apunta a un ingeniero que orquesta flotas de agentes autónomos más que a uno que teclea funciones: define la intención, descompone el problema, delega la ejecución en la IA y se concentra en revisar, integrar y responder por el resultado. Kent Beck, creador del desarrollo guiado por pruebas, lo expresó al constatar que "el 90 % de mis habilidades hoy valen 0 dólares", mientras que el 10 % restante —visión, diseño y control de la complejidad— pasó a valer mil veces más (Beck, 2023). Y Martin Fowler advierte que los LLM introducen una abstracción </w:t>
       </w:r>
       <w:r>
         <w:rPr>
@@ -885,7 +885,7 @@
         <w:t>no determinista</w:t>
       </w:r>
       <w:r>
-        <w:t>, sin la reproducibilidad de un compilador, comparable en magnitud al paso del ensamblador a los lenguajes de alto nivel (Fowler, 2025). El nuevo peldaño no elimina el juicio humano: lo vuelve más abstracto, más arriesgado y más decisivo.</w:t>
+        <w:t>, sin la reproducibilidad de un compilador, comparable en magnitud al paso del ensamblador a los lenguajes de alto nivel (Fowler, 2025). El nuevo peldaño no elimina el juicio: lo vuelve más abstracto y más decisivo.</w:t>
       </w:r>
     </w:p>
     <w:p>
@@ -895,7 +895,7 @@
         <w:jc w:val="both"/>
       </w:pPr>
       <w:r>
-        <w:t>Los datos laborales, sin embargo, advierten que la transición no será indolora ni uniforme. La Oficina de Estadísticas Laborales de EE. UU. proyecta un crecimiento del empleo de "desarrolladores de software" cercano al 15 % entre 2024 y 2034, mientras "programadores" se contraería un 6 % (Bureau of Labor Statistics, 2025): se automatiza codificar, no diseñar y decidir. Un estudio de Stanford halló, además, caídas del 13-16 % en el empleo de carrera temprana (22-25 años) de las ocupaciones más expuestas a la IA, mientras los experimentados se mantenían estables (Brynjolfsson et al., 2025). La "puerta de entrada" junior se estrecha y la demanda se desplaza hacia perfiles con criterio: las competencias del nuevo rol.</w:t>
+        <w:t>Los datos laborales, sin embargo, advierten que la transición no será indolora ni uniforme. La Oficina de Estadísticas Laborales de EE. UU. proyecta un alza cercana al 15 % en "desarrolladores de software" (2024-2034), mientras "programadores" se contraería un 6 % (Bureau of Labor Statistics, 2025): se automatiza codificar, no diseñar y decidir. Un estudio de Stanford halló, además, caídas del 13-16 % en el empleo de carrera temprana (22-25 años) de las ocupaciones más expuestas a la IA, mientras los experimentados se mantenían estables (Brynjolfsson et al., 2025). La "puerta de entrada" junior se estrecha y la demanda se desplaza hacia perfiles con criterio: las del nuevo rol.</w:t>
       </w:r>
     </w:p>
     <w:p>
@@ -1028,7 +1028,7 @@
         <w:jc w:val="both"/>
       </w:pPr>
       <w:r>
-        <w:t>Como toda proyección, depende de quienes la construyen, cuyas opiniones, aunque dispares, convergen en un punto. En el extremo más audaz, Dario Amodei (Anthropic) pronosticó en 2025 que la IA escribiría el 90 % del código en meses y "esencialmente todo" en un año, pero aclaró que "el programador todavía debe especificar (…) las decisiones generales de diseño" (Council on Foreign Relations, 2025). Andrej Karpathy describió el "Software 3.0", en el que "programamos las computadoras en inglés", y popularizó el "vibe coding" (Karpathy, 2025).</w:t>
+        <w:t>Como toda proyección, depende de quienes la construyen, cuyas opiniones, aunque dispares, convergen en un punto. Dario Amodei (Anthropic) pronosticó en 2025 que la IA escribiría el 90 % del código en meses y "esencialmente todo" en un año, pero aclaró que "el programador todavía debe especificar (…) las decisiones generales de diseño" (Council on Foreign Relations, 2025). Karpathy describió el "Software 3.0" —"programamos las computadoras en inglés"— y popularizó el "vibe coding" (Karpathy, 2025).</w:t>
       </w:r>
     </w:p>
     <w:p>
@@ -1039,6 +1039,16 @@
       </w:pPr>
       <w:r>
         <w:t>No todas las voces comparten ese optimismo. Grady Booch, coautor de UML, replicó que tales pronósticos revelan "una incomprensión fundamental de lo que es la ingeniería de software": "tus herramientas están cambiando, pero tus problemas no" (Booch, 2026). Bjarne Stroustrup, creador de C++, advirtió que el riesgo no es tanto el reemplazo como que los programadores "pierdan la capacidad de detectar problemas por estar tan acostumbrados a que se los resuelvan" (Stroustrup, 2025), un peligro que la sección anterior fundamenta teóricamente.</w:t>
+      </w:r>
+    </w:p>
+    <w:p>
+      <w:pPr>
+        <w:spacing w:line="360" w:lineRule="auto" w:after="120"/>
+        <w:ind w:firstLine="576"/>
+        <w:jc w:val="both"/>
+      </w:pPr>
+      <w:r>
+        <w:t>Existe, además, un bando que anticipa no una transformación sino un reemplazo. Amodei advirtió que la IA podría eliminar la mitad de los empleos administrativos de nivel inicial en uno a cinco años y elevar el desempleo al 10-20 % (VandeHei y Allen, 2025); Zuckerberg proyectó que cubriría el trabajo de los ingenieros de nivel medio de Meta, y Salesforce congeló la contratación de ingenieros en 2025 tras reportar un 30 % más de productividad (The San Francisco Standard, 2025). En clave académica, Frey y Osborne (2017) estimaron en un 47 % el empleo estadounidense en alto riesgo. No conviene minimizarlas, pero admiten reparos: aquel estudio medía ocupaciones enteras, no tareas, y trabajos posteriores lo corrigieron a la baja; las predicciones de directivos cargan un interés comercial evidente —Salesforce sigue empleando unos 15.000 ingenieros y Benioff admite que la IA aún no los sustituye—; y el desplazamiento golpea la tarea rutinaria de codificar, no el juicio de especificar, validar y decidir que el apartado IV vuelve irreductible.</w:t>
       </w:r>
     </w:p>
     <w:p>
@@ -1107,7 +1117,7 @@
         <w:jc w:val="both"/>
       </w:pPr>
       <w:r>
-        <w:t>El recorrido confirma, con matices, la hipótesis inicial. En la próxima década el ingeniero informático no será reemplazado por la IA, pero su rol se transformará: el centro de gravedad de la profesión pasará de la ejecución técnica —escribir código línea por línea— a la especificación, el diseño, la integración y, sobre todo, la validación y supervisión crítica de sistemas cada vez más autónomos. La historia respalda esta lectura, pues cada abstracción anterior elevó al ingeniero en lugar de eliminarlo; la evidencia reciente la matiza, al mostrar que la IA acelera la producción pero degrada la garantía de corrección; y la teoría de la computación la fundamenta: la verificación universal (Rice y Turing), la resolución eficiente de todo problema (P vs. NP) y la traducción de la intención ambigua al lenguaje formal (Chomsky) no son tareas que una máquina pueda asumir por completo.</w:t>
+        <w:t>El recorrido confirma, con matices, la hipótesis inicial. En la próxima década el ingeniero informático no será reemplazado por la IA, pero su rol se transformará: el centro de gravedad de la profesión pasará de la ejecución técnica —escribir código línea por línea— a la especificación, el diseño, la integración y, sobre todo, la validación y supervisión crítica de sistemas cada vez más autónomos. La historia lo respalda, pues cada abstracción previa elevó al ingeniero en vez de eliminarlo; la evidencia reciente lo matiza, pues la IA acelera la producción pero degrada la garantía de corrección; y la teoría de la computación lo fundamenta: la verificación universal (Rice y Turing), la resolución eficiente de todo problema (P vs. NP) y la traducción de la intención ambigua al lenguaje formal (Chomsky) no son tareas que una máquina pueda asumir por completo.</w:t>
       </w:r>
     </w:p>
     <w:p>
@@ -1465,25 +1475,6 @@
         <w:jc w:val="left"/>
       </w:pPr>
       <w:r>
-        <w:t xml:space="preserve">DORA. (2024). </w:t>
-      </w:r>
-      <w:r>
-        <w:rPr>
-          <w:i/>
-        </w:rPr>
-        <w:t>Accelerate state of DevOps report 2024</w:t>
-      </w:r>
-      <w:r>
-        <w:t>. Google Cloud. https://dora.dev/research/2024/dora-report/</w:t>
-      </w:r>
-    </w:p>
-    <w:p>
-      <w:pPr>
-        <w:spacing w:line="360" w:lineRule="auto" w:after="120"/>
-        <w:ind w:left="720" w:hanging="720"/>
-        <w:jc w:val="left"/>
-      </w:pPr>
-      <w:r>
         <w:t xml:space="preserve">Fowler, M. (2025, 24 de junio). </w:t>
       </w:r>
       <w:r>
@@ -1503,16 +1494,16 @@
         <w:jc w:val="left"/>
       </w:pPr>
       <w:r>
-        <w:t xml:space="preserve">GitClear. (2025). </w:t>
+        <w:t xml:space="preserve">Frey, C. B., &amp; Osborne, M. A. (2017). The future of employment: How susceptible are jobs to computerisation? </w:t>
       </w:r>
       <w:r>
         <w:rPr>
           <w:i/>
         </w:rPr>
-        <w:t>AI copilot code quality: 2025 research</w:t>
+        <w:t>Technological Forecasting and Social Change, 114</w:t>
       </w:r>
       <w:r>
-        <w:t>. https://www.gitclear.com/ai_assistant_code_quality_2025_research</w:t>
+        <w:t>, 254-280. https://doi.org/10.1016/j.techfore.2016.08.019</w:t>
       </w:r>
     </w:p>
     <w:p>
@@ -1570,25 +1561,6 @@
       </w:r>
       <w:r>
         <w:t xml:space="preserve"> (pp. 21558-21572). https://doi.org/10.48550/arXiv.2305.01210</w:t>
-      </w:r>
-    </w:p>
-    <w:p>
-      <w:pPr>
-        <w:spacing w:line="360" w:lineRule="auto" w:after="120"/>
-        <w:ind w:left="720" w:hanging="720"/>
-        <w:jc w:val="left"/>
-      </w:pPr>
-      <w:r>
-        <w:t xml:space="preserve">McKinsey &amp; Company. (2023, 27 de junio). </w:t>
-      </w:r>
-      <w:r>
-        <w:rPr>
-          <w:i/>
-        </w:rPr>
-        <w:t>Unleashing developer productivity with generative AI</w:t>
-      </w:r>
-      <w:r>
-        <w:t>. https://www.mckinsey.com/capabilities/mckinsey-digital/our-insights/unleashing-developer-productivity-with-generative-ai</w:t>
       </w:r>
     </w:p>
     <w:p>
@@ -1769,6 +1741,25 @@
         <w:jc w:val="left"/>
       </w:pPr>
       <w:r>
+        <w:t xml:space="preserve">The San Francisco Standard. (2025, 27 de febrero). </w:t>
+      </w:r>
+      <w:r>
+        <w:rPr>
+          <w:i/>
+        </w:rPr>
+        <w:t>Marc Benioff: Salesforce will hire no engineers in 2025 due to AI</w:t>
+      </w:r>
+      <w:r>
+        <w:t>. https://sfstandard.com/2025/02/27/salesforce-marcbenioff-layoffs-tech-agents/</w:t>
+      </w:r>
+    </w:p>
+    <w:p>
+      <w:pPr>
+        <w:spacing w:line="360" w:lineRule="auto" w:after="120"/>
+        <w:ind w:left="720" w:hanging="720"/>
+        <w:jc w:val="left"/>
+      </w:pPr>
+      <w:r>
         <w:t xml:space="preserve">Shen, J. H., &amp; Tamkin, A. (2026). </w:t>
       </w:r>
       <w:r>
@@ -1874,6 +1865,25 @@
       </w:r>
       <w:r>
         <w:t>(1), 230-265. https://doi.org/10.1112/plms/s2-42.1.230</w:t>
+      </w:r>
+    </w:p>
+    <w:p>
+      <w:pPr>
+        <w:spacing w:line="360" w:lineRule="auto" w:after="120"/>
+        <w:ind w:left="720" w:hanging="720"/>
+        <w:jc w:val="left"/>
+      </w:pPr>
+      <w:r>
+        <w:t xml:space="preserve">VandeHei, J., &amp; Allen, M. (2025, 28 de mayo). </w:t>
+      </w:r>
+      <w:r>
+        <w:rPr>
+          <w:i/>
+        </w:rPr>
+        <w:t>Behind the curtain: A white-collar bloodbath</w:t>
+      </w:r>
+      <w:r>
+        <w:t>. Axios. https://www.axios.com/2025/05/28/ai-jobs-white-collar-unemployment-anthropic</w:t>
       </w:r>
     </w:p>
     <w:p>

</xml_diff>

<commit_message>
Integrar las conclusiones del panel: núcleo blindado, eje distributivo y pipeline cognitivo
- Sección IV: reformula el "núcleo irreductible" como su versión
  blindada (alto riesgo + responsabilidad legal no delegable), que
  absorbe la objeción de que la verificación acotada se automatiza
- Sección V: el cierre de la puerta junior se enmarca también como
  riesgo cognitivo (faltan expertos para auditar la IA) y distributivo
  (el valor puede migrar al tooling aun con pleno empleo)
- Reescritura net-neutral para respetar el tope de 3.000 (2.996);
  se quita la cita de hype de Dohmke y se aprietan varios pasajes
- 44 referencias, sin citas huérfanas; .docx regenerado

Co-Authored-By: Claude Opus 4.8 <noreply@anthropic.com>
Claude-Session: https://claude.ai/code/session_01GRUp5qFeKJME8uZW1YQ6nF
</commit_message>
<xml_diff>
--- a/Paper_Rol_del_ingeniero_informatico_en_10_anios.docx
+++ b/Paper_Rol_del_ingeniero_informatico_en_10_anios.docx
@@ -786,7 +786,16 @@
         <w:t>teoría</w:t>
       </w:r>
       <w:r>
-        <w:t xml:space="preserve"> del problema que reside en la mente del equipo. Allí reside el corazón irreductible de la ingeniería.</w:t>
+        <w:t xml:space="preserve"> del problema que reside en la mente del equipo. Ahí reside el corazón irreductible de la ingeniería: no en </w:t>
+      </w:r>
+      <w:r>
+        <w:rPr>
+          <w:i/>
+        </w:rPr>
+        <w:t>toda</w:t>
+      </w:r>
+      <w:r>
+        <w:t xml:space="preserve"> la programación —la verificación acotada y de bajo riesgo se automatiza— sino en su franja crítica, donde la indecidibilidad se cruza con sistemas de alto riesgo y con una responsabilidad que ninguna norma legal admite delegar en una máquina.</w:t>
       </w:r>
     </w:p>
     <w:p>
@@ -811,7 +820,7 @@
         <w:jc w:val="both"/>
       </w:pPr>
       <w:r>
-        <w:t>Si la teoría garantiza un núcleo humano, la economía explica por qué podría ampliarse. La "paradoja de Jevons" ofrece una guía: cuando una tecnología abarata un recurso, su consumo total tiende a aumentar. Los cajeros automáticos son paradigmáticos: lejos de eliminarlos, abarataron la sucursal, los bancos abrieron más y el empleo creció (Bessen, 2015). En el software la lógica es análoga: al abaratarse la producción, la demanda —y la de quienes lo diseñan y controlan— podría crecer (Acemoglu y Restrepo, 2019; Autor, 2015). Thomas Dohmke, entonces director de GitHub, proyectó "mil millones de desarrolladores habilitados por miles de millones de agentes de IA" (Dohmke, 2025).</w:t>
+        <w:t>Si la teoría garantiza un núcleo humano, la economía explica por qué podría ampliarse. La "paradoja de Jevons" ofrece una guía: cuando una tecnología abarata un recurso, su consumo total tiende a aumentar. Los cajeros automáticos son paradigmáticos: lejos de eliminarlos, abarataron la sucursal, los bancos abrieron más y el empleo creció (Bessen, 2015). En el software la lógica es análoga: al abaratarse la producción, la demanda —y la de quienes lo diseñan y controlan— podría crecer (Acemoglu y Restrepo, 2019; Autor, 2015).</w:t>
       </w:r>
     </w:p>
     <w:p>
@@ -830,7 +839,7 @@
         <w:t>especificar</w:t>
       </w:r>
       <w:r>
-        <w:t xml:space="preserve"> qué debe hacer el sistema (la complejidad esencial de Brooks); </w:t>
+        <w:t xml:space="preserve"> qué debe hacer el sistema; </w:t>
       </w:r>
       <w:r>
         <w:rPr>
@@ -857,7 +866,7 @@
         <w:t>supervisar</w:t>
       </w:r>
       <w:r>
-        <w:t xml:space="preserve"> sistemas autónomos en su seguridad, sesgo e impacto; y </w:t>
+        <w:t xml:space="preserve"> sistemas autónomos (seguridad, sesgo, impacto); y </w:t>
       </w:r>
       <w:r>
         <w:rPr>
@@ -866,7 +875,7 @@
         <w:t>decidir</w:t>
       </w:r>
       <w:r>
-        <w:t xml:space="preserve"> bajo restricciones de intratabilidad y de valores. Es el "30 % difícil" de Osmani vuelto centro de gravedad de la profesión. Las proyecciones lo confirman: cerca del 40 % de las habilidades cambiarán hacia 2030, con el pensamiento analítico, la IA y la ciberseguridad entre las más demandadas (World Economic Forum, 2025); y marcos como el SWEBOK (Washizaki, 2024) ya definen la ingeniería muy por encima de la codificación.</w:t>
+        <w:t xml:space="preserve"> bajo restricciones de intratabilidad y de valores. Es el "30 % difícil" de Osmani vuelto centro de gravedad de la profesión. Las proyecciones lo confirman: cerca del 40 % de las habilidades cambiarán hacia 2030 (World Economic Forum, 2025), y marcos como el SWEBOK (Washizaki, 2024) ya definen la ingeniería muy por encima de la codificación.</w:t>
       </w:r>
     </w:p>
     <w:p>
@@ -876,7 +885,7 @@
         <w:jc w:val="both"/>
       </w:pPr>
       <w:r>
-        <w:t xml:space="preserve">Proyectada a 2035, esa transformación apunta a un ingeniero que orquesta flotas de agentes autónomos más que a uno que teclea funciones: define la intención, descompone el problema, delega la ejecución en la IA y se concentra en revisar, integrar y responder por el resultado. Kent Beck, creador del desarrollo guiado por pruebas, lo expresó al constatar que "el 90 % de mis habilidades hoy valen 0 dólares", mientras que el 10 % restante —visión, diseño y control de la complejidad— pasó a valer mil veces más (Beck, 2023). Y Martin Fowler advierte que los LLM introducen una abstracción </w:t>
+        <w:t xml:space="preserve">Proyectada a 2035, esa transformación apunta a un ingeniero que orquesta flotas de agentes más que a uno que teclea funciones: define la intención, delega la ejecución y se concentra en revisar, integrar y responder por el resultado. Kent Beck lo expresó al constatar que "el 90 % de mis habilidades hoy valen 0 dólares", mientras que el 10 % restante —visión, diseño y control de la complejidad— pasó a valer mil veces más (Beck, 2023). Y Martin Fowler advierte que los LLM introducen una abstracción </w:t>
       </w:r>
       <w:r>
         <w:rPr>
@@ -885,7 +894,7 @@
         <w:t>no determinista</w:t>
       </w:r>
       <w:r>
-        <w:t>, sin la reproducibilidad de un compilador, comparable en magnitud al paso del ensamblador a los lenguajes de alto nivel (Fowler, 2025). El nuevo peldaño no elimina el juicio: lo vuelve más abstracto y más decisivo.</w:t>
+        <w:t>, sin la reproducibilidad de un compilador, comparable al paso del ensamblador a los lenguajes de alto nivel (Fowler, 2025). El nuevo peldaño no elimina el juicio: lo vuelve más abstracto y decisivo.</w:t>
       </w:r>
     </w:p>
     <w:p>
@@ -895,7 +904,16 @@
         <w:jc w:val="both"/>
       </w:pPr>
       <w:r>
-        <w:t>Los datos laborales, sin embargo, advierten que la transición no será indolora ni uniforme. La Oficina de Estadísticas Laborales de EE. UU. proyecta un alza cercana al 15 % en "desarrolladores de software" (2024-2034), mientras "programadores" se contraería un 6 % (Bureau of Labor Statistics, 2025): se automatiza codificar, no diseñar y decidir. Un estudio de Stanford halló, además, caídas del 13-16 % en el empleo de carrera temprana (22-25 años) de las ocupaciones más expuestas a la IA, mientras los experimentados se mantenían estables (Brynjolfsson et al., 2025). La "puerta de entrada" junior se estrecha y la demanda se desplaza hacia perfiles con criterio: las del nuevo rol.</w:t>
+        <w:t xml:space="preserve">Los datos laborales, sin embargo, advierten que la transición no será indolora ni uniforme. La Oficina de Estadísticas Laborales de EE. UU. proyecta un alza cercana al 15 % en "desarrolladores de software" (2024-2034), mientras "programadores" se contraería un 6 % (Bureau of Labor Statistics, 2025): se automatiza codificar, no diseñar y decidir. Un estudio de Stanford halló, además, caídas del 13-16 % en el empleo de carrera temprana (22-25 años) de las ocupaciones más expuestas a la IA, mientras los experimentados se mantenían estables (Brynjolfsson et al., 2025). La "puerta de entrada" junior se estrecha, y su cierre no es solo laboral sino </w:t>
+      </w:r>
+      <w:r>
+        <w:rPr>
+          <w:i/>
+        </w:rPr>
+        <w:t>cognitivo</w:t>
+      </w:r>
+      <w:r>
+        <w:t>: si la IA absorbe las tareas donde se forma el criterio, faltarán los expertos capaces de auditarla. Y aun conservando el empleo, el ingeniero afronta un riesgo distributivo: que el valor migre hacia quienes proveen las herramientas de IA.</w:t>
       </w:r>
     </w:p>
     <w:p>
@@ -1028,7 +1046,7 @@
         <w:jc w:val="both"/>
       </w:pPr>
       <w:r>
-        <w:t>Como toda proyección, depende de quienes la construyen, cuyas opiniones, aunque dispares, convergen en un punto. Dario Amodei (Anthropic) pronosticó en 2025 que la IA escribiría el 90 % del código en meses y "esencialmente todo" en un año, pero aclaró que "el programador todavía debe especificar (…) las decisiones generales de diseño" (Council on Foreign Relations, 2025). Karpathy describió el "Software 3.0" —"programamos las computadoras en inglés"— y popularizó el "vibe coding" (Karpathy, 2025).</w:t>
+        <w:t>Como toda proyección, depende de quienes la construyen, cuyas opiniones, aunque dispares, convergen en un punto. Dario Amodei (Anthropic) pronosticó en 2025 que la IA escribiría el 90 % del código en meses y "esencialmente todo" en un año, pero aclaró que "el programador todavía debe especificar (…) las decisiones generales de diseño" (Council on Foreign Relations, 2025). Karpathy describió el "Software 3.0" y popularizó el "vibe coding" (Karpathy, 2025).</w:t>
       </w:r>
     </w:p>
     <w:p>
@@ -1038,7 +1056,7 @@
         <w:jc w:val="both"/>
       </w:pPr>
       <w:r>
-        <w:t>No todas las voces comparten ese optimismo. Grady Booch, coautor de UML, replicó que tales pronósticos revelan "una incomprensión fundamental de lo que es la ingeniería de software": "tus herramientas están cambiando, pero tus problemas no" (Booch, 2026). Bjarne Stroustrup, creador de C++, advirtió que el riesgo no es tanto el reemplazo como que los programadores "pierdan la capacidad de detectar problemas por estar tan acostumbrados a que se los resuelvan" (Stroustrup, 2025), un peligro que la sección anterior fundamenta teóricamente.</w:t>
+        <w:t>No todas las voces comparten ese optimismo. Grady Booch, coautor de UML, replicó que tales pronósticos revelan "una incomprensión fundamental de lo que es la ingeniería de software": "tus herramientas están cambiando, pero tus problemas no" (Booch, 2026). Bjarne Stroustrup, creador de C++, advirtió que el riesgo no es tanto el reemplazo como que los programadores "pierdan la capacidad de detectar problemas por estar tan acostumbrados a que se los resuelvan" (Stroustrup, 2025), un peligro que el apartado IV fundamenta.</w:t>
       </w:r>
     </w:p>
     <w:p>
@@ -1058,7 +1076,7 @@
         <w:jc w:val="both"/>
       </w:pPr>
       <w:r>
-        <w:t>Sam Altman, de OpenAI, ofrece quizás la síntesis más equilibrada: "cada ingeniero de software hará, durante un buen tiempo, muchísimo más" (Thompson, 2025), y "mucha más gente podrá crear software, pero los expertos seguirán siendo mucho mejores que los novatos, si adoptan las nuevas herramientas" (Altman, 2025). La IA no anula al ingeniero: amplifica al que sabe usarla. Incluso las voces más optimistas reservan para el humano las tareas de especificar, decidir y juzgar —las mismas que la teoría de la computación demuestra que no pueden automatizarse.</w:t>
+        <w:t>Sam Altman (OpenAI) ofrece la síntesis más equilibrada: "cada ingeniero de software hará, durante un buen tiempo, muchísimo más" (Thompson, 2025), y "los expertos seguirán siendo mucho mejores que los novatos, si adoptan las nuevas herramientas" (Altman, 2025). La IA no anula al ingeniero: amplifica al que sabe usarla. Incluso las voces más optimistas reservan para el humano las tareas de especificar, decidir y juzgar —las mismas que la teoría de la computación demuestra que no pueden automatizarse.</w:t>
       </w:r>
     </w:p>
     <w:p>
@@ -1127,7 +1145,7 @@
         <w:jc w:val="both"/>
       </w:pPr>
       <w:r>
-        <w:t>La paradoja final es esperanzadora: cuanto más poderosa se vuelve la automatización, más valioso se torna el juicio humano que decide qué automatizar, cómo validarlo y para qué fin. El ingeniero del futuro será menos un escriba de instrucciones y más un arquitecto, un auditor y un responsable último de sistemas que ni él ni la máquina pueden comprender por completo. La teoría de la computación, lejos de anunciar el fin de la profesión, traza el contorno preciso de su porvenir.</w:t>
+        <w:t>La paradoja final es esperanzadora: cuanto más poderosa se vuelve la automatización, más valioso se torna el juicio humano que decide qué automatizar, cómo validarlo y para qué fin. El ingeniero del futuro será menos un escriba de instrucciones y más un arquitecto, un auditor y un responsable último de sistemas que ni él ni la máquina comprenden del todo. La teoría de la computación, lejos de anunciar el fin de la profesión, traza el contorno de su porvenir.</w:t>
       </w:r>
     </w:p>
     <w:p>
@@ -1447,25 +1465,6 @@
       </w:r>
       <w:r>
         <w:t>(10), 859-866. https://doi.org/10.1145/355604.361591</w:t>
-      </w:r>
-    </w:p>
-    <w:p>
-      <w:pPr>
-        <w:spacing w:line="360" w:lineRule="auto" w:after="120"/>
-        <w:ind w:left="720" w:hanging="720"/>
-        <w:jc w:val="left"/>
-      </w:pPr>
-      <w:r>
-        <w:t xml:space="preserve">Dohmke, T. (2025, 11 de agosto). </w:t>
-      </w:r>
-      <w:r>
-        <w:rPr>
-          <w:i/>
-        </w:rPr>
-        <w:t>Auf Wiedersehen, GitHub</w:t>
-      </w:r>
-      <w:r>
-        <w:t>. The GitHub Blog. https://github.blog/news-insights/company-news/goodbye-github/</w:t>
       </w:r>
     </w:p>
     <w:p>

</xml_diff>

<commit_message>
Generar PDF final, cargar datos de portada y pulir redacción
- Portada: Integrantes (Martín Ezequiel Pulitano y Nicolás Silva),
  carrera (Ing. Informática, 3.er año) y materia; Profesor/a como
  línea a completar
- build_pdf.py: genera el PDF nativo (Liberation Serif ≈ Times, figuras
  embebidas, bibliografía con sangría francesa, numeración de página);
  no depende de LibreOffice
- Revisión de redacción: nombres propios completos en primera mención
  (Sundar Pichai, Satya Nadella, Andrej Karpathy, Mark Zuckerberg) y
  ajustes de estilo; cuerpo en 2.998 palabras (máx. 3.000)
- README actualizado

Co-Authored-By: Claude Opus 4.8 <noreply@anthropic.com>
Claude-Session: https://claude.ai/code/session_01GRUp5qFeKJME8uZW1YQ6nF
</commit_message>
<xml_diff>
--- a/Paper_Rol_del_ingeniero_informatico_en_10_anios.docx
+++ b/Paper_Rol_del_ingeniero_informatico_en_10_anios.docx
@@ -64,7 +64,7 @@
           <w:b w:val="0"/>
           <w:sz w:val="24"/>
         </w:rPr>
-        <w:t>Carrera de grado: Ingeniería Informática</w:t>
+        <w:t>Carrera: Ingeniería Informática (3.er año)</w:t>
       </w:r>
     </w:p>
     <w:p>
@@ -103,7 +103,7 @@
           <w:b w:val="0"/>
           <w:sz w:val="24"/>
         </w:rPr>
-        <w:t>Integrantes: ______________________________</w:t>
+        <w:t>Integrantes: Martín Ezequiel Pulitano y Nicolás Silva</w:t>
       </w:r>
     </w:p>
     <w:p>
@@ -207,7 +207,7 @@
         <w:jc w:val="both"/>
       </w:pPr>
       <w:r>
-        <w:t xml:space="preserve">Para sostenerla se recorre la historia de la profesión como sucesión de abstracciones (II), el estado actual de la IA (III) y los límites computacionales que explican </w:t>
+        <w:t xml:space="preserve">Para sostenerla se recorre la historia como sucesión de abstracciones (II), el estado actual de la IA (III) y los límites computacionales que explican </w:t>
       </w:r>
       <w:r>
         <w:rPr>
@@ -241,7 +241,7 @@
         <w:jc w:val="both"/>
       </w:pPr>
       <w:r>
-        <w:t>La historia del software puede leerse como el ascenso por una "escalera de abstracción" en la que cada peldaño automatizó el trabajo del anterior y, lejos de suprimir al ingeniero, lo elevó conceptualmente. Programar fue primero código máquina y ensamblador; el salto decisivo llegó con los lenguajes de alto nivel: FORTRAN (Backus, IBM, 1957) permitió expresar algoritmos en notación matemática y delegó el código de bajo nivel en un compilador; COBOL, inspirado en Grace Hopper, hizo lo propio para los negocios.</w:t>
+        <w:t>La historia del software puede leerse como el ascenso por una "escalera de abstracción" en la que cada peldaño automatizó el trabajo del anterior y, lejos de suprimir al ingeniero, lo elevó conceptualmente. Al principio, programar era escribir código máquina y ensamblador; el salto decisivo llegó con los lenguajes de alto nivel: FORTRAN (Backus, IBM, 1957) permitió expresar algoritmos en notación matemática y delegó el código de bajo nivel en un compilador; COBOL, inspirado en Grace Hopper, hizo lo propio para los negocios.</w:t>
       </w:r>
     </w:p>
     <w:p>
@@ -295,7 +295,7 @@
         <w:t>issues</w:t>
       </w:r>
       <w:r>
-        <w:t xml:space="preserve"> reales de software, el estado del arte pasó de ~14 % a comienzos de 2024 a más del 77 % a fines de 2025 (Anthropic, 2025): de uno de cada siete casos a más de tres de cada cuatro en menos de dos años. La adopción acompaña: GitHub Copilot superó los veinte millones de usuarios en 2025, Pichai afirmó en 2024 que la IA genera "más de una cuarta parte del código nuevo en Google" y Nadella la estimó entre el 20 % y el 30 % en Microsoft (Zeff, 2025). La encuesta de Stack Overflow (2025) confirma la masividad: el 84 % usa o planea usar IA, frente al 76 % anterior.</w:t>
+        <w:t xml:space="preserve"> reales de software, el estado del arte pasó de ~14 % a comienzos de 2024 a más del 77 % a fines de 2025 (Anthropic, 2025): de uno de cada siete casos a más de tres de cada cuatro en menos de dos años. La adopción acompaña: GitHub Copilot superó los veinte millones de usuarios en 2025, Sundar Pichai afirmó en 2024 que la IA genera "más de una cuarta parte del código nuevo en Google" y Satya Nadella la estimó entre el 20 % y el 30 % en Microsoft (Zeff, 2025). La encuesta de Stack Overflow (2025) confirma la masividad: el 84 % usa o planea usar IA, frente al 76 % anterior.</w:t>
       </w:r>
     </w:p>
     <w:p>
@@ -1046,7 +1046,7 @@
         <w:jc w:val="both"/>
       </w:pPr>
       <w:r>
-        <w:t>Como toda proyección, depende de quienes la construyen, cuyas opiniones, aunque dispares, convergen en un punto. Dario Amodei (Anthropic) pronosticó en 2025 que la IA escribiría el 90 % del código en meses y "esencialmente todo" en un año, pero aclaró que "el programador todavía debe especificar (…) las decisiones generales de diseño" (Council on Foreign Relations, 2025). Karpathy describió el "Software 3.0" y popularizó el "vibe coding" (Karpathy, 2025).</w:t>
+        <w:t>Como toda proyección, depende de quienes la construyen, cuyas opiniones, aunque dispares, convergen en un punto. Dario Amodei (Anthropic) pronosticó en 2025 que la IA escribiría el 90 % del código en meses y "esencialmente todo" en un año, pero aclaró que "el programador todavía debe especificar (…) las decisiones generales de diseño" (Council on Foreign Relations, 2025). Andrej Karpathy describió el "Software 3.0" y popularizó el "vibe coding" (Karpathy, 2025).</w:t>
       </w:r>
     </w:p>
     <w:p>
@@ -1066,7 +1066,7 @@
         <w:jc w:val="both"/>
       </w:pPr>
       <w:r>
-        <w:t>Existe, además, un bando que anticipa no una transformación sino un reemplazo. Amodei advirtió que la IA podría eliminar la mitad de los empleos administrativos de nivel inicial en uno a cinco años y elevar el desempleo al 10-20 % (VandeHei y Allen, 2025); Zuckerberg proyectó que cubriría el trabajo de los ingenieros de nivel medio de Meta, y Salesforce congeló la contratación de ingenieros en 2025 tras reportar un 30 % más de productividad (The San Francisco Standard, 2025). En clave académica, Frey y Osborne (2017) estimaron en un 47 % el empleo estadounidense en alto riesgo. No conviene minimizarlas, pero admiten reparos: aquel estudio medía ocupaciones enteras, no tareas, y trabajos posteriores lo corrigieron a la baja; las predicciones de directivos cargan un interés comercial evidente —Salesforce sigue empleando unos 15.000 ingenieros y Benioff admite que la IA aún no los sustituye—; y el desplazamiento golpea la tarea rutinaria de codificar, no el juicio de especificar, validar y decidir que el apartado IV vuelve irreductible.</w:t>
+        <w:t>Existe, además, un bando que anticipa no una transformación sino un reemplazo. Amodei advirtió que la IA podría eliminar la mitad de los empleos administrativos de nivel inicial en uno a cinco años y elevar el desempleo al 10-20 % (VandeHei y Allen, 2025); Mark Zuckerberg proyectó que cubriría el trabajo de los ingenieros de nivel medio de Meta, y Salesforce congeló la contratación de ingenieros en 2025 tras reportar un 30 % más de productividad (The San Francisco Standard, 2025). En clave académica, Frey y Osborne (2017) estimaron en un 47 % el empleo estadounidense en alto riesgo. No conviene minimizarlas, pero admiten reparos: aquel estudio medía ocupaciones enteras, no tareas, y trabajos posteriores lo corrigieron a la baja; las predicciones de directivos cargan un interés comercial evidente —Salesforce sigue empleando unos 15.000 ingenieros y Benioff admite que la IA aún no los sustituye—; y el desplazamiento golpea la tarea rutinaria de codificar, no el juicio de especificar, validar y decidir que el apartado IV vuelve irreductible.</w:t>
       </w:r>
     </w:p>
     <w:p>
@@ -1145,7 +1145,7 @@
         <w:jc w:val="both"/>
       </w:pPr>
       <w:r>
-        <w:t>La paradoja final es esperanzadora: cuanto más poderosa se vuelve la automatización, más valioso se torna el juicio humano que decide qué automatizar, cómo validarlo y para qué fin. El ingeniero del futuro será menos un escriba de instrucciones y más un arquitecto, un auditor y un responsable último de sistemas que ni él ni la máquina comprenden del todo. La teoría de la computación, lejos de anunciar el fin de la profesión, traza el contorno de su porvenir.</w:t>
+        <w:t>La paradoja final es esperanzadora: cuanto más poderosa se vuelve la automatización, más valioso es el juicio humano que decide qué automatizar, cómo validarlo y para qué fin. El ingeniero del futuro será menos un escriba de instrucciones y más un arquitecto, un auditor y un responsable último de sistemas que ni él ni la máquina comprenden del todo. La teoría de la computación, lejos de anunciar el fin de la profesión, traza el contorno de su porvenir.</w:t>
       </w:r>
     </w:p>
     <w:p>

</xml_diff>

<commit_message>
Actualizar SWE-bench a mediados de 2026 (Opus 4.8 y Fable 5)
- Figura 1: agrega los puntos de 2026 — Claude Opus 4.8 (88,6 %, may.)
  y Claude Fable 5 / clase Mythos (95 %, jun.); eje a 100 % y nota de
  saturación del benchmark
- Sección III y epígrafe: el estado del arte va de ~14 % (2024) a ~95 %
  (mediados de 2026); cita actualizada a Anthropic (2026, Fable 5)
- Cuerpo en 2.999 palabras (máx. 3.000); .docx y .pdf regenerados

Co-Authored-By: Claude Opus 4.8 <noreply@anthropic.com>
Claude-Session: https://claude.ai/code/session_01GRUp5qFeKJME8uZW1YQ6nF
</commit_message>
<xml_diff>
--- a/Paper_Rol_del_ingeniero_informatico_en_10_anios.docx
+++ b/Paper_Rol_del_ingeniero_informatico_en_10_anios.docx
@@ -295,7 +295,7 @@
         <w:t>issues</w:t>
       </w:r>
       <w:r>
-        <w:t xml:space="preserve"> reales de software, el estado del arte pasó de ~14 % a comienzos de 2024 a más del 77 % a fines de 2025 (Anthropic, 2025): de uno de cada siete casos a más de tres de cada cuatro en menos de dos años. La adopción acompaña: GitHub Copilot superó los veinte millones de usuarios en 2025, Sundar Pichai afirmó en 2024 que la IA genera "más de una cuarta parte del código nuevo en Google" y Satya Nadella la estimó entre el 20 % y el 30 % en Microsoft (Zeff, 2025). La encuesta de Stack Overflow (2025) confirma la masividad: el 84 % usa o planea usar IA, frente al 76 % anterior.</w:t>
+        <w:t xml:space="preserve"> reales de software, el estado del arte pasó de ~14 % a comienzos de 2024 a cerca del 95 % a mediados de 2026 (Anthropic, 2026): de uno de cada siete casos a más de nueve de cada diez en poco más de dos años. La adopción acompaña: GitHub Copilot superó los veinte millones de usuarios en 2025, Sundar Pichai afirmó en 2024 que la IA genera "más de una cuarta parte del código nuevo en Google" y Satya Nadella la estimó entre el 20 % y el 30 % en Microsoft (Zeff, 2025). La encuesta de Stack Overflow (2025) confirma la masividad: el 84 % usa o planea usar IA, frente al 76 % anterior.</w:t>
       </w:r>
     </w:p>
     <w:p>
@@ -306,7 +306,7 @@
       <w:r>
         <w:drawing>
           <wp:inline xmlns:a="http://schemas.openxmlformats.org/drawingml/2006/main" xmlns:pic="http://schemas.openxmlformats.org/drawingml/2006/picture">
-            <wp:extent cx="5394960" cy="2967228"/>
+            <wp:extent cx="5394960" cy="2760212"/>
             <wp:docPr id="1" name="Picture 1"/>
             <wp:cNvGraphicFramePr>
               <a:graphicFrameLocks noChangeAspect="1"/>
@@ -327,7 +327,7 @@
                   <pic:spPr>
                     <a:xfrm>
                       <a:off x="0" y="0"/>
-                      <a:ext cx="5394960" cy="2967228"/>
+                      <a:ext cx="5394960" cy="2760212"/>
                     </a:xfrm>
                     <a:prstGeom prst="rect"/>
                   </pic:spPr>
@@ -365,7 +365,7 @@
           <w:color w:val="404040"/>
           <w:sz w:val="19"/>
         </w:rPr>
-        <w:t xml:space="preserve"> reales de software pasó de ~14 % (inicios de 2024) a ~77 % (2025) en SWE-bench. Fuente: elaboración propia a partir de Anthropic (2025) y datos públicos de SWE-bench.</w:t>
+        <w:t xml:space="preserve"> reales de software pasó de ~14 % (inicios de 2024) a ~95 % (mediados de 2026) en SWE-bench Verified. Fuente: elaboración propia a partir de Anthropic (2026) y datos públicos de SWE-bench.</w:t>
       </w:r>
     </w:p>
     <w:p>
@@ -1208,16 +1208,16 @@
         <w:jc w:val="left"/>
       </w:pPr>
       <w:r>
-        <w:t xml:space="preserve">Anthropic. (2025, 22 de mayo). </w:t>
+        <w:t xml:space="preserve">Anthropic. (2026, 9 de junio). </w:t>
       </w:r>
       <w:r>
         <w:rPr>
           <w:i/>
         </w:rPr>
-        <w:t>Introducing Claude 4</w:t>
+        <w:t>Claude Fable 5</w:t>
       </w:r>
       <w:r>
-        <w:t>. https://www.anthropic.com/news/claude-4</w:t>
+        <w:t>. https://www.anthropic.com/news/claude-fable-5</w:t>
       </w:r>
     </w:p>
     <w:p>

</xml_diff>

<commit_message>
Actualizar todo el paper a junio/julio 2026 ("dónde estamos ahora")
- Visiones (VI): evalúa el pronóstico de Amodei a mediados de 2026 —
  cumplido de puertas adentro (en Anthropic casi todo el código lo
  escribe la IA, Krieger 2026) pero no a escala industrial
- Empleo (V): dato 2026 del AI Index de Stanford — devs de 22-25 años
  −20 % desde 2024, en un año con 142.000 despidos tech; +30 creció
- Adopción (III): redacción puesta al día
- 2 referencias nuevas (Krieger 2026; Stanford HAI 2026); recortes
  compensatorios para mantener 2.996 palabras (máx. 3.000)
- .docx y .pdf regenerados

Co-Authored-By: Claude Opus 4.8 <noreply@anthropic.com>
Claude-Session: https://claude.ai/code/session_01GRUp5qFeKJME8uZW1YQ6nF
</commit_message>
<xml_diff>
--- a/Paper_Rol_del_ingeniero_informatico_en_10_anios.docx
+++ b/Paper_Rol_del_ingeniero_informatico_en_10_anios.docx
@@ -295,7 +295,7 @@
         <w:t>issues</w:t>
       </w:r>
       <w:r>
-        <w:t xml:space="preserve"> reales de software, el estado del arte pasó de ~14 % a comienzos de 2024 a cerca del 95 % a mediados de 2026 (Anthropic, 2026): de uno de cada siete casos a más de nueve de cada diez en poco más de dos años. La adopción acompaña: GitHub Copilot superó los veinte millones de usuarios en 2025, Sundar Pichai afirmó en 2024 que la IA genera "más de una cuarta parte del código nuevo en Google" y Satya Nadella la estimó entre el 20 % y el 30 % en Microsoft (Zeff, 2025). La encuesta de Stack Overflow (2025) confirma la masividad: el 84 % usa o planea usar IA, frente al 76 % anterior.</w:t>
+        <w:t xml:space="preserve"> reales de software, el estado del arte pasó de ~14 % a comienzos de 2024 a cerca del 95 % a mediados de 2026 (Anthropic, 2026): de uno de cada siete casos a más de nueve de cada diez en poco más de dos años. La adopción acompaña: GitHub Copilot superó los veinte millones de usuarios, Sundar Pichai cifró en 2024 el código generado por IA en Google en "más de una cuarta parte" y Satya Nadella lo situó entre el 20 % y el 30 % en Microsoft (Zeff, 2025); la encuesta de Stack Overflow (2025) lo confirma: el 84 % de los desarrolladores usa o planea usar IA.</w:t>
       </w:r>
     </w:p>
     <w:p>
@@ -394,7 +394,7 @@
         <w:jc w:val="both"/>
       </w:pPr>
       <w:r>
-        <w:t xml:space="preserve">Esa misma brecha reaparece al medir la productividad, donde la evidencia es más matizada de lo que sugiere el entusiasmo. Un experimento controlado de GitHub y Microsoft mostró que quienes usaban Copilot completaban una tarea acotada —programar un servidor HTTP— un 55,8 % más rápido (Peng et al., 2023), y un experimento de campo con 4.867 desarrolladores de Microsoft, Accenture y una empresa Fortune 100 halló un aumento del 26 % en las tareas completadas (Cui et al., 2025). Pero ese último reveló un patrón decisivo: la mejora se concentraba en los programadores junior y casi se desvanecía entre los seniors. El contrapunto más nítido lo aportó un ensayo aleatorizado independiente de METR (2025): desarrolladores </w:t>
+        <w:t xml:space="preserve">Esa misma brecha reaparece al medir la productividad, donde la evidencia es más matizada de lo que sugiere el entusiasmo. Un experimento controlado de GitHub mostró que con Copilot una tarea acotada —programar un servidor HTTP— se completaba un 55,8 % más rápido (Peng et al., 2023), y un experimento de campo con 4.867 desarrolladores halló un aumento del 26 % en las tareas completadas (Cui et al., 2025). Pero ese último reveló un patrón decisivo: la mejora se concentraba en los programadores junior y casi se desvanecía entre los seniors. El contrapunto más nítido lo aportó un ensayo aleatorizado independiente de METR (2025): desarrolladores </w:t>
       </w:r>
       <w:r>
         <w:rPr>
@@ -522,7 +522,7 @@
         <w:t>más</w:t>
       </w:r>
       <w:r>
-        <w:t xml:space="preserve"> en él —una falsa confianza peligrosa (Perry et al., 2023)—. Las evaluaciones de corrección apuntan en el mismo sentido: al endurecer los tests, la tasa de acierto cae entre 19 y 29 puntos (Liu et al., 2023), lo que revela que "pasar los tests" no equivale a satisfacer la especificación. En seguridad, cerca del 40 % de las sugerencias de Copilot en escenarios sensibles incluían vulnerabilidades conocidas (Pearce et al., 2022), y un informe de 2025 sobre más de un centenar de modelos halló código vulnerable en el 45 % de los casos, sin que los más nuevos fueran más seguros (Veracode, 2025). Se suma un riesgo inédito: cerca del 20 % de los paquetes que los modelos recomiendan importar no existen, lo que habilita el </w:t>
+        <w:t xml:space="preserve"> en él —una falsa confianza peligrosa (Perry et al., 2023)—. Las evaluaciones de corrección apuntan en el mismo sentido: al endurecer los tests, la tasa de acierto cae entre 19 y 29 puntos (Liu et al., 2023), lo que revela que "pasar los tests" no equivale a satisfacer la especificación. En seguridad, cerca del 40 % de las sugerencias de Copilot en escenarios sensibles incluían vulnerabilidades conocidas (Pearce et al., 2022), y un informe de 2025 halló código vulnerable en el 45 % de los casos, sin que los modelos más nuevos fueran más seguros (Veracode, 2025). Se suma un riesgo inédito: cerca del 20 % de los paquetes que los modelos recomiendan importar no existen, lo que habilita el </w:t>
       </w:r>
       <w:r>
         <w:rPr>
@@ -820,7 +820,7 @@
         <w:jc w:val="both"/>
       </w:pPr>
       <w:r>
-        <w:t>Si la teoría garantiza un núcleo humano, la economía explica por qué podría ampliarse. La "paradoja de Jevons" ofrece una guía: cuando una tecnología abarata un recurso, su consumo total tiende a aumentar. Los cajeros automáticos son paradigmáticos: lejos de eliminarlos, abarataron la sucursal, los bancos abrieron más y el empleo creció (Bessen, 2015). En el software la lógica es análoga: al abaratarse la producción, la demanda —y la de quienes lo diseñan y controlan— podría crecer (Acemoglu y Restrepo, 2019; Autor, 2015).</w:t>
+        <w:t>Si la teoría garantiza un núcleo humano, la economía explica por qué podría ampliarse. Vale la "paradoja de Jevons": cuando una tecnología abarata un recurso, su consumo total tiende a aumentar. Los cajeros automáticos son el caso clásico: abarataron la sucursal, los bancos abrieron más y el empleo creció (Bessen, 2015). En el software la lógica es análoga: al abaratarse la producción, la demanda —y la de quienes lo diseñan y controlan— podría crecer (Acemoglu y Restrepo, 2019; Autor, 2015).</w:t>
       </w:r>
     </w:p>
     <w:p>
@@ -885,7 +885,7 @@
         <w:jc w:val="both"/>
       </w:pPr>
       <w:r>
-        <w:t xml:space="preserve">Proyectada a 2035, esa transformación apunta a un ingeniero que orquesta flotas de agentes más que a uno que teclea funciones: define la intención, delega la ejecución y se concentra en revisar, integrar y responder por el resultado. Kent Beck lo expresó al constatar que "el 90 % de mis habilidades hoy valen 0 dólares", mientras que el 10 % restante —visión, diseño y control de la complejidad— pasó a valer mil veces más (Beck, 2023). Y Martin Fowler advierte que los LLM introducen una abstracción </w:t>
+        <w:t xml:space="preserve">Proyectada a 2035, esa transformación apunta a un ingeniero que orquesta flotas de agentes más que a uno que teclea funciones: define la intención, delega la ejecución y responde por el resultado. Kent Beck lo expresó al constatar que "el 90 % de mis habilidades hoy valen 0 dólares", mientras que el 10 % restante —visión, diseño y control de la complejidad— pasó a valer mil veces más (Beck, 2023). Y Martin Fowler advierte que los LLM introducen una abstracción </w:t>
       </w:r>
       <w:r>
         <w:rPr>
@@ -904,7 +904,7 @@
         <w:jc w:val="both"/>
       </w:pPr>
       <w:r>
-        <w:t xml:space="preserve">Los datos laborales, sin embargo, advierten que la transición no será indolora ni uniforme. La Oficina de Estadísticas Laborales de EE. UU. proyecta un alza cercana al 15 % en "desarrolladores de software" (2024-2034), mientras "programadores" se contraería un 6 % (Bureau of Labor Statistics, 2025): se automatiza codificar, no diseñar y decidir. Un estudio de Stanford halló, además, caídas del 13-16 % en el empleo de carrera temprana (22-25 años) de las ocupaciones más expuestas a la IA, mientras los experimentados se mantenían estables (Brynjolfsson et al., 2025). La "puerta de entrada" junior se estrecha, y su cierre no es solo laboral sino </w:t>
+        <w:t xml:space="preserve">Los datos laborales, sin embargo, advierten que la transición no será indolora ni uniforme. La Oficina de Estadísticas Laborales de EE. UU. proyecta un alza cercana al 15 % en "desarrolladores de software" (2024-2034), mientras "programadores" se contraería un 6 % (Bureau of Labor Statistics, 2025): se automatiza codificar, no diseñar y decidir. El AI Index de Stanford afinó el dato: hacia mediados de 2026, el empleo de desarrolladores de 22-25 años había caído cerca del 20 % desde 2024 —en un año con 142.000 despidos tecnológicos— mientras el de los mayores de 30 crecía en las mismas empresas (Brynjolfsson et al., 2025; Stanford HAI, 2026). La "puerta de entrada" junior se estrecha, y su cierre no es solo laboral sino </w:t>
       </w:r>
       <w:r>
         <w:rPr>
@@ -1046,7 +1046,16 @@
         <w:jc w:val="both"/>
       </w:pPr>
       <w:r>
-        <w:t>Como toda proyección, depende de quienes la construyen, cuyas opiniones, aunque dispares, convergen en un punto. Dario Amodei (Anthropic) pronosticó en 2025 que la IA escribiría el 90 % del código en meses y "esencialmente todo" en un año, pero aclaró que "el programador todavía debe especificar (…) las decisiones generales de diseño" (Council on Foreign Relations, 2025). Andrej Karpathy describió el "Software 3.0" y popularizó el "vibe coding" (Karpathy, 2025).</w:t>
+        <w:t xml:space="preserve">Como toda proyección, depende de quienes la construyen, cuyas opiniones, aunque dispares, convergen en un punto. Dario Amodei (Anthropic) pronosticó en 2025 que la IA escribiría el 90 % del código en meses y "esencialmente todo" en un año, pero aclaró que "el programador todavía debe especificar (…) las decisiones generales de diseño" (Council on Foreign Relations, 2025). A mediados de 2026 ese pronóstico se cumplió </w:t>
+      </w:r>
+      <w:r>
+        <w:rPr>
+          <w:i/>
+        </w:rPr>
+        <w:t>de puertas adentro</w:t>
+      </w:r>
+      <w:r>
+        <w:t xml:space="preserve"> —en la propia Anthropic casi todo el código lo escribe la IA (Krieger, 2026)—, pero no a escala industrial, donde sigue muy por debajo. Andrej Karpathy describió el "Software 3.0" y popularizó el "vibe coding" (Karpathy, 2025).</w:t>
       </w:r>
     </w:p>
     <w:p>
@@ -1056,7 +1065,7 @@
         <w:jc w:val="both"/>
       </w:pPr>
       <w:r>
-        <w:t>No todas las voces comparten ese optimismo. Grady Booch, coautor de UML, replicó que tales pronósticos revelan "una incomprensión fundamental de lo que es la ingeniería de software": "tus herramientas están cambiando, pero tus problemas no" (Booch, 2026). Bjarne Stroustrup, creador de C++, advirtió que el riesgo no es tanto el reemplazo como que los programadores "pierdan la capacidad de detectar problemas por estar tan acostumbrados a que se los resuelvan" (Stroustrup, 2025), un peligro que el apartado IV fundamenta.</w:t>
+        <w:t>No todas las voces comparten ese optimismo. Grady Booch, coautor de UML, replicó que tales pronósticos revelan "una incomprensión fundamental de lo que es la ingeniería de software" (Booch, 2026). Bjarne Stroustrup, creador de C++, advirtió que el riesgo no es tanto el reemplazo como que los programadores "pierdan la capacidad de detectar problemas por estar tan acostumbrados a que se los resuelvan" (Stroustrup, 2025), un peligro que el apartado IV fundamenta.</w:t>
       </w:r>
     </w:p>
     <w:p>
@@ -1101,7 +1110,7 @@
         <w:jc w:val="both"/>
       </w:pPr>
       <w:r>
-        <w:t xml:space="preserve">Toda predicción tecnológica a diez años está sujeta a una incertidumbre considerable: la conclusión es una estimación fundada, no una certeza. Buena parte de la evidencia cuantitativa proviene de estudios recientes —algunos aún </w:t>
+        <w:t xml:space="preserve">Toda predicción tecnológica a diez años es incierta: la conclusión es una estimación fundada, no una certeza. Buena parte de la evidencia proviene de estudios recientes —algunos aún </w:t>
       </w:r>
       <w:r>
         <w:rPr>
@@ -1110,7 +1119,7 @@
         <w:t>working papers</w:t>
       </w:r>
       <w:r>
-        <w:t xml:space="preserve"> sin revisión por pares— y de declaraciones de ejecutivos con intereses comerciales en la tecnología que promueven, lo que obliga a leerlas con cautela. La causalidad de los fenómenos laborales es además discutible: la contracción del empleo junior podría obedecer tanto a la IA como al fin del crédito barato y a la sobrecontratación previa. Lo que sí ofrece una base sólida es el marco teórico: los resultados de Turing, Rice, Cook y Chomsky no caducan con la próxima versión de un modelo, y son el fundamento más firme de la tesis aquí defendida.</w:t>
+        <w:t xml:space="preserve"> sin revisión por pares— y de declaraciones de ejecutivos con intereses comerciales, lo que obliga a leerlas con cautela. La causalidad de los fenómenos laborales es además discutible: la contracción del empleo junior podría obedecer tanto a la IA como al fin del crédito barato y a la sobrecontratación previa. La base sólida es el marco teórico: los resultados de Turing, Rice, Cook y Chomsky no caducan con la próxima versión de un modelo, y son el fundamento más firme de la tesis aquí defendida.</w:t>
       </w:r>
     </w:p>
     <w:p>
@@ -1145,7 +1154,7 @@
         <w:jc w:val="both"/>
       </w:pPr>
       <w:r>
-        <w:t>La paradoja final es esperanzadora: cuanto más poderosa se vuelve la automatización, más valioso es el juicio humano que decide qué automatizar, cómo validarlo y para qué fin. El ingeniero del futuro será menos un escriba de instrucciones y más un arquitecto, un auditor y un responsable último de sistemas que ni él ni la máquina comprenden del todo. La teoría de la computación, lejos de anunciar el fin de la profesión, traza el contorno de su porvenir.</w:t>
+        <w:t>La paradoja final es esperanzadora: cuanto más poderosa se vuelve la automatización, más valioso es el juicio humano que decide qué automatizar, cómo validarlo y para qué fin. El ingeniero del futuro será menos un escriba y más un arquitecto, un auditor y un responsable último de sistemas que ni él ni la máquina comprenden del todo. La teoría de la computación, lejos de anunciar el fin de la profesión, traza el contorno de su porvenir.</w:t>
       </w:r>
     </w:p>
     <w:p>
@@ -1550,6 +1559,25 @@
         <w:jc w:val="left"/>
       </w:pPr>
       <w:r>
+        <w:t xml:space="preserve">Krieger, M. (2026). </w:t>
+      </w:r>
+      <w:r>
+        <w:rPr>
+          <w:i/>
+        </w:rPr>
+        <w:t>Dario Amodei had predicted 90% of code would be written by AI, but now at Anthropic it's effectively 100%</w:t>
+      </w:r>
+      <w:r>
+        <w:t>. OfficeChai. https://officechai.com/ai/dario-amodei-had-predicted-90-of-code-would-be-written-by-ai-but-now-at-anthropic-its-effectively-100-anthropic-cpo/</w:t>
+      </w:r>
+    </w:p>
+    <w:p>
+      <w:pPr>
+        <w:spacing w:line="360" w:lineRule="auto" w:after="120"/>
+        <w:ind w:left="720" w:hanging="720"/>
+        <w:jc w:val="left"/>
+      </w:pPr>
+      <w:r>
         <w:t xml:space="preserve">Liu, J., Xia, C. S., Wang, Y., &amp; Zhang, L. (2023). Is your code generated by ChatGPT really correct? Rigorous evaluation of large language models for code generation. En </w:t>
       </w:r>
       <w:r>
@@ -1807,6 +1835,25 @@
       </w:r>
       <w:r>
         <w:t>. https://survey.stackoverflow.co/2025/ai/</w:t>
+      </w:r>
+    </w:p>
+    <w:p>
+      <w:pPr>
+        <w:spacing w:line="360" w:lineRule="auto" w:after="120"/>
+        <w:ind w:left="720" w:hanging="720"/>
+        <w:jc w:val="left"/>
+      </w:pPr>
+      <w:r>
+        <w:t xml:space="preserve">Stanford HAI. (2026). </w:t>
+      </w:r>
+      <w:r>
+        <w:rPr>
+          <w:i/>
+        </w:rPr>
+        <w:t>Artificial intelligence index report 2026</w:t>
+      </w:r>
+      <w:r>
+        <w:t>. Stanford Institute for Human-Centered Artificial Intelligence. https://hai.stanford.edu/ai-index</w:t>
       </w:r>
     </w:p>
     <w:p>

</xml_diff>

<commit_message>
Reorientar la tesis según la evidencia 2026: polarización con desplazamiento real
La evidencia de mediados de 2026 no respalda ni el reemplazo total (BLS
+15 %, seniors +30 crecen, núcleo teórico) ni una transformación benigna
(desempleo de grads 6,1 %, junior -20 %, 142.000 despidos). Indica
POLARIZACIÓN: la base de ejecución se automatiza y se desploma mientras
un núcleo fino de seniors sobrevive y concentra el valor.

- Título, resumen, hipótesis y conclusión reescritos a esa tesis
- Sección V (empleo): datos pesimistas 2026 — desempleo de recién
  recibidos (Reserva Federal de NY), 48 % de despidos atribuidos a la
  IA, "cinco programadores ahora son tres"; se mantiene el +15 % del BLS
  como prueba de que es polarización, no extinción
- Referencia nueva: Federal Reserve Bank of New York (2026)
- 2.995 palabras (máx. 3.000); .docx y .pdf regenerados

Co-Authored-By: Claude Opus 4.8 <noreply@anthropic.com>
Claude-Session: https://claude.ai/code/session_01GRUp5qFeKJME8uZW1YQ6nF
</commit_message>
<xml_diff>
--- a/Paper_Rol_del_ingeniero_informatico_en_10_anios.docx
+++ b/Paper_Rol_del_ingeniero_informatico_en_10_anios.docx
@@ -38,7 +38,7 @@
           <w:b/>
           <w:sz w:val="32"/>
         </w:rPr>
-        <w:t>El rol del ingeniero informático en los próximos diez años: de la ejecución técnica a la supervisión crítica de sistemas automatizados</w:t>
+        <w:t>El rol del ingeniero informático en los próximos diez años: automatización de la base, polarización del oficio y un núcleo humano irreductible</w:t>
       </w:r>
     </w:p>
     <w:p>
@@ -146,7 +146,7 @@
         <w:jc w:val="both"/>
       </w:pPr>
       <w:r>
-        <w:t>La irrupción de la inteligencia artificial generativa y de los agentes de programación autónomos ha reabierto una pregunta tan vieja como la propia disciplina: ¿seguirá existiendo el ingeniero informático? Este trabajo sostiene que, en la próxima década, el ingeniero no será reemplazado por la tecnología, sino que su rol se transformará: dejará de centrarse en la ejecución técnica para enfocarse en la especificación, la integración, la validación y la supervisión crítica de sistemas automatizados. El argumento se construye sobre tres pilares: la evidencia histórica de que cada salto de abstracción elevó el nivel del trabajo en lugar de eliminarlo; la evidencia empírica reciente (2021-2026) sobre el alcance y los límites medidos de la IA en el desarrollo de software; y, como columna vertebral teórica, los límites fundamentales de la computación —el problema de la detención, el teorema de Rice, la cuestión P vs. NP y la jerarquía de Chomsky— que garantizan la existencia de un núcleo irreductiblemente humano de juicio. La conclusión es necesariamente una estimación: el ingeniero del futuro ascenderá en la escalera de abstracción hacia tareas que la teoría de la computación demuestra que ninguna máquina puede automatizar por completo.</w:t>
+        <w:t>La irrupción de la inteligencia artificial generativa y de los agentes de programación autónomos ha reabierto una pregunta tan vieja como la propia disciplina: ¿seguirá existiendo el ingeniero informático? Este trabajo sostiene que, en la próxima década, la IA no hará desaparecer a la profesión, pero la reconfigurará por polarización: automatizará la capa de ejecución y las tareas de entrada —desplazando empleo real, sobre todo junior— mientras concentra el trabajo en un núcleo más delgado de ingenieros dedicados a especificar, validar y responder por sistemas de alto riesgo, y desplaza buena parte del valor hacia quienes proveen las herramientas. El argumento combina tres planos: la evidencia histórica de que cada salto de abstracción recompuso el trabajo; la evidencia empírica reciente (2021-2026), que ya muestra benchmarks saturados junto a un derrumbe del empleo de entrada; y, como columna vertebral, los límites fundamentales de la computación —el problema de la detención, el teorema de Rice, P vs. NP y la jerarquía de Chomsky— que garantizan un residuo de juicio irreductiblemente humano. La conclusión es una estimación: el oficio no se extingue, pero se parte en dos, y la transición será dura y desigual.</w:t>
       </w:r>
     </w:p>
     <w:p>
@@ -162,7 +162,7 @@
         <w:t>Palabras clave:</w:t>
       </w:r>
       <w:r>
-        <w:t xml:space="preserve"> ingeniería de software, inteligencia artificial, indecidibilidad, problema de la detención, P vs. NP, automatización.</w:t>
+        <w:t xml:space="preserve"> ingeniería de software, inteligencia artificial, indecidibilidad, P vs. NP, polarización laboral, desplazamiento del empleo.</w:t>
       </w:r>
     </w:p>
     <w:p>
@@ -197,7 +197,7 @@
         <w:jc w:val="both"/>
       </w:pPr>
       <w:r>
-        <w:t>Este trabajo parte de la siguiente hipótesis: en los próximos diez años, el rol del ingeniero dejará de centrarse en la ejecución técnica para enfocarse en la toma de decisiones, la integración de tecnologías y la supervisión crítica de sistemas automatizados. No será reemplazado, sino que se volverá menos operativo y más estratégico, con mayor responsabilidad en diseñar, validar y controlar sistemas complejos.</w:t>
+        <w:t>Este trabajo parte de la siguiente hipótesis: en los próximos diez años, la IA no reemplazará a la profesión, pero la polarizará. La capa de ejecución —la codificación rutinaria y las tareas junior— se automatiza y se contrae con fuerza, desplazando empleo real; a la vez, se revaloriza un núcleo más estrecho de ingenieros que especifican, integran, validan y responden por sistemas críticos. El ingeniero no desaparece, pero el oficio se parte: menos puestos en la base, más exigencia de juicio en la cima.</w:t>
       </w:r>
     </w:p>
     <w:p>
@@ -241,7 +241,7 @@
         <w:jc w:val="both"/>
       </w:pPr>
       <w:r>
-        <w:t>La historia del software puede leerse como el ascenso por una "escalera de abstracción" en la que cada peldaño automatizó el trabajo del anterior y, lejos de suprimir al ingeniero, lo elevó conceptualmente. Al principio, programar era escribir código máquina y ensamblador; el salto decisivo llegó con los lenguajes de alto nivel: FORTRAN (Backus, IBM, 1957) permitió expresar algoritmos en notación matemática y delegó el código de bajo nivel en un compilador; COBOL, inspirado en Grace Hopper, hizo lo propio para los negocios.</w:t>
+        <w:t>La historia del software puede leerse como el ascenso por una "escalera de abstracción" en la que cada peldaño automatizó el trabajo del anterior y, lejos de suprimir al ingeniero, lo elevó conceptualmente. Al principio, programar era escribir código máquina y ensamblador; el salto llegó con los lenguajes de alto nivel: FORTRAN (Backus, IBM, 1957) expresó algoritmos en notación matemática y delegó el código de bajo nivel en un compilador; COBOL, inspirado en Grace Hopper, hizo lo propio para los negocios.</w:t>
       </w:r>
     </w:p>
     <w:p>
@@ -251,7 +251,7 @@
         <w:jc w:val="both"/>
       </w:pPr>
       <w:r>
-        <w:t>Paradójicamente, esa creciente potencia trajo una crisis: en la Conferencia de Ingeniería de Software de la OTAN (Garmisch, 1968) se acuñó la expresión "crisis del software" para describir la incapacidad de gestionar la complejidad de sistemas cada vez más grandes (Naur y Randell, 1969). La respuesta no fue menos ingeniería, sino más: ante un problema vuelto "igualmente gigantesco" por las máquinas (Dijkstra, 1972), nacieron la programación estructurada, las metodologías y la disciplina misma de la ingeniería de software.</w:t>
+        <w:t>Paradójicamente, esa creciente potencia trajo una crisis: en la Conferencia de Ingeniería de Software de la OTAN (Garmisch, 1968) se acuñó la expresión "crisis del software" para describir la incapacidad de gestionar la complejidad de sistemas cada vez más grandes (Naur y Randell, 1969). La respuesta no fue menos ingeniería, sino más: ante un problema vuelto "igualmente gigantesco" (Dijkstra, 1972), nacieron la programación estructurada, las metodologías y la disciplina misma de la ingeniería de software.</w:t>
       </w:r>
     </w:p>
     <w:p>
@@ -384,7 +384,7 @@
         <w:t>issue</w:t>
       </w:r>
       <w:r>
-        <w:t xml:space="preserve"> aislado en un repositorio conocido es muy distinto de operar dentro de un sistema de producción, con su contexto y sus consecuencias.</w:t>
+        <w:t xml:space="preserve"> aislado en un repositorio conocido es muy distinto de operar dentro de un sistema de producción real.</w:t>
       </w:r>
     </w:p>
     <w:p>
@@ -421,7 +421,7 @@
         <w:t>creían</w:t>
       </w:r>
       <w:r>
-        <w:t xml:space="preserve"> haberse acelerado un 20 %. Lejos de contradecirse, los estudios convergen en una lección: la IA acelera lo rutinario y lo desconocido para quien empieza, pero rinde poco —o estorba— en el trabajo experto sobre sistemas maduros. La brecha entre productividad percibida y real es, en sí misma, reveladora.</w:t>
+        <w:t xml:space="preserve"> haberse acelerado un 20 %. Los estudios convergen: la IA acelera lo rutinario y lo desconocido para quien empieza, pero rinde poco —o estorba— en el trabajo experto sobre sistemas maduros. La brecha entre productividad percibida y real es, en sí misma, reveladora.</w:t>
       </w:r>
     </w:p>
     <w:p>
@@ -610,7 +610,7 @@
         <w:jc w:val="both"/>
       </w:pPr>
       <w:r>
-        <w:t>¿Por qué, pese a estos avances, el ingeniero no desaparecerá? La respuesta más profunda no es económica ni sociológica, sino computacional: existen barreras matemáticas, demostradas y permanentes, que ninguna IA —en última instancia, un proceso computable— puede sortear.</w:t>
+        <w:t>¿Por qué, pese a estos avances, el ingeniero no desaparecerá? La respuesta más profunda no es económica ni sociológica, sino computacional: hay barreras matemáticas, demostradas y permanentes, que ninguna IA —un proceso computable— puede sortear.</w:t>
       </w:r>
     </w:p>
     <w:p>
@@ -820,7 +820,7 @@
         <w:jc w:val="both"/>
       </w:pPr>
       <w:r>
-        <w:t>Si la teoría garantiza un núcleo humano, la economía explica por qué podría ampliarse. Vale la "paradoja de Jevons": cuando una tecnología abarata un recurso, su consumo total tiende a aumentar. Los cajeros automáticos son el caso clásico: abarataron la sucursal, los bancos abrieron más y el empleo creció (Bessen, 2015). En el software la lógica es análoga: al abaratarse la producción, la demanda —y la de quienes lo diseñan y controlan— podría crecer (Acemoglu y Restrepo, 2019; Autor, 2015).</w:t>
+        <w:t>Si la teoría garantiza un núcleo humano, la economía explica por qué puede crecer. Vale la "paradoja de Jevons": cuando una tecnología abarata un recurso, su consumo total tiende a aumentar. Los cajeros automáticos son el caso clásico: abarataron la sucursal, los bancos abrieron más y el empleo creció (Bessen, 2015). En el software la lógica es análoga: al abaratarse la producción, la demanda —y la de quienes lo diseñan y controlan— podría crecer (Acemoglu y Restrepo, 2019; Autor, 2015).</w:t>
       </w:r>
     </w:p>
     <w:p>
@@ -875,7 +875,7 @@
         <w:t>decidir</w:t>
       </w:r>
       <w:r>
-        <w:t xml:space="preserve"> bajo restricciones de intratabilidad y de valores. Es el "30 % difícil" de Osmani vuelto centro de gravedad de la profesión. Las proyecciones lo confirman: cerca del 40 % de las habilidades cambiarán hacia 2030 (World Economic Forum, 2025), y marcos como el SWEBOK (Washizaki, 2024) ya definen la ingeniería muy por encima de la codificación.</w:t>
+        <w:t xml:space="preserve"> bajo restricciones de intratabilidad y de valores. Es el "30 % difícil" de Osmani vuelto centro de la profesión. Las proyecciones lo confirman: cerca del 40 % de las habilidades cambiarán hacia 2030 (World Economic Forum, 2025), y marcos como el SWEBOK (Washizaki, 2024) ya definen la ingeniería muy por encima de la codificación.</w:t>
       </w:r>
     </w:p>
     <w:p>
@@ -904,7 +904,7 @@
         <w:jc w:val="both"/>
       </w:pPr>
       <w:r>
-        <w:t xml:space="preserve">Los datos laborales, sin embargo, advierten que la transición no será indolora ni uniforme. La Oficina de Estadísticas Laborales de EE. UU. proyecta un alza cercana al 15 % en "desarrolladores de software" (2024-2034), mientras "programadores" se contraería un 6 % (Bureau of Labor Statistics, 2025): se automatiza codificar, no diseñar y decidir. El AI Index de Stanford afinó el dato: hacia mediados de 2026, el empleo de desarrolladores de 22-25 años había caído cerca del 20 % desde 2024 —en un año con 142.000 despidos tecnológicos— mientras el de los mayores de 30 crecía en las mismas empresas (Brynjolfsson et al., 2025; Stanford HAI, 2026). La "puerta de entrada" junior se estrecha, y su cierre no es solo laboral sino </w:t>
+        <w:t xml:space="preserve">Los datos laborales de 2026 muestran una recomposición brutal y desigual. La base de entrada se desploma: el empleo de desarrolladores de 22-25 años cayó cerca del 20 % desde 2024, el desempleo de los recién recibidos en Ciencias de la Computación trepó al 6,1 % —por encima de carreras como Historia del Arte (Federal Reserve Bank of New York, 2026)— y, de los 142.000 despidos tecnológicos del año, casi la mitad se atribuyeron a la IA (Stanford HAI, 2026). Pero la cima resiste: el empleo de los mayores de 30 creció en las mismas empresas y la Oficina de Estadísticas Laborales aún proyecta un alza del 15 % en "desarrolladores de software" a 2034, frente a un −6 % en "programadores" (Bureau of Labor Statistics, 2025; Brynjolfsson et al., 2025). El patrón no es extinción sino polarización: donde se necesitaban cinco programadores, ahora bastan tres. Y el cierre de la "puerta de entrada" junior no es solo laboral sino </w:t>
       </w:r>
       <w:r>
         <w:rPr>
@@ -913,7 +913,7 @@
         <w:t>cognitivo</w:t>
       </w:r>
       <w:r>
-        <w:t>: si la IA absorbe las tareas donde se forma el criterio, faltarán los expertos capaces de auditarla. Y aun conservando el empleo, el ingeniero afronta un riesgo distributivo: que el valor migre hacia quienes proveen las herramientas de IA.</w:t>
+        <w:t>: si la IA absorbe las tareas donde se forma el criterio, faltarán los expertos capaces de auditarla. Aun con empleo, además, el valor migra hacia quienes proveen las herramientas.</w:t>
       </w:r>
     </w:p>
     <w:p>
@@ -1075,7 +1075,7 @@
         <w:jc w:val="both"/>
       </w:pPr>
       <w:r>
-        <w:t>Existe, además, un bando que anticipa no una transformación sino un reemplazo. Amodei advirtió que la IA podría eliminar la mitad de los empleos administrativos de nivel inicial en uno a cinco años y elevar el desempleo al 10-20 % (VandeHei y Allen, 2025); Mark Zuckerberg proyectó que cubriría el trabajo de los ingenieros de nivel medio de Meta, y Salesforce congeló la contratación de ingenieros en 2025 tras reportar un 30 % más de productividad (The San Francisco Standard, 2025). En clave académica, Frey y Osborne (2017) estimaron en un 47 % el empleo estadounidense en alto riesgo. No conviene minimizarlas, pero admiten reparos: aquel estudio medía ocupaciones enteras, no tareas, y trabajos posteriores lo corrigieron a la baja; las predicciones de directivos cargan un interés comercial evidente —Salesforce sigue empleando unos 15.000 ingenieros y Benioff admite que la IA aún no los sustituye—; y el desplazamiento golpea la tarea rutinaria de codificar, no el juicio de especificar, validar y decidir que el apartado IV vuelve irreductible.</w:t>
+        <w:t>Existe, además, un bando que anticipa no una transformación sino un reemplazo. Amodei advirtió que la IA podría eliminar la mitad de los empleos administrativos de nivel inicial en uno a cinco años y elevar el desempleo al 10-20 % (VandeHei y Allen, 2025); Mark Zuckerberg proyectó que cubriría el trabajo de los ingenieros de nivel medio de Meta, y Salesforce congeló la contratación de ingenieros en 2025 tras reportar un 30 % más de productividad (The San Francisco Standard, 2025). En clave académica, Frey y Osborne (2017) estimaron en un 47 % el empleo estadounidense en alto riesgo. No conviene minimizarlas, pero admiten reparos: aquel estudio medía ocupaciones enteras, no tareas, y trabajos posteriores lo corrigieron a la baja; las predicciones de directivos cargan un interés comercial —Salesforce aún emplea unos 15.000 ingenieros—; y el desplazamiento golpea la tarea rutinaria de codificar, no el juicio de especificar, validar y decidir que el apartado IV vuelve irreductible.</w:t>
       </w:r>
     </w:p>
     <w:p>
@@ -1085,7 +1085,7 @@
         <w:jc w:val="both"/>
       </w:pPr>
       <w:r>
-        <w:t>Sam Altman (OpenAI) ofrece la síntesis más equilibrada: "cada ingeniero de software hará, durante un buen tiempo, muchísimo más" (Thompson, 2025), y "los expertos seguirán siendo mucho mejores que los novatos, si adoptan las nuevas herramientas" (Altman, 2025). La IA no anula al ingeniero: amplifica al que sabe usarla. Incluso las voces más optimistas reservan para el humano las tareas de especificar, decidir y juzgar —las mismas que la teoría de la computación demuestra que no pueden automatizarse.</w:t>
+        <w:t>Sam Altman (OpenAI) ofrece la síntesis más equilibrada: "cada ingeniero de software hará, durante un buen tiempo, muchísimo más" (Thompson, 2025), y "los expertos seguirán siendo mucho mejores que los novatos, si adoptan las nuevas herramientas" (Altman, 2025). La IA no anula al ingeniero: amplifica al que sabe usarla. Incluso los más optimistas reservan para el humano especificar, decidir y juzgar —lo que la teoría de la computación demuestra inautomatizable.</w:t>
       </w:r>
     </w:p>
     <w:p>
@@ -1119,7 +1119,7 @@
         <w:t>working papers</w:t>
       </w:r>
       <w:r>
-        <w:t xml:space="preserve"> sin revisión por pares— y de declaraciones de ejecutivos con intereses comerciales, lo que obliga a leerlas con cautela. La causalidad de los fenómenos laborales es además discutible: la contracción del empleo junior podría obedecer tanto a la IA como al fin del crédito barato y a la sobrecontratación previa. La base sólida es el marco teórico: los resultados de Turing, Rice, Cook y Chomsky no caducan con la próxima versión de un modelo, y son el fundamento más firme de la tesis aquí defendida.</w:t>
+        <w:t xml:space="preserve"> sin revisión por pares— y de declaraciones de ejecutivos con intereses comerciales, lo que obliga a leerlas con cautela. La causalidad es además discutible: la contracción del empleo junior podría deberse tanto a la IA como al fin del crédito barato y la sobrecontratación previa. La base sólida es el marco teórico: los resultados de Turing, Rice, Cook y Chomsky no caducan con la próxima versión de un modelo, y son el fundamento más firme de la tesis aquí defendida.</w:t>
       </w:r>
     </w:p>
     <w:p>
@@ -1144,7 +1144,7 @@
         <w:jc w:val="both"/>
       </w:pPr>
       <w:r>
-        <w:t>El recorrido confirma, con matices, la hipótesis inicial. En la próxima década el ingeniero informático no será reemplazado por la IA, pero su rol se transformará: el centro de gravedad de la profesión pasará de la ejecución técnica —escribir código línea por línea— a la especificación, el diseño, la integración y, sobre todo, la validación y supervisión crítica de sistemas cada vez más autónomos. La historia lo respalda, pues cada abstracción previa elevó al ingeniero en vez de eliminarlo; la evidencia reciente lo matiza, pues la IA acelera la producción pero degrada la garantía de corrección; y la teoría de la computación lo fundamenta: la verificación universal (Rice y Turing), la resolución eficiente de todo problema (P vs. NP) y la traducción de la intención ambigua al lenguaje formal (Chomsky) no son tareas que una máquina pueda asumir por completo.</w:t>
+        <w:t>El recorrido confirma la hipótesis. En la próxima década el ingeniero informático no desaparecerá, pero la profesión se polarizará: la base de ejecución se automatiza y se contrae —con desplazamiento real de empleo, sobre todo junior—, mientras un núcleo más delgado de especificación, verificación y responsabilidad se vuelve indispensable y concentra el valor. La historia muestra que cada abstracción recompuso el trabajo; la evidencia de 2026 añade que esta vez la recomposición es brutal en la base —derrumbe del empleo de entrada—; y la teoría de la computación garantiza el núcleo: la verificación universal (Rice y Turing), la resolución eficiente de todo problema (P vs. NP) y la traducción de la intención ambigua al lenguaje formal (Chomsky) no son tareas que una máquina pueda asumir por completo.</w:t>
       </w:r>
     </w:p>
     <w:p>
@@ -1154,7 +1154,7 @@
         <w:jc w:val="both"/>
       </w:pPr>
       <w:r>
-        <w:t>La paradoja final es esperanzadora: cuanto más poderosa se vuelve la automatización, más valioso es el juicio humano que decide qué automatizar, cómo validarlo y para qué fin. El ingeniero del futuro será menos un escriba y más un arquitecto, un auditor y un responsable último de sistemas que ni él ni la máquina comprenden del todo. La teoría de la computación, lejos de anunciar el fin de la profesión, traza el contorno de su porvenir.</w:t>
+        <w:t>La paradoja final es agridulce: cuanto más poderosa se vuelve la automatización, más valioso —y más escaso— se torna el juicio humano que decide qué automatizar, cómo validarlo y para qué fin. El ingeniero del futuro será menos un escriba y más un arquitecto, un auditor y un responsable último; pero serán menos quienes lleguen a esa cima, y más dura la entrada. La teoría de la computación no anuncia el fin de la profesión: traza el contorno —más estrecho— de su porvenir.</w:t>
       </w:r>
     </w:p>
     <w:p>
@@ -1474,6 +1474,25 @@
       </w:r>
       <w:r>
         <w:t>(10), 859-866. https://doi.org/10.1145/355604.361591</w:t>
+      </w:r>
+    </w:p>
+    <w:p>
+      <w:pPr>
+        <w:spacing w:line="360" w:lineRule="auto" w:after="120"/>
+        <w:ind w:left="720" w:hanging="720"/>
+        <w:jc w:val="left"/>
+      </w:pPr>
+      <w:r>
+        <w:t xml:space="preserve">Federal Reserve Bank of New York. (2026). </w:t>
+      </w:r>
+      <w:r>
+        <w:rPr>
+          <w:i/>
+        </w:rPr>
+        <w:t>The labor market for recent college graduates</w:t>
+      </w:r>
+      <w:r>
+        <w:t>. https://www.newyorkfed.org/research/college-labor-market</w:t>
       </w:r>
     </w:p>
     <w:p>

</xml_diff>

<commit_message>
Cierre con "quién gana" y llamado a esforzarse inteligentemente y dónde
- Conclusión: nuevo cierre competitivo y accionable — gana quien sube
  al peldaño que la máquina no alcanza (especificación/verificación de
  alto riesgo, orquestación de agentes, nichos de demanda explosiva);
  el mensaje es esforzarse no más sino *inteligentemente* y *dónde*
- Sección V: nombra a los ganadores con datos 2026 — pensamiento
  analítico, IA y datos, ciberseguridad a la cabeza de la demanda
  (WEF 2025), con primas salariales muy por encima del promedio
- Recortes compensatorios; 2.994 palabras (máx. 3.000)
- .docx y .pdf regenerados

Co-Authored-By: Claude Opus 4.8 <noreply@anthropic.com>
Claude-Session: https://claude.ai/code/session_01GRUp5qFeKJME8uZW1YQ6nF
</commit_message>
<xml_diff>
--- a/Paper_Rol_del_ingeniero_informatico_en_10_anios.docx
+++ b/Paper_Rol_del_ingeniero_informatico_en_10_anios.docx
@@ -251,7 +251,7 @@
         <w:jc w:val="both"/>
       </w:pPr>
       <w:r>
-        <w:t>Paradójicamente, esa creciente potencia trajo una crisis: en la Conferencia de Ingeniería de Software de la OTAN (Garmisch, 1968) se acuñó la expresión "crisis del software" para describir la incapacidad de gestionar la complejidad de sistemas cada vez más grandes (Naur y Randell, 1969). La respuesta no fue menos ingeniería, sino más: ante un problema vuelto "igualmente gigantesco" (Dijkstra, 1972), nacieron la programación estructurada, las metodologías y la disciplina misma de la ingeniería de software.</w:t>
+        <w:t>Paradójicamente, esa creciente potencia trajo una crisis: en la Conferencia de Ingeniería de Software de la OTAN (Garmisch, 1968) se acuñó la expresión "crisis del software" para describir la incapacidad de gestionar la complejidad de sistemas cada vez más grandes (Naur y Randell, 1969). La respuesta no fue menos ingeniería sino más: ante un problema "igualmente gigantesco" (Dijkstra, 1972) nacieron la programación estructurada, las metodologías y la disciplina misma de la ingeniería de software.</w:t>
       </w:r>
     </w:p>
     <w:p>
@@ -295,7 +295,7 @@
         <w:t>issues</w:t>
       </w:r>
       <w:r>
-        <w:t xml:space="preserve"> reales de software, el estado del arte pasó de ~14 % a comienzos de 2024 a cerca del 95 % a mediados de 2026 (Anthropic, 2026): de uno de cada siete casos a más de nueve de cada diez en poco más de dos años. La adopción acompaña: GitHub Copilot superó los veinte millones de usuarios, Sundar Pichai cifró en 2024 el código generado por IA en Google en "más de una cuarta parte" y Satya Nadella lo situó entre el 20 % y el 30 % en Microsoft (Zeff, 2025); la encuesta de Stack Overflow (2025) lo confirma: el 84 % de los desarrolladores usa o planea usar IA.</w:t>
+        <w:t xml:space="preserve"> reales de software, el estado del arte pasó de ~14 % a comienzos de 2024 a cerca del 95 % a mediados de 2026 (Anthropic, 2026): de uno de cada siete casos a más de nueve de cada diez en poco más de dos años. La adopción acompaña: GitHub Copilot superó los veinte millones de usuarios, Sundar Pichai cifró en 2024 el código generado por IA en Google en "más de una cuarta parte" y Satya Nadella lo situó en 20-30 % en Microsoft (Zeff, 2025); Stack Overflow (2025) lo confirma: el 84 % de los desarrolladores usa o planea usar IA.</w:t>
       </w:r>
     </w:p>
     <w:p>
@@ -394,7 +394,7 @@
         <w:jc w:val="both"/>
       </w:pPr>
       <w:r>
-        <w:t xml:space="preserve">Esa misma brecha reaparece al medir la productividad, donde la evidencia es más matizada de lo que sugiere el entusiasmo. Un experimento controlado de GitHub mostró que con Copilot una tarea acotada —programar un servidor HTTP— se completaba un 55,8 % más rápido (Peng et al., 2023), y un experimento de campo con 4.867 desarrolladores halló un aumento del 26 % en las tareas completadas (Cui et al., 2025). Pero ese último reveló un patrón decisivo: la mejora se concentraba en los programadores junior y casi se desvanecía entre los seniors. El contrapunto más nítido lo aportó un ensayo aleatorizado independiente de METR (2025): desarrolladores </w:t>
+        <w:t xml:space="preserve">Esa misma brecha reaparece al medir la productividad, donde la evidencia es más matizada de lo que sugiere el entusiasmo. Un experimento controlado de GitHub mostró que con Copilot una tarea acotada —programar un servidor HTTP— se completaba un 55,8 % más rápido (Peng et al., 2023), y un experimento de campo con 4.867 desarrolladores halló un aumento del 26 % en las tareas completadas (Cui et al., 2025). Pero ese último reveló un patrón: la mejora se concentraba en los junior y casi se desvanecía entre los seniors. El contrapunto más nítido lo aportó un ensayo aleatorizado independiente de METR (2025): desarrolladores </w:t>
       </w:r>
       <w:r>
         <w:rPr>
@@ -421,7 +421,7 @@
         <w:t>creían</w:t>
       </w:r>
       <w:r>
-        <w:t xml:space="preserve"> haberse acelerado un 20 %. Los estudios convergen: la IA acelera lo rutinario y lo desconocido para quien empieza, pero rinde poco —o estorba— en el trabajo experto sobre sistemas maduros. La brecha entre productividad percibida y real es, en sí misma, reveladora.</w:t>
+        <w:t xml:space="preserve"> haberse acelerado un 20 %. Los estudios convergen: la IA acelera lo rutinario y lo desconocido para quien empieza, pero rinde poco —o estorba— en el trabajo experto sobre sistemas maduros.</w:t>
       </w:r>
     </w:p>
     <w:p>
@@ -522,7 +522,7 @@
         <w:t>más</w:t>
       </w:r>
       <w:r>
-        <w:t xml:space="preserve"> en él —una falsa confianza peligrosa (Perry et al., 2023)—. Las evaluaciones de corrección apuntan en el mismo sentido: al endurecer los tests, la tasa de acierto cae entre 19 y 29 puntos (Liu et al., 2023), lo que revela que "pasar los tests" no equivale a satisfacer la especificación. En seguridad, cerca del 40 % de las sugerencias de Copilot en escenarios sensibles incluían vulnerabilidades conocidas (Pearce et al., 2022), y un informe de 2025 halló código vulnerable en el 45 % de los casos, sin que los modelos más nuevos fueran más seguros (Veracode, 2025). Se suma un riesgo inédito: cerca del 20 % de los paquetes que los modelos recomiendan importar no existen, lo que habilita el </w:t>
+        <w:t xml:space="preserve"> en él —una falsa confianza peligrosa (Perry et al., 2023)—. Las evaluaciones de corrección coinciden: al endurecer los tests, la tasa de acierto cae 19-29 puntos (Liu et al., 2023): "pasar los tests" no equivale a satisfacer la especificación. En seguridad, cerca del 40 % de las sugerencias de Copilot en escenarios sensibles incluían vulnerabilidades conocidas (Pearce et al., 2022), y un informe de 2025 halló código vulnerable en el 45 % de los casos, sin que los modelos más nuevos fueran más seguros (Veracode, 2025). Se suma un riesgo inédito: cerca del 20 % de los paquetes que los modelos recomiendan importar no existen, lo que habilita el </w:t>
       </w:r>
       <w:r>
         <w:rPr>
@@ -638,7 +638,7 @@
         <w:t>toda</w:t>
       </w:r>
       <w:r>
-        <w:t xml:space="preserve"> propiedad semántica no trivial de un programa —como "¿está libre de cierto error?" o "¿cumple su especificación?"— es indecidible. Por tanto, ninguna IA puede verificar de forma general y automática si un programa arbitrario satisface su especificación: la verificación seguirá exigiendo juicio humano y herramientas que solo funcionan restringiendo el problema o renunciando a la completitud.</w:t>
+        <w:t xml:space="preserve"> propiedad semántica no trivial de un programa —como "¿está libre de cierto error?" o "¿cumple su especificación?"— es indecidible. Por tanto, ninguna IA puede verificar de forma general si un programa arbitrario cumple su especificación: la verificación seguirá exigiendo juicio humano y herramientas que solo funcionan restringiendo el problema.</w:t>
       </w:r>
     </w:p>
     <w:p>
@@ -749,7 +749,7 @@
         <w:jc w:val="both"/>
       </w:pPr>
       <w:r>
-        <w:t>Estas barreras alcanzan a la propia IA. Mediante diagonalización apoyada en la indecidibilidad de la detención, se demuestra que la "alucinación" es innata a los LLM: ningún modelo puede aprender todas las funciones computables, por lo que producirá errores que no detecta por sí mismo (Xu et al., 2024). Un LLM no puede autoverificar su salida; necesita un agente externo —el ingeniero— que la contraste con la realidad y asuma la responsabilidad.</w:t>
+        <w:t>Estas barreras alcanzan a la propia IA. Mediante diagonalización apoyada en la indecidibilidad de la detención, se demuestra que la "alucinación" es innata a los LLM: ningún modelo puede aprender todas las funciones computables, por lo que producirá errores que no detecta por sí mismo (Xu et al., 2024). Un LLM no puede autoverificarse; necesita un agente externo —el ingeniero— que contraste su salida con la realidad y asuma la responsabilidad.</w:t>
       </w:r>
     </w:p>
     <w:p>
@@ -820,7 +820,7 @@
         <w:jc w:val="both"/>
       </w:pPr>
       <w:r>
-        <w:t>Si la teoría garantiza un núcleo humano, la economía explica por qué puede crecer. Vale la "paradoja de Jevons": cuando una tecnología abarata un recurso, su consumo total tiende a aumentar. Los cajeros automáticos son el caso clásico: abarataron la sucursal, los bancos abrieron más y el empleo creció (Bessen, 2015). En el software la lógica es análoga: al abaratarse la producción, la demanda —y la de quienes lo diseñan y controlan— podría crecer (Acemoglu y Restrepo, 2019; Autor, 2015).</w:t>
+        <w:t>Si la teoría garantiza un núcleo humano, la economía explica por qué puede crecer. Vale la "paradoja de Jevons": cuando una tecnología abarata un recurso, su consumo total tiende a aumentar. Los cajeros automáticos lo ilustran: abarataron la sucursal, los bancos abrieron más y el empleo creció (Bessen, 2015). En el software la lógica es análoga: al abaratarse la producción, la demanda de quienes lo diseñan y controlan podría crecer (Acemoglu y Restrepo, 2019; Autor, 2015).</w:t>
       </w:r>
     </w:p>
     <w:p>
@@ -875,7 +875,7 @@
         <w:t>decidir</w:t>
       </w:r>
       <w:r>
-        <w:t xml:space="preserve"> bajo restricciones de intratabilidad y de valores. Es el "30 % difícil" de Osmani vuelto centro de la profesión. Las proyecciones lo confirman: cerca del 40 % de las habilidades cambiarán hacia 2030 (World Economic Forum, 2025), y marcos como el SWEBOK (Washizaki, 2024) ya definen la ingeniería muy por encima de la codificación.</w:t>
+        <w:t xml:space="preserve"> bajo restricciones de intratabilidad y de valores. Es el "30 % difícil" de Osmani vuelto centro de la profesión. Las proyecciones marcan dónde está la demanda: hacia 2030 cambiará cerca del 40 % de las habilidades, con el pensamiento analítico, la IA y los datos, y la ciberseguridad a la cabeza (World Economic Forum, 2025) —nichos que en 2026 pagan primas muy por encima del promedio (Stanford HAI, 2026)—; y marcos como el SWEBOK (Washizaki, 2024) definen la ingeniería muy por encima de la codificación.</w:t>
       </w:r>
     </w:p>
     <w:p>
@@ -885,7 +885,7 @@
         <w:jc w:val="both"/>
       </w:pPr>
       <w:r>
-        <w:t xml:space="preserve">Proyectada a 2035, esa transformación apunta a un ingeniero que orquesta flotas de agentes más que a uno que teclea funciones: define la intención, delega la ejecución y responde por el resultado. Kent Beck lo expresó al constatar que "el 90 % de mis habilidades hoy valen 0 dólares", mientras que el 10 % restante —visión, diseño y control de la complejidad— pasó a valer mil veces más (Beck, 2023). Y Martin Fowler advierte que los LLM introducen una abstracción </w:t>
+        <w:t xml:space="preserve">Proyectada a 2035, apunta a un ingeniero que orquesta agentes más que a uno que teclea: define la intención, delega la ejecución y responde por el resultado. Kent Beck lo expresó al constatar que "el 90 % de mis habilidades hoy valen 0 dólares", mientras que el 10 % restante —visión, diseño y control de la complejidad— pasó a valer mil veces más (Beck, 2023). Y Martin Fowler advierte que los LLM introducen una abstracción </w:t>
       </w:r>
       <w:r>
         <w:rPr>
@@ -894,7 +894,7 @@
         <w:t>no determinista</w:t>
       </w:r>
       <w:r>
-        <w:t>, sin la reproducibilidad de un compilador, comparable al paso del ensamblador a los lenguajes de alto nivel (Fowler, 2025). El nuevo peldaño no elimina el juicio: lo vuelve más abstracto y decisivo.</w:t>
+        <w:t>, sin la reproducibilidad de un compilador, comparable al salto del ensamblador a los lenguajes de alto nivel (Fowler, 2025).</w:t>
       </w:r>
     </w:p>
     <w:p>
@@ -1065,7 +1065,7 @@
         <w:jc w:val="both"/>
       </w:pPr>
       <w:r>
-        <w:t>No todas las voces comparten ese optimismo. Grady Booch, coautor de UML, replicó que tales pronósticos revelan "una incomprensión fundamental de lo que es la ingeniería de software" (Booch, 2026). Bjarne Stroustrup, creador de C++, advirtió que el riesgo no es tanto el reemplazo como que los programadores "pierdan la capacidad de detectar problemas por estar tan acostumbrados a que se los resuelvan" (Stroustrup, 2025), un peligro que el apartado IV fundamenta.</w:t>
+        <w:t>No todas las voces comparten ese optimismo. Grady Booch, coautor de UML, replicó que tales pronósticos revelan "una incomprensión fundamental de lo que es la ingeniería de software" (Booch, 2026). Bjarne Stroustrup, creador de C++, advirtió que el riesgo no es el reemplazo sino que los programadores "pierdan la capacidad de detectar problemas por estar tan acostumbrados a que se los resuelvan" (Stroustrup, 2025).</w:t>
       </w:r>
     </w:p>
     <w:p>
@@ -1075,7 +1075,7 @@
         <w:jc w:val="both"/>
       </w:pPr>
       <w:r>
-        <w:t>Existe, además, un bando que anticipa no una transformación sino un reemplazo. Amodei advirtió que la IA podría eliminar la mitad de los empleos administrativos de nivel inicial en uno a cinco años y elevar el desempleo al 10-20 % (VandeHei y Allen, 2025); Mark Zuckerberg proyectó que cubriría el trabajo de los ingenieros de nivel medio de Meta, y Salesforce congeló la contratación de ingenieros en 2025 tras reportar un 30 % más de productividad (The San Francisco Standard, 2025). En clave académica, Frey y Osborne (2017) estimaron en un 47 % el empleo estadounidense en alto riesgo. No conviene minimizarlas, pero admiten reparos: aquel estudio medía ocupaciones enteras, no tareas, y trabajos posteriores lo corrigieron a la baja; las predicciones de directivos cargan un interés comercial —Salesforce aún emplea unos 15.000 ingenieros—; y el desplazamiento golpea la tarea rutinaria de codificar, no el juicio de especificar, validar y decidir que el apartado IV vuelve irreductible.</w:t>
+        <w:t>Existe, además, un bando que anticipa no una transformación sino un reemplazo. Amodei advirtió que la IA podría eliminar la mitad de los empleos administrativos de nivel inicial en uno a cinco años y elevar el desempleo al 10-20 % (VandeHei y Allen, 2025); Mark Zuckerberg proyectó que cubriría el trabajo de los ingenieros de nivel medio de Meta, y Salesforce congeló la contratación de ingenieros en 2025 (The San Francisco Standard, 2025). En clave académica, Frey y Osborne (2017) estimaron en un 47 % el empleo estadounidense en alto riesgo. No conviene minimizarlas, pero admiten reparos: aquel estudio medía ocupaciones, no tareas, y se corrigió a la baja; las predicciones de directivos cargan un interés comercial —Salesforce aún emplea unos 15.000 ingenieros—; y el desplazamiento golpea la tarea rutinaria de codificar, no el juicio de especificar, validar y decidir que el apartado IV vuelve irreductible.</w:t>
       </w:r>
     </w:p>
     <w:p>
@@ -1154,7 +1154,34 @@
         <w:jc w:val="both"/>
       </w:pPr>
       <w:r>
-        <w:t>La paradoja final es agridulce: cuanto más poderosa se vuelve la automatización, más valioso —y más escaso— se torna el juicio humano que decide qué automatizar, cómo validarlo y para qué fin. El ingeniero del futuro será menos un escriba y más un arquitecto, un auditor y un responsable último; pero serán menos quienes lleguen a esa cima, y más dura la entrada. La teoría de la computación no anuncia el fin de la profesión: traza el contorno —más estrecho— de su porvenir.</w:t>
+        <w:t xml:space="preserve">¿Quién gana, entonces? No el que escribe código más rápido —eso ya lo hace la máquina—, sino el que sube primero al peldaño que ella no alcanza: el que especifica y verifica sistemas de alto riesgo, el que orquesta agentes en lugar de competir con ellos, el que se especializa donde la demanda explota. De ahí el mensaje para quien empieza: no se trata de esforzarse </w:t>
+      </w:r>
+      <w:r>
+        <w:rPr>
+          <w:i/>
+        </w:rPr>
+        <w:t>más</w:t>
+      </w:r>
+      <w:r>
+        <w:t xml:space="preserve">, sino de esforzarse </w:t>
+      </w:r>
+      <w:r>
+        <w:rPr>
+          <w:i/>
+        </w:rPr>
+        <w:t>inteligentemente</w:t>
+      </w:r>
+      <w:r>
+        <w:t xml:space="preserve"> y, sobre todo, </w:t>
+      </w:r>
+      <w:r>
+        <w:rPr>
+          <w:i/>
+        </w:rPr>
+        <w:t>dónde</w:t>
+      </w:r>
+      <w:r>
+        <w:t xml:space="preserve"> —huir de la tarea que la IA ya hace mejor y correr hacia el juicio que, por los límites mismos de la computación, le sigue perteneciendo al humano—. La competencia no es contra la máquina: es por el lugar escaso desde el cual se la dirige. Quien lo entienda a tiempo no será desplazado: estará del lado que gana.</w:t>
       </w:r>
     </w:p>
     <w:p>

</xml_diff>

<commit_message>
Renumerar figuras (archivo = número en el documento) y cargar integrantes en portada
- Figuras: los nombres de archivo ahora coinciden con su número en el
  documento (fig3=seguridad, fig4=chomsky, fig5=empleo, fig6=wef).
  Actualizadas las rutas en paper.md, build_figures.py y los assets PNG.
- Portada: cargados los integrantes (Martín Ezequiel Pulitano y
  Nicolás Ulises Silva) en build_docx.py. Profesor/a queda pendiente.
- .docx regenerado.

Co-Authored-By: Claude Opus 4.8 <noreply@anthropic.com>
Claude-Session: https://claude.ai/code/session_01FqTs9VKxmytL6igKtKJn1Z
</commit_message>
<xml_diff>
--- a/Paper_Rol_del_ingeniero_informatico_en_10_anios.docx
+++ b/Paper_Rol_del_ingeniero_informatico_en_10_anios.docx
@@ -103,7 +103,7 @@
           <w:b w:val="0"/>
           <w:sz w:val="24"/>
         </w:rPr>
-        <w:t>Integrantes: ______________________________</w:t>
+        <w:t>Integrantes: Martín Ezequiel Pulitano y Nicolás Ulises Silva</w:t>
       </w:r>
     </w:p>
     <w:p>
@@ -513,7 +513,7 @@
               <a:graphicData uri="http://schemas.openxmlformats.org/drawingml/2006/picture">
                 <pic:pic>
                   <pic:nvPicPr>
-                    <pic:cNvPr id="0" name="fig6_seguridad.png"/>
+                    <pic:cNvPr id="0" name="fig3_seguridad.png"/>
                     <pic:cNvPicPr/>
                   </pic:nvPicPr>
                   <pic:blipFill>
@@ -676,7 +676,7 @@
               <a:graphicData uri="http://schemas.openxmlformats.org/drawingml/2006/picture">
                 <pic:pic>
                   <pic:nvPicPr>
-                    <pic:cNvPr id="0" name="fig3_chomsky.png"/>
+                    <pic:cNvPr id="0" name="fig4_chomsky.png"/>
                     <pic:cNvPicPr/>
                   </pic:nvPicPr>
                   <pic:blipFill>
@@ -883,7 +883,7 @@
               <a:graphicData uri="http://schemas.openxmlformats.org/drawingml/2006/picture">
                 <pic:pic>
                   <pic:nvPicPr>
-                    <pic:cNvPr id="0" name="fig4_empleo.png"/>
+                    <pic:cNvPr id="0" name="fig5_empleo.png"/>
                     <pic:cNvPicPr/>
                   </pic:nvPicPr>
                   <pic:blipFill>
@@ -937,7 +937,7 @@
               <a:graphicData uri="http://schemas.openxmlformats.org/drawingml/2006/picture">
                 <pic:pic>
                   <pic:nvPicPr>
-                    <pic:cNvPr id="0" name="fig5_wef.png"/>
+                    <pic:cNvPr id="0" name="fig6_wef.png"/>
                     <pic:cNvPicPr/>
                   </pic:nvPicPr>
                   <pic:blipFill>

</xml_diff>

<commit_message>
Incorporar mejoras opcionales financiadas con recortes (cuerpo: 2.988 → 2.984)
Adiciones de contenido:
- Jevons condicionado a la elasticidad de la demanda (no es ley universal).
- Caveat de saturación del benchmark SWE-bench.
- Cierre del arco "escalera de abstracción" en la conclusión.
- Tensión de Karpathy: "programar en inglés" no elimina la traducción a lo
  formal, la desplaza al ingeniero que debe desambiguar.

Recortes compensatorios (redundancia):
- Eliminado el remate redundante de la sección IV (la más extensa).
- "no proviene de la economía ni de la sociología" → "no es económica ni
  sociológica"; y dos frases comprimidas en III.

Co-Authored-By: Claude Opus 4.8 <noreply@anthropic.com>
Claude-Session: https://claude.ai/code/session_01FqTs9VKxmytL6igKtKJn1Z
</commit_message>
<xml_diff>
--- a/Paper_Rol_del_ingeniero_informatico_en_10_anios.docx
+++ b/Paper_Rol_del_ingeniero_informatico_en_10_anios.docx
@@ -304,7 +304,16 @@
         <w:t>issues</w:t>
       </w:r>
       <w:r>
-        <w:t xml:space="preserve"> reales de proyectos de software, el estado del arte pasó de resolver alrededor del 14 % de los problemas a comienzos de 2024 a cerca del 77 % en 2025 (Anthropic, 2025): de uno de cada siete casos a más de tres de cada cuatro en unos dieciocho meses. La adopción acompaña esa capacidad: GitHub Copilot superó los veinte millones de usuarios en 2025; Sundar Pichai afirmó en 2024 que la IA genera —y los ingenieros luego revisan— «más de una cuarta parte de todo el código nuevo en Google» y Satya Nadella la estimó en 2025 entre el 20 % y el 30 % en Microsoft (Zeff, 2025).</w:t>
+        <w:t xml:space="preserve"> reales de proyectos de software, el estado del arte pasó de resolver alrededor del 14 % de los problemas a comienzos de 2024 a cerca del 77 % en 2025 (Anthropic, 2025): de uno de cada siete casos a más de tres de cada cuatro en unos dieciocho meses, aunque el </w:t>
+      </w:r>
+      <w:r>
+        <w:rPr>
+          <w:i/>
+        </w:rPr>
+        <w:t>benchmark</w:t>
+      </w:r>
+      <w:r>
+        <w:t xml:space="preserve"> empieza a saturarse. La adopción acompaña esa capacidad: GitHub Copilot superó los veinte millones de usuarios en 2025; Sundar Pichai afirmó en 2024 que la IA genera —y los ingenieros luego revisan— «más de una cuarta parte de todo el código nuevo en Google» y Satya Nadella la estimó en 2025 entre el 20 % y el 30 % en Microsoft (Zeff, 2025).</w:t>
       </w:r>
     </w:p>
     <w:p>
@@ -411,7 +420,7 @@
         <w:t>creían</w:t>
       </w:r>
       <w:r>
-        <w:t xml:space="preserve"> haberse acelerado un 20 %. La brecha entre la productividad percibida y la real es, en sí misma, un dato relevante.</w:t>
+        <w:t xml:space="preserve"> haberse acelerado un 20 %. La brecha entre la productividad percibida y la real es, en sí misma, reveladora.</w:t>
       </w:r>
     </w:p>
     <w:p>
@@ -475,7 +484,7 @@
         <w:jc w:val="both"/>
       </w:pPr>
       <w:r>
-        <w:t xml:space="preserve">A esta tensión se suman los problemas de calidad y seguridad. Addy Osmani, ingeniero de Google, describió el «problema del 70 %»: la IA produce con rapidez el 70 % de una solución, pero el 30 % final —casos límite, depuración, integración con producción, mantenibilidad— sigue requiriendo el juicio de un ingeniero experimentado (Osmani, 2024). Un estudio controlado de la Universidad de Stanford halló que los programadores con acceso a un asistente de IA escribían código </w:t>
+        <w:t xml:space="preserve">A esto se suman problemas de calidad y seguridad. Addy Osmani, ingeniero de Google, describió el «problema del 70 %»: la IA produce con rapidez el 70 % de una solución, pero el 30 % final —casos límite, depuración, integración con producción, mantenibilidad— sigue requiriendo el juicio de un ingeniero experimentado (Osmani, 2024). Un estudio controlado de la Universidad de Stanford halló que los programadores con acceso a un asistente de IA escribían código </w:t>
       </w:r>
       <w:r>
         <w:rPr>
@@ -572,7 +581,7 @@
         <w:jc w:val="both"/>
       </w:pPr>
       <w:r>
-        <w:t>¿Por qué, pese a estos avances, es razonable sostener que el ingeniero no desaparecerá? La respuesta más profunda no proviene de la economía ni de la sociología, sino de la propia teoría de la computación. Existen barreras matemáticas, demostradas y permanentes, que ninguna IA —que es, en última instancia, un proceso computable— puede sortear.</w:t>
+        <w:t>¿Por qué, pese a estos avances, es razonable sostener que el ingeniero no desaparecerá? La respuesta más profunda no es económica ni sociológica, sino de la propia teoría de la computación. Existen barreras matemáticas, demostradas y permanentes, que ninguna IA —que es, en última instancia, un proceso computable— puede sortear.</w:t>
       </w:r>
     </w:p>
     <w:p>
@@ -656,7 +665,7 @@
         <w:t>transformer</w:t>
       </w:r>
       <w:r>
-        <w:t xml:space="preserve"> con precisión logarítmica está acotado por la clase TC⁰ y —salvo que se derrumben conjeturas de complejidad ampliamente aceptadas— no reconoce gramáticas libres de contexto arbitrarias (Delétang et al., 2023; Merrill y Sabharwal, 2023); la arquitectura actual no generaliza a lenguajes que exceden ese nivel. La teoría de lenguajes formales y la complejidad describen, así, los límites concretos de la IA que el ingeniero debe conocer.</w:t>
+        <w:t xml:space="preserve"> con precisión logarítmica está acotado por la clase TC⁰ y —salvo que se derrumben conjeturas de complejidad ampliamente aceptadas— no reconoce gramáticas libres de contexto arbitrarias (Delétang et al., 2023; Merrill y Sabharwal, 2023); la arquitectura actual no generaliza a lenguajes que exceden ese nivel.</w:t>
       </w:r>
     </w:p>
     <w:p>
@@ -798,7 +807,7 @@
         <w:jc w:val="both"/>
       </w:pPr>
       <w:r>
-        <w:t>Si la teoría garantiza un núcleo humano, la economía explica por qué ese núcleo no solo persistirá, sino que probablemente se ampliará. La historia de la automatización lo ilustra con la «paradoja de Jevons»: cuando una tecnología abarata el uso de un recurso, su consumo total tiende a aumentar. El caso de los cajeros automáticos es ilustrativo: al abaratar la sucursal, los bancos abrieron más y el empleo de cajeros creció durante dos décadas —antes de revertirse con la banca móvil—, aunque la tarea viró hacia la atención (Bessen, 2015). Aplicada al software, la lógica es análoga: al volverse más barato producir, la demanda —y la de quienes lo diseñan y controlan— podría crecer (Acemoglu y Restrepo, 2019; Autor, 2015). Thomas Dohmke, entonces director ejecutivo de GitHub, llegó a proyectar «mil millones de desarrolladores habilitados por miles de millones de agentes de IA» (Dohmke, 2025).</w:t>
+        <w:t>Si la teoría garantiza un núcleo humano, la economía explica por qué ese núcleo no solo persistirá, sino que probablemente se ampliará. La historia de la automatización lo ilustra con la «paradoja de Jevons»: cuando una tecnología abarata el uso de un recurso, su consumo total tiende a aumentar si la demanda es elástica. El caso de los cajeros automáticos es ilustrativo: al abaratar la sucursal, los bancos abrieron más y el empleo de cajeros creció durante dos décadas —antes de revertirse con la banca móvil—, aunque la tarea viró hacia la atención (Bessen, 2015). Aplicada al software, la lógica es análoga: al volverse más barato producir, la demanda —y la de quienes lo diseñan y controlan— podría crecer (Acemoglu y Restrepo, 2019; Autor, 2015). Thomas Dohmke, entonces director ejecutivo de GitHub, llegó a proyectar «mil millones de desarrolladores habilitados por miles de millones de agentes de IA» (Dohmke, 2025).</w:t>
       </w:r>
     </w:p>
     <w:p>
@@ -996,7 +1005,7 @@
         <w:jc w:val="both"/>
       </w:pPr>
       <w:r>
-        <w:t xml:space="preserve">Como toda proyección, depende de cómo lean el futuro quienes lo construyen, y sus opiniones, aunque dispares, convergen en un punto. En el extremo más audaz, Dario Amodei (Anthropic) pronosticó en marzo de 2025 que la IA escribiría el 90 % del código en tres a seis meses y «esencialmente todo» en doce; pero aclaró de inmediato que «el programador todavía debe especificar (…) las decisiones generales de diseño» (Council on Foreign Relations, 2025). Andrej Karpathy describió el «Software 3.0», en el que «programamos las computadoras en inglés» (Karpathy, 2025), y popularizó el </w:t>
+        <w:t xml:space="preserve">Como toda proyección, depende de cómo lean el futuro quienes lo construyen, y sus opiniones, aunque dispares, convergen en un punto. En el extremo más audaz, Dario Amodei (Anthropic) pronosticó en marzo de 2025 que la IA escribiría el 90 % del código en tres a seis meses y «esencialmente todo» en doce; pero aclaró de inmediato que «el programador todavía debe especificar (…) las decisiones generales de diseño» (Council on Foreign Relations, 2025). Andrej Karpathy describió el «Software 3.0», en el que «programamos las computadoras en inglés» —que el ingeniero aún debe desambiguar— (Karpathy, 2025), y popularizó el </w:t>
       </w:r>
       <w:r>
         <w:rPr>
@@ -1103,7 +1112,7 @@
         <w:jc w:val="both"/>
       </w:pPr>
       <w:r>
-        <w:t>La paradoja final es esperanzadora: cuanto más poderosa se vuelve la automatización, más valioso se torna el juicio humano que decide qué automatizar, cómo validarlo y para qué fin. El ingeniero del futuro será menos un escriba de instrucciones y más un arquitecto, un auditor y un responsable último de sistemas que ni él ni la máquina pueden comprender por completo. La teoría de la computación, lejos de anunciar el fin de la profesión, traza el contorno preciso de su porvenir.</w:t>
+        <w:t>La paradoja final es esperanzadora: cuanto más poderosa se vuelve la automatización, más valioso se torna el juicio humano que decide qué automatizar, cómo validarlo y para qué fin. En lo alto de la escalera de abstracción, el ingeniero del futuro será menos un escriba de instrucciones y más un arquitecto, un auditor y un responsable último de sistemas que ni él ni la máquina pueden comprender por completo. La teoría de la computación, lejos de anunciar el fin de la profesión, traza el contorno preciso de su porvenir.</w:t>
       </w:r>
     </w:p>
     <w:p>

</xml_diff>

<commit_message>
Conclusión más honesta: la transición no es "color de rosa"
La conclusión cerraba demasiado optimista. Ahora reconoce explícitamente el
costo: la puerta de entrada junior se angosta y la codificación pura se
contrae, con perdedores concretos pese a un saldo agregado positivo; la
transición premia a quien asciende y deja expuesto a quien no. Recién hecha
esa salvedad se mantiene la paradoja esperanzadora. Cierre: "el contorno
preciso —y exigente— de su porvenir".

Compensado con recortes de redundancia (cuerpo: 2.984 → 2.996, bajo el techo
de 3.000). .docx y .pdf regenerados.

Co-Authored-By: Claude Opus 4.8 <noreply@anthropic.com>
Claude-Session: https://claude.ai/code/session_01FqTs9VKxmytL6igKtKJn1Z
</commit_message>
<xml_diff>
--- a/Paper_Rol_del_ingeniero_informatico_en_10_anios.docx
+++ b/Paper_Rol_del_ingeniero_informatico_en_10_anios.docx
@@ -286,7 +286,7 @@
         <w:jc w:val="both"/>
       </w:pPr>
       <w:r>
-        <w:t xml:space="preserve">El ritmo del cambio reciente es difícil de exagerar. En el </w:t>
+        <w:t xml:space="preserve">En el </w:t>
       </w:r>
       <w:r>
         <w:rPr>
@@ -502,7 +502,7 @@
         <w:t>más</w:t>
       </w:r>
       <w:r>
-        <w:t xml:space="preserve"> en su seguridad: una peligrosa falsa sensación de confianza (Perry et al., 2023). Las evaluaciones de corrección apuntan en el mismo sentido: al endurecer los conjuntos de prueba, la corrección medida del código generado cae entre 19 y 29 puntos (Liu et al., 2023), y cerca del 40 % de las sugerencias de Copilot en escenarios de seguridad incluyen vulnerabilidades conocidas (Pearce et al., 2022). La IA, en suma, acelera la producción pero no garantiza la corrección: traslada el cuello de botella desde la escritura del código hacia su verificación.</w:t>
+        <w:t xml:space="preserve"> en su seguridad: una peligrosa falsa sensación de confianza (Perry et al., 2023). Las evaluaciones de corrección apuntan en el mismo sentido: al endurecer los conjuntos de prueba, la corrección medida del código generado cae entre 19 y 29 puntos (Liu et al., 2023), y cerca del 40 % de las sugerencias de Copilot en escenarios de seguridad incluyen vulnerabilidades conocidas (Pearce et al., 2022). La IA acelera la producción pero no garantiza la corrección: traslada el cuello de botella desde la escritura del código hacia su verificación.</w:t>
       </w:r>
     </w:p>
     <w:p>
@@ -782,7 +782,7 @@
         <w:t>teoría</w:t>
       </w:r>
       <w:r>
-        <w:t xml:space="preserve"> del problema que reside en la mente del equipo y que ninguna especificación formal captura. Allí reside el corazón irreductible de la ingeniería.</w:t>
+        <w:t xml:space="preserve"> del problema que reside en la mente del equipo y que ninguna especificación formal captura.</w:t>
       </w:r>
     </w:p>
     <w:p>
@@ -1014,7 +1014,7 @@
         <w:t>vibe coding</w:t>
       </w:r>
       <w:r>
-        <w:t xml:space="preserve"> para la programación guiada por la intuición y delegada en la IA.</w:t>
+        <w:t>, programación delegada en la IA.</w:t>
       </w:r>
     </w:p>
     <w:p>
@@ -1102,7 +1102,7 @@
         <w:jc w:val="both"/>
       </w:pPr>
       <w:r>
-        <w:t>El recorrido permite confirmar, con matices, la hipótesis inicial. En los próximos diez años el ingeniero informático conservará su lugar, pero no su forma de trabajo: el centro de gravedad de la profesión pasará de la ejecución técnica —escribir código línea por línea— a la especificación, el diseño, la integración y, sobre todo, la validación y supervisión crítica de sistemas crecientemente autónomos. La historia respalda esta lectura: cada abstracción anterior elevó al ingeniero en lugar de eliminarlo; la evidencia empírica reciente la matiza, al mostrar que la IA acelera la producción pero degrada la garantía de corrección; y la teoría de la computación la fundamenta, al demostrar que la verificación universal (Rice y Turing), la resolución eficiente de todo problema (P vs. NP) y la traducción de la intención ambigua al lenguaje formal (Chomsky) no son tareas que una máquina pueda asumir por completo.</w:t>
+        <w:t>El recorrido permite confirmar, con matices, la hipótesis inicial. En los próximos diez años el ingeniero informático conservará su lugar, pero no su forma de trabajo: el centro de gravedad de la profesión pasará de la ejecución técnica —escribir código línea por línea— a la especificación, el diseño, la integración y, sobre todo, la validación y supervisión crítica de sistemas crecientemente autónomos. La historia respalda esta lectura: cada abstracción anterior elevó al ingeniero en lugar de eliminarlo; la evidencia empírica reciente la matiza, al mostrar que la IA acelera la producción pero degrada la garantía de corrección; y la teoría de la computación la fundamenta: la verificación universal (Rice, Turing), la resolución eficiente de todo problema (P vs. NP) y la traducción de la intención ambigua a lo formal (Chomsky) exceden a cualquier máquina.</w:t>
       </w:r>
     </w:p>
     <w:p>
@@ -1112,7 +1112,7 @@
         <w:jc w:val="both"/>
       </w:pPr>
       <w:r>
-        <w:t>La paradoja final es esperanzadora: cuanto más poderosa se vuelve la automatización, más valioso se torna el juicio humano que decide qué automatizar, cómo validarlo y para qué fin. En lo alto de la escalera de abstracción, el ingeniero del futuro será menos un escriba de instrucciones y más un arquitecto, un auditor y un responsable último de sistemas que ni él ni la máquina pueden comprender por completo. La teoría de la computación, lejos de anunciar el fin de la profesión, traza el contorno preciso de su porvenir.</w:t>
+        <w:t>El balance, sin embargo, no es de color de rosa: la puerta de entrada junior se angosta y la codificación pura se contrae, con perdedores concretos pese a un saldo agregado positivo. La transición premia a quien asciende y deja expuesto a quien no. Hecha esa salvedad, la paradoja de fondo es esperanzadora: cuanto más poderosa se vuelve la automatización, más valioso se torna el juicio humano que decide qué automatizar, cómo validarlo y para qué fin. En lo alto de esa escalera, el ingeniero del futuro será menos un escriba de instrucciones y más un arquitecto, un auditor y un responsable último de sistemas que ni él ni la máquina pueden comprender por completo. La teoría de la computación, lejos de anunciar el fin de la profesión, traza el contorno preciso —y exigente— de su porvenir.</w:t>
       </w:r>
     </w:p>
     <w:p>

</xml_diff>

<commit_message>
Tesis más fuerte: menos ingenieros y concentración en los mejores (polarización)
La intro, el resumen y la conclusión ahora plantean explícitamente que la IA
no hará desaparecer la profesión pero la reducirá y polarizará: menos puestos
—sobre todo rutinarios y de nivel inicial— y valor concentrado en los más
capaces. "El que solo codifica queda expuesto; el que asciende en abstracción,
no."

Evidencia agregada (sección V) y referencia nueva:
- SignalFire (2025): la contratación de recién recibidos en las grandes
  tecnológicas cayó ~50 % desde 2019; la IA absorbe las tareas con que los
  juniors aprendían. Bibliografía: 39 → 40.

Compensado con recortes de redundancia en III, IV y la conclusión (cuerpo:
2.996 → 2.985, bajo el techo). .docx y .pdf regenerados.

Co-Authored-By: Claude Opus 4.8 <noreply@anthropic.com>
Claude-Session: https://claude.ai/code/session_01FqTs9VKxmytL6igKtKJn1Z
</commit_message>
<xml_diff>
--- a/Paper_Rol_del_ingeniero_informatico_en_10_anios.docx
+++ b/Paper_Rol_del_ingeniero_informatico_en_10_anios.docx
@@ -146,7 +146,7 @@
         <w:jc w:val="both"/>
       </w:pPr>
       <w:r>
-        <w:t>La irrupción de la inteligencia artificial generativa y de los agentes de programación autónomos ha reabierto una pregunta tan vieja como la propia disciplina: ¿seguirá existiendo el ingeniero informático? Este trabajo sostiene que, en la próxima década, el ingeniero no será reemplazado por la tecnología, sino que su rol se transformará: dejará de centrarse en la ejecución técnica para enfocarse en la especificación, la integración, la validación y la supervisión crítica de sistemas automatizados. El argumento se construye sobre tres pilares: la evidencia histórica de que cada salto de abstracción elevó el nivel del trabajo en lugar de eliminarlo; la evidencia empírica reciente (2021-2026) sobre el alcance y los límites medidos de la IA en el desarrollo de software; y, como columna vertebral teórica, los límites fundamentales de la computación —el problema de la detención, el teorema de Rice, la cuestión P vs. NP y la jerarquía de Chomsky— que garantizan la existencia de un núcleo irreductiblemente humano de juicio. La conclusión es una proyección calibrada: el ingeniero del futuro ascenderá en la escalera de abstracción hacia tareas que la teoría de la computación demuestra que ninguna máquina puede automatizar por completo.</w:t>
+        <w:t>La irrupción de la inteligencia artificial generativa y de los agentes de programación autónomos ha reabierto una pregunta tan vieja como la propia disciplina: ¿seguirá existiendo el ingeniero informático? Este trabajo sostiene que, en la próxima década, la IA no reemplazará a la profesión, pero la reducirá y polarizará: habrá menos ingenieros —sobre todo en los puestos rutinarios y de nivel inicial— y el valor se concentrará en los más capaces, que dejarán la ejecución técnica para enfocarse en la especificación, la integración, la validación y la supervisión crítica de sistemas automatizados. El argumento se construye sobre tres pilares: la evidencia histórica de que cada salto de abstracción elevó el nivel del trabajo en lugar de eliminarlo; la evidencia empírica reciente (2021-2026) sobre el alcance y los límites medidos de la IA en el desarrollo de software; y, como columna vertebral teórica, los límites fundamentales de la computación —el problema de la detención, el teorema de Rice, la cuestión P vs. NP y la jerarquía de Chomsky— que garantizan la existencia de un núcleo irreductiblemente humano de juicio. La conclusión es una proyección calibrada: el ingeniero del futuro ascenderá en la escalera de abstracción hacia tareas que la teoría de la computación demuestra que ninguna máquina puede automatizar por completo.</w:t>
       </w:r>
     </w:p>
     <w:p>
@@ -197,7 +197,7 @@
         <w:jc w:val="both"/>
       </w:pPr>
       <w:r>
-        <w:t>Este trabajo parte de la siguiente hipótesis: en los próximos diez años, el rol del ingeniero informático dejará de centrarse en la ejecución técnica para abarcar la toma de decisiones, la integración de tecnologías y la supervisión crítica de sistemas automatizados. El ingeniero no será reemplazado, sino que se volverá menos operativo y más estratégico, con mayor responsabilidad en diseñar, validar y controlar sistemas complejos.</w:t>
+        <w:t>Este trabajo parte de la siguiente hipótesis: en los próximos diez años la IA no hará desaparecer la profesión, pero la reducirá y polarizará. Habrá menos ingenieros —sobre todo en puestos rutinarios y de nivel inicial— y el valor se concentrará en los mejores: los que dejen la ejecución técnica para abarcar la toma de decisiones, la integración y la supervisión crítica de sistemas automatizados. El que solo codifica queda expuesto; el que asciende en abstracción, no.</w:t>
       </w:r>
     </w:p>
     <w:p>
@@ -420,7 +420,7 @@
         <w:t>creían</w:t>
       </w:r>
       <w:r>
-        <w:t xml:space="preserve"> haberse acelerado un 20 %. La brecha entre la productividad percibida y la real es, en sí misma, reveladora.</w:t>
+        <w:t xml:space="preserve"> haberse acelerado un 20 %.</w:t>
       </w:r>
     </w:p>
     <w:p>
@@ -484,7 +484,7 @@
         <w:jc w:val="both"/>
       </w:pPr>
       <w:r>
-        <w:t xml:space="preserve">A esto se suman problemas de calidad y seguridad. Addy Osmani, ingeniero de Google, describió el «problema del 70 %»: la IA produce con rapidez el 70 % de una solución, pero el 30 % final —casos límite, depuración, integración con producción, mantenibilidad— sigue requiriendo el juicio de un ingeniero experimentado (Osmani, 2024). Un estudio controlado de la Universidad de Stanford halló que los programadores con acceso a un asistente de IA escribían código </w:t>
+        <w:t xml:space="preserve">A esto se suman problemas de calidad y seguridad. Addy Osmani, ingeniero de Google, describió el «problema del 70 %»: la IA produce con rapidez el 70 % de una solución, pero el 30 % final —casos límite, depuración, mantenibilidad— sigue requiriendo el juicio de un ingeniero experimentado (Osmani, 2024). Un estudio controlado de la Universidad de Stanford halló que los programadores con acceso a un asistente de IA escribían código </w:t>
       </w:r>
       <w:r>
         <w:rPr>
@@ -581,7 +581,7 @@
         <w:jc w:val="both"/>
       </w:pPr>
       <w:r>
-        <w:t>¿Por qué, pese a estos avances, es razonable sostener que el ingeniero no desaparecerá? La respuesta más profunda no es económica ni sociológica, sino de la propia teoría de la computación. Existen barreras matemáticas, demostradas y permanentes, que ninguna IA —que es, en última instancia, un proceso computable— puede sortear.</w:t>
+        <w:t>¿Por qué, pese a estos avances, el ingeniero no desaparecerá? La respuesta más profunda no es económica ni sociológica, sino de la propia teoría de la computación. Existen barreras matemáticas, demostradas y permanentes, que ninguna IA —que es, en última instancia, un proceso computable— puede sortear.</w:t>
       </w:r>
     </w:p>
     <w:p>
@@ -637,7 +637,7 @@
         <w:t>intratabilidad</w:t>
       </w:r>
       <w:r>
-        <w:t xml:space="preserve">. El problema P vs. NP, uno de los siete Problemas del Milenio, pregunta si todo problema cuya solución puede verificarse rápidamente puede también resolverse rápidamente (Cook, 1971; Karp, 1972). Bajo la hipótesis ampliamente aceptada de que P ≠ NP, numerosos problemas centrales de la ingeniería (planificación, ruteo, asignación de recursos) son NP-difíciles y no admiten soluciones eficientes en el peor caso. Este límite es matemático, no de capacidad de cómputo: ninguna IA lo derogará. El ingeniero seguirá siendo quien elija heurísticas, aproximaciones y compromisos; decidir </w:t>
+        <w:t xml:space="preserve">. El problema P vs. NP pregunta si todo problema cuya solución puede verificarse rápidamente puede también resolverse rápidamente (Cook, 1971; Karp, 1972). Bajo la hipótesis ampliamente aceptada de que P ≠ NP, numerosos problemas centrales de la ingeniería (planificación, ruteo, asignación de recursos) son NP-difíciles, sin solución eficiente en el peor caso. Este límite es matemático, no de capacidad de cómputo: ninguna IA lo derogará. El ingeniero seguirá siendo quien elija heurísticas, aproximaciones y compromisos; decidir </w:t>
       </w:r>
       <w:r>
         <w:rPr>
@@ -646,7 +646,7 @@
         <w:t>qué</w:t>
       </w:r>
       <w:r>
-        <w:t xml:space="preserve"> sacrificar —optimalidad, tiempo o recursos— es un acto de juicio, no un cálculo automatizable.</w:t>
+        <w:t xml:space="preserve"> sacrificar es un acto de juicio, no un cálculo automatizable.</w:t>
       </w:r>
     </w:p>
     <w:p>
@@ -745,7 +745,7 @@
         <w:jc w:val="both"/>
       </w:pPr>
       <w:r>
-        <w:t>Estas barreras alcanzan también a la propia IA. Trabajos recientes demuestran, mediante diagonalización apoyada en la indecidibilidad del problema de la detención, que la «alucinación» es una limitación innata de los LLM: ningún modelo puede aprender todas las funciones computables, por lo que producirá inevitablemente errores que no puede detectar por sí mismo (Xu et al., 2024). Un LLM no puede autoverificar su salida; necesita un agente externo —el ingeniero— que la contraste con la realidad y asuma la responsabilidad.</w:t>
+        <w:t>Estas barreras alcanzan también a la propia IA. Trabajos recientes demuestran, mediante diagonalización apoyada en la indecidibilidad del problema de la detención, que la «alucinación» es una limitación innata de los LLM: ningún modelo puede aprender todas las funciones computables, por lo que producirá inevitablemente errores que no puede detectar por sí mismo (Xu et al., 2024). Necesita, pues, un verificador externo —el ingeniero— que responda por ella.</w:t>
       </w:r>
     </w:p>
     <w:p>
@@ -872,7 +872,7 @@
         <w:jc w:val="both"/>
       </w:pPr>
       <w:r>
-        <w:t>Con todo, los datos del mercado laboral advierten que la transición no será indolora ni uniforme. La Oficina de Estadísticas Laborales de EE. UU. proyecta un crecimiento del empleo de «desarrolladores de software» cercano al 15 % entre 2024 y 2034 —muy por encima del promedio—, mientras la categoría más estrecha de «programadores» se contraería un 6 % por la automatización (Bureau of Labor Statistics, 2025): se automatiza la tarea de codificar, no la de diseñar y decidir. A la vez, un estudio de Stanford halló una caída de empleo del 13 % al 16 % en los trabajadores de carrera temprana (22-25 años) de las ocupaciones más expuestas a la IA —entre ellas el desarrollo de software—, mientras los de mayor experiencia se mantenían estables (Brynjolfsson et al., 2025). La «puerta de entrada» junior se estrecha y la demanda se desplaza hacia perfiles con criterio: las competencias del nuevo rol.</w:t>
+        <w:t>Con todo, los datos del mercado laboral advierten que la transición no será indolora ni uniforme. La Oficina de Estadísticas Laborales de EE. UU. proyecta un crecimiento del empleo de «desarrolladores de software» cercano al 15 % entre 2024 y 2034 —muy por encima del promedio—, mientras la categoría más estrecha de «programadores» se contraería un 6 % por la automatización (Bureau of Labor Statistics, 2025): se automatiza la tarea de codificar, no la de diseñar y decidir. A la vez, un estudio de Stanford halló una caída de empleo del 13 % al 16 % en los trabajadores de carrera temprana (22-25 años) de las ocupaciones más expuestas a la IA —entre ellas el desarrollo de software—, mientras los de mayor experiencia se mantenían estables (Brynjolfsson et al., 2025). La contratación de recién recibidos en las grandes tecnológicas cayó cerca del 50 % desde 2019, porque la IA absorbe las tareas con que los juniors aprendían (SignalFire, 2025). La «puerta de entrada» junior se estrecha y la demanda se desplaza hacia perfiles con criterio: las competencias del nuevo rol.</w:t>
       </w:r>
     </w:p>
     <w:p>
@@ -1102,7 +1102,7 @@
         <w:jc w:val="both"/>
       </w:pPr>
       <w:r>
-        <w:t>El recorrido permite confirmar, con matices, la hipótesis inicial. En los próximos diez años el ingeniero informático conservará su lugar, pero no su forma de trabajo: el centro de gravedad de la profesión pasará de la ejecución técnica —escribir código línea por línea— a la especificación, el diseño, la integración y, sobre todo, la validación y supervisión crítica de sistemas crecientemente autónomos. La historia respalda esta lectura: cada abstracción anterior elevó al ingeniero en lugar de eliminarlo; la evidencia empírica reciente la matiza, al mostrar que la IA acelera la producción pero degrada la garantía de corrección; y la teoría de la computación la fundamenta: la verificación universal (Rice, Turing), la resolución eficiente de todo problema (P vs. NP) y la traducción de la intención ambigua a lo formal (Chomsky) exceden a cualquier máquina.</w:t>
+        <w:t>El recorrido permite confirmar, con matices, la hipótesis inicial. En los próximos diez años la profesión no desaparecerá, pero será más pequeña y más exigente —menos ingenieros, concentrados en los mejores—, y cambiará de forma: su centro de gravedad pasará de la ejecución técnica —escribir código línea por línea— a la especificación, el diseño, la integración y, sobre todo, la validación y supervisión crítica de sistemas crecientemente autónomos. La historia respalda esta lectura: cada abstracción anterior elevó al ingeniero en lugar de eliminarlo; la evidencia empírica reciente la matiza, al mostrar que la IA acelera la producción pero degrada la garantía de corrección; y la teoría de la computación la fundamenta: la verificación universal (Rice, Turing), la resolución eficiente de todo problema (P vs. NP) y la traducción de la intención ambigua a lo formal (Chomsky) exceden a cualquier máquina.</w:t>
       </w:r>
     </w:p>
     <w:p>
@@ -1112,7 +1112,7 @@
         <w:jc w:val="both"/>
       </w:pPr>
       <w:r>
-        <w:t>El balance, sin embargo, no es de color de rosa: la puerta de entrada junior se angosta y la codificación pura se contrae, con perdedores concretos pese a un saldo agregado positivo. La transición premia a quien asciende y deja expuesto a quien no. Hecha esa salvedad, la paradoja de fondo es esperanzadora: cuanto más poderosa se vuelve la automatización, más valioso se torna el juicio humano que decide qué automatizar, cómo validarlo y para qué fin. En lo alto de esa escalera, el ingeniero del futuro será menos un escriba de instrucciones y más un arquitecto, un auditor y un responsable último de sistemas que ni él ni la máquina pueden comprender por completo. La teoría de la computación, lejos de anunciar el fin de la profesión, traza el contorno preciso —y exigente— de su porvenir.</w:t>
+        <w:t>El balance, sin embargo, no es de color de rosa: la puerta de entrada junior se angosta y la codificación pura se contrae, con perdedores concretos pese a un saldo agregado positivo. Hecha esa salvedad, la paradoja de fondo es esperanzadora: cuanto más poderosa se vuelve la automatización, más valioso se torna el juicio humano que decide qué automatizar, cómo validarlo y para qué fin. En lo alto de esa escalera, el ingeniero del futuro será menos un escriba de instrucciones y más un arquitecto, un auditor y un responsable último de sistemas que ni él ni la máquina pueden comprender por completo. La teoría de la computación, lejos de anunciar el fin de la profesión, traza el contorno preciso —y exigente— de su porvenir.</w:t>
       </w:r>
     </w:p>
     <w:p>
@@ -1688,6 +1688,25 @@
         <w:jc w:val="left"/>
       </w:pPr>
       <w:r>
+        <w:t xml:space="preserve">SignalFire. (2025). </w:t>
+      </w:r>
+      <w:r>
+        <w:rPr>
+          <w:i/>
+        </w:rPr>
+        <w:t>State of tech talent report 2025</w:t>
+      </w:r>
+      <w:r>
+        <w:t>. https://www.signalfire.com/blog/signalfire-state-of-talent-report-2025</w:t>
+      </w:r>
+    </w:p>
+    <w:p>
+      <w:pPr>
+        <w:spacing w:line="360" w:lineRule="auto" w:after="120"/>
+        <w:ind w:left="720" w:hanging="720"/>
+        <w:jc w:val="left"/>
+      </w:pPr>
+      <w:r>
         <w:t xml:space="preserve">Spracklen, J., Wijewickrama, R., Sakib, A. H. M. N., Maiti, A., Viswanath, B., &amp; Jadliwala, M. (2025). We have a package for you! A comprehensive analysis of package hallucinations by code generating LLMs. En </w:t>
       </w:r>
       <w:r>

</xml_diff>

<commit_message>
Reforzar "muchos menos": datos de Indeed + decisión de Salesforce (Benioff)
Tesis de polarización ahora cuantitativamente blindada (sección V):
- Indeed Hiring Lab (2025): ofertas de software -36% desde 2020; experience
  creep — puestos junior -34% frente a -19% senior (el dato que mejor calza
  con "la base se contrae más que el top").
- Benioff/Salesforce (2024, 20VC): no suma ingenieros en 2025 tras +30% de
  productividad con IA, encuadrado como freno de contratación (no despidos).
Citas verificadas contra fuentes primarias; Zuckerberg descartado por
prospectivo/promocional.

Compensado quitando la cita más blanda (McKinsey 20-45%, redundante con Peng)
y comprimiendo detalle histórico en II (cuerpo: 2.985 -> 2.989; refs 40 -> 41).
.docx y .pdf regenerados.

Co-Authored-By: Claude Opus 4.8 <noreply@anthropic.com>
Claude-Session: https://claude.ai/code/session_01FqTs9VKxmytL6igKtKJn1Z
</commit_message>
<xml_diff>
--- a/Paper_Rol_del_ingeniero_informatico_en_10_anios.docx
+++ b/Paper_Rol_del_ingeniero_informatico_en_10_anios.docx
@@ -241,7 +241,7 @@
         <w:jc w:val="both"/>
       </w:pPr>
       <w:r>
-        <w:t>La historia del software puede leerse como el ascenso por una «escalera de abstracción» en la que cada peldaño automatizó el trabajo del peldaño anterior y, lejos de suprimir al ingeniero, lo elevó a un nivel conceptual superior. En los años cuarenta y cincuenta, programar significaba escribir código máquina y, más tarde, lenguaje ensamblador; el propio ensamblador fue la primera herramienta que automatizó la traducción de mnemónicos a instrucciones binarias. El salto decisivo llegó con los lenguajes de alto nivel: FORTRAN, diseñado por John Backus en IBM y distribuido desde 1957, permitió expresar algoritmos en notación matemática y delegó en un compilador la generación del código de bajo nivel; COBOL, inspirado en el trabajo de Grace Hopper, hizo lo propio para el ámbito de los negocios.</w:t>
+        <w:t>La historia del software puede leerse como el ascenso por una «escalera de abstracción» en la que cada peldaño automatizó el trabajo del peldaño anterior y, lejos de suprimir al ingeniero, lo elevó a un nivel conceptual superior. En los años cuarenta y cincuenta, programar significaba escribir código máquina y, más tarde, ensamblador —la primera herramienta que automatizó la traducción a instrucciones binarias—. El salto decisivo llegó con los lenguajes de alto nivel: FORTRAN (Backus, IBM, 1957) permitió expresar algoritmos en notación matemática y delegó en un compilador el código de bajo nivel; COBOL, inspirado en Grace Hopper, hizo lo propio para los negocios.</w:t>
       </w:r>
     </w:p>
     <w:p>
@@ -393,7 +393,7 @@
         <w:jc w:val="both"/>
       </w:pPr>
       <w:r>
-        <w:t xml:space="preserve">Ahora bien, la evidencia rigurosa sobre su impacto es más matizada de lo que sugiere el entusiasmo. Un experimento controlado de GitHub y Microsoft mostró que los desarrolladores que usaban Copilot completaban una tarea acotada —programar un servidor HTTP— un 55,8 % más rápido (Peng et al., 2023), y McKinsey estimó mejoras de productividad de entre el 20 % y el 45 % en la función de ingeniería de software (McKinsey &amp; Company, 2023). Sin embargo, un ensayo controlado aleatorizado independiente de METR (2025) arrojó un resultado contraintuitivo: desarrolladores </w:t>
+        <w:t xml:space="preserve">Ahora bien, la evidencia rigurosa sobre su impacto es más matizada de lo que sugiere el entusiasmo. Un experimento controlado de GitHub y Microsoft mostró que los desarrolladores que usaban Copilot completaban una tarea acotada —programar un servidor HTTP— un 55,8 % más rápido (Peng et al., 2023). Sin embargo, un ensayo controlado aleatorizado independiente de METR (2025) arrojó un resultado contraintuitivo: desarrolladores </w:t>
       </w:r>
       <w:r>
         <w:rPr>
@@ -872,7 +872,7 @@
         <w:jc w:val="both"/>
       </w:pPr>
       <w:r>
-        <w:t>Con todo, los datos del mercado laboral advierten que la transición no será indolora ni uniforme. La Oficina de Estadísticas Laborales de EE. UU. proyecta un crecimiento del empleo de «desarrolladores de software» cercano al 15 % entre 2024 y 2034 —muy por encima del promedio—, mientras la categoría más estrecha de «programadores» se contraería un 6 % por la automatización (Bureau of Labor Statistics, 2025): se automatiza la tarea de codificar, no la de diseñar y decidir. A la vez, un estudio de Stanford halló una caída de empleo del 13 % al 16 % en los trabajadores de carrera temprana (22-25 años) de las ocupaciones más expuestas a la IA —entre ellas el desarrollo de software—, mientras los de mayor experiencia se mantenían estables (Brynjolfsson et al., 2025). La contratación de recién recibidos en las grandes tecnológicas cayó cerca del 50 % desde 2019, porque la IA absorbe las tareas con que los juniors aprendían (SignalFire, 2025). La «puerta de entrada» junior se estrecha y la demanda se desplaza hacia perfiles con criterio: las competencias del nuevo rol.</w:t>
+        <w:t>Con todo, los datos del mercado laboral advierten que la transición no será indolora ni uniforme. La Oficina de Estadísticas Laborales de EE. UU. proyecta un crecimiento del empleo de «desarrolladores de software» cercano al 15 % entre 2024 y 2034 —muy por encima del promedio—, mientras la categoría más estrecha de «programadores» se contraería un 6 % por la automatización (Bureau of Labor Statistics, 2025): se automatiza la tarea de codificar, no la de diseñar y decidir. A la vez, un estudio de Stanford halló una caída de empleo del 13 % al 16 % en los trabajadores de carrera temprana (22-25 años) de las ocupaciones más expuestas a la IA —entre ellas el desarrollo de software—, mientras los de mayor experiencia se mantenían estables (Brynjolfsson et al., 2025). La contratación de recién recibidos en las grandes tecnológicas cayó cerca del 50 % desde 2019, porque la IA absorbe las tareas con que los juniors aprendían (SignalFire, 2025). Indeed registra una caída del 36 % en las ofertas de software desde 2020 y un endurecimiento de los requisitos: los puestos junior se contrajeron un 34 %, frente al 19 % de los senior (Indeed Hiring Lab, 2025). Salesforce, incluso, anunció que en 2025 no sumaría ingenieros tras elevar su productividad más de un 30 % con IA (Benioff, 2024). La «puerta de entrada» junior se estrecha y la demanda se desplaza hacia perfiles con criterio: las competencias del nuevo rol.</w:t>
       </w:r>
     </w:p>
     <w:p>
@@ -1034,7 +1034,7 @@
         <w:jc w:val="both"/>
       </w:pPr>
       <w:r>
-        <w:t>Sam Altman, de OpenAI, ofrece quizás la síntesis más equilibrada. Ante la pregunta de si conviene seguir contratando ingenieros respondió que «cada ingeniero de software hará, durante un buen tiempo, muchísimo más» (Thompson, 2025), y agregó que «mucha más gente podrá crear software, pero los expertos seguirán siendo mucho mejores que los novatos, si adoptan las nuevas herramientas» (Altman, 2025). Es la hipótesis de este trabajo en boca de un protagonista del cambio: la IA no anula al ingeniero, sino que amplifica al que sabe usarla. Existen, es cierto, posiciones más radicales —Welsh anuncia software «entrenado, no programado»—, pero incluso varias de las voces más optimistas reservan para el humano las tareas de especificar, decidir y juzgar: las mismas que la teoría de la computación demuestra que no pueden automatizarse.</w:t>
+        <w:t>Sam Altman, de OpenAI, ofrece quizás la síntesis más equilibrada. Sostuvo que «cada ingeniero de software hará, durante un buen tiempo, muchísimo más» (Thompson, 2025), y agregó que «mucha más gente podrá crear software, pero los expertos seguirán siendo mucho mejores que los novatos, si adoptan las nuevas herramientas» (Altman, 2025). Es la hipótesis de este trabajo en boca de un protagonista del cambio: la IA no anula al ingeniero, sino que amplifica al que sabe usarla. Existen, es cierto, posiciones más radicales —Welsh anuncia software «entrenado, no programado»—, pero incluso varias de las voces más optimistas reservan para el humano las tareas de especificar, decidir y juzgar: las mismas que la teoría de la computación demuestra que no pueden automatizarse.</w:t>
       </w:r>
     </w:p>
     <w:p>
@@ -1223,6 +1223,34 @@
       </w:r>
       <w:r>
         <w:t>(3), 3-30. https://doi.org/10.1257/jep.29.3.3</w:t>
+      </w:r>
+    </w:p>
+    <w:p>
+      <w:pPr>
+        <w:spacing w:line="360" w:lineRule="auto" w:after="120"/>
+        <w:ind w:left="720" w:hanging="720"/>
+        <w:jc w:val="left"/>
+      </w:pPr>
+      <w:r>
+        <w:t xml:space="preserve">Benioff, M. (2024, 9 de diciembre). </w:t>
+      </w:r>
+      <w:r>
+        <w:rPr>
+          <w:i/>
+        </w:rPr>
+        <w:t>Marc Benioff, Salesforce founder: Why Salesforce isn't hiring software engineers</w:t>
+      </w:r>
+      <w:r>
+        <w:t xml:space="preserve"> (n.º 1236) [Episodio de podcast de audio]. En </w:t>
+      </w:r>
+      <w:r>
+        <w:rPr>
+          <w:i/>
+        </w:rPr>
+        <w:t>20VC with Harry Stebbings</w:t>
+      </w:r>
+      <w:r>
+        <w:t>. https://www.thetwentyminutevc.com/marc-benioff-2</w:t>
       </w:r>
     </w:p>
     <w:p>
@@ -1441,6 +1469,25 @@
         <w:jc w:val="left"/>
       </w:pPr>
       <w:r>
+        <w:t xml:space="preserve">Indeed Hiring Lab. (2025, 30 de julio). </w:t>
+      </w:r>
+      <w:r>
+        <w:rPr>
+          <w:i/>
+        </w:rPr>
+        <w:t>Experience requirements have tightened amid the tech hiring freeze</w:t>
+      </w:r>
+      <w:r>
+        <w:t>. https://www.hiringlab.org/2025/07/30/experience-requirements-have-tightened-amid-the-tech-hiring-freeze/</w:t>
+      </w:r>
+    </w:p>
+    <w:p>
+      <w:pPr>
+        <w:spacing w:line="360" w:lineRule="auto" w:after="120"/>
+        <w:ind w:left="720" w:hanging="720"/>
+        <w:jc w:val="left"/>
+      </w:pPr>
+      <w:r>
         <w:t xml:space="preserve">Karp, R. M. (1972). Reducibility among combinatorial problems. En </w:t>
       </w:r>
       <w:r>
@@ -1489,25 +1536,6 @@
       </w:r>
       <w:r>
         <w:t xml:space="preserve"> (pp. 21558-21572). https://doi.org/10.48550/arXiv.2305.01210</w:t>
-      </w:r>
-    </w:p>
-    <w:p>
-      <w:pPr>
-        <w:spacing w:line="360" w:lineRule="auto" w:after="120"/>
-        <w:ind w:left="720" w:hanging="720"/>
-        <w:jc w:val="left"/>
-      </w:pPr>
-      <w:r>
-        <w:t xml:space="preserve">McKinsey &amp; Company. (2023, 27 de junio). </w:t>
-      </w:r>
-      <w:r>
-        <w:rPr>
-          <w:i/>
-        </w:rPr>
-        <w:t>Unleashing developer productivity with generative AI</w:t>
-      </w:r>
-      <w:r>
-        <w:t>. https://www.mckinsey.com/capabilities/mckinsey-digital/our-insights/unleashing-developer-productivity-with-generative-ai</w:t>
       </w:r>
     </w:p>
     <w:p>

</xml_diff>

<commit_message>
Contar la salida (y retiro) de Claude Fable 5 / Mythos 5
Sección III: tras el ~89% de Opus 4.8, se añade que en junio de 2026
aparecieron modelos aún más capaces (Fable 5 y Mythos 5) pero su acceso fue
suspendido a los días por una directiva del gobierno de EE. UU. Encuadre
honesto: Anthropic NO reporta un número de SWE-bench para ellos (el ~95% es
de leaderboards de terceros), por lo que el estado del arte citable y
disponible sigue siendo Opus 4.8.

- Bibliografia: tres entradas Anthropic 2026 con desambiguacion a/b/c
  (Fable&Mythos / Opus 4.8 / statement de suspension). 44 -> 46 referencias.
- Compensado quitando la cifra Indeed -36% (se conserva junior -34% vs senior
  -19%) y una frase redundante en IV. Cuerpo: 2.988 -> 2.990. .docx/.pdf/figura
  regenerados.

Co-Authored-By: Claude Opus 4.8 <noreply@anthropic.com>
Claude-Session: https://claude.ai/code/session_01FqTs9VKxmytL6igKtKJn1Z
</commit_message>
<xml_diff>
--- a/Paper_Rol_del_ingeniero_informatico_en_10_anios.docx
+++ b/Paper_Rol_del_ingeniero_informatico_en_10_anios.docx
@@ -304,7 +304,7 @@
         <w:t>issues</w:t>
       </w:r>
       <w:r>
-        <w:t xml:space="preserve"> reales de proyectos de software, el estado del arte pasó de resolver alrededor del 14 % de los problemas a comienzos de 2024 a casi el 89 % en 2026 (Anthropic, 2026): de uno de cada siete casos a casi nueve de cada diez en dos años, aunque el </w:t>
+        <w:t xml:space="preserve"> reales de proyectos de software, el estado del arte pasó de resolver alrededor del 14 % de los problemas a comienzos de 2024 a casi el 89 % en 2026 (Anthropic, 2026b): de uno de cada siete casos a casi nueve de cada diez en dos años, aunque el </w:t>
       </w:r>
       <w:r>
         <w:rPr>
@@ -313,7 +313,7 @@
         <w:t>benchmark</w:t>
       </w:r>
       <w:r>
-        <w:t xml:space="preserve"> empieza a saturarse. La adopción acompaña esa capacidad: GitHub Copilot superó los veinte millones de usuarios en 2025; Sundar Pichai afirmó en 2026 que el 75 % del código nuevo en Google se genera con IA y lo aprueban ingenieros (Pichai, 2026), y Satya Nadella lo estimó entre el 20 % y el 30 % en Microsoft (Zeff, 2025).</w:t>
+        <w:t xml:space="preserve"> empieza a saturarse. En junio de 2026 aparecieron modelos aún más capaces —Claude Fable 5 y Mythos 5—, pero una directiva del gobierno de EE. UU. suspendió su acceso a los días (Anthropic, 2026a, 2026c). La adopción acompaña esa capacidad: GitHub Copilot superó los veinte millones de usuarios en 2025; Sundar Pichai afirmó en 2026 que el 75 % del código nuevo en Google se genera con IA y lo aprueban ingenieros (Pichai, 2026), y Satya Nadella lo estimó entre el 20 % y el 30 % en Microsoft (Zeff, 2025).</w:t>
       </w:r>
     </w:p>
     <w:p>
@@ -383,7 +383,7 @@
           <w:color w:val="404040"/>
           <w:sz w:val="19"/>
         </w:rPr>
-        <w:t xml:space="preserve"> reales de software pasó de ~14 % (inicios de 2024) a ~89 % (2026) en SWE-bench. Fuente: elaboración propia a partir de Anthropic (2026) y datos públicos de SWE-bench.</w:t>
+        <w:t xml:space="preserve"> reales de software pasó de ~14 % (inicios de 2024) a ~89 % (2026) en SWE-bench. Fuente: elaboración propia a partir de Anthropic (2026b) y datos públicos de SWE-bench.</w:t>
       </w:r>
     </w:p>
     <w:p>
@@ -637,7 +637,7 @@
         <w:t>intratabilidad</w:t>
       </w:r>
       <w:r>
-        <w:t xml:space="preserve">. El problema P vs. NP pregunta si todo problema cuya solución puede verificarse rápidamente puede también resolverse rápidamente (Cook, 1971; Karp, 1972). Bajo la hipótesis ampliamente aceptada de que P ≠ NP, numerosos problemas centrales de la ingeniería (planificación, ruteo, asignación de recursos) son NP-difíciles, sin solución eficiente en el peor caso. Este límite es matemático, no de capacidad de cómputo: ninguna IA lo derogará. El ingeniero seguirá siendo quien elija heurísticas, aproximaciones y compromisos; decidir </w:t>
+        <w:t xml:space="preserve">. El problema P vs. NP pregunta si todo problema cuya solución puede verificarse rápidamente puede también resolverse rápidamente (Cook, 1971; Karp, 1972). Bajo la hipótesis ampliamente aceptada de que P ≠ NP, numerosos problemas centrales de la ingeniería (planificación, ruteo, asignación de recursos) son NP-difíciles, sin solución eficiente en el peor caso. El ingeniero seguirá siendo quien elija heurísticas, aproximaciones y compromisos; decidir </w:t>
       </w:r>
       <w:r>
         <w:rPr>
@@ -872,7 +872,7 @@
         <w:jc w:val="both"/>
       </w:pPr>
       <w:r>
-        <w:t>Con todo, los datos del mercado laboral advierten que la transición no será indolora ni uniforme. La Oficina de Estadísticas Laborales de EE. UU. proyecta un crecimiento del empleo de «desarrolladores de software» cercano al 15 % entre 2024 y 2034 —muy por encima del promedio—, mientras la categoría más estrecha de «programadores» se contraería un 6 % por la automatización (Bureau of Labor Statistics, 2025): se automatiza la tarea de codificar, no la de diseñar y decidir. A la vez, un estudio de Stanford halló una caída de empleo del 13 % al 16 % en los trabajadores de carrera temprana (22-25 años) de las ocupaciones más expuestas a la IA —entre ellas el desarrollo de software—, mientras los de mayor experiencia se mantenían estables (Brynjolfsson et al., 2025). La contratación de recién recibidos cayó cerca del 65 % en las grandes tecnológicas y un 76 % en las startups respecto de 2019, porque la IA absorbe las tareas con que los juniors aprendían (SignalFire, 2026). Indeed registra una caída del 36 % en las ofertas de software desde 2020 y un endurecimiento de los requisitos: los puestos junior se contrajeron un 34 %, frente al 19 % de los senior (Indeed Hiring Lab, 2025). Salesforce, incluso, anunció que en 2025 no sumaría ingenieros tras elevar su productividad más de un 30 % con IA (Benioff, 2024). La «puerta de entrada» junior se estrecha y la demanda se desplaza hacia perfiles con criterio: las competencias del nuevo rol.</w:t>
+        <w:t>Con todo, los datos del mercado laboral advierten que la transición no será indolora ni uniforme. La Oficina de Estadísticas Laborales de EE. UU. proyecta un crecimiento del empleo de «desarrolladores de software» cercano al 15 % entre 2024 y 2034 —muy por encima del promedio—, mientras la categoría más estrecha de «programadores» se contraería un 6 % por la automatización (Bureau of Labor Statistics, 2025): se automatiza la tarea de codificar, no la de diseñar y decidir. A la vez, un estudio de Stanford halló una caída de empleo del 13 % al 16 % en los trabajadores de carrera temprana (22-25 años) de las ocupaciones más expuestas a la IA —entre ellas el desarrollo de software—, mientras los de mayor experiencia se mantenían estables (Brynjolfsson et al., 2025). La contratación de recién recibidos cayó cerca del 65 % en las grandes tecnológicas y un 76 % en las startups respecto de 2019, porque la IA absorbe las tareas con que los juniors aprendían (SignalFire, 2026). Indeed registra que los puestos junior se contrajeron un 34 %, frente al 19 % de los senior (Indeed Hiring Lab, 2025). Salesforce, incluso, anunció que en 2025 no sumaría ingenieros tras elevar su productividad más de un 30 % con IA (Benioff, 2024). La «puerta de entrada» junior se estrecha y la demanda se desplaza hacia perfiles con criterio: las competencias del nuevo rol.</w:t>
       </w:r>
     </w:p>
     <w:p>
@@ -1194,7 +1194,26 @@
         <w:jc w:val="left"/>
       </w:pPr>
       <w:r>
-        <w:t xml:space="preserve">Anthropic. (2026, 28 de mayo). </w:t>
+        <w:t xml:space="preserve">Anthropic. (2026a, 9 de junio). </w:t>
+      </w:r>
+      <w:r>
+        <w:rPr>
+          <w:i/>
+        </w:rPr>
+        <w:t>Claude Fable 5 and Claude Mythos 5</w:t>
+      </w:r>
+      <w:r>
+        <w:t>. https://www.anthropic.com/news/claude-fable-5-mythos-5</w:t>
+      </w:r>
+    </w:p>
+    <w:p>
+      <w:pPr>
+        <w:spacing w:line="360" w:lineRule="auto" w:after="120"/>
+        <w:ind w:left="720" w:hanging="720"/>
+        <w:jc w:val="left"/>
+      </w:pPr>
+      <w:r>
+        <w:t xml:space="preserve">Anthropic. (2026b, 28 de mayo). </w:t>
       </w:r>
       <w:r>
         <w:rPr>
@@ -1204,6 +1223,25 @@
       </w:r>
       <w:r>
         <w:t>. https://www.anthropic.com/news/claude-opus-4-8</w:t>
+      </w:r>
+    </w:p>
+    <w:p>
+      <w:pPr>
+        <w:spacing w:line="360" w:lineRule="auto" w:after="120"/>
+        <w:ind w:left="720" w:hanging="720"/>
+        <w:jc w:val="left"/>
+      </w:pPr>
+      <w:r>
+        <w:t xml:space="preserve">Anthropic. (2026c, 12 de junio). </w:t>
+      </w:r>
+      <w:r>
+        <w:rPr>
+          <w:i/>
+        </w:rPr>
+        <w:t>Statement on the US government directive to suspend access to Fable 5 and Mythos 5</w:t>
+      </w:r>
+      <w:r>
+        <w:t>. https://www.anthropic.com/news/fable-mythos-access</w:t>
       </w:r>
     </w:p>
     <w:p>

</xml_diff>

<commit_message>
Corrección de estilo: arreglar frase truncada y formalizar registro
Tras una revisión de estilo del paper completo:
- [grave] III: "suspendió su acceso a los días" -> "a los pocos días"
  (un recorte previo había dejado la frase agramatical).
- Conclusión: "no es de color de rosa" -> "no es enteramente favorable"
  (registro más formal); "se angosta" -> "se estrecha" (más neutro).

Cuerpo: 2.989/3.000. .docx y .pdf regenerados.

Co-Authored-By: Claude Opus 4.8 <noreply@anthropic.com>
Claude-Session: https://claude.ai/code/session_01FqTs9VKxmytL6igKtKJn1Z
</commit_message>
<xml_diff>
--- a/Paper_Rol_del_ingeniero_informatico_en_10_anios.docx
+++ b/Paper_Rol_del_ingeniero_informatico_en_10_anios.docx
@@ -313,7 +313,7 @@
         <w:t>benchmark</w:t>
       </w:r>
       <w:r>
-        <w:t xml:space="preserve"> empieza a saturarse. En junio de 2026 aparecieron modelos aún más capaces —Claude Fable 5 y Mythos 5—, pero una directiva del gobierno de EE. UU. suspendió su acceso a los días (Anthropic, 2026a, 2026c). La adopción acompaña esa capacidad: GitHub Copilot superó los veinte millones de usuarios en 2025; Sundar Pichai afirmó en 2026 que el 75 % del código nuevo en Google se genera con IA y lo aprueban ingenieros (Pichai, 2026), y Satya Nadella lo estimó entre el 20 % y el 30 % en Microsoft (Zeff, 2025).</w:t>
+        <w:t xml:space="preserve"> empieza a saturarse. En junio de 2026 aparecieron modelos aún más capaces —Claude Fable 5 y Mythos 5—, pero una directiva del gobierno de EE. UU. suspendió su acceso a los pocos días (Anthropic, 2026a, 2026c). La adopción acompaña esa capacidad: GitHub Copilot superó los veinte millones de usuarios en 2025; Sundar Pichai afirmó en 2026 que el 75 % del código nuevo en Google se genera con IA y lo aprueban ingenieros (Pichai, 2026), y Satya Nadella lo estimó entre el 20 % y el 30 % en Microsoft (Zeff, 2025).</w:t>
       </w:r>
     </w:p>
     <w:p>
@@ -1112,7 +1112,7 @@
         <w:jc w:val="both"/>
       </w:pPr>
       <w:r>
-        <w:t>El balance, sin embargo, no es de color de rosa: la puerta de entrada junior se angosta y la codificación pura se contrae, con perdedores concretos pese a un saldo agregado positivo. Hecha esa salvedad, la paradoja de fondo es esperanzadora: cuanto más poderosa se vuelve la automatización, más valioso se torna el juicio humano que decide qué automatizar, cómo validarlo y para qué fin. En lo alto de esa escalera, el ingeniero del futuro será menos un escriba de instrucciones y más un arquitecto, un auditor y un responsable último de sistemas que ni él ni la máquina pueden comprender por completo. La teoría de la computación, lejos de anunciar el fin de la profesión, traza el contorno preciso —y exigente— de su porvenir.</w:t>
+        <w:t>El balance, sin embargo, no es enteramente favorable: la puerta de entrada junior se estrecha y la codificación pura se contrae, con perdedores concretos pese a un saldo agregado positivo. Hecha esa salvedad, la paradoja de fondo es esperanzadora: cuanto más poderosa se vuelve la automatización, más valioso se torna el juicio humano que decide qué automatizar, cómo validarlo y para qué fin. En lo alto de esa escalera, el ingeniero del futuro será menos un escriba de instrucciones y más un arquitecto, un auditor y un responsable último de sistemas que ni él ni la máquina pueden comprender por completo. La teoría de la computación, lejos de anunciar el fin de la profesión, traza el contorno preciso —y exigente— de su porvenir.</w:t>
       </w:r>
     </w:p>
     <w:p>

</xml_diff>

<commit_message>
Pulir bibliografía a APA 7 (edición vigente en 2026)
Auditoría APA: la 7.ª edición sigue siendo el estándar en 2026 (no hay 8.ª).
La bibliografía estaba "en regla con observaciones"; correcciones de formato:
- Podcasts (Benioff, Booch, Stroustrup): título del episodio en redonda y
  serie en cursiva (estaban invertidos), descriptor unificado [Episodio de
  podcast], anfitrión con rol, "pódcast"->"podcast".
- Preprints arXiv: Peng y Xu unificados al patrón [Preprint] + DOI
  (10.48550/arXiv) igual que Dong y Guo (4 preprints consistentes).
- Bessen: quitado "International Monetary Fund" (es artículo de revista).
- Veracode: descriptor [Informe].
Desambiguacion Anthropic 2026a/b/c: verificada correcta (alfabetica por
titulo, coherente con el texto) - sin cambios. Cuerpo intacto (2.989); solo
bibliografia. .docx/.pdf regenerados.

Co-Authored-By: Claude Opus 4.8 <noreply@anthropic.com>
Claude-Session: https://claude.ai/code/session_01FqTs9VKxmytL6igKtKJn1Z
</commit_message>
<xml_diff>
--- a/Paper_Rol_del_ingeniero_informatico_en_10_anios.docx
+++ b/Paper_Rol_del_ingeniero_informatico_en_10_anios.docx
@@ -1270,16 +1270,7 @@
         <w:jc w:val="left"/>
       </w:pPr>
       <w:r>
-        <w:t xml:space="preserve">Benioff, M. (2024, 9 de diciembre). </w:t>
-      </w:r>
-      <w:r>
-        <w:rPr>
-          <w:i/>
-        </w:rPr>
-        <w:t>Marc Benioff, Salesforce founder: Why Salesforce isn't hiring software engineers</w:t>
-      </w:r>
-      <w:r>
-        <w:t xml:space="preserve"> (n.º 1236) [Episodio de podcast de audio]. En </w:t>
+        <w:t xml:space="preserve">Benioff, M. (2024, 9 de diciembre). Marc Benioff, Salesforce founder: Why Salesforce isn't hiring software engineers (n.º 1236) [Episodio de podcast]. </w:t>
       </w:r>
       <w:r>
         <w:rPr>
@@ -1288,7 +1279,7 @@
         <w:t>20VC with Harry Stebbings</w:t>
       </w:r>
       <w:r>
-        <w:t>. https://www.thetwentyminutevc.com/marc-benioff-2</w:t>
+        <w:t xml:space="preserve"> (H. Stebbings, anfitrión). https://www.thetwentyminutevc.com/marc-benioff-2</w:t>
       </w:r>
     </w:p>
     <w:p>
@@ -1307,7 +1298,7 @@
         <w:t>Finance &amp; Development, 52</w:t>
       </w:r>
       <w:r>
-        <w:t>(1), 16-19. International Monetary Fund. https://www.imf.org/external/pubs/ft/fandd/2015/03/bessen.htm</w:t>
+        <w:t>(1), 16-19. https://www.imf.org/external/pubs/ft/fandd/2015/03/bessen.htm</w:t>
       </w:r>
     </w:p>
     <w:p>
@@ -1317,16 +1308,16 @@
         <w:jc w:val="left"/>
       </w:pPr>
       <w:r>
-        <w:t xml:space="preserve">Booch, G. (2026, 4 de febrero). </w:t>
+        <w:t xml:space="preserve">Booch, G. (2026, 4 de febrero). The third golden age of software engineering — Thanks to AI, with Grady Booch [Episodio de podcast]. </w:t>
       </w:r>
       <w:r>
         <w:rPr>
           <w:i/>
         </w:rPr>
-        <w:t>The third golden age of software engineering — Thanks to AI, with Grady Booch</w:t>
+        <w:t>The Pragmatic Engineer</w:t>
       </w:r>
       <w:r>
-        <w:t xml:space="preserve"> [Episodio de pódcast]. The Pragmatic Engineer (G. Orosz, entrevistador). https://newsletter.pragmaticengineer.com/p/the-third-golden-age-of-software</w:t>
+        <w:t xml:space="preserve"> (G. Orosz, anfitrión). https://newsletter.pragmaticengineer.com/p/the-third-golden-age-of-software</w:t>
       </w:r>
     </w:p>
     <w:p>
@@ -1744,7 +1735,7 @@
         <w:t>The impact of AI on developer productivity: Evidence from GitHub Copilot</w:t>
       </w:r>
       <w:r>
-        <w:t xml:space="preserve"> (arXiv:2302.06590). arXiv. https://arxiv.org/abs/2302.06590</w:t>
+        <w:t xml:space="preserve"> [Preprint]. arXiv. https://doi.org/10.48550/arXiv.2302.06590</w:t>
       </w:r>
     </w:p>
     <w:p>
@@ -1849,16 +1840,16 @@
         <w:jc w:val="left"/>
       </w:pPr>
       <w:r>
-        <w:t xml:space="preserve">Stroustrup, B. (2026, 18 de mayo). </w:t>
+        <w:t xml:space="preserve">Stroustrup, B. (2026, 18 de mayo). Creator of C++: Bell Labs, negative overhead abstraction, and mistakes [Episodio de podcast]. </w:t>
       </w:r>
       <w:r>
         <w:rPr>
           <w:i/>
         </w:rPr>
-        <w:t>Creator of C++: Bell Labs, negative overhead abstraction, and mistakes</w:t>
+        <w:t>Developing Dev</w:t>
       </w:r>
       <w:r>
-        <w:t xml:space="preserve"> (R. Peterman, entrevistador). Developing Dev. https://www.developing.dev/p/creator-of-c-bell-labs-negative-overhead</w:t>
+        <w:t xml:space="preserve"> (R. Peterman, anfitrión). https://www.developing.dev/p/creator-of-c-bell-labs-negative-overhead</w:t>
       </w:r>
     </w:p>
     <w:p>
@@ -1915,7 +1906,7 @@
         <w:t>GenAI code security report</w:t>
       </w:r>
       <w:r>
-        <w:t>. https://www.veracode.com/resources/analyst-reports/2025-genai-code-security-report/</w:t>
+        <w:t xml:space="preserve"> [Informe]. https://www.veracode.com/resources/analyst-reports/2025-genai-code-security-report/</w:t>
       </w:r>
     </w:p>
     <w:p>
@@ -1991,7 +1982,7 @@
         <w:t>Hallucination is inevitable: An innate limitation of large language models</w:t>
       </w:r>
       <w:r>
-        <w:t xml:space="preserve"> (arXiv:2401.11817). arXiv. https://arxiv.org/abs/2401.11817</w:t>
+        <w:t xml:space="preserve"> [Preprint]. arXiv. https://doi.org/10.48550/arXiv.2401.11817</w:t>
       </w:r>
     </w:p>
     <w:p>

</xml_diff>

<commit_message>
Quitar año redundante junto a la cita (lectura más limpia)
En III, "...89 % en 2026 (Anthropic, 2026b)" repetía el año pegado a la cita
y se leía como tartamudeo (parecía que "2026b" fuera un typo). Se quita el
"en 2026" (la fecha queda implícita por "en dos años" y por la cita). Igual
con Pichai: cita narrativa "Sundar Pichai (2026) afirmó que..." en vez de
"afirmó en 2026 que... (Pichai, 2026)". El sufijo 2026b es correcto (APA,
desambiguación). Cuerpo: 2.989 -> 2.984. .docx/.pdf regenerados.

Co-Authored-By: Claude Opus 4.8 <noreply@anthropic.com>
Claude-Session: https://claude.ai/code/session_01FqTs9VKxmytL6igKtKJn1Z
</commit_message>
<xml_diff>
--- a/Paper_Rol_del_ingeniero_informatico_en_10_anios.docx
+++ b/Paper_Rol_del_ingeniero_informatico_en_10_anios.docx
@@ -304,7 +304,7 @@
         <w:t>issues</w:t>
       </w:r>
       <w:r>
-        <w:t xml:space="preserve"> reales de proyectos de software, el estado del arte pasó de resolver alrededor del 14 % de los problemas a comienzos de 2024 a casi el 89 % en 2026 (Anthropic, 2026b): de uno de cada siete casos a casi nueve de cada diez en dos años, aunque el </w:t>
+        <w:t xml:space="preserve"> reales de proyectos de software, el estado del arte pasó de resolver alrededor del 14 % de los problemas a comienzos de 2024 a casi el 89 % (Anthropic, 2026b): de uno de cada siete casos a casi nueve de cada diez en dos años, aunque el </w:t>
       </w:r>
       <w:r>
         <w:rPr>
@@ -313,7 +313,7 @@
         <w:t>benchmark</w:t>
       </w:r>
       <w:r>
-        <w:t xml:space="preserve"> empieza a saturarse. En junio de 2026 aparecieron modelos aún más capaces —Claude Fable 5 y Mythos 5—, pero una directiva del gobierno de EE. UU. suspendió su acceso a los pocos días (Anthropic, 2026a, 2026c). La adopción acompaña esa capacidad: GitHub Copilot superó los veinte millones de usuarios en 2025; Sundar Pichai afirmó en 2026 que el 75 % del código nuevo en Google se genera con IA y lo aprueban ingenieros (Pichai, 2026), y Satya Nadella lo estimó entre el 20 % y el 30 % en Microsoft (Zeff, 2025).</w:t>
+        <w:t xml:space="preserve"> empieza a saturarse. En junio de 2026 aparecieron modelos aún más capaces —Claude Fable 5 y Mythos 5—, pero una directiva del gobierno de EE. UU. suspendió su acceso a los pocos días (Anthropic, 2026a, 2026c). La adopción acompaña esa capacidad: GitHub Copilot superó los veinte millones de usuarios en 2025; Sundar Pichai (2026) afirmó que el 75 % del código nuevo en Google se genera con IA y lo aprueban ingenieros, y Satya Nadella lo estimó entre el 20 % y el 30 % en Microsoft (Zeff, 2025).</w:t>
       </w:r>
     </w:p>
     <w:p>

</xml_diff>

<commit_message>
Integrar en main el paper de esta sesión, conservando presentación y debate
main tenía trabajo de otra sesión (presentación HTML en vivo, guion de debate,
TEMARIO.md) más una versión divergente del paper. Por decisión del autor, se
adopta el paper de esta sesión y se conserva todo lo demás:

- paper.md: versión de esta sesión (2.984 palabras, 46 refs APA 7 verificadas,
  fuentes 2026, tesis de polarización, estilo corregido).
- Se traen: README, build_docx/figures/pdf, .docx, .pdf, DEFENSA_oral.md y las
  figuras renumeradas (archivo = número en el documento).
- Se conservan intactos: TEMARIO.md, debate_en_vivo.html,
  presentacion_4bloques.html, presentacion_debate.md.
- build_presentacion.py: solo se actualizan las referencias a las figuras
  renumeradas para que siga siendo ejecutable.

Co-Authored-By: Claude Opus 4.8 <noreply@anthropic.com>
Claude-Session: https://claude.ai/code/session_01FqTs9VKxmytL6igKtKJn1Z
</commit_message>
<xml_diff>
--- a/Paper_Rol_del_ingeniero_informatico_en_10_anios.docx
+++ b/Paper_Rol_del_ingeniero_informatico_en_10_anios.docx
@@ -38,7 +38,7 @@
           <w:b/>
           <w:sz w:val="32"/>
         </w:rPr>
-        <w:t>El rol del ingeniero informático en los próximos diez años: automatización de la base, polarización del oficio y un núcleo humano irreductible</w:t>
+        <w:t>El rol del ingeniero informático en los próximos diez años: de la ejecución técnica a la supervisión crítica de sistemas automatizados</w:t>
       </w:r>
     </w:p>
     <w:p>
@@ -64,7 +64,7 @@
           <w:b w:val="0"/>
           <w:sz w:val="24"/>
         </w:rPr>
-        <w:t>Carrera: Ingeniería Informática (3.er año)</w:t>
+        <w:t>Carrera de grado: Ingeniería Informática</w:t>
       </w:r>
     </w:p>
     <w:p>
@@ -103,7 +103,7 @@
           <w:b w:val="0"/>
           <w:sz w:val="24"/>
         </w:rPr>
-        <w:t>Integrantes: Martín Ezequiel Pulitano y Nicolás Silva</w:t>
+        <w:t>Integrantes: Martín Ezequiel Pulitano y Nicolás Ulises Silva</w:t>
       </w:r>
     </w:p>
     <w:p>
@@ -146,7 +146,7 @@
         <w:jc w:val="both"/>
       </w:pPr>
       <w:r>
-        <w:t>La irrupción de la inteligencia artificial generativa y de los agentes de programación autónomos ha reabierto una pregunta tan vieja como la propia disciplina: ¿seguirá existiendo el ingeniero informático? Este trabajo sostiene que, en la próxima década, la IA no hará desaparecer a la profesión, pero la reconfigurará por polarización: automatizará la capa de ejecución y las tareas de entrada —desplazando empleo real, sobre todo junior— mientras concentra el trabajo en un núcleo más delgado de ingenieros dedicados a especificar, validar y responder por sistemas de alto riesgo, y desplaza buena parte del valor hacia quienes proveen las herramientas. El argumento combina tres planos: la evidencia histórica de que cada salto de abstracción recompuso el trabajo; la evidencia empírica reciente (2021-2026), que ya muestra benchmarks saturados junto a un derrumbe del empleo de entrada; y, como columna vertebral, los límites fundamentales de la computación —el problema de la detención, el teorema de Rice, P vs. NP y la jerarquía de Chomsky— que garantizan un residuo de juicio irreductiblemente humano. La conclusión es una estimación: el oficio no se extingue, pero se parte en dos, y la transición será dura y desigual.</w:t>
+        <w:t>La irrupción de la inteligencia artificial generativa y de los agentes de programación autónomos ha reabierto una pregunta tan vieja como la propia disciplina: ¿seguirá existiendo el ingeniero informático? Este trabajo sostiene que, en la próxima década, la IA no reemplazará a la profesión, pero la reducirá y polarizará: habrá menos ingenieros —sobre todo en los puestos rutinarios y de nivel inicial— y el valor se concentrará en los más capaces, que dejarán la ejecución técnica para enfocarse en la especificación, la integración, la validación y la supervisión crítica de sistemas automatizados. El argumento se construye sobre tres pilares: la evidencia histórica de que cada salto de abstracción elevó el nivel del trabajo en lugar de eliminarlo; la evidencia empírica reciente (2021-2026) sobre el alcance y los límites medidos de la IA en el desarrollo de software; y, como columna vertebral teórica, los límites fundamentales de la computación —el problema de la detención, el teorema de Rice, la cuestión P vs. NP y la jerarquía de Chomsky— que garantizan la existencia de un núcleo irreductiblemente humano de juicio. La conclusión es una proyección calibrada: el ingeniero del futuro ascenderá en la escalera de abstracción hacia tareas que la teoría de la computación demuestra que ninguna máquina puede automatizar por completo.</w:t>
       </w:r>
     </w:p>
     <w:p>
@@ -162,7 +162,7 @@
         <w:t>Palabras clave:</w:t>
       </w:r>
       <w:r>
-        <w:t xml:space="preserve"> ingeniería de software, inteligencia artificial, indecidibilidad, P vs. NP, polarización laboral, desplazamiento del empleo.</w:t>
+        <w:t xml:space="preserve"> ingeniería de software, inteligencia artificial, indecidibilidad, problema de la detención, P vs. NP, jerarquía de Chomsky, automatización.</w:t>
       </w:r>
     </w:p>
     <w:p>
@@ -187,7 +187,7 @@
         <w:jc w:val="both"/>
       </w:pPr>
       <w:r>
-        <w:t>Cada vez que la tecnología avanzó, el rol del ingeniero informático cambió con ella: los lenguajes de alto nivel, los entornos integrados de desarrollo o la nube transformaron su trabajo diario sin hacer desaparecer la profesión. Hoy, la inteligencia artificial generativa —en particular los modelos grandes de lenguaje (LLM) y los agentes de codificación autónomos— plantea el desafío más radical hasta la fecha, al punto de que destacados referentes pronostican que la mayor parte del código será escrita por máquinas en pocos años.</w:t>
+        <w:t>Cada vez que la tecnología avanzó de forma significativa, el rol del ingeniero informático cambió con ella. Los lenguajes de alto nivel, los entornos integrados de desarrollo o la computación en la nube modificaron profundamente su trabajo diario; sin embargo, ninguna de esas revoluciones hizo desaparecer la profesión. Hoy, la inteligencia artificial generativa —y en particular los modelos grandes de lenguaje (LLM) y los agentes de codificación autónomos— plantean el desafío más radical hasta la fecha, al punto de que destacados referentes de la industria pronostican que la mayor parte del código será escrita por máquinas en pocos años.</w:t>
       </w:r>
     </w:p>
     <w:p>
@@ -197,7 +197,7 @@
         <w:jc w:val="both"/>
       </w:pPr>
       <w:r>
-        <w:t>Este trabajo parte de la siguiente hipótesis: en los próximos diez años, la IA no reemplazará a la profesión, pero la polarizará. La capa de ejecución —la codificación rutinaria y las tareas junior— se automatiza y se contrae con fuerza, desplazando empleo real; a la vez, se revaloriza un núcleo más estrecho de ingenieros que especifican, integran, validan y responden por sistemas críticos. El ingeniero no desaparece, pero el oficio se parte: menos puestos en la base, más exigencia de juicio en la cima.</w:t>
+        <w:t>Este trabajo parte de la siguiente hipótesis: en los próximos diez años la IA no hará desaparecer la profesión, pero la reducirá y polarizará. Habrá menos ingenieros —sobre todo en puestos rutinarios y de nivel inicial— y el valor se concentrará en los mejores: los que dejen la ejecución técnica para abarcar la toma de decisiones, la integración y la supervisión crítica de sistemas automatizados. El que solo codifica queda expuesto; el que asciende en abstracción, no.</w:t>
       </w:r>
     </w:p>
     <w:p>
@@ -207,7 +207,7 @@
         <w:jc w:val="both"/>
       </w:pPr>
       <w:r>
-        <w:t xml:space="preserve">Para sostenerla se recorre la historia como sucesión de abstracciones (II), el estado actual de la IA (III) y los límites computacionales que explican </w:t>
+        <w:t xml:space="preserve">Metodológicamente es un ensayo argumentativo basado en una revisión de fuentes técnicas, empíricas y teóricas. Para sostenerla se recorre la historia de la profesión como sucesión de abstracciones (II), el estado actual de la IA en el desarrollo de software (III) y el marco teórico de la materia —los límites computacionales que explican </w:t>
       </w:r>
       <w:r>
         <w:rPr>
@@ -216,7 +216,7 @@
         <w:t>por qué</w:t>
       </w:r>
       <w:r>
-        <w:t xml:space="preserve"> persiste un rol humano (IV), antes de caracterizar el nuevo rol, las visiones de expertos y las limitaciones (V a VII).</w:t>
+        <w:t xml:space="preserve"> persiste un rol humano (IV)—, para luego caracterizar el nuevo rol, las visiones de expertos y las limitaciones (V a VII). Por ser una proyección a futuro, la conclusión es una estimación fundada.</w:t>
       </w:r>
     </w:p>
     <w:p>
@@ -241,7 +241,7 @@
         <w:jc w:val="both"/>
       </w:pPr>
       <w:r>
-        <w:t>La historia del software puede leerse como el ascenso por una "escalera de abstracción" en la que cada peldaño automatizó el trabajo del anterior y, lejos de suprimir al ingeniero, lo elevó conceptualmente. Al principio, programar era escribir código máquina y ensamblador; el salto llegó con los lenguajes de alto nivel: FORTRAN (Backus, IBM, 1957) expresó algoritmos en notación matemática y delegó el código de bajo nivel en un compilador; COBOL, inspirado en Grace Hopper, hizo lo propio para los negocios.</w:t>
+        <w:t>La historia del software puede leerse como el ascenso por una «escalera de abstracción» en la que cada peldaño automatizó el trabajo del peldaño anterior y, lejos de suprimir al ingeniero, lo elevó a un nivel conceptual superior. En los años cuarenta y cincuenta, programar significaba escribir código máquina y, más tarde, ensamblador —la primera herramienta que automatizó la traducción a instrucciones binarias—. El salto decisivo llegó con los lenguajes de alto nivel: FORTRAN (Backus, IBM, 1957) permitió expresar algoritmos en notación matemática y delegó en un compilador el código de bajo nivel; COBOL, inspirado en Grace Hopper, hizo lo propio para los negocios.</w:t>
       </w:r>
     </w:p>
     <w:p>
@@ -251,7 +251,7 @@
         <w:jc w:val="both"/>
       </w:pPr>
       <w:r>
-        <w:t>Paradójicamente, esa creciente potencia trajo una crisis: en la Conferencia de Ingeniería de Software de la OTAN (Garmisch, 1968) se acuñó la expresión "crisis del software" para describir la incapacidad de gestionar la complejidad de sistemas cada vez más grandes (Naur y Randell, 1969). La respuesta no fue menos ingeniería sino más: ante un problema "igualmente gigantesco" (Dijkstra, 1972) nacieron la programación estructurada, las metodologías y la disciplina misma de la ingeniería de software.</w:t>
+        <w:t>Paradójicamente, esta creciente potencia trajo aparejada una crisis. En la célebre Conferencia de Ingeniería de Software de la OTAN, celebrada en Garmisch en octubre de 1968, los asistentes acuñaron la expresión «crisis del software» para describir la incapacidad de los programadores de gestionar la complejidad de sistemas cada vez más grandes (Naur y Randell, 1969). Como sintetizaría Edsger Dijkstra en su conferencia Turing de 1972, «mientras no había máquinas, programar no era ningún problema; (…) ahora que tenemos computadoras gigantescas, programar se ha convertido en un problema igualmente gigantesco» (Dijkstra, 1972). La respuesta a esa crisis no fue menos ingeniería, sino más: nacieron la programación estructurada, las metodologías y la disciplina misma de la ingeniería de software.</w:t>
       </w:r>
     </w:p>
     <w:p>
@@ -261,7 +261,7 @@
         <w:jc w:val="both"/>
       </w:pPr>
       <w:r>
-        <w:t>Los peldaños siguientes confirman el patrón: los IDE comprimieron el ciclo de edición, compilación y prueba; Git (2005) y Stack Overflow (2008) compartieron el conocimiento; la nube (Amazon Web Services, 2006) abstrajo la infraestructura y DevOps (2009) automatizó el despliegue; y en 2021 GitHub Copilot introdujo el primer "programador en par". En cada caso la herramienta automatizó lo rutinario, pero el ingeniero permaneció y ascendió hacia el diseño de arquitecturas distribuidas. El anuncio de su desaparición tampoco es nuevo —ya se proclamó con COBOL, los lenguajes de cuarta generación y el "sin código"—; la tesis del "fin de la programación" (Welsh, 2023) es la más reciente de una larga serie de profecías incumplidas.</w:t>
+        <w:t>Los peldaños siguientes confirman el patrón. Los entornos integrados de desarrollo comprimieron el ciclo de edición, compilación y prueba; el software libre, Git (2005) y Stack Overflow (2008) compartieron el conocimiento; la nube (Amazon Web Services, 2006) abstrajo la infraestructura física y la cultura DevOps (2009) automatizó el despliegue. En 2021, GitHub Copilot introdujo el primer «programador en par» basado en IA. En todos los casos la herramienta automatizó lo más rutinario, pero el ingeniero permaneció: ascendió de la gestión de registros al diseño de arquitecturas distribuidas. La IA generativa es el peldaño más alto de una escalera muy larga. Y el anuncio de la desaparición del programador no es nuevo: ya se proclamó con COBOL, con los lenguajes de cuarta generación y con las plataformas «sin código», y cada vez la profesión creció; la tesis del «fin de la programación» (Welsh, 2023) es la más reciente de una larga serie de profecías incumplidas.</w:t>
       </w:r>
     </w:p>
     <w:p>
@@ -286,7 +286,16 @@
         <w:jc w:val="both"/>
       </w:pPr>
       <w:r>
-        <w:t xml:space="preserve">El ritmo del cambio es difícil de exagerar. En SWE-bench Verified, que mide la capacidad de la IA para resolver </w:t>
+        <w:t xml:space="preserve">En el </w:t>
+      </w:r>
+      <w:r>
+        <w:rPr>
+          <w:i/>
+        </w:rPr>
+        <w:t>benchmark</w:t>
+      </w:r>
+      <w:r>
+        <w:t xml:space="preserve"> SWE-bench Verified, que mide la capacidad de los sistemas de IA para resolver </w:t>
       </w:r>
       <w:r>
         <w:rPr>
@@ -295,7 +304,16 @@
         <w:t>issues</w:t>
       </w:r>
       <w:r>
-        <w:t xml:space="preserve"> reales de software, el estado del arte pasó de ~14 % a comienzos de 2024 a cerca del 95 % a mediados de 2026 (Anthropic, 2026): de uno de cada siete casos a más de nueve de cada diez en poco más de dos años. La adopción acompaña: GitHub Copilot superó los veinte millones de usuarios, Sundar Pichai cifró en 2024 el código generado por IA en Google en "más de una cuarta parte" y Satya Nadella lo situó en 20-30 % en Microsoft (Zeff, 2025); Stack Overflow (2025) lo confirma: el 84 % de los desarrolladores usa o planea usar IA.</w:t>
+        <w:t xml:space="preserve"> reales de proyectos de software, el estado del arte pasó de resolver alrededor del 14 % de los problemas a comienzos de 2024 a casi el 89 % (Anthropic, 2026b): de uno de cada siete casos a casi nueve de cada diez en dos años, aunque el </w:t>
+      </w:r>
+      <w:r>
+        <w:rPr>
+          <w:i/>
+        </w:rPr>
+        <w:t>benchmark</w:t>
+      </w:r>
+      <w:r>
+        <w:t xml:space="preserve"> empieza a saturarse. En junio de 2026 aparecieron modelos aún más capaces —Claude Fable 5 y Mythos 5—, pero una directiva del gobierno de EE. UU. suspendió su acceso a los pocos días (Anthropic, 2026a, 2026c). La adopción acompaña esa capacidad: GitHub Copilot superó los veinte millones de usuarios en 2025; Sundar Pichai (2026) afirmó que el 75 % del código nuevo en Google se genera con IA y lo aprueban ingenieros, y Satya Nadella lo estimó entre el 20 % y el 30 % en Microsoft (Zeff, 2025).</w:t>
       </w:r>
     </w:p>
     <w:p>
@@ -306,7 +324,7 @@
       <w:r>
         <w:drawing>
           <wp:inline xmlns:a="http://schemas.openxmlformats.org/drawingml/2006/main" xmlns:pic="http://schemas.openxmlformats.org/drawingml/2006/picture">
-            <wp:extent cx="5394960" cy="2760212"/>
+            <wp:extent cx="5394960" cy="2967228"/>
             <wp:docPr id="1" name="Picture 1"/>
             <wp:cNvGraphicFramePr>
               <a:graphicFrameLocks noChangeAspect="1"/>
@@ -327,7 +345,7 @@
                   <pic:spPr>
                     <a:xfrm>
                       <a:off x="0" y="0"/>
-                      <a:ext cx="5394960" cy="2760212"/>
+                      <a:ext cx="5394960" cy="2967228"/>
                     </a:xfrm>
                     <a:prstGeom prst="rect"/>
                   </pic:spPr>
@@ -365,7 +383,7 @@
           <w:color w:val="404040"/>
           <w:sz w:val="19"/>
         </w:rPr>
-        <w:t xml:space="preserve"> reales de software pasó de ~14 % (inicios de 2024) a ~95 % (mediados de 2026) en SWE-bench Verified. Fuente: elaboración propia a partir de Anthropic (2026) y datos públicos de SWE-bench.</w:t>
+        <w:t xml:space="preserve"> reales de software pasó de ~14 % (inicios de 2024) a ~89 % (2026) en SWE-bench. Fuente: elaboración propia a partir de Anthropic (2026b) y datos públicos de SWE-bench.</w:t>
       </w:r>
     </w:p>
     <w:p>
@@ -375,26 +393,7 @@
         <w:jc w:val="both"/>
       </w:pPr>
       <w:r>
-        <w:t xml:space="preserve">Conviene, no obstante, leer estos números con cautela: un benchmark no es el mundo real. El propio equipo de SWE-bench Verified advirtió que el conjunto se saturó y "ya no mide las capacidades de codificación de frontera", y la distancia con la práctica quedó expuesta cuando un grupo independiente probó al agente Devin —presentado en 2024 como "el primer ingeniero de software de IA"— en tareas reales: completó con éxito solo 3 de 20 (Husain et al., 2025). Resolver un </w:t>
-      </w:r>
-      <w:r>
-        <w:rPr>
-          <w:i/>
-        </w:rPr>
-        <w:t>issue</w:t>
-      </w:r>
-      <w:r>
-        <w:t xml:space="preserve"> aislado en un repositorio conocido es muy distinto de operar dentro de un sistema de producción real.</w:t>
-      </w:r>
-    </w:p>
-    <w:p>
-      <w:pPr>
-        <w:spacing w:line="360" w:lineRule="auto" w:after="120"/>
-        <w:ind w:firstLine="576"/>
-        <w:jc w:val="both"/>
-      </w:pPr>
-      <w:r>
-        <w:t xml:space="preserve">Esa misma brecha reaparece al medir la productividad, donde la evidencia es más matizada de lo que sugiere el entusiasmo. Un experimento controlado de GitHub mostró que con Copilot una tarea acotada —programar un servidor HTTP— se completaba un 55,8 % más rápido (Peng et al., 2023), y un experimento de campo con 4.867 desarrolladores halló un aumento del 26 % en las tareas completadas (Cui et al., 2025). Pero ese último reveló un patrón: la mejora se concentraba en los junior y casi se desvanecía entre los seniors. El contrapunto más nítido lo aportó un ensayo aleatorizado independiente de METR (2025): desarrolladores </w:t>
+        <w:t xml:space="preserve">Ahora bien, la evidencia rigurosa sobre su impacto es más matizada de lo que sugiere el entusiasmo. Un experimento controlado de GitHub y Microsoft mostró que los desarrolladores que usaban Copilot completaban una tarea acotada —programar un servidor HTTP— un 55,8 % más rápido (Peng et al., 2023). Sin embargo, un ensayo controlado aleatorizado independiente de METR (2025) arrojó un resultado contraintuitivo: desarrolladores </w:t>
       </w:r>
       <w:r>
         <w:rPr>
@@ -412,7 +411,7 @@
         <w:t>más</w:t>
       </w:r>
       <w:r>
-        <w:t xml:space="preserve"> con IA, pese a que </w:t>
+        <w:t xml:space="preserve"> con herramientas de IA, pese a que </w:t>
       </w:r>
       <w:r>
         <w:rPr>
@@ -421,7 +420,7 @@
         <w:t>creían</w:t>
       </w:r>
       <w:r>
-        <w:t xml:space="preserve"> haberse acelerado un 20 %. Los estudios convergen: la IA acelera lo rutinario y lo desconocido para quien empieza, pero rinde poco —o estorba— en el trabajo experto sobre sistemas maduros.</w:t>
+        <w:t xml:space="preserve"> haberse acelerado un 20 %.</w:t>
       </w:r>
     </w:p>
     <w:p>
@@ -485,7 +484,16 @@
         <w:jc w:val="both"/>
       </w:pPr>
       <w:r>
-        <w:t xml:space="preserve">A esa ambivalencia se añade un efecto sobre la confianza y la formación. Según Stack Overflow (2025), la confianza en la exactitud de las salidas de IA cayó a alrededor de un tercio, y el 45 % afirma que depurar código de IA lleva </w:t>
+        <w:t xml:space="preserve">A esto se suman problemas de calidad y seguridad. Addy Osmani, ingeniero de Google, describió el «problema del 70 %»: la IA produce con rapidez el 70 % de una solución, pero el 30 % final —casos límite, depuración, mantenibilidad— sigue requiriendo el juicio de un ingeniero experimentado (Osmani, 2024). Un estudio controlado de la Universidad de Stanford halló que los programadores con acceso a un asistente de IA escribían código </w:t>
+      </w:r>
+      <w:r>
+        <w:rPr>
+          <w:i/>
+        </w:rPr>
+        <w:t>menos</w:t>
+      </w:r>
+      <w:r>
+        <w:t xml:space="preserve"> seguro y confiaban </w:t>
       </w:r>
       <w:r>
         <w:rPr>
@@ -494,44 +502,7 @@
         <w:t>más</w:t>
       </w:r>
       <w:r>
-        <w:t xml:space="preserve"> tiempo que escribirlo. Y el problema trasciende la productividad: un ensayo de Anthropic con ingenieros mayormente junior observó que quienes trabajaban con IA puntuaban sensiblemente menos en una prueba posterior sin ella —sobre todo en depuración—, lo que sugiere que delegar demasiado pronto erosiona el aprendizaje del juicio que la supervisión exigirá (Shen y Tamkin, 2026).</w:t>
-      </w:r>
-    </w:p>
-    <w:p>
-      <w:pPr>
-        <w:spacing w:line="360" w:lineRule="auto" w:after="120"/>
-        <w:ind w:firstLine="576"/>
-        <w:jc w:val="both"/>
-      </w:pPr>
-      <w:r>
-        <w:t xml:space="preserve">A esta tensión se suman la calidad y la seguridad. Addy Osmani (Google) describió el "problema del 70 %": la IA produce con rapidez el 70 % de una solución, pero el 30 % final —casos límite, depuración, integración con producción, mantenibilidad— sigue exigiendo juicio experto (Osmani, 2024). Un estudio de Stanford halló que, con un asistente de IA, los programadores escribían código </w:t>
-      </w:r>
-      <w:r>
-        <w:rPr>
-          <w:i/>
-        </w:rPr>
-        <w:t>menos</w:t>
-      </w:r>
-      <w:r>
-        <w:t xml:space="preserve"> seguro y a la vez confiaban </w:t>
-      </w:r>
-      <w:r>
-        <w:rPr>
-          <w:i/>
-        </w:rPr>
-        <w:t>más</w:t>
-      </w:r>
-      <w:r>
-        <w:t xml:space="preserve"> en él —una falsa confianza peligrosa (Perry et al., 2023)—. Las evaluaciones de corrección coinciden: al endurecer los tests, la tasa de acierto cae 19-29 puntos (Liu et al., 2023): "pasar los tests" no equivale a satisfacer la especificación. En seguridad, cerca del 40 % de las sugerencias de Copilot en escenarios sensibles incluían vulnerabilidades conocidas (Pearce et al., 2022), y un informe de 2025 halló código vulnerable en el 45 % de los casos, sin que los modelos más nuevos fueran más seguros (Veracode, 2025). Se suma un riesgo inédito: cerca del 20 % de los paquetes que los modelos recomiendan importar no existen, lo que habilita el </w:t>
-      </w:r>
-      <w:r>
-        <w:rPr>
-          <w:i/>
-        </w:rPr>
-        <w:t>slopsquatting</w:t>
-      </w:r>
-      <w:r>
-        <w:t xml:space="preserve"> —registrarlos con código malicioso (Spracklen et al., 2025)—. La IA, en suma, acelera la producción pero no garantiza la corrección: traslada el cuello de botella desde la escritura del código hacia su verificación.</w:t>
+        <w:t xml:space="preserve"> en su seguridad: una peligrosa falsa sensación de confianza (Perry et al., 2023). Las evaluaciones de corrección apuntan en el mismo sentido: al endurecer los conjuntos de prueba, la corrección medida del código generado cae entre 19 y 29 puntos (Liu et al., 2023), y cerca del 40 % de las sugerencias de Copilot en escenarios de seguridad incluyen vulnerabilidades conocidas (Pearce et al., 2022). La IA acelera la producción pero no garantiza la corrección: traslada el cuello de botella desde la escritura del código hacia su verificación.</w:t>
       </w:r>
     </w:p>
     <w:p>
@@ -551,7 +522,7 @@
               <a:graphicData uri="http://schemas.openxmlformats.org/drawingml/2006/picture">
                 <pic:pic>
                   <pic:nvPicPr>
-                    <pic:cNvPr id="0" name="fig6_seguridad.png"/>
+                    <pic:cNvPr id="0" name="fig3_seguridad.png"/>
                     <pic:cNvPicPr/>
                   </pic:nvPicPr>
                   <pic:blipFill>
@@ -610,7 +581,7 @@
         <w:jc w:val="both"/>
       </w:pPr>
       <w:r>
-        <w:t>¿Por qué, pese a estos avances, el ingeniero no desaparecerá? La respuesta más profunda no es económica ni sociológica, sino computacional: hay barreras matemáticas, demostradas y permanentes, que ninguna IA —un proceso computable— puede sortear.</w:t>
+        <w:t>¿Por qué, pese a estos avances, el ingeniero no desaparecerá? La respuesta más profunda no es económica ni sociológica, sino de la propia teoría de la computación. Existen barreras matemáticas, demostradas y permanentes, que ninguna IA —que es, en última instancia, un proceso computable— puede sortear.</w:t>
       </w:r>
     </w:p>
     <w:p>
@@ -629,7 +600,16 @@
         <w:t>indecidibilidad</w:t>
       </w:r>
       <w:r>
-        <w:t xml:space="preserve">. En 1936, Turing demostró que el problema de la detención es indecidible: ningún algoritmo puede determinar, para todo programa y entrada, si terminará o correrá indefinidamente (Turing, 1936). El teorema de Rice (1953) lo generaliza: </w:t>
+        <w:t>. En 1936, Alan Turing demostró que el problema de la detención (</w:t>
+      </w:r>
+      <w:r>
+        <w:rPr>
+          <w:i/>
+        </w:rPr>
+        <w:t>halting problem</w:t>
+      </w:r>
+      <w:r>
+        <w:t xml:space="preserve">) es indecidible: no existe ningún algoritmo que, dado un programa y una entrada arbitrarios, determine en todos los casos si ese programa terminará o se ejecutará indefinidamente (Turing, 1936). El teorema de Rice (1953) generaliza este resultado: </w:t>
       </w:r>
       <w:r>
         <w:rPr>
@@ -638,7 +618,7 @@
         <w:t>toda</w:t>
       </w:r>
       <w:r>
-        <w:t xml:space="preserve"> propiedad semántica no trivial de un programa —como "¿está libre de cierto error?" o "¿cumple su especificación?"— es indecidible. Por tanto, ninguna IA puede verificar de forma general si un programa arbitrario cumple su especificación: la verificación seguirá exigiendo juicio humano y herramientas que solo funcionan restringiendo el problema.</w:t>
+        <w:t xml:space="preserve"> propiedad semántica no trivial de los programas —toda afirmación sobre el comportamiento de un programa, como «¿produce siempre la salida correcta?» o «¿cumple esta especificación?»— es indecidible (Rice, 1953). La implicación es directa: ningún procedimiento general y automático decide si un programa arbitrario satisface su especificación —tampoco un humano en el caso general—. El límite no vuelve al ingeniero un verificador infalible, sino el responsable de un juicio falible sobre instancias acotadas, que solo se resuelve restringiendo el problema o renunciando a la completitud.</w:t>
       </w:r>
     </w:p>
     <w:p>
@@ -657,7 +637,7 @@
         <w:t>intratabilidad</w:t>
       </w:r>
       <w:r>
-        <w:t xml:space="preserve">. El problema P vs. NP, uno de los siete Problemas del Milenio, pregunta si todo problema cuya solución se verifica rápido puede también resolverse rápido (Cook, 1971). Bajo la hipótesis aceptada de que P ≠ NP, numerosos problemas centrales de la ingeniería (planificación, ruteo, asignación de recursos) son NP-difíciles y no admiten soluciones eficientes en el peor caso. Es un límite matemático: ninguna IA lo derogará. El ingeniero seguirá eligiendo heurísticas y compromisos; decidir </w:t>
+        <w:t xml:space="preserve">. El problema P vs. NP pregunta si todo problema cuya solución puede verificarse rápidamente puede también resolverse rápidamente (Cook, 1971; Karp, 1972). Bajo la hipótesis ampliamente aceptada de que P ≠ NP, numerosos problemas centrales de la ingeniería (planificación, ruteo, asignación de recursos) son NP-difíciles, sin solución eficiente en el peor caso. El ingeniero seguirá siendo quien elija heurísticas, aproximaciones y compromisos; decidir </w:t>
       </w:r>
       <w:r>
         <w:rPr>
@@ -666,7 +646,7 @@
         <w:t>qué</w:t>
       </w:r>
       <w:r>
-        <w:t xml:space="preserve"> sacrificar —optimalidad, tiempo o recursos— es un acto de juicio, no un cálculo automatizable.</w:t>
+        <w:t xml:space="preserve"> sacrificar es un acto de juicio, no un cálculo automatizable.</w:t>
       </w:r>
     </w:p>
     <w:p>
@@ -676,16 +656,16 @@
         <w:jc w:val="both"/>
       </w:pPr>
       <w:r>
-        <w:t xml:space="preserve">La tercera barrera concierne al lenguaje. La jerarquía de Chomsky (1956) ordena los lenguajes formales según su poder generativo, y los de programación pertenecen, en su sintaxis, a los libres de contexto: formales, precisos, analizables sin ambigüedad. El lenguaje natural —y las instrucciones que un humano da a un LLM— es, en cambio, ambiguo y dependiente del contexto. El rol perdurable del ingeniero es el de traductor: convertir la intención humana, informal e incompleta, en una especificación formal ejecutable. No es una analogía: los propios </w:t>
+        <w:t xml:space="preserve">La tercera barrera concierne al lenguaje. La jerarquía de Chomsky (1956) organiza los lenguajes formales según su poder generativo, y la sintaxis de los lenguajes de programación es esencialmente libre de contexto —su léxico es regular y ciertas reglas (tipos, declaración previa al uso) son sensibles al contexto (Aho et al., 2007)—: son formales y se diseñan para analizarse de manera determinista y sin ambigüedad. El lenguaje natural —y, con él, las instrucciones que un humano da a un LLM— es, en cambio, ambiguo, dependiente del contexto y no constituye un lenguaje formal. El rol perdurable del ingeniero es justamente el de traductor entre ambos mundos: convertir la intención humana, informal e incompleta, en una especificación formal que una máquina pueda ejecutar. Esta conexión no es una mera analogía: trabajos recientes muestran que el cómputo interno de un </w:t>
       </w:r>
       <w:r>
         <w:rPr>
           <w:i/>
         </w:rPr>
-        <w:t>transformers</w:t>
+        <w:t>transformer</w:t>
       </w:r>
       <w:r>
-        <w:t xml:space="preserve"> están acotados por la jerarquía de Chomsky y, bajo supuestos realistas de precisión, pertenecen a la clase TC⁰, incapaz de reconocer gramáticas libres de contexto arbitrarias (Delétang et al., 2023; Merrill y Sabharwal, 2023).</w:t>
+        <w:t xml:space="preserve"> con precisión logarítmica está acotado por la clase TC⁰ y —salvo que se derrumben conjeturas de complejidad ampliamente aceptadas— no reconoce gramáticas libres de contexto arbitrarias (Delétang et al., 2023; Merrill y Sabharwal, 2023; Dong et al., 2026); la arquitectura actual no generaliza a lenguajes que exceden ese nivel.</w:t>
       </w:r>
     </w:p>
     <w:p>
@@ -705,7 +685,7 @@
               <a:graphicData uri="http://schemas.openxmlformats.org/drawingml/2006/picture">
                 <pic:pic>
                   <pic:nvPicPr>
-                    <pic:cNvPr id="0" name="fig3_chomsky.png"/>
+                    <pic:cNvPr id="0" name="fig4_chomsky.png"/>
                     <pic:cNvPicPr/>
                   </pic:nvPicPr>
                   <pic:blipFill>
@@ -739,7 +719,23 @@
           <w:color w:val="404040"/>
           <w:sz w:val="19"/>
         </w:rPr>
-        <w:t>Figura 4. Los transformers, situados dentro de la jerarquía de Chomsky: con precisión realista equivalen a la clase de complejidad TC⁰. Fuente: elaboración propia a partir de Chomsky (1956), Delétang et al. (2023) y Merrill y Sabharwal (2023).</w:t>
+        <w:t xml:space="preserve">Figura 4. Los </w:t>
+      </w:r>
+      <w:r>
+        <w:rPr>
+          <w:i/>
+          <w:color w:val="404040"/>
+          <w:sz w:val="19"/>
+        </w:rPr>
+        <w:t>transformers</w:t>
+      </w:r>
+      <w:r>
+        <w:rPr>
+          <w:i/>
+          <w:color w:val="404040"/>
+          <w:sz w:val="19"/>
+        </w:rPr>
+        <w:t>, situados dentro de la jerarquía de Chomsky: con precisión realista equivalen a la clase de complejidad TC⁰. Fuente: elaboración propia a partir de Chomsky (1956), Delétang et al. (2023) y Merrill y Sabharwal (2023).</w:t>
       </w:r>
     </w:p>
     <w:p>
@@ -749,7 +745,7 @@
         <w:jc w:val="both"/>
       </w:pPr>
       <w:r>
-        <w:t>Estas barreras alcanzan a la propia IA. Mediante diagonalización apoyada en la indecidibilidad de la detención, se demuestra que la "alucinación" es innata a los LLM: ningún modelo puede aprender todas las funciones computables, por lo que producirá errores que no detecta por sí mismo (Xu et al., 2024). Un LLM no puede autoverificarse; necesita un agente externo —el ingeniero— que contraste su salida con la realidad y asuma la responsabilidad.</w:t>
+        <w:t>Estas barreras alcanzan también a la propia IA. Trabajos recientes demuestran, mediante diagonalización apoyada en la indecidibilidad del problema de la detención, que la «alucinación» es una limitación innata de los LLM: ningún modelo puede aprender todas las funciones computables, por lo que producirá inevitablemente errores que no puede detectar por sí mismo (Xu et al., 2024; Guo y Li, 2026). Necesita, pues, un verificador externo —el ingeniero— que responda por ella.</w:t>
       </w:r>
     </w:p>
     <w:p>
@@ -768,7 +764,7 @@
         <w:t>accidental</w:t>
       </w:r>
       <w:r>
-        <w:t xml:space="preserve"> —la del proceso de construcción, que las herramientas reducen— de la </w:t>
+        <w:t xml:space="preserve"> —la del proceso de construcción, que las herramientas sí reducen— de la </w:t>
       </w:r>
       <w:r>
         <w:rPr>
@@ -777,7 +773,7 @@
         <w:t>esencial</w:t>
       </w:r>
       <w:r>
-        <w:t xml:space="preserve">, la dificultad conceptual inherente al problema. "La parte más difícil de construir un sistema de software es decidir con precisión qué construir": la IA ataca lo accidental, pero decidir qué construir, para quién y con qué compromisos éticos es una tarea humana cargada de valores. En la misma línea, Naur (1985) sostuvo que el verdadero producto de programar es una </w:t>
+        <w:t xml:space="preserve"> —la dificultad conceptual inherente al problema—. Para Brooks, «la parte más difícil de construir un sistema de software es decidir con precisión qué construir»: la IA ataca lo accidental, pero decidir qué construir, para quién y con qué compromisos éticos es un acto humano cargado de valores, no un cómputo. En la misma línea, Naur (1985) sostuvo que el verdadero producto de programar es una </w:t>
       </w:r>
       <w:r>
         <w:rPr>
@@ -786,16 +782,7 @@
         <w:t>teoría</w:t>
       </w:r>
       <w:r>
-        <w:t xml:space="preserve"> del problema que reside en la mente del equipo. Ahí reside el corazón irreductible de la ingeniería: no en </w:t>
-      </w:r>
-      <w:r>
-        <w:rPr>
-          <w:i/>
-        </w:rPr>
-        <w:t>toda</w:t>
-      </w:r>
-      <w:r>
-        <w:t xml:space="preserve"> la programación —la verificación acotada y de bajo riesgo se automatiza— sino en su franja crítica, donde la indecidibilidad se cruza con sistemas de alto riesgo y con una responsabilidad que ninguna norma legal admite delegar en una máquina.</w:t>
+        <w:t xml:space="preserve"> del problema que reside en la mente del equipo y que ninguna especificación formal captura.</w:t>
       </w:r>
     </w:p>
     <w:p>
@@ -820,7 +807,7 @@
         <w:jc w:val="both"/>
       </w:pPr>
       <w:r>
-        <w:t>Si la teoría garantiza un núcleo humano, la economía explica por qué puede crecer. Vale la "paradoja de Jevons": cuando una tecnología abarata un recurso, su consumo total tiende a aumentar. Los cajeros automáticos lo ilustran: abarataron la sucursal, los bancos abrieron más y el empleo creció (Bessen, 2015). En el software la lógica es análoga: al abaratarse la producción, la demanda de quienes lo diseñan y controlan podría crecer (Acemoglu y Restrepo, 2019; Autor, 2015).</w:t>
+        <w:t>Si la teoría garantiza un núcleo humano, la economía explica por qué ese núcleo no solo persistirá, sino que probablemente se ampliará. La historia de la automatización lo ilustra con la «paradoja de Jevons»: cuando una tecnología abarata el uso de un recurso, su consumo total tiende a aumentar si la demanda es elástica. El caso de los cajeros automáticos es ilustrativo: al abaratar la sucursal, los bancos abrieron más y el empleo de cajeros creció durante dos décadas —antes de revertirse con la banca móvil—, aunque la tarea viró hacia la atención (Bessen, 2015). Aplicada al software, la lógica es análoga: al volverse más barato producir, la demanda —y la de quienes lo diseñan y controlan— podría crecer (Acemoglu y Restrepo, 2019; Autor, 2015). Thomas Dohmke, entonces director ejecutivo de GitHub, llegó a proyectar «mil millones de desarrolladores habilitados por miles de millones de agentes de IA» (Dohmke, 2025).</w:t>
       </w:r>
     </w:p>
     <w:p>
@@ -830,7 +817,7 @@
         <w:jc w:val="both"/>
       </w:pPr>
       <w:r>
-        <w:t xml:space="preserve">El nuevo rol es un peldaño más en la escalera de abstracción. El ingeniero del futuro escribirá menos código línea por línea y dedicará su tiempo a: </w:t>
+        <w:t xml:space="preserve">El nuevo rol puede describirse como un peldaño más en la escalera de abstracción. El ingeniero del futuro escribirá menos código línea por línea y, en cambio, dedicará su tiempo a: </w:t>
       </w:r>
       <w:r>
         <w:rPr>
@@ -839,7 +826,7 @@
         <w:t>especificar</w:t>
       </w:r>
       <w:r>
-        <w:t xml:space="preserve"> qué debe hacer el sistema; </w:t>
+        <w:t xml:space="preserve"> con precisión qué debe hacer el sistema (la complejidad esencial de Brooks); </w:t>
       </w:r>
       <w:r>
         <w:rPr>
@@ -848,25 +835,25 @@
         <w:t>diseñar</w:t>
       </w:r>
       <w:r>
-        <w:t xml:space="preserve"> arquitecturas e integrar componentes heterogéneos, incluidos los modelos de IA; </w:t>
+        <w:t xml:space="preserve"> arquitecturas e integrar componentes heterogéneos, incluidos los propios modelos de IA; </w:t>
       </w:r>
       <w:r>
         <w:rPr>
           <w:b/>
         </w:rPr>
-        <w:t>validar y verificar</w:t>
+        <w:t>validar</w:t>
       </w:r>
       <w:r>
-        <w:t xml:space="preserve"> el código generado, sabiendo —por Rice y Turing— que esa validación no puede delegarse del todo; </w:t>
+        <w:t xml:space="preserve"> el código generado —algo que Rice y Turing vuelven indecidible en general y, por eso, no delegable—; </w:t>
       </w:r>
       <w:r>
         <w:rPr>
           <w:b/>
         </w:rPr>
-        <w:t>supervisar</w:t>
+        <w:t>supervisar críticamente</w:t>
       </w:r>
       <w:r>
-        <w:t xml:space="preserve"> sistemas autónomos (seguridad, sesgo, impacto); y </w:t>
+        <w:t xml:space="preserve"> sistemas autónomos que ni siquiera pueden autoverificarse, atendiendo a su seguridad y su sesgo; y </w:t>
       </w:r>
       <w:r>
         <w:rPr>
@@ -875,7 +862,7 @@
         <w:t>decidir</w:t>
       </w:r>
       <w:r>
-        <w:t xml:space="preserve"> bajo restricciones de intratabilidad y de valores. Es el "30 % difícil" de Osmani vuelto centro de la profesión. Las proyecciones marcan dónde está la demanda: hacia 2030 cambiará cerca del 40 % de las habilidades, con el pensamiento analítico, la IA y los datos, y la ciberseguridad a la cabeza (World Economic Forum, 2025) —nichos que en 2026 pagan primas muy por encima del promedio (Stanford HAI, 2026)—; y marcos como el SWEBOK (Washizaki, 2024) definen la ingeniería muy por encima de la codificación.</w:t>
+        <w:t>, bajo la intratabilidad de P vs. NP, qué sacrificar y con qué valores. Es, precisamente, el «30 % difícil» de Osmani convertido en el centro de gravedad de la profesión. Las proyecciones de competencias confirman ese desplazamiento: cerca del 40 % de las habilidades cambiarán hacia 2030, con el pensamiento analítico, la IA y los datos, y la ciberseguridad entre las más demandadas (World Economic Forum, 2025); y marcos como el SWEBOK (Washizaki, 2024) ya definen la ingeniería de software muy por encima de la codificación, abarcando requisitos, arquitectura, validación y seguridad.</w:t>
       </w:r>
     </w:p>
     <w:p>
@@ -885,35 +872,7 @@
         <w:jc w:val="both"/>
       </w:pPr>
       <w:r>
-        <w:t xml:space="preserve">Proyectada a 2035, apunta a un ingeniero que orquesta agentes más que a uno que teclea: define la intención, delega la ejecución y responde por el resultado. Kent Beck lo expresó al constatar que "el 90 % de mis habilidades hoy valen 0 dólares", mientras que el 10 % restante —visión, diseño y control de la complejidad— pasó a valer mil veces más (Beck, 2023). Y Martin Fowler advierte que los LLM introducen una abstracción </w:t>
-      </w:r>
-      <w:r>
-        <w:rPr>
-          <w:i/>
-        </w:rPr>
-        <w:t>no determinista</w:t>
-      </w:r>
-      <w:r>
-        <w:t>, sin la reproducibilidad de un compilador, comparable al salto del ensamblador a los lenguajes de alto nivel (Fowler, 2025).</w:t>
-      </w:r>
-    </w:p>
-    <w:p>
-      <w:pPr>
-        <w:spacing w:line="360" w:lineRule="auto" w:after="120"/>
-        <w:ind w:firstLine="576"/>
-        <w:jc w:val="both"/>
-      </w:pPr>
-      <w:r>
-        <w:t xml:space="preserve">Los datos laborales de 2026 muestran una recomposición brutal y desigual. La base de entrada se desploma: el empleo de desarrolladores de 22-25 años cayó cerca del 20 % desde 2024, el desempleo de los recién recibidos en Ciencias de la Computación trepó al 6,1 % —por encima de carreras como Historia del Arte (Federal Reserve Bank of New York, 2026)— y, de los 142.000 despidos tecnológicos del año, casi la mitad se atribuyeron a la IA (Stanford HAI, 2026). Pero la cima resiste: el empleo de los mayores de 30 creció en las mismas empresas y la Oficina de Estadísticas Laborales aún proyecta un alza del 15 % en "desarrolladores de software" a 2034, frente a un −6 % en "programadores" (Bureau of Labor Statistics, 2025; Brynjolfsson et al., 2025). El patrón no es extinción sino polarización: donde se necesitaban cinco programadores, ahora bastan tres. Y el cierre de la "puerta de entrada" junior no es solo laboral sino </w:t>
-      </w:r>
-      <w:r>
-        <w:rPr>
-          <w:i/>
-        </w:rPr>
-        <w:t>cognitivo</w:t>
-      </w:r>
-      <w:r>
-        <w:t>: si la IA absorbe las tareas donde se forma el criterio, faltarán los expertos capaces de auditarla. Aun con empleo, además, el valor migra hacia quienes proveen las herramientas.</w:t>
+        <w:t>Con todo, los datos del mercado laboral advierten que la transición no será indolora ni uniforme. La Oficina de Estadísticas Laborales de EE. UU. proyecta un crecimiento del empleo de «desarrolladores de software» cercano al 15 % entre 2024 y 2034 —muy por encima del promedio—, mientras la categoría más estrecha de «programadores» se contraería un 6 % por la automatización (Bureau of Labor Statistics, 2025): se automatiza la tarea de codificar, no la de diseñar y decidir. A la vez, un estudio de Stanford halló una caída de empleo del 13 % al 16 % en los trabajadores de carrera temprana (22-25 años) de las ocupaciones más expuestas a la IA —entre ellas el desarrollo de software—, mientras los de mayor experiencia se mantenían estables (Brynjolfsson et al., 2025). La contratación de recién recibidos cayó cerca del 65 % en las grandes tecnológicas y un 76 % en las startups respecto de 2019, porque la IA absorbe las tareas con que los juniors aprendían (SignalFire, 2026). Indeed registra que los puestos junior se contrajeron un 34 %, frente al 19 % de los senior (Indeed Hiring Lab, 2025). Salesforce, incluso, anunció que en 2025 no sumaría ingenieros tras elevar su productividad más de un 30 % con IA (Benioff, 2024). La «puerta de entrada» junior se estrecha y la demanda se desplaza hacia perfiles con criterio: las competencias del nuevo rol.</w:t>
       </w:r>
     </w:p>
     <w:p>
@@ -933,7 +892,7 @@
               <a:graphicData uri="http://schemas.openxmlformats.org/drawingml/2006/picture">
                 <pic:pic>
                   <pic:nvPicPr>
-                    <pic:cNvPr id="0" name="fig4_empleo.png"/>
+                    <pic:cNvPr id="0" name="fig5_empleo.png"/>
                     <pic:cNvPicPr/>
                   </pic:nvPicPr>
                   <pic:blipFill>
@@ -967,7 +926,7 @@
           <w:color w:val="404040"/>
           <w:sz w:val="19"/>
         </w:rPr>
-        <w:t>Figura 5. El empleo se recompone: crece "desarrollador de software" mientras se contraen "programador" y el empleo joven en ocupaciones expuestas a la IA. Fuente: Bureau of Labor Statistics (2025); Brynjolfsson et al. (2025).</w:t>
+        <w:t>Figura 5. El empleo se recompone: crece «desarrollador de software» mientras se contraen «programador» y el empleo joven en ocupaciones expuestas a la IA. Fuente: Bureau of Labor Statistics (2025); Brynjolfsson et al. (2025).</w:t>
       </w:r>
     </w:p>
     <w:p>
@@ -987,7 +946,7 @@
               <a:graphicData uri="http://schemas.openxmlformats.org/drawingml/2006/picture">
                 <pic:pic>
                   <pic:nvPicPr>
-                    <pic:cNvPr id="0" name="fig5_wef.png"/>
+                    <pic:cNvPr id="0" name="fig6_wef.png"/>
                     <pic:cNvPicPr/>
                   </pic:nvPicPr>
                   <pic:blipFill>
@@ -1046,16 +1005,16 @@
         <w:jc w:val="both"/>
       </w:pPr>
       <w:r>
-        <w:t xml:space="preserve">Como toda proyección, depende de quienes la construyen, cuyas opiniones, aunque dispares, convergen en un punto. Dario Amodei (Anthropic) pronosticó en 2025 que la IA escribiría el 90 % del código en meses y "esencialmente todo" en un año, pero aclaró que "el programador todavía debe especificar (…) las decisiones generales de diseño" (Council on Foreign Relations, 2025). A mediados de 2026 ese pronóstico se cumplió </w:t>
+        <w:t xml:space="preserve">Como toda proyección, depende de cómo lean el futuro quienes lo construyen, y sus opiniones, aunque dispares, convergen en un punto. En el extremo más audaz, Dario Amodei (Anthropic) pronosticó en marzo de 2025 que la IA escribiría el 90 % del código en tres a seis meses y «esencialmente todo» en doce; pero aclaró de inmediato que «el programador todavía debe especificar (…) las decisiones generales de diseño» (Council on Foreign Relations, 2025). Andrej Karpathy describió el «Software 3.0», en el que «programamos las computadoras en inglés» —que el ingeniero aún debe desambiguar— (Karpathy, 2025), y popularizó el </w:t>
       </w:r>
       <w:r>
         <w:rPr>
           <w:i/>
         </w:rPr>
-        <w:t>de puertas adentro</w:t>
+        <w:t>vibe coding</w:t>
       </w:r>
       <w:r>
-        <w:t xml:space="preserve"> —en la propia Anthropic casi todo el código lo escribe la IA (Krieger, 2026)—, pero no a escala industrial, donde sigue muy por debajo. Andrej Karpathy describió el "Software 3.0" y popularizó el "vibe coding" (Karpathy, 2025).</w:t>
+        <w:t>, programación delegada en la IA.</w:t>
       </w:r>
     </w:p>
     <w:p>
@@ -1065,7 +1024,7 @@
         <w:jc w:val="both"/>
       </w:pPr>
       <w:r>
-        <w:t>No todas las voces comparten ese optimismo. Grady Booch, coautor de UML, replicó que tales pronósticos revelan "una incomprensión fundamental de lo que es la ingeniería de software" (Booch, 2026). Bjarne Stroustrup, creador de C++, advirtió que el riesgo no es el reemplazo sino que los programadores "pierdan la capacidad de detectar problemas por estar tan acostumbrados a que se los resuelvan" (Stroustrup, 2025).</w:t>
+        <w:t>No todas las voces comparten ese optimismo. Grady Booch, coautor de UML, replicó a Amodei que tales pronósticos revelan «una incomprensión fundamental de lo que es la ingeniería de software» y condensó la cuestión en una frase: «tus herramientas están cambiando, pero tus problemas no» (Booch, 2026). Bjarne Stroustrup, creador de C++, advirtió que las herramientas de IA «generan más errores, más agujeros de seguridad… código difícil de validar», justo cuando los desarrolladores senior capaces de validarlo empiezan a jubilarse (Stroustrup, 2026).</w:t>
       </w:r>
     </w:p>
     <w:p>
@@ -1075,17 +1034,7 @@
         <w:jc w:val="both"/>
       </w:pPr>
       <w:r>
-        <w:t>Existe, además, un bando que anticipa no una transformación sino un reemplazo. Amodei advirtió que la IA podría eliminar la mitad de los empleos administrativos de nivel inicial en uno a cinco años y elevar el desempleo al 10-20 % (VandeHei y Allen, 2025); Mark Zuckerberg proyectó que cubriría el trabajo de los ingenieros de nivel medio de Meta, y Salesforce congeló la contratación de ingenieros en 2025 (The San Francisco Standard, 2025). En clave académica, Frey y Osborne (2017) estimaron en un 47 % el empleo estadounidense en alto riesgo. No conviene minimizarlas, pero admiten reparos: aquel estudio medía ocupaciones, no tareas, y se corrigió a la baja; las predicciones de directivos cargan un interés comercial —Salesforce aún emplea unos 15.000 ingenieros—; y el desplazamiento golpea la tarea rutinaria de codificar, no el juicio de especificar, validar y decidir que el apartado IV vuelve irreductible.</w:t>
-      </w:r>
-    </w:p>
-    <w:p>
-      <w:pPr>
-        <w:spacing w:line="360" w:lineRule="auto" w:after="120"/>
-        <w:ind w:firstLine="576"/>
-        <w:jc w:val="both"/>
-      </w:pPr>
-      <w:r>
-        <w:t>Sam Altman (OpenAI) ofrece la síntesis más equilibrada: "cada ingeniero de software hará, durante un buen tiempo, muchísimo más" (Thompson, 2025), y "los expertos seguirán siendo mucho mejores que los novatos, si adoptan las nuevas herramientas" (Altman, 2025). La IA no anula al ingeniero: amplifica al que sabe usarla. Incluso los más optimistas reservan para el humano especificar, decidir y juzgar —lo que la teoría de la computación demuestra inautomatizable.</w:t>
+        <w:t>Sam Altman, de OpenAI, ofrece quizás la síntesis más equilibrada. Sostuvo que «cada ingeniero de software hará, durante un buen tiempo, muchísimo más» (Thompson, 2025), y agregó que «mucha más gente podrá crear software, pero los expertos seguirán siendo mucho mejores que los novatos, si adoptan las nuevas herramientas» (Altman, 2025). Es la hipótesis de este trabajo en boca de un protagonista del cambio: la IA no anula al ingeniero, sino que amplifica al que sabe usarla. Existen, es cierto, posiciones más radicales —Welsh anuncia software «entrenado, no programado»—, pero incluso varias de las voces más optimistas reservan para el humano las tareas de especificar, decidir y juzgar: las mismas que la teoría de la computación demuestra que no pueden automatizarse.</w:t>
       </w:r>
     </w:p>
     <w:p>
@@ -1110,7 +1059,7 @@
         <w:jc w:val="both"/>
       </w:pPr>
       <w:r>
-        <w:t xml:space="preserve">Toda predicción tecnológica a diez años es incierta: la conclusión es una estimación fundada, no una certeza. Buena parte de la evidencia proviene de estudios recientes —algunos aún </w:t>
+        <w:t xml:space="preserve">Este trabajo proyecta una tendencia a diez años, y toda predicción tecnológica es muy incierta; la conclusión es, por tanto, una estimación fundada y no una certeza. Buena parte de la evidencia cuantitativa proviene de estudios recientes, algunos aún en forma de </w:t>
       </w:r>
       <w:r>
         <w:rPr>
@@ -1119,7 +1068,16 @@
         <w:t>working papers</w:t>
       </w:r>
       <w:r>
-        <w:t xml:space="preserve"> sin revisión por pares— y de declaraciones de ejecutivos con intereses comerciales, lo que obliga a leerlas con cautela. La causalidad es además discutible: la contracción del empleo junior podría deberse tanto a la IA como al fin del crédito barato y la sobrecontratación previa. La base sólida es el marco teórico: los resultados de Turing, Rice, Cook y Chomsky no caducan con la próxima versión de un modelo, y son el fundamento más firme de la tesis aquí defendida.</w:t>
+        <w:t xml:space="preserve"> no revisados por pares, y de declaraciones de ejecutivos con intereses comerciales en la propia tecnología que promueven, lo que obliga a leerlas con cautela. La causalidad de los fenómenos laborales observados es, además, materia de debate: la contracción del empleo junior podría obedecer tanto a la IA como al fin del crédito barato y a la sobrecontratación previa. Cabe una objeción al propio marco teórico: la indecidibilidad y la intratabilidad rigen el caso general, mientras la ingeniería opera a menudo sobre instancias restringidas donde la automatización sí es muy eficaz; el límite acota la automatización </w:t>
+      </w:r>
+      <w:r>
+        <w:rPr>
+          <w:i/>
+        </w:rPr>
+        <w:t>total</w:t>
+      </w:r>
+      <w:r>
+        <w:t>, no los avances parciales. Aun así, los resultados de Turing, Rice, Cook y Chomsky no caducan con la próxima versión de un modelo y son el fundamento más firme de la tesis aquí defendida.</w:t>
       </w:r>
     </w:p>
     <w:p>
@@ -1144,7 +1102,7 @@
         <w:jc w:val="both"/>
       </w:pPr>
       <w:r>
-        <w:t>El recorrido confirma la hipótesis. En la próxima década el ingeniero informático no desaparecerá, pero la profesión se polarizará: la base de ejecución se automatiza y se contrae —con desplazamiento real de empleo, sobre todo junior—, mientras un núcleo más delgado de especificación, verificación y responsabilidad se vuelve indispensable y concentra el valor. La historia muestra que cada abstracción recompuso el trabajo; la evidencia de 2026 añade que esta vez la recomposición es brutal en la base —derrumbe del empleo de entrada—; y la teoría de la computación garantiza el núcleo: la verificación universal (Rice y Turing), la resolución eficiente de todo problema (P vs. NP) y la traducción de la intención ambigua al lenguaje formal (Chomsky) no son tareas que una máquina pueda asumir por completo.</w:t>
+        <w:t>El recorrido permite confirmar, con matices, la hipótesis inicial. En los próximos diez años la profesión no desaparecerá, pero será más pequeña y más exigente —menos ingenieros, concentrados en los mejores—, y cambiará de forma: su centro de gravedad pasará de la ejecución técnica —escribir código línea por línea— a la especificación, el diseño, la integración y, sobre todo, la validación y supervisión crítica de sistemas crecientemente autónomos. La historia respalda esta lectura: cada abstracción anterior elevó al ingeniero en lugar de eliminarlo; la evidencia empírica reciente la matiza, al mostrar que la IA acelera la producción pero degrada la garantía de corrección; y la teoría de la computación la fundamenta: la verificación universal (Rice, Turing), la resolución eficiente de todo problema (P vs. NP) y la traducción de la intención ambigua a lo formal (Chomsky) exceden a cualquier máquina.</w:t>
       </w:r>
     </w:p>
     <w:p>
@@ -1154,34 +1112,7 @@
         <w:jc w:val="both"/>
       </w:pPr>
       <w:r>
-        <w:t xml:space="preserve">¿Quién gana, entonces? No el que escribe código más rápido —eso ya lo hace la máquina—, sino el que sube primero al peldaño que ella no alcanza: el que especifica y verifica sistemas de alto riesgo, el que orquesta agentes en lugar de competir con ellos, el que se especializa donde la demanda explota. De ahí el mensaje para quien empieza: no se trata de esforzarse </w:t>
-      </w:r>
-      <w:r>
-        <w:rPr>
-          <w:i/>
-        </w:rPr>
-        <w:t>más</w:t>
-      </w:r>
-      <w:r>
-        <w:t xml:space="preserve">, sino de esforzarse </w:t>
-      </w:r>
-      <w:r>
-        <w:rPr>
-          <w:i/>
-        </w:rPr>
-        <w:t>inteligentemente</w:t>
-      </w:r>
-      <w:r>
-        <w:t xml:space="preserve"> y, sobre todo, </w:t>
-      </w:r>
-      <w:r>
-        <w:rPr>
-          <w:i/>
-        </w:rPr>
-        <w:t>dónde</w:t>
-      </w:r>
-      <w:r>
-        <w:t xml:space="preserve"> —huir de la tarea que la IA ya hace mejor y correr hacia el juicio que, por los límites mismos de la computación, le sigue perteneciendo al humano—. La competencia no es contra la máquina: es por el lugar escaso desde el cual se la dirige. Quien lo entienda a tiempo no será desplazado: estará del lado que gana.</w:t>
+        <w:t>El balance, sin embargo, no es enteramente favorable: la puerta de entrada junior se estrecha y la codificación pura se contrae, con perdedores concretos pese a un saldo agregado positivo. Hecha esa salvedad, la paradoja de fondo es esperanzadora: cuanto más poderosa se vuelve la automatización, más valioso se torna el juicio humano que decide qué automatizar, cómo validarlo y para qué fin. En lo alto de esa escalera, el ingeniero del futuro será menos un escriba de instrucciones y más un arquitecto, un auditor y un responsable último de sistemas que ni él ni la máquina pueden comprender por completo. La teoría de la computación, lejos de anunciar el fin de la profesión, traza el contorno preciso —y exigente— de su porvenir.</w:t>
       </w:r>
     </w:p>
     <w:p>
@@ -1225,6 +1156,25 @@
         <w:jc w:val="left"/>
       </w:pPr>
       <w:r>
+        <w:t xml:space="preserve">Aho, A. V., Lam, M. S., Sethi, R., &amp; Ullman, J. D. (2007). </w:t>
+      </w:r>
+      <w:r>
+        <w:rPr>
+          <w:i/>
+        </w:rPr>
+        <w:t>Compilers: Principles, techniques, and tools</w:t>
+      </w:r>
+      <w:r>
+        <w:t xml:space="preserve"> (2.ª ed.). Pearson Addison-Wesley.</w:t>
+      </w:r>
+    </w:p>
+    <w:p>
+      <w:pPr>
+        <w:spacing w:line="360" w:lineRule="auto" w:after="120"/>
+        <w:ind w:left="720" w:hanging="720"/>
+        <w:jc w:val="left"/>
+      </w:pPr>
+      <w:r>
         <w:t xml:space="preserve">Altman, S. (2025, 10 de junio). </w:t>
       </w:r>
       <w:r>
@@ -1244,16 +1194,54 @@
         <w:jc w:val="left"/>
       </w:pPr>
       <w:r>
-        <w:t xml:space="preserve">Anthropic. (2026, 9 de junio). </w:t>
+        <w:t xml:space="preserve">Anthropic. (2026a, 9 de junio). </w:t>
       </w:r>
       <w:r>
         <w:rPr>
           <w:i/>
         </w:rPr>
-        <w:t>Claude Fable 5</w:t>
+        <w:t>Claude Fable 5 and Claude Mythos 5</w:t>
       </w:r>
       <w:r>
-        <w:t>. https://www.anthropic.com/news/claude-fable-5</w:t>
+        <w:t>. https://www.anthropic.com/news/claude-fable-5-mythos-5</w:t>
+      </w:r>
+    </w:p>
+    <w:p>
+      <w:pPr>
+        <w:spacing w:line="360" w:lineRule="auto" w:after="120"/>
+        <w:ind w:left="720" w:hanging="720"/>
+        <w:jc w:val="left"/>
+      </w:pPr>
+      <w:r>
+        <w:t xml:space="preserve">Anthropic. (2026b, 28 de mayo). </w:t>
+      </w:r>
+      <w:r>
+        <w:rPr>
+          <w:i/>
+        </w:rPr>
+        <w:t>Claude Opus 4.8</w:t>
+      </w:r>
+      <w:r>
+        <w:t>. https://www.anthropic.com/news/claude-opus-4-8</w:t>
+      </w:r>
+    </w:p>
+    <w:p>
+      <w:pPr>
+        <w:spacing w:line="360" w:lineRule="auto" w:after="120"/>
+        <w:ind w:left="720" w:hanging="720"/>
+        <w:jc w:val="left"/>
+      </w:pPr>
+      <w:r>
+        <w:t xml:space="preserve">Anthropic. (2026c, 12 de junio). </w:t>
+      </w:r>
+      <w:r>
+        <w:rPr>
+          <w:i/>
+        </w:rPr>
+        <w:t>Statement on the US government directive to suspend access to Fable 5 and Mythos 5</w:t>
+      </w:r>
+      <w:r>
+        <w:t>. https://www.anthropic.com/news/fable-mythos-access</w:t>
       </w:r>
     </w:p>
     <w:p>
@@ -1282,16 +1270,16 @@
         <w:jc w:val="left"/>
       </w:pPr>
       <w:r>
-        <w:t xml:space="preserve">Beck, K. (2023, 19 de abril). </w:t>
+        <w:t xml:space="preserve">Benioff, M. (2024, 9 de diciembre). Marc Benioff, Salesforce founder: Why Salesforce isn't hiring software engineers (n.º 1236) [Episodio de podcast]. </w:t>
       </w:r>
       <w:r>
         <w:rPr>
           <w:i/>
         </w:rPr>
-        <w:t>90% of my skills are now worth $0</w:t>
+        <w:t>20VC with Harry Stebbings</w:t>
       </w:r>
       <w:r>
-        <w:t>. Tidy First? https://newsletter.kentbeck.com/p/90-of-my-skills-are-now-worth-0</w:t>
+        <w:t xml:space="preserve"> (H. Stebbings, anfitrión). https://www.thetwentyminutevc.com/marc-benioff-2</w:t>
       </w:r>
     </w:p>
     <w:p>
@@ -1310,7 +1298,7 @@
         <w:t>Finance &amp; Development, 52</w:t>
       </w:r>
       <w:r>
-        <w:t>(1), 16-19. Fondo Monetario Internacional. https://www.imf.org/external/pubs/ft/fandd/2015/03/bessen.htm</w:t>
+        <w:t>(1), 16-19. https://www.imf.org/external/pubs/ft/fandd/2015/03/bessen.htm</w:t>
       </w:r>
     </w:p>
     <w:p>
@@ -1320,16 +1308,16 @@
         <w:jc w:val="left"/>
       </w:pPr>
       <w:r>
-        <w:t xml:space="preserve">Booch, G. (2026, 4 de febrero). </w:t>
+        <w:t xml:space="preserve">Booch, G. (2026, 4 de febrero). The third golden age of software engineering — Thanks to AI, with Grady Booch [Episodio de podcast]. </w:t>
       </w:r>
       <w:r>
         <w:rPr>
           <w:i/>
         </w:rPr>
-        <w:t>The third golden age of software engineering — Thanks to AI, with Grady Booch</w:t>
+        <w:t>The Pragmatic Engineer</w:t>
       </w:r>
       <w:r>
-        <w:t xml:space="preserve"> [Episodio de pódcast]. The Pragmatic Engineer (G. Orosz, entrevistador). https://newsletter.pragmaticengineer.com/p/the-third-golden-age-of-software</w:t>
+        <w:t xml:space="preserve"> (G. Orosz, anfitrión). https://newsletter.pragmaticengineer.com/p/the-third-golden-age-of-software</w:t>
       </w:r>
     </w:p>
     <w:p>
@@ -1453,25 +1441,6 @@
         <w:jc w:val="left"/>
       </w:pPr>
       <w:r>
-        <w:t xml:space="preserve">Cui, Z. K., Demirer, M., Jaffe, S., Musolff, L., Peng, S., &amp; Salz, T. (2025). </w:t>
-      </w:r>
-      <w:r>
-        <w:rPr>
-          <w:i/>
-        </w:rPr>
-        <w:t>The effects of generative AI on high-skilled work: Evidence from three field experiments with software developers</w:t>
-      </w:r>
-      <w:r>
-        <w:t xml:space="preserve"> [Documento de trabajo]. Massachusetts Institute of Technology. https://economics.mit.edu/sites/default/files/inline-files/draft_copilot_experiments.pdf</w:t>
-      </w:r>
-    </w:p>
-    <w:p>
-      <w:pPr>
-        <w:spacing w:line="360" w:lineRule="auto" w:after="120"/>
-        <w:ind w:left="720" w:hanging="720"/>
-        <w:jc w:val="left"/>
-      </w:pPr>
-      <w:r>
         <w:t xml:space="preserve">Delétang, G., Ruoss, A., Grau-Moya, J., Genewein, T., Wenliang, L. K., Catt, E., Cundy, C., Hutter, M., Legg, S., Veness, J., &amp; Ortega, P. A. (2023). </w:t>
       </w:r>
       <w:r>
@@ -1510,16 +1479,16 @@
         <w:jc w:val="left"/>
       </w:pPr>
       <w:r>
-        <w:t xml:space="preserve">Federal Reserve Bank of New York. (2026). </w:t>
+        <w:t xml:space="preserve">Dohmke, T. (2025, 11 de agosto). </w:t>
       </w:r>
       <w:r>
         <w:rPr>
           <w:i/>
         </w:rPr>
-        <w:t>The labor market for recent college graduates</w:t>
+        <w:t>Auf Wiedersehen, GitHub</w:t>
       </w:r>
       <w:r>
-        <w:t>. https://www.newyorkfed.org/research/college-labor-market</w:t>
+        <w:t>. The GitHub Blog. https://github.blog/news-insights/company-news/goodbye-github/</w:t>
       </w:r>
     </w:p>
     <w:p>
@@ -1529,16 +1498,16 @@
         <w:jc w:val="left"/>
       </w:pPr>
       <w:r>
-        <w:t xml:space="preserve">Fowler, M. (2025, 24 de junio). </w:t>
+        <w:t xml:space="preserve">Dong, Y., Xiao, J., Jiang, X., Guo, X., Fan, Z., Qian, J., Zhang, K., Li, J., Jin, Z., &amp; Li, G. (2026). </w:t>
       </w:r>
       <w:r>
         <w:rPr>
           <w:i/>
         </w:rPr>
-        <w:t>LLMs bring new nature of abstraction</w:t>
+        <w:t>Evaluating the formal reasoning capabilities of large language models through Chomsky hierarchy</w:t>
       </w:r>
       <w:r>
-        <w:t>. martinfowler.com. https://martinfowler.com/articles/2025-nature-abstraction.html</w:t>
+        <w:t xml:space="preserve"> [Preprint]. arXiv. https://doi.org/10.48550/arXiv.2604.02709</w:t>
       </w:r>
     </w:p>
     <w:p>
@@ -1548,16 +1517,16 @@
         <w:jc w:val="left"/>
       </w:pPr>
       <w:r>
-        <w:t xml:space="preserve">Frey, C. B., &amp; Osborne, M. A. (2017). The future of employment: How susceptible are jobs to computerisation? </w:t>
+        <w:t xml:space="preserve">Guo, A., &amp; Li, J. (2026). </w:t>
       </w:r>
       <w:r>
         <w:rPr>
           <w:i/>
         </w:rPr>
-        <w:t>Technological Forecasting and Social Change, 114</w:t>
+        <w:t>Hallucination is a consequence of space-optimality: A rate-distortion theorem for membership testing</w:t>
       </w:r>
       <w:r>
-        <w:t>, 254-280. https://doi.org/10.1016/j.techfore.2016.08.019</w:t>
+        <w:t xml:space="preserve"> [Preprint]. arXiv. https://doi.org/10.48550/arXiv.2602.00906</w:t>
       </w:r>
     </w:p>
     <w:p>
@@ -1567,16 +1536,35 @@
         <w:jc w:val="left"/>
       </w:pPr>
       <w:r>
-        <w:t xml:space="preserve">Husain, H., Flath, I., &amp; Whitaker, J. (2025, 8 de enero). </w:t>
+        <w:t xml:space="preserve">Indeed Hiring Lab. (2025, 30 de julio). </w:t>
       </w:r>
       <w:r>
         <w:rPr>
           <w:i/>
         </w:rPr>
-        <w:t>Thoughts on a month with Devin</w:t>
+        <w:t>Experience requirements have tightened amid the tech hiring freeze</w:t>
       </w:r>
       <w:r>
-        <w:t>. Answer.AI. https://www.answer.ai/posts/2025-01-08-devin.html</w:t>
+        <w:t>. https://www.hiringlab.org/2025/07/30/experience-requirements-have-tightened-amid-the-tech-hiring-freeze/</w:t>
+      </w:r>
+    </w:p>
+    <w:p>
+      <w:pPr>
+        <w:spacing w:line="360" w:lineRule="auto" w:after="120"/>
+        <w:ind w:left="720" w:hanging="720"/>
+        <w:jc w:val="left"/>
+      </w:pPr>
+      <w:r>
+        <w:t xml:space="preserve">Karp, R. M. (1972). Reducibility among combinatorial problems. En </w:t>
+      </w:r>
+      <w:r>
+        <w:rPr>
+          <w:i/>
+        </w:rPr>
+        <w:t>Complexity of computer computations</w:t>
+      </w:r>
+      <w:r>
+        <w:t xml:space="preserve"> (pp. 85-103). Plenum Press. https://doi.org/10.1007/978-1-4684-2001-2_9</w:t>
       </w:r>
     </w:p>
     <w:p>
@@ -1596,25 +1584,6 @@
       </w:r>
       <w:r>
         <w:t xml:space="preserve"> [Video]. Y Combinator AI Startup School. YouTube. https://www.youtube.com/watch?v=LCEmiRjPEtQ</w:t>
-      </w:r>
-    </w:p>
-    <w:p>
-      <w:pPr>
-        <w:spacing w:line="360" w:lineRule="auto" w:after="120"/>
-        <w:ind w:left="720" w:hanging="720"/>
-        <w:jc w:val="left"/>
-      </w:pPr>
-      <w:r>
-        <w:t xml:space="preserve">Krieger, M. (2026). </w:t>
-      </w:r>
-      <w:r>
-        <w:rPr>
-          <w:i/>
-        </w:rPr>
-        <w:t>Dario Amodei had predicted 90% of code would be written by AI, but now at Anthropic it's effectively 100%</w:t>
-      </w:r>
-      <w:r>
-        <w:t>. OfficeChai. https://officechai.com/ai/dario-amodei-had-predicted-90-of-code-would-be-written-by-ai-but-now-at-anthropic-its-effectively-100-anthropic-cpo/</w:t>
       </w:r>
     </w:p>
     <w:p>
@@ -1766,7 +1735,7 @@
         <w:t>The impact of AI on developer productivity: Evidence from GitHub Copilot</w:t>
       </w:r>
       <w:r>
-        <w:t xml:space="preserve"> (arXiv:2302.06590). arXiv. https://arxiv.org/abs/2302.06590</w:t>
+        <w:t xml:space="preserve"> [Preprint]. arXiv. https://doi.org/10.48550/arXiv.2302.06590</w:t>
       </w:r>
     </w:p>
     <w:p>
@@ -1795,6 +1764,25 @@
         <w:jc w:val="left"/>
       </w:pPr>
       <w:r>
+        <w:t xml:space="preserve">Pichai, S. (2026, 22 de abril). </w:t>
+      </w:r>
+      <w:r>
+        <w:rPr>
+          <w:i/>
+        </w:rPr>
+        <w:t>Sundar Pichai shares news from Google Cloud Next 2026</w:t>
+      </w:r>
+      <w:r>
+        <w:t>. Google. https://blog.google/innovation-and-ai/infrastructure-and-cloud/google-cloud/cloud-next-2026-sundar-pichai/</w:t>
+      </w:r>
+    </w:p>
+    <w:p>
+      <w:pPr>
+        <w:spacing w:line="360" w:lineRule="auto" w:after="120"/>
+        <w:ind w:left="720" w:hanging="720"/>
+        <w:jc w:val="left"/>
+      </w:pPr>
+      <w:r>
         <w:t xml:space="preserve">Rice, H. G. (1953). Classes of recursively enumerable sets and their decision problems. </w:t>
       </w:r>
       <w:r>
@@ -1814,16 +1802,16 @@
         <w:jc w:val="left"/>
       </w:pPr>
       <w:r>
-        <w:t xml:space="preserve">The San Francisco Standard. (2025, 27 de febrero). </w:t>
+        <w:t xml:space="preserve">SignalFire. (2026, 22 de junio). </w:t>
       </w:r>
       <w:r>
         <w:rPr>
           <w:i/>
         </w:rPr>
-        <w:t>Marc Benioff: Salesforce will hire no engineers in 2025 due to AI</w:t>
+        <w:t>The SignalFire state of tech talent report — 2026</w:t>
       </w:r>
       <w:r>
-        <w:t>. https://sfstandard.com/2025/02/27/salesforce-marcbenioff-layoffs-tech-agents/</w:t>
+        <w:t>. https://www.signalfire.com/blog/signalfire-state-of-talent-report-2026</w:t>
       </w:r>
     </w:p>
     <w:p>
@@ -1833,26 +1821,7 @@
         <w:jc w:val="left"/>
       </w:pPr>
       <w:r>
-        <w:t xml:space="preserve">Shen, J. H., &amp; Tamkin, A. (2026). </w:t>
-      </w:r>
-      <w:r>
-        <w:rPr>
-          <w:i/>
-        </w:rPr>
-        <w:t>How AI impacts skill formation</w:t>
-      </w:r>
-      <w:r>
-        <w:t xml:space="preserve"> (arXiv:2601.20245). arXiv. https://arxiv.org/abs/2601.20245</w:t>
-      </w:r>
-    </w:p>
-    <w:p>
-      <w:pPr>
-        <w:spacing w:line="360" w:lineRule="auto" w:after="120"/>
-        <w:ind w:left="720" w:hanging="720"/>
-        <w:jc w:val="left"/>
-      </w:pPr>
-      <w:r>
-        <w:t xml:space="preserve">Spracklen, J., Wijewickrama, R., Sakib, A. H. M. N., Maiti, A., Viswanath, B., &amp; Jadliwala, M. (2025). We have a package for you! A comprehensive analysis of package hallucinations by code-generating LLMs. En </w:t>
+        <w:t xml:space="preserve">Spracklen, J., Wijewickrama, R., Sakib, A. H. M. N., Maiti, A., Viswanath, B., &amp; Jadliwala, M. (2025). We have a package for you! A comprehensive analysis of package hallucinations by code generating LLMs. En </w:t>
       </w:r>
       <w:r>
         <w:rPr>
@@ -1871,54 +1840,16 @@
         <w:jc w:val="left"/>
       </w:pPr>
       <w:r>
-        <w:t xml:space="preserve">Stack Overflow. (2025). </w:t>
+        <w:t xml:space="preserve">Stroustrup, B. (2026, 18 de mayo). Creator of C++: Bell Labs, negative overhead abstraction, and mistakes [Episodio de podcast]. </w:t>
       </w:r>
       <w:r>
         <w:rPr>
           <w:i/>
         </w:rPr>
-        <w:t>2025 developer survey: AI</w:t>
+        <w:t>Developing Dev</w:t>
       </w:r>
       <w:r>
-        <w:t>. https://survey.stackoverflow.co/2025/ai/</w:t>
-      </w:r>
-    </w:p>
-    <w:p>
-      <w:pPr>
-        <w:spacing w:line="360" w:lineRule="auto" w:after="120"/>
-        <w:ind w:left="720" w:hanging="720"/>
-        <w:jc w:val="left"/>
-      </w:pPr>
-      <w:r>
-        <w:t xml:space="preserve">Stanford HAI. (2026). </w:t>
-      </w:r>
-      <w:r>
-        <w:rPr>
-          <w:i/>
-        </w:rPr>
-        <w:t>Artificial intelligence index report 2026</w:t>
-      </w:r>
-      <w:r>
-        <w:t>. Stanford Institute for Human-Centered Artificial Intelligence. https://hai.stanford.edu/ai-index</w:t>
-      </w:r>
-    </w:p>
-    <w:p>
-      <w:pPr>
-        <w:spacing w:line="360" w:lineRule="auto" w:after="120"/>
-        <w:ind w:left="720" w:hanging="720"/>
-        <w:jc w:val="left"/>
-      </w:pPr>
-      <w:r>
-        <w:t xml:space="preserve">Stroustrup, B. (2025, 9 de mayo). </w:t>
-      </w:r>
-      <w:r>
-        <w:rPr>
-          <w:i/>
-        </w:rPr>
-        <w:t>Interview: Bjarne Stroustrup on 21st century C++, AI risks, and why the language is hard to replace</w:t>
-      </w:r>
-      <w:r>
-        <w:t xml:space="preserve"> (T. Anderson, entrevistador). DevClass. https://devclass.com/2025/05/09/interview-bjarne-stroustrup-on-21st-century-c-ai-risks-and-why-the-language-is-hard-to-replace/</w:t>
+        <w:t xml:space="preserve"> (R. Peterman, anfitrión). https://www.developing.dev/p/creator-of-c-bell-labs-negative-overhead</w:t>
       </w:r>
     </w:p>
     <w:p>
@@ -1966,35 +1897,16 @@
         <w:jc w:val="left"/>
       </w:pPr>
       <w:r>
-        <w:t xml:space="preserve">VandeHei, J., &amp; Allen, M. (2025, 28 de mayo). </w:t>
-      </w:r>
-      <w:r>
-        <w:rPr>
-          <w:i/>
-        </w:rPr>
-        <w:t>Behind the curtain: A white-collar bloodbath</w:t>
-      </w:r>
-      <w:r>
-        <w:t>. Axios. https://www.axios.com/2025/05/28/ai-jobs-white-collar-unemployment-anthropic</w:t>
-      </w:r>
-    </w:p>
-    <w:p>
-      <w:pPr>
-        <w:spacing w:line="360" w:lineRule="auto" w:after="120"/>
-        <w:ind w:left="720" w:hanging="720"/>
-        <w:jc w:val="left"/>
-      </w:pPr>
-      <w:r>
         <w:t xml:space="preserve">Veracode. (2025). </w:t>
       </w:r>
       <w:r>
         <w:rPr>
           <w:i/>
         </w:rPr>
-        <w:t>2025 GenAI code security report</w:t>
+        <w:t>GenAI code security report</w:t>
       </w:r>
       <w:r>
-        <w:t>. https://www.veracode.com/resources/analyst-reports/2025-genai-code-security-report/</w:t>
+        <w:t xml:space="preserve"> [Informe]. https://www.veracode.com/resources/analyst-reports/2025-genai-code-security-report/</w:t>
       </w:r>
     </w:p>
     <w:p>
@@ -2070,7 +1982,7 @@
         <w:t>Hallucination is inevitable: An innate limitation of large language models</w:t>
       </w:r>
       <w:r>
-        <w:t xml:space="preserve"> (arXiv:2401.11817). arXiv. https://arxiv.org/abs/2401.11817</w:t>
+        <w:t xml:space="preserve"> [Preprint]. arXiv. https://doi.org/10.48550/arXiv.2401.11817</w:t>
       </w:r>
     </w:p>
     <w:p>

</xml_diff>